<commit_message>
hoàn thanh khảo sát thực trạng, quy trình nghiệp vụ, quy định được giao
</commit_message>
<xml_diff>
--- a/doc/01-HoVanKhanh.docx
+++ b/doc/01-HoVanKhanh.docx
@@ -81,13 +81,23 @@
           <w:szCs w:val="26"/>
         </w:rPr>
       </w:pPr>
-      <w:r>
-        <w:rPr>
-          <w:rFonts w:ascii="Times New Roman" w:hAnsi="Times New Roman" w:cs="Times New Roman"/>
-          <w:sz w:val="26"/>
-          <w:szCs w:val="26"/>
-        </w:rPr>
-        <w:t xml:space="preserve">Nhóm </w:t>
+      <w:proofErr w:type="spellStart"/>
+      <w:r>
+        <w:rPr>
+          <w:rFonts w:ascii="Times New Roman" w:hAnsi="Times New Roman" w:cs="Times New Roman"/>
+          <w:sz w:val="26"/>
+          <w:szCs w:val="26"/>
+        </w:rPr>
+        <w:t>Nhóm</w:t>
+      </w:r>
+      <w:proofErr w:type="spellEnd"/>
+      <w:r>
+        <w:rPr>
+          <w:rFonts w:ascii="Times New Roman" w:hAnsi="Times New Roman" w:cs="Times New Roman"/>
+          <w:sz w:val="26"/>
+          <w:szCs w:val="26"/>
+        </w:rPr>
+        <w:t xml:space="preserve"> </w:t>
       </w:r>
       <w:r>
         <w:rPr>
@@ -115,14 +125,53 @@
         </w:rPr>
         <w:t xml:space="preserve">- </w:t>
       </w:r>
-      <w:r>
-        <w:rPr>
-          <w:rFonts w:ascii="Times New Roman" w:hAnsi="Times New Roman" w:cs="Times New Roman"/>
-          <w:sz w:val="26"/>
-          <w:szCs w:val="26"/>
-        </w:rPr>
-        <w:t>Thành viên nhóm</w:t>
-      </w:r>
+      <w:proofErr w:type="spellStart"/>
+      <w:r>
+        <w:rPr>
+          <w:rFonts w:ascii="Times New Roman" w:hAnsi="Times New Roman" w:cs="Times New Roman"/>
+          <w:sz w:val="26"/>
+          <w:szCs w:val="26"/>
+        </w:rPr>
+        <w:t>Thành</w:t>
+      </w:r>
+      <w:proofErr w:type="spellEnd"/>
+      <w:r>
+        <w:rPr>
+          <w:rFonts w:ascii="Times New Roman" w:hAnsi="Times New Roman" w:cs="Times New Roman"/>
+          <w:sz w:val="26"/>
+          <w:szCs w:val="26"/>
+        </w:rPr>
+        <w:t xml:space="preserve"> </w:t>
+      </w:r>
+      <w:proofErr w:type="spellStart"/>
+      <w:r>
+        <w:rPr>
+          <w:rFonts w:ascii="Times New Roman" w:hAnsi="Times New Roman" w:cs="Times New Roman"/>
+          <w:sz w:val="26"/>
+          <w:szCs w:val="26"/>
+        </w:rPr>
+        <w:t>viên</w:t>
+      </w:r>
+      <w:proofErr w:type="spellEnd"/>
+      <w:r>
+        <w:rPr>
+          <w:rFonts w:ascii="Times New Roman" w:hAnsi="Times New Roman" w:cs="Times New Roman"/>
+          <w:sz w:val="26"/>
+          <w:szCs w:val="26"/>
+        </w:rPr>
+        <w:t xml:space="preserve"> </w:t>
+      </w:r>
+      <w:proofErr w:type="spellStart"/>
+      <w:proofErr w:type="gramStart"/>
+      <w:r>
+        <w:rPr>
+          <w:rFonts w:ascii="Times New Roman" w:hAnsi="Times New Roman" w:cs="Times New Roman"/>
+          <w:sz w:val="26"/>
+          <w:szCs w:val="26"/>
+        </w:rPr>
+        <w:t>nhóm</w:t>
+      </w:r>
+      <w:proofErr w:type="spellEnd"/>
       <w:r>
         <w:rPr>
           <w:rFonts w:ascii="Times New Roman" w:hAnsi="Times New Roman" w:cs="Times New Roman"/>
@@ -131,6 +180,7 @@
         </w:rPr>
         <w:t xml:space="preserve"> :</w:t>
       </w:r>
+      <w:proofErr w:type="gramEnd"/>
     </w:p>
     <w:p>
       <w:pPr>
@@ -236,7 +286,67 @@
                 <w:sz w:val="26"/>
                 <w:szCs w:val="26"/>
               </w:rPr>
-              <w:t>Lê Trần Quang Thanh (Nhóm trưởng)</w:t>
+              <w:t xml:space="preserve">Lê </w:t>
+            </w:r>
+            <w:proofErr w:type="spellStart"/>
+            <w:r>
+              <w:rPr>
+                <w:rFonts w:ascii="Times New Roman" w:hAnsi="Times New Roman" w:cs="Times New Roman"/>
+                <w:color w:val="000000" w:themeColor="text1"/>
+                <w:sz w:val="26"/>
+                <w:szCs w:val="26"/>
+              </w:rPr>
+              <w:t>Trần</w:t>
+            </w:r>
+            <w:proofErr w:type="spellEnd"/>
+            <w:r>
+              <w:rPr>
+                <w:rFonts w:ascii="Times New Roman" w:hAnsi="Times New Roman" w:cs="Times New Roman"/>
+                <w:color w:val="000000" w:themeColor="text1"/>
+                <w:sz w:val="26"/>
+                <w:szCs w:val="26"/>
+              </w:rPr>
+              <w:t xml:space="preserve"> Quang Thanh (</w:t>
+            </w:r>
+            <w:proofErr w:type="spellStart"/>
+            <w:r>
+              <w:rPr>
+                <w:rFonts w:ascii="Times New Roman" w:hAnsi="Times New Roman" w:cs="Times New Roman"/>
+                <w:color w:val="000000" w:themeColor="text1"/>
+                <w:sz w:val="26"/>
+                <w:szCs w:val="26"/>
+              </w:rPr>
+              <w:t>Nhóm</w:t>
+            </w:r>
+            <w:proofErr w:type="spellEnd"/>
+            <w:r>
+              <w:rPr>
+                <w:rFonts w:ascii="Times New Roman" w:hAnsi="Times New Roman" w:cs="Times New Roman"/>
+                <w:color w:val="000000" w:themeColor="text1"/>
+                <w:sz w:val="26"/>
+                <w:szCs w:val="26"/>
+              </w:rPr>
+              <w:t xml:space="preserve"> </w:t>
+            </w:r>
+            <w:proofErr w:type="spellStart"/>
+            <w:r>
+              <w:rPr>
+                <w:rFonts w:ascii="Times New Roman" w:hAnsi="Times New Roman" w:cs="Times New Roman"/>
+                <w:color w:val="000000" w:themeColor="text1"/>
+                <w:sz w:val="26"/>
+                <w:szCs w:val="26"/>
+              </w:rPr>
+              <w:t>trưởng</w:t>
+            </w:r>
+            <w:proofErr w:type="spellEnd"/>
+            <w:r>
+              <w:rPr>
+                <w:rFonts w:ascii="Times New Roman" w:hAnsi="Times New Roman" w:cs="Times New Roman"/>
+                <w:color w:val="000000" w:themeColor="text1"/>
+                <w:sz w:val="26"/>
+                <w:szCs w:val="26"/>
+              </w:rPr>
+              <w:t>)</w:t>
             </w:r>
           </w:p>
         </w:tc>
@@ -282,6 +392,7 @@
                 <w:szCs w:val="26"/>
               </w:rPr>
             </w:pPr>
+            <w:proofErr w:type="spellStart"/>
             <w:r>
               <w:rPr>
                 <w:rFonts w:ascii="Times New Roman" w:hAnsi="Times New Roman" w:cs="Times New Roman"/>
@@ -289,8 +400,29 @@
                 <w:sz w:val="26"/>
                 <w:szCs w:val="26"/>
               </w:rPr>
-              <w:t>Nguyễn Minh Thuận</w:t>
+              <w:t>Nguyễn</w:t>
             </w:r>
+            <w:proofErr w:type="spellEnd"/>
+            <w:r>
+              <w:rPr>
+                <w:rFonts w:ascii="Times New Roman" w:hAnsi="Times New Roman" w:cs="Times New Roman"/>
+                <w:color w:val="000000" w:themeColor="text1"/>
+                <w:sz w:val="26"/>
+                <w:szCs w:val="26"/>
+              </w:rPr>
+              <w:t xml:space="preserve"> Minh </w:t>
+            </w:r>
+            <w:proofErr w:type="spellStart"/>
+            <w:r>
+              <w:rPr>
+                <w:rFonts w:ascii="Times New Roman" w:hAnsi="Times New Roman" w:cs="Times New Roman"/>
+                <w:color w:val="000000" w:themeColor="text1"/>
+                <w:sz w:val="26"/>
+                <w:szCs w:val="26"/>
+              </w:rPr>
+              <w:t>Thuận</w:t>
+            </w:r>
+            <w:proofErr w:type="spellEnd"/>
           </w:p>
         </w:tc>
         <w:tc>
@@ -335,6 +467,7 @@
                 <w:szCs w:val="26"/>
               </w:rPr>
             </w:pPr>
+            <w:proofErr w:type="spellStart"/>
             <w:r>
               <w:rPr>
                 <w:rFonts w:ascii="Times New Roman" w:hAnsi="Times New Roman" w:cs="Times New Roman"/>
@@ -342,8 +475,29 @@
                 <w:sz w:val="26"/>
                 <w:szCs w:val="26"/>
               </w:rPr>
-              <w:t>Nguyễn Minh Lý</w:t>
+              <w:t>Nguyễn</w:t>
             </w:r>
+            <w:proofErr w:type="spellEnd"/>
+            <w:r>
+              <w:rPr>
+                <w:rFonts w:ascii="Times New Roman" w:hAnsi="Times New Roman" w:cs="Times New Roman"/>
+                <w:color w:val="000000" w:themeColor="text1"/>
+                <w:sz w:val="26"/>
+                <w:szCs w:val="26"/>
+              </w:rPr>
+              <w:t xml:space="preserve"> Minh </w:t>
+            </w:r>
+            <w:proofErr w:type="spellStart"/>
+            <w:r>
+              <w:rPr>
+                <w:rFonts w:ascii="Times New Roman" w:hAnsi="Times New Roman" w:cs="Times New Roman"/>
+                <w:color w:val="000000" w:themeColor="text1"/>
+                <w:sz w:val="26"/>
+                <w:szCs w:val="26"/>
+              </w:rPr>
+              <w:t>Lý</w:t>
+            </w:r>
+            <w:proofErr w:type="spellEnd"/>
           </w:p>
         </w:tc>
         <w:tc>
@@ -388,6 +542,7 @@
                 <w:szCs w:val="26"/>
               </w:rPr>
             </w:pPr>
+            <w:proofErr w:type="spellStart"/>
             <w:r>
               <w:rPr>
                 <w:rFonts w:ascii="Times New Roman" w:hAnsi="Times New Roman" w:cs="Times New Roman"/>
@@ -395,8 +550,49 @@
                 <w:sz w:val="26"/>
                 <w:szCs w:val="26"/>
               </w:rPr>
-              <w:t>Nguyễn Khắc Duy</w:t>
+              <w:t>Nguyễn</w:t>
             </w:r>
+            <w:proofErr w:type="spellEnd"/>
+            <w:r>
+              <w:rPr>
+                <w:rFonts w:ascii="Times New Roman" w:hAnsi="Times New Roman" w:cs="Times New Roman"/>
+                <w:color w:val="000000" w:themeColor="text1"/>
+                <w:sz w:val="26"/>
+                <w:szCs w:val="26"/>
+              </w:rPr>
+              <w:t xml:space="preserve"> </w:t>
+            </w:r>
+            <w:proofErr w:type="spellStart"/>
+            <w:r>
+              <w:rPr>
+                <w:rFonts w:ascii="Times New Roman" w:hAnsi="Times New Roman" w:cs="Times New Roman"/>
+                <w:color w:val="000000" w:themeColor="text1"/>
+                <w:sz w:val="26"/>
+                <w:szCs w:val="26"/>
+              </w:rPr>
+              <w:t>Khắc</w:t>
+            </w:r>
+            <w:proofErr w:type="spellEnd"/>
+            <w:r>
+              <w:rPr>
+                <w:rFonts w:ascii="Times New Roman" w:hAnsi="Times New Roman" w:cs="Times New Roman"/>
+                <w:color w:val="000000" w:themeColor="text1"/>
+                <w:sz w:val="26"/>
+                <w:szCs w:val="26"/>
+              </w:rPr>
+              <w:t xml:space="preserve"> </w:t>
+            </w:r>
+            <w:proofErr w:type="spellStart"/>
+            <w:r>
+              <w:rPr>
+                <w:rFonts w:ascii="Times New Roman" w:hAnsi="Times New Roman" w:cs="Times New Roman"/>
+                <w:color w:val="000000" w:themeColor="text1"/>
+                <w:sz w:val="26"/>
+                <w:szCs w:val="26"/>
+              </w:rPr>
+              <w:t>Duy</w:t>
+            </w:r>
+            <w:proofErr w:type="spellEnd"/>
           </w:p>
         </w:tc>
         <w:tc>
@@ -448,7 +644,27 @@
                 <w:sz w:val="26"/>
                 <w:szCs w:val="26"/>
               </w:rPr>
-              <w:t>Hồ Văn Khánh</w:t>
+              <w:t xml:space="preserve">Hồ </w:t>
+            </w:r>
+            <w:proofErr w:type="spellStart"/>
+            <w:r>
+              <w:rPr>
+                <w:rFonts w:ascii="Times New Roman" w:hAnsi="Times New Roman" w:cs="Times New Roman"/>
+                <w:color w:val="000000" w:themeColor="text1"/>
+                <w:sz w:val="26"/>
+                <w:szCs w:val="26"/>
+              </w:rPr>
+              <w:t>Văn</w:t>
+            </w:r>
+            <w:proofErr w:type="spellEnd"/>
+            <w:r>
+              <w:rPr>
+                <w:rFonts w:ascii="Times New Roman" w:hAnsi="Times New Roman" w:cs="Times New Roman"/>
+                <w:color w:val="000000" w:themeColor="text1"/>
+                <w:sz w:val="26"/>
+                <w:szCs w:val="26"/>
+              </w:rPr>
+              <w:t xml:space="preserve"> Khánh</w:t>
             </w:r>
           </w:p>
         </w:tc>
@@ -504,6 +720,7 @@
           <w:szCs w:val="26"/>
         </w:rPr>
       </w:pPr>
+      <w:proofErr w:type="spellStart"/>
       <w:r>
         <w:rPr>
           <w:rFonts w:ascii="Times New Roman" w:hAnsi="Times New Roman" w:cs="Times New Roman"/>
@@ -511,7 +728,57 @@
           <w:sz w:val="26"/>
           <w:szCs w:val="26"/>
         </w:rPr>
-        <w:t>Tên ứng dụng:</w:t>
+        <w:t>Tên</w:t>
+      </w:r>
+      <w:proofErr w:type="spellEnd"/>
+      <w:r>
+        <w:rPr>
+          <w:rFonts w:ascii="Times New Roman" w:hAnsi="Times New Roman" w:cs="Times New Roman"/>
+          <w:i/>
+          <w:sz w:val="26"/>
+          <w:szCs w:val="26"/>
+        </w:rPr>
+        <w:t xml:space="preserve"> </w:t>
+      </w:r>
+      <w:proofErr w:type="spellStart"/>
+      <w:r>
+        <w:rPr>
+          <w:rFonts w:ascii="Times New Roman" w:hAnsi="Times New Roman" w:cs="Times New Roman"/>
+          <w:i/>
+          <w:sz w:val="26"/>
+          <w:szCs w:val="26"/>
+        </w:rPr>
+        <w:t>ứng</w:t>
+      </w:r>
+      <w:proofErr w:type="spellEnd"/>
+      <w:r>
+        <w:rPr>
+          <w:rFonts w:ascii="Times New Roman" w:hAnsi="Times New Roman" w:cs="Times New Roman"/>
+          <w:i/>
+          <w:sz w:val="26"/>
+          <w:szCs w:val="26"/>
+        </w:rPr>
+        <w:t xml:space="preserve"> </w:t>
+      </w:r>
+      <w:proofErr w:type="spellStart"/>
+      <w:r>
+        <w:rPr>
+          <w:rFonts w:ascii="Times New Roman" w:hAnsi="Times New Roman" w:cs="Times New Roman"/>
+          <w:i/>
+          <w:sz w:val="26"/>
+          <w:szCs w:val="26"/>
+        </w:rPr>
+        <w:t>dụng</w:t>
+      </w:r>
+      <w:proofErr w:type="spellEnd"/>
+      <w:r>
+        <w:rPr>
+          <w:rFonts w:ascii="Times New Roman" w:hAnsi="Times New Roman" w:cs="Times New Roman"/>
+          <w:i/>
+          <w:sz w:val="26"/>
+          <w:szCs w:val="26"/>
+        </w:rPr>
+        <w:t>:</w:t>
       </w:r>
       <w:r>
         <w:rPr>
@@ -555,14 +822,88 @@
           <w:szCs w:val="26"/>
         </w:rPr>
       </w:pPr>
-      <w:r>
-        <w:rPr>
-          <w:rFonts w:ascii="Times New Roman" w:hAnsi="Times New Roman" w:cs="Times New Roman"/>
-          <w:sz w:val="26"/>
-          <w:szCs w:val="26"/>
-        </w:rPr>
-        <w:t>Thời gian thực hiện: Từ</w:t>
-      </w:r>
+      <w:proofErr w:type="spellStart"/>
+      <w:r>
+        <w:rPr>
+          <w:rFonts w:ascii="Times New Roman" w:hAnsi="Times New Roman" w:cs="Times New Roman"/>
+          <w:sz w:val="26"/>
+          <w:szCs w:val="26"/>
+        </w:rPr>
+        <w:t>Thời</w:t>
+      </w:r>
+      <w:proofErr w:type="spellEnd"/>
+      <w:r>
+        <w:rPr>
+          <w:rFonts w:ascii="Times New Roman" w:hAnsi="Times New Roman" w:cs="Times New Roman"/>
+          <w:sz w:val="26"/>
+          <w:szCs w:val="26"/>
+        </w:rPr>
+        <w:t xml:space="preserve"> </w:t>
+      </w:r>
+      <w:proofErr w:type="spellStart"/>
+      <w:r>
+        <w:rPr>
+          <w:rFonts w:ascii="Times New Roman" w:hAnsi="Times New Roman" w:cs="Times New Roman"/>
+          <w:sz w:val="26"/>
+          <w:szCs w:val="26"/>
+        </w:rPr>
+        <w:t>gian</w:t>
+      </w:r>
+      <w:proofErr w:type="spellEnd"/>
+      <w:r>
+        <w:rPr>
+          <w:rFonts w:ascii="Times New Roman" w:hAnsi="Times New Roman" w:cs="Times New Roman"/>
+          <w:sz w:val="26"/>
+          <w:szCs w:val="26"/>
+        </w:rPr>
+        <w:t xml:space="preserve"> </w:t>
+      </w:r>
+      <w:proofErr w:type="spellStart"/>
+      <w:r>
+        <w:rPr>
+          <w:rFonts w:ascii="Times New Roman" w:hAnsi="Times New Roman" w:cs="Times New Roman"/>
+          <w:sz w:val="26"/>
+          <w:szCs w:val="26"/>
+        </w:rPr>
+        <w:t>thực</w:t>
+      </w:r>
+      <w:proofErr w:type="spellEnd"/>
+      <w:r>
+        <w:rPr>
+          <w:rFonts w:ascii="Times New Roman" w:hAnsi="Times New Roman" w:cs="Times New Roman"/>
+          <w:sz w:val="26"/>
+          <w:szCs w:val="26"/>
+        </w:rPr>
+        <w:t xml:space="preserve"> </w:t>
+      </w:r>
+      <w:proofErr w:type="spellStart"/>
+      <w:r>
+        <w:rPr>
+          <w:rFonts w:ascii="Times New Roman" w:hAnsi="Times New Roman" w:cs="Times New Roman"/>
+          <w:sz w:val="26"/>
+          <w:szCs w:val="26"/>
+        </w:rPr>
+        <w:t>hiện</w:t>
+      </w:r>
+      <w:proofErr w:type="spellEnd"/>
+      <w:r>
+        <w:rPr>
+          <w:rFonts w:ascii="Times New Roman" w:hAnsi="Times New Roman" w:cs="Times New Roman"/>
+          <w:sz w:val="26"/>
+          <w:szCs w:val="26"/>
+        </w:rPr>
+        <w:t xml:space="preserve">: </w:t>
+      </w:r>
+      <w:proofErr w:type="spellStart"/>
+      <w:r>
+        <w:rPr>
+          <w:rFonts w:ascii="Times New Roman" w:hAnsi="Times New Roman" w:cs="Times New Roman"/>
+          <w:sz w:val="26"/>
+          <w:szCs w:val="26"/>
+        </w:rPr>
+        <w:t>Từ</w:t>
+      </w:r>
+      <w:proofErr w:type="spellEnd"/>
       <w:r>
         <w:rPr>
           <w:rFonts w:ascii="Times New Roman" w:hAnsi="Times New Roman" w:cs="Times New Roman"/>
@@ -617,7 +958,25 @@
           <w:sz w:val="26"/>
           <w:szCs w:val="26"/>
         </w:rPr>
-        <w:t xml:space="preserve"> đến </w:t>
+        <w:t xml:space="preserve"> </w:t>
+      </w:r>
+      <w:proofErr w:type="spellStart"/>
+      <w:r>
+        <w:rPr>
+          <w:rFonts w:ascii="Times New Roman" w:hAnsi="Times New Roman" w:cs="Times New Roman"/>
+          <w:sz w:val="26"/>
+          <w:szCs w:val="26"/>
+        </w:rPr>
+        <w:t>đến</w:t>
+      </w:r>
+      <w:proofErr w:type="spellEnd"/>
+      <w:r>
+        <w:rPr>
+          <w:rFonts w:ascii="Times New Roman" w:hAnsi="Times New Roman" w:cs="Times New Roman"/>
+          <w:sz w:val="26"/>
+          <w:szCs w:val="26"/>
+        </w:rPr>
+        <w:t xml:space="preserve"> </w:t>
       </w:r>
       <w:r>
         <w:rPr>
@@ -673,7 +1032,25 @@
           <w:sz w:val="26"/>
           <w:szCs w:val="26"/>
         </w:rPr>
-        <w:t xml:space="preserve"> tuần)</w:t>
+        <w:t xml:space="preserve"> </w:t>
+      </w:r>
+      <w:proofErr w:type="spellStart"/>
+      <w:r>
+        <w:rPr>
+          <w:rFonts w:ascii="Times New Roman" w:hAnsi="Times New Roman" w:cs="Times New Roman"/>
+          <w:sz w:val="26"/>
+          <w:szCs w:val="26"/>
+        </w:rPr>
+        <w:t>tuần</w:t>
+      </w:r>
+      <w:proofErr w:type="spellEnd"/>
+      <w:r>
+        <w:rPr>
+          <w:rFonts w:ascii="Times New Roman" w:hAnsi="Times New Roman" w:cs="Times New Roman"/>
+          <w:sz w:val="26"/>
+          <w:szCs w:val="26"/>
+        </w:rPr>
+        <w:t>)</w:t>
       </w:r>
     </w:p>
     <w:p>
@@ -714,16 +1091,67 @@
           <w:sz w:val="26"/>
           <w:szCs w:val="26"/>
         </w:rPr>
-        <w:t>Thu thập</w:t>
-      </w:r>
-      <w:r>
-        <w:rPr>
-          <w:rFonts w:ascii="Times New Roman" w:hAnsi="Times New Roman" w:cs="Times New Roman"/>
-          <w:b/>
-          <w:sz w:val="26"/>
-          <w:szCs w:val="26"/>
-        </w:rPr>
-        <w:t xml:space="preserve"> yêu cầu:</w:t>
+        <w:t xml:space="preserve">Thu </w:t>
+      </w:r>
+      <w:proofErr w:type="spellStart"/>
+      <w:r>
+        <w:rPr>
+          <w:rFonts w:ascii="Times New Roman" w:hAnsi="Times New Roman" w:cs="Times New Roman"/>
+          <w:b/>
+          <w:sz w:val="26"/>
+          <w:szCs w:val="26"/>
+        </w:rPr>
+        <w:t>thập</w:t>
+      </w:r>
+      <w:proofErr w:type="spellEnd"/>
+      <w:r>
+        <w:rPr>
+          <w:rFonts w:ascii="Times New Roman" w:hAnsi="Times New Roman" w:cs="Times New Roman"/>
+          <w:b/>
+          <w:sz w:val="26"/>
+          <w:szCs w:val="26"/>
+        </w:rPr>
+        <w:t xml:space="preserve"> </w:t>
+      </w:r>
+      <w:proofErr w:type="spellStart"/>
+      <w:r>
+        <w:rPr>
+          <w:rFonts w:ascii="Times New Roman" w:hAnsi="Times New Roman" w:cs="Times New Roman"/>
+          <w:b/>
+          <w:sz w:val="26"/>
+          <w:szCs w:val="26"/>
+        </w:rPr>
+        <w:t>yêu</w:t>
+      </w:r>
+      <w:proofErr w:type="spellEnd"/>
+      <w:r>
+        <w:rPr>
+          <w:rFonts w:ascii="Times New Roman" w:hAnsi="Times New Roman" w:cs="Times New Roman"/>
+          <w:b/>
+          <w:sz w:val="26"/>
+          <w:szCs w:val="26"/>
+        </w:rPr>
+        <w:t xml:space="preserve"> </w:t>
+      </w:r>
+      <w:proofErr w:type="spellStart"/>
+      <w:r>
+        <w:rPr>
+          <w:rFonts w:ascii="Times New Roman" w:hAnsi="Times New Roman" w:cs="Times New Roman"/>
+          <w:b/>
+          <w:sz w:val="26"/>
+          <w:szCs w:val="26"/>
+        </w:rPr>
+        <w:t>cầu</w:t>
+      </w:r>
+      <w:proofErr w:type="spellEnd"/>
+      <w:r>
+        <w:rPr>
+          <w:rFonts w:ascii="Times New Roman" w:hAnsi="Times New Roman" w:cs="Times New Roman"/>
+          <w:b/>
+          <w:sz w:val="26"/>
+          <w:szCs w:val="26"/>
+        </w:rPr>
+        <w:t>:</w:t>
       </w:r>
     </w:p>
     <w:p>
@@ -742,24 +1170,77 @@
           <w:szCs w:val="26"/>
         </w:rPr>
       </w:pPr>
-      <w:r>
-        <w:rPr>
-          <w:rFonts w:ascii="Times New Roman" w:hAnsi="Times New Roman" w:cs="Times New Roman"/>
-          <w:b/>
-          <w:sz w:val="26"/>
-          <w:szCs w:val="26"/>
-        </w:rPr>
-        <w:t>Khảo sát</w:t>
-      </w:r>
-      <w:r>
-        <w:rPr>
-          <w:rFonts w:ascii="Times New Roman" w:hAnsi="Times New Roman" w:cs="Times New Roman"/>
-          <w:b/>
-          <w:sz w:val="26"/>
-          <w:szCs w:val="26"/>
-        </w:rPr>
-        <w:t xml:space="preserve"> hiện trạng</w:t>
-      </w:r>
+      <w:proofErr w:type="spellStart"/>
+      <w:r>
+        <w:rPr>
+          <w:rFonts w:ascii="Times New Roman" w:hAnsi="Times New Roman" w:cs="Times New Roman"/>
+          <w:b/>
+          <w:sz w:val="26"/>
+          <w:szCs w:val="26"/>
+        </w:rPr>
+        <w:t>Khảo</w:t>
+      </w:r>
+      <w:proofErr w:type="spellEnd"/>
+      <w:r>
+        <w:rPr>
+          <w:rFonts w:ascii="Times New Roman" w:hAnsi="Times New Roman" w:cs="Times New Roman"/>
+          <w:b/>
+          <w:sz w:val="26"/>
+          <w:szCs w:val="26"/>
+        </w:rPr>
+        <w:t xml:space="preserve"> </w:t>
+      </w:r>
+      <w:proofErr w:type="spellStart"/>
+      <w:r>
+        <w:rPr>
+          <w:rFonts w:ascii="Times New Roman" w:hAnsi="Times New Roman" w:cs="Times New Roman"/>
+          <w:b/>
+          <w:sz w:val="26"/>
+          <w:szCs w:val="26"/>
+        </w:rPr>
+        <w:t>sát</w:t>
+      </w:r>
+      <w:proofErr w:type="spellEnd"/>
+      <w:r>
+        <w:rPr>
+          <w:rFonts w:ascii="Times New Roman" w:hAnsi="Times New Roman" w:cs="Times New Roman"/>
+          <w:b/>
+          <w:sz w:val="26"/>
+          <w:szCs w:val="26"/>
+        </w:rPr>
+        <w:t xml:space="preserve"> </w:t>
+      </w:r>
+      <w:proofErr w:type="spellStart"/>
+      <w:r>
+        <w:rPr>
+          <w:rFonts w:ascii="Times New Roman" w:hAnsi="Times New Roman" w:cs="Times New Roman"/>
+          <w:b/>
+          <w:sz w:val="26"/>
+          <w:szCs w:val="26"/>
+        </w:rPr>
+        <w:t>hiện</w:t>
+      </w:r>
+      <w:proofErr w:type="spellEnd"/>
+      <w:r>
+        <w:rPr>
+          <w:rFonts w:ascii="Times New Roman" w:hAnsi="Times New Roman" w:cs="Times New Roman"/>
+          <w:b/>
+          <w:sz w:val="26"/>
+          <w:szCs w:val="26"/>
+        </w:rPr>
+        <w:t xml:space="preserve"> </w:t>
+      </w:r>
+      <w:proofErr w:type="spellStart"/>
+      <w:r>
+        <w:rPr>
+          <w:rFonts w:ascii="Times New Roman" w:hAnsi="Times New Roman" w:cs="Times New Roman"/>
+          <w:b/>
+          <w:sz w:val="26"/>
+          <w:szCs w:val="26"/>
+        </w:rPr>
+        <w:t>trạng</w:t>
+      </w:r>
+      <w:proofErr w:type="spellEnd"/>
       <w:r>
         <w:rPr>
           <w:rFonts w:ascii="Times New Roman" w:hAnsi="Times New Roman" w:cs="Times New Roman"/>
@@ -772,25 +1253,36 @@
     </w:p>
     <w:p>
       <w:pPr>
-        <w:pStyle w:val="ListParagraph"/>
         <w:spacing w:after="120" w:line="240" w:lineRule="auto"/>
-        <w:ind w:left="1440"/>
+        <w:ind w:left="720"/>
         <w:jc w:val="both"/>
         <w:rPr>
           <w:rFonts w:ascii="Times New Roman" w:hAnsi="Times New Roman" w:cs="Times New Roman"/>
-          <w:b/>
-          <w:sz w:val="26"/>
-          <w:szCs w:val="26"/>
-        </w:rPr>
-      </w:pPr>
-      <w:r>
-        <w:rPr>
-          <w:rFonts w:ascii="Times New Roman" w:hAnsi="Times New Roman" w:cs="Times New Roman"/>
-          <w:b/>
-          <w:sz w:val="26"/>
-          <w:szCs w:val="26"/>
-        </w:rPr>
-        <w:t>hovankhanh</w:t>
+          <w:bCs/>
+          <w:sz w:val="26"/>
+          <w:szCs w:val="26"/>
+          <w:lang w:val="vi-VN"/>
+        </w:rPr>
+      </w:pPr>
+      <w:r>
+        <w:rPr>
+          <w:rFonts w:ascii="Times New Roman" w:hAnsi="Times New Roman" w:cs="Times New Roman"/>
+          <w:bCs/>
+          <w:sz w:val="26"/>
+          <w:szCs w:val="26"/>
+          <w:lang w:val="vi-VN"/>
+        </w:rPr>
+        <w:t xml:space="preserve">Hệ thống phần mềm quản lý phòng khám nha khoa được xây dựng nhằm giải quyết tình trạng quản lý thủ công, phân tán dữ liệu và thiếu đồng bộ giữa các bộ phận: Nhân viên quản lý, lễ tân, nha sĩ và y tá. Mặc dù chỉ phục vụ cho thao tác nội bộ của nhân viên, hệ thống vẫn lấy bệnh nhân làm trung tâm dữ liệu với quy trình vận hành khép kín: Lễ tân tiếp nhận thông tin </w:t>
+      </w:r>
+      <w:r>
+        <w:rPr>
+          <w:rFonts w:ascii="Times New Roman" w:hAnsi="Times New Roman" w:cs="Times New Roman"/>
+          <w:bCs/>
+          <w:sz w:val="26"/>
+          <w:szCs w:val="26"/>
+          <w:lang w:val="vi-VN"/>
+        </w:rPr>
+        <w:t>hành chính, khởi tạo mã bệnh nhân (đối với khách hàng mới) hoặc tra cứu (đối với khách cũ); Nha sĩ và y tá truy xuất hồ sơ bệnh án điện tử để phục vụ chẩn đoán, lập sơ đồ răng, theo dõi tiền sử bệnh lý và kê đơn thuốc. Đặc biệt, hệ thống tập trung lưu trữ toàn bộ lịch sử khám và điều trị bao gồm: Nhật ký từng phiên làm việc, tiến trình dịch vụ nhiều đợt, theo dõi thanh toán công nợ và lịch hẹn khám, giúp tối ưu hóa quy trình điều trị dài hạn và nâng cao hiệu quả vận hành phòng khám.</w:t>
       </w:r>
     </w:p>
     <w:p>
@@ -809,15 +1301,77 @@
           <w:szCs w:val="26"/>
         </w:rPr>
       </w:pPr>
-      <w:r>
-        <w:rPr>
-          <w:rFonts w:ascii="Times New Roman" w:hAnsi="Times New Roman" w:cs="Times New Roman"/>
-          <w:b/>
-          <w:sz w:val="26"/>
-          <w:szCs w:val="26"/>
-        </w:rPr>
-        <w:t>Quy trình nghiệp vụ</w:t>
-      </w:r>
+      <w:proofErr w:type="spellStart"/>
+      <w:r>
+        <w:rPr>
+          <w:rFonts w:ascii="Times New Roman" w:hAnsi="Times New Roman" w:cs="Times New Roman"/>
+          <w:b/>
+          <w:sz w:val="26"/>
+          <w:szCs w:val="26"/>
+        </w:rPr>
+        <w:t>Quy</w:t>
+      </w:r>
+      <w:proofErr w:type="spellEnd"/>
+      <w:r>
+        <w:rPr>
+          <w:rFonts w:ascii="Times New Roman" w:hAnsi="Times New Roman" w:cs="Times New Roman"/>
+          <w:b/>
+          <w:sz w:val="26"/>
+          <w:szCs w:val="26"/>
+        </w:rPr>
+        <w:t xml:space="preserve"> </w:t>
+      </w:r>
+      <w:proofErr w:type="spellStart"/>
+      <w:r>
+        <w:rPr>
+          <w:rFonts w:ascii="Times New Roman" w:hAnsi="Times New Roman" w:cs="Times New Roman"/>
+          <w:b/>
+          <w:sz w:val="26"/>
+          <w:szCs w:val="26"/>
+        </w:rPr>
+        <w:t>trình</w:t>
+      </w:r>
+      <w:proofErr w:type="spellEnd"/>
+      <w:r>
+        <w:rPr>
+          <w:rFonts w:ascii="Times New Roman" w:hAnsi="Times New Roman" w:cs="Times New Roman"/>
+          <w:b/>
+          <w:sz w:val="26"/>
+          <w:szCs w:val="26"/>
+        </w:rPr>
+        <w:t xml:space="preserve"> </w:t>
+      </w:r>
+      <w:proofErr w:type="spellStart"/>
+      <w:r>
+        <w:rPr>
+          <w:rFonts w:ascii="Times New Roman" w:hAnsi="Times New Roman" w:cs="Times New Roman"/>
+          <w:b/>
+          <w:sz w:val="26"/>
+          <w:szCs w:val="26"/>
+        </w:rPr>
+        <w:t>nghiệp</w:t>
+      </w:r>
+      <w:proofErr w:type="spellEnd"/>
+      <w:r>
+        <w:rPr>
+          <w:rFonts w:ascii="Times New Roman" w:hAnsi="Times New Roman" w:cs="Times New Roman"/>
+          <w:b/>
+          <w:sz w:val="26"/>
+          <w:szCs w:val="26"/>
+        </w:rPr>
+        <w:t xml:space="preserve"> </w:t>
+      </w:r>
+      <w:proofErr w:type="spellStart"/>
+      <w:r>
+        <w:rPr>
+          <w:rFonts w:ascii="Times New Roman" w:hAnsi="Times New Roman" w:cs="Times New Roman"/>
+          <w:b/>
+          <w:sz w:val="26"/>
+          <w:szCs w:val="26"/>
+        </w:rPr>
+        <w:t>vụ</w:t>
+      </w:r>
+      <w:proofErr w:type="spellEnd"/>
     </w:p>
     <w:p>
       <w:pPr>
@@ -826,11 +1380,719 @@
         <w:jc w:val="both"/>
         <w:rPr>
           <w:rFonts w:ascii="Times New Roman" w:hAnsi="Times New Roman" w:cs="Times New Roman"/>
-          <w:b/>
-          <w:sz w:val="26"/>
-          <w:szCs w:val="26"/>
-        </w:rPr>
-      </w:pPr>
+          <w:bCs/>
+          <w:sz w:val="26"/>
+          <w:szCs w:val="26"/>
+          <w:lang w:val="vi-VN"/>
+        </w:rPr>
+      </w:pPr>
+      <w:r>
+        <w:rPr>
+          <w:rFonts w:ascii="Times New Roman" w:hAnsi="Times New Roman" w:cs="Times New Roman"/>
+          <w:b/>
+          <w:sz w:val="26"/>
+          <w:szCs w:val="26"/>
+          <w:lang w:val="vi-VN"/>
+        </w:rPr>
+        <w:t>-</w:t>
+      </w:r>
+      <w:r>
+        <w:rPr>
+          <w:rFonts w:ascii="Times New Roman" w:hAnsi="Times New Roman" w:cs="Times New Roman"/>
+          <w:bCs/>
+          <w:sz w:val="26"/>
+          <w:szCs w:val="26"/>
+          <w:lang w:val="vi-VN"/>
+        </w:rPr>
+        <w:t>Đăng ký bệnh nhân mới:</w:t>
+      </w:r>
+    </w:p>
+    <w:p>
+      <w:pPr>
+        <w:pStyle w:val="ListParagraph"/>
+        <w:spacing w:after="120" w:line="240" w:lineRule="auto"/>
+        <w:jc w:val="both"/>
+        <w:rPr>
+          <w:rFonts w:ascii="Times New Roman" w:hAnsi="Times New Roman" w:cs="Times New Roman"/>
+          <w:bCs/>
+          <w:sz w:val="26"/>
+          <w:szCs w:val="26"/>
+          <w:lang w:val="vi-VN"/>
+        </w:rPr>
+      </w:pPr>
+      <w:r>
+        <w:rPr>
+          <w:rFonts w:ascii="Times New Roman" w:hAnsi="Times New Roman" w:cs="Times New Roman"/>
+          <w:bCs/>
+          <w:sz w:val="26"/>
+          <w:szCs w:val="26"/>
+          <w:lang w:val="vi-VN"/>
+        </w:rPr>
+        <w:t xml:space="preserve">+Lễ tân tiếp nhận thông tin </w:t>
+      </w:r>
+      <w:r>
+        <w:rPr>
+          <w:rFonts w:ascii="Times New Roman" w:hAnsi="Times New Roman" w:cs="Times New Roman"/>
+          <w:bCs/>
+          <w:sz w:val="26"/>
+          <w:szCs w:val="26"/>
+          <w:lang w:val="vi-VN"/>
+        </w:rPr>
+        <w:t>từ bệnh nhân trực tiếp tại quầy.</w:t>
+      </w:r>
+    </w:p>
+    <w:p>
+      <w:pPr>
+        <w:pStyle w:val="ListParagraph"/>
+        <w:spacing w:after="120" w:line="240" w:lineRule="auto"/>
+        <w:jc w:val="both"/>
+        <w:rPr>
+          <w:rFonts w:ascii="Times New Roman" w:hAnsi="Times New Roman" w:cs="Times New Roman"/>
+          <w:bCs/>
+          <w:sz w:val="26"/>
+          <w:szCs w:val="26"/>
+          <w:lang w:val="vi-VN"/>
+        </w:rPr>
+      </w:pPr>
+      <w:r>
+        <w:rPr>
+          <w:rFonts w:ascii="Times New Roman" w:hAnsi="Times New Roman" w:cs="Times New Roman"/>
+          <w:bCs/>
+          <w:sz w:val="26"/>
+          <w:szCs w:val="26"/>
+          <w:lang w:val="vi-VN"/>
+        </w:rPr>
+        <w:t>+Lễ tân nhập thông tin của bệnh nhân vào hệ thống kiểm tra trùng lặp:</w:t>
+      </w:r>
+    </w:p>
+    <w:p>
+      <w:pPr>
+        <w:pStyle w:val="ListParagraph"/>
+        <w:numPr>
+          <w:ilvl w:val="0"/>
+          <w:numId w:val="7"/>
+        </w:numPr>
+        <w:spacing w:after="120" w:line="240" w:lineRule="auto"/>
+        <w:jc w:val="both"/>
+        <w:rPr>
+          <w:rFonts w:ascii="Times New Roman" w:hAnsi="Times New Roman" w:cs="Times New Roman"/>
+          <w:bCs/>
+          <w:sz w:val="26"/>
+          <w:szCs w:val="26"/>
+          <w:lang w:val="vi-VN"/>
+        </w:rPr>
+      </w:pPr>
+      <w:r>
+        <w:rPr>
+          <w:rFonts w:ascii="Times New Roman" w:hAnsi="Times New Roman" w:cs="Times New Roman"/>
+          <w:bCs/>
+          <w:sz w:val="26"/>
+          <w:szCs w:val="26"/>
+          <w:lang w:val="vi-VN"/>
+        </w:rPr>
+        <w:t>Nếu đã có: Chuyển sang điều phối bệnh nhân.</w:t>
+      </w:r>
+    </w:p>
+    <w:p>
+      <w:pPr>
+        <w:pStyle w:val="ListParagraph"/>
+        <w:numPr>
+          <w:ilvl w:val="0"/>
+          <w:numId w:val="7"/>
+        </w:numPr>
+        <w:spacing w:after="120" w:line="240" w:lineRule="auto"/>
+        <w:jc w:val="both"/>
+        <w:rPr>
+          <w:rFonts w:ascii="Times New Roman" w:hAnsi="Times New Roman" w:cs="Times New Roman"/>
+          <w:bCs/>
+          <w:sz w:val="26"/>
+          <w:szCs w:val="26"/>
+          <w:lang w:val="vi-VN"/>
+        </w:rPr>
+      </w:pPr>
+      <w:r>
+        <w:rPr>
+          <w:rFonts w:ascii="Times New Roman" w:hAnsi="Times New Roman" w:cs="Times New Roman"/>
+          <w:bCs/>
+          <w:sz w:val="26"/>
+          <w:szCs w:val="26"/>
+          <w:lang w:val="vi-VN"/>
+        </w:rPr>
+        <w:t>Nếu chưa có: Chuyển sang tạo hồ sơ mới.</w:t>
+      </w:r>
+    </w:p>
+    <w:p>
+      <w:pPr>
+        <w:spacing w:after="120" w:line="240" w:lineRule="auto"/>
+        <w:ind w:left="720"/>
+        <w:jc w:val="both"/>
+        <w:rPr>
+          <w:rFonts w:ascii="Times New Roman" w:hAnsi="Times New Roman" w:cs="Times New Roman"/>
+          <w:bCs/>
+          <w:sz w:val="26"/>
+          <w:szCs w:val="26"/>
+          <w:lang w:val="vi-VN"/>
+        </w:rPr>
+      </w:pPr>
+      <w:r>
+        <w:rPr>
+          <w:rFonts w:ascii="Times New Roman" w:hAnsi="Times New Roman" w:cs="Times New Roman"/>
+          <w:bCs/>
+          <w:sz w:val="26"/>
+          <w:szCs w:val="26"/>
+          <w:lang w:val="vi-VN"/>
+        </w:rPr>
+        <w:t>+Lễ tân nhập thông tin hành chính (Họ tên, Ngày sinh, Giới tính, Số điện thoại, Địa chỉ) và thông tin tiền sử y khoa (Dị ứng thuốc, bệnh lý nền nhu tim mạch, tiểu đường…).</w:t>
+      </w:r>
+    </w:p>
+    <w:p>
+      <w:pPr>
+        <w:spacing w:after="120" w:line="240" w:lineRule="auto"/>
+        <w:ind w:left="720"/>
+        <w:jc w:val="both"/>
+        <w:rPr>
+          <w:rFonts w:ascii="Times New Roman" w:hAnsi="Times New Roman" w:cs="Times New Roman"/>
+          <w:bCs/>
+          <w:sz w:val="26"/>
+          <w:szCs w:val="26"/>
+          <w:lang w:val="vi-VN"/>
+        </w:rPr>
+      </w:pPr>
+      <w:r>
+        <w:rPr>
+          <w:rFonts w:ascii="Times New Roman" w:hAnsi="Times New Roman" w:cs="Times New Roman"/>
+          <w:bCs/>
+          <w:sz w:val="26"/>
+          <w:szCs w:val="26"/>
+          <w:lang w:val="vi-VN"/>
+        </w:rPr>
+        <w:t>+Hệ thống khởi tạo mã bệnh nhân và lưu vào cơ sở dữ liệu.</w:t>
+      </w:r>
+    </w:p>
+    <w:p>
+      <w:pPr>
+        <w:spacing w:after="120" w:line="240" w:lineRule="auto"/>
+        <w:ind w:left="720"/>
+        <w:jc w:val="both"/>
+        <w:rPr>
+          <w:rFonts w:ascii="Times New Roman" w:hAnsi="Times New Roman" w:cs="Times New Roman"/>
+          <w:bCs/>
+          <w:sz w:val="26"/>
+          <w:szCs w:val="26"/>
+          <w:lang w:val="vi-VN"/>
+        </w:rPr>
+      </w:pPr>
+      <w:r>
+        <w:rPr>
+          <w:rFonts w:ascii="Times New Roman" w:hAnsi="Times New Roman" w:cs="Times New Roman"/>
+          <w:bCs/>
+          <w:sz w:val="26"/>
+          <w:szCs w:val="26"/>
+          <w:lang w:val="vi-VN"/>
+        </w:rPr>
+        <w:t xml:space="preserve">+Lễ tân xếp bệnh nhân vào danh sách </w:t>
+      </w:r>
+      <w:r>
+        <w:rPr>
+          <w:rFonts w:ascii="Times New Roman" w:hAnsi="Times New Roman" w:cs="Times New Roman"/>
+          <w:bCs/>
+          <w:sz w:val="26"/>
+          <w:szCs w:val="26"/>
+          <w:lang w:val="vi-VN"/>
+        </w:rPr>
+        <w:t>chờ.</w:t>
+      </w:r>
+    </w:p>
+    <w:p>
+      <w:pPr>
+        <w:spacing w:after="120" w:line="240" w:lineRule="auto"/>
+        <w:ind w:left="720"/>
+        <w:jc w:val="both"/>
+        <w:rPr>
+          <w:rFonts w:ascii="Times New Roman" w:hAnsi="Times New Roman" w:cs="Times New Roman"/>
+          <w:bCs/>
+          <w:sz w:val="26"/>
+          <w:szCs w:val="26"/>
+          <w:lang w:val="vi-VN"/>
+        </w:rPr>
+      </w:pPr>
+      <w:r>
+        <w:rPr>
+          <w:rFonts w:ascii="Times New Roman" w:hAnsi="Times New Roman" w:cs="Times New Roman"/>
+          <w:bCs/>
+          <w:sz w:val="26"/>
+          <w:szCs w:val="26"/>
+          <w:lang w:val="vi-VN"/>
+        </w:rPr>
+        <w:t>-Điều phối bệnh nhân:</w:t>
+      </w:r>
+    </w:p>
+    <w:p>
+      <w:pPr>
+        <w:spacing w:after="120" w:line="240" w:lineRule="auto"/>
+        <w:ind w:left="720"/>
+        <w:jc w:val="both"/>
+        <w:rPr>
+          <w:rFonts w:ascii="Times New Roman" w:hAnsi="Times New Roman" w:cs="Times New Roman"/>
+          <w:bCs/>
+          <w:sz w:val="26"/>
+          <w:szCs w:val="26"/>
+          <w:lang w:val="vi-VN"/>
+        </w:rPr>
+      </w:pPr>
+      <w:r>
+        <w:rPr>
+          <w:rFonts w:ascii="Times New Roman" w:hAnsi="Times New Roman" w:cs="Times New Roman"/>
+          <w:bCs/>
+          <w:sz w:val="26"/>
+          <w:szCs w:val="26"/>
+          <w:lang w:val="vi-VN"/>
+        </w:rPr>
+        <w:t>+Lễ tân tra cứu mã bệnh nhân.</w:t>
+      </w:r>
+    </w:p>
+    <w:p>
+      <w:pPr>
+        <w:spacing w:after="120" w:line="240" w:lineRule="auto"/>
+        <w:ind w:left="720"/>
+        <w:jc w:val="both"/>
+        <w:rPr>
+          <w:rFonts w:ascii="Times New Roman" w:hAnsi="Times New Roman" w:cs="Times New Roman"/>
+          <w:bCs/>
+          <w:sz w:val="26"/>
+          <w:szCs w:val="26"/>
+          <w:lang w:val="vi-VN"/>
+        </w:rPr>
+      </w:pPr>
+      <w:r>
+        <w:rPr>
+          <w:rFonts w:ascii="Times New Roman" w:hAnsi="Times New Roman" w:cs="Times New Roman"/>
+          <w:bCs/>
+          <w:sz w:val="26"/>
+          <w:szCs w:val="26"/>
+          <w:lang w:val="vi-VN"/>
+        </w:rPr>
+        <w:lastRenderedPageBreak/>
+        <w:t xml:space="preserve">+Xác nhận lịch hẹn: </w:t>
+      </w:r>
+    </w:p>
+    <w:p>
+      <w:pPr>
+        <w:pStyle w:val="ListParagraph"/>
+        <w:numPr>
+          <w:ilvl w:val="0"/>
+          <w:numId w:val="8"/>
+        </w:numPr>
+        <w:spacing w:after="120" w:line="240" w:lineRule="auto"/>
+        <w:jc w:val="both"/>
+        <w:rPr>
+          <w:rFonts w:ascii="Times New Roman" w:hAnsi="Times New Roman" w:cs="Times New Roman"/>
+          <w:bCs/>
+          <w:sz w:val="26"/>
+          <w:szCs w:val="26"/>
+          <w:lang w:val="vi-VN"/>
+        </w:rPr>
+      </w:pPr>
+      <w:r>
+        <w:rPr>
+          <w:rFonts w:ascii="Times New Roman" w:hAnsi="Times New Roman" w:cs="Times New Roman"/>
+          <w:bCs/>
+          <w:sz w:val="26"/>
+          <w:szCs w:val="26"/>
+          <w:lang w:val="vi-VN"/>
+        </w:rPr>
+        <w:t>Trường hợp có đặt lịch trước: Lễ tân xác nhận lịch hẹn.</w:t>
+      </w:r>
+    </w:p>
+    <w:p>
+      <w:pPr>
+        <w:pStyle w:val="ListParagraph"/>
+        <w:numPr>
+          <w:ilvl w:val="0"/>
+          <w:numId w:val="8"/>
+        </w:numPr>
+        <w:spacing w:after="120" w:line="240" w:lineRule="auto"/>
+        <w:jc w:val="both"/>
+        <w:rPr>
+          <w:rFonts w:ascii="Times New Roman" w:hAnsi="Times New Roman" w:cs="Times New Roman"/>
+          <w:bCs/>
+          <w:sz w:val="26"/>
+          <w:szCs w:val="26"/>
+          <w:lang w:val="vi-VN"/>
+        </w:rPr>
+      </w:pPr>
+      <w:r>
+        <w:rPr>
+          <w:rFonts w:ascii="Times New Roman" w:hAnsi="Times New Roman" w:cs="Times New Roman"/>
+          <w:bCs/>
+          <w:sz w:val="26"/>
+          <w:szCs w:val="26"/>
+          <w:lang w:val="vi-VN"/>
+        </w:rPr>
+        <w:t>Trường hợp chưa có đặt lịch trước: Lễ tân kiểm tra lịch trống của nha sĩ để xếp ca hoặc nếu hết lịch trống sẽ đặt lịch hẹn khác vào thời gian trống khác.</w:t>
+      </w:r>
+    </w:p>
+    <w:p>
+      <w:pPr>
+        <w:spacing w:after="120" w:line="240" w:lineRule="auto"/>
+        <w:ind w:left="720"/>
+        <w:jc w:val="both"/>
+        <w:rPr>
+          <w:rFonts w:ascii="Times New Roman" w:hAnsi="Times New Roman" w:cs="Times New Roman"/>
+          <w:bCs/>
+          <w:sz w:val="26"/>
+          <w:szCs w:val="26"/>
+          <w:lang w:val="vi-VN"/>
+        </w:rPr>
+      </w:pPr>
+      <w:r>
+        <w:rPr>
+          <w:rFonts w:ascii="Times New Roman" w:hAnsi="Times New Roman" w:cs="Times New Roman"/>
+          <w:bCs/>
+          <w:sz w:val="26"/>
+          <w:szCs w:val="26"/>
+          <w:lang w:val="vi-VN"/>
+        </w:rPr>
+        <w:t xml:space="preserve">+Lễ tân cập nhật trạng thái của bệnh nhân từ “Đã </w:t>
+      </w:r>
+      <w:r>
+        <w:rPr>
+          <w:rFonts w:ascii="Times New Roman" w:hAnsi="Times New Roman" w:cs="Times New Roman"/>
+          <w:bCs/>
+          <w:sz w:val="26"/>
+          <w:szCs w:val="26"/>
+          <w:lang w:val="vi-VN"/>
+        </w:rPr>
+        <w:t>đặt</w:t>
+      </w:r>
+      <w:r>
+        <w:rPr>
+          <w:rFonts w:ascii="Times New Roman" w:hAnsi="Times New Roman" w:cs="Times New Roman"/>
+          <w:bCs/>
+          <w:sz w:val="26"/>
+          <w:szCs w:val="26"/>
+          <w:lang w:val="vi-VN"/>
+        </w:rPr>
+        <w:t>”</w:t>
+      </w:r>
+      <w:r>
+        <w:rPr>
+          <w:rFonts w:ascii="Times New Roman" w:hAnsi="Times New Roman" w:cs="Times New Roman"/>
+          <w:bCs/>
+          <w:sz w:val="26"/>
+          <w:szCs w:val="26"/>
+          <w:lang w:val="vi-VN"/>
+        </w:rPr>
+        <w:t xml:space="preserve"> hoặc “Chờ” sang trạng thái “Đang chờ khám”.</w:t>
+      </w:r>
+    </w:p>
+    <w:p>
+      <w:pPr>
+        <w:spacing w:after="120" w:line="240" w:lineRule="auto"/>
+        <w:ind w:left="720"/>
+        <w:jc w:val="both"/>
+        <w:rPr>
+          <w:rFonts w:ascii="Times New Roman" w:hAnsi="Times New Roman" w:cs="Times New Roman"/>
+          <w:bCs/>
+          <w:sz w:val="26"/>
+          <w:szCs w:val="26"/>
+          <w:lang w:val="vi-VN"/>
+        </w:rPr>
+      </w:pPr>
+      <w:r>
+        <w:rPr>
+          <w:rFonts w:ascii="Times New Roman" w:hAnsi="Times New Roman" w:cs="Times New Roman"/>
+          <w:bCs/>
+          <w:sz w:val="26"/>
+          <w:szCs w:val="26"/>
+          <w:lang w:val="vi-VN"/>
+        </w:rPr>
+        <w:t>+Hệ thống sẽ gửi thông báo danh sách chờ đến màn hình làm việc của nha sĩ, y tá tương ứng.</w:t>
+      </w:r>
+    </w:p>
+    <w:p>
+      <w:pPr>
+        <w:spacing w:after="120" w:line="240" w:lineRule="auto"/>
+        <w:ind w:left="720"/>
+        <w:jc w:val="both"/>
+        <w:rPr>
+          <w:rFonts w:ascii="Times New Roman" w:hAnsi="Times New Roman" w:cs="Times New Roman"/>
+          <w:bCs/>
+          <w:sz w:val="26"/>
+          <w:szCs w:val="26"/>
+          <w:lang w:val="vi-VN"/>
+        </w:rPr>
+      </w:pPr>
+      <w:r>
+        <w:rPr>
+          <w:rFonts w:ascii="Times New Roman" w:hAnsi="Times New Roman" w:cs="Times New Roman"/>
+          <w:bCs/>
+          <w:sz w:val="26"/>
+          <w:szCs w:val="26"/>
+          <w:lang w:val="vi-VN"/>
+        </w:rPr>
+        <w:t xml:space="preserve">-Tra cứu hồ sơ bệnh nhân: </w:t>
+      </w:r>
+    </w:p>
+    <w:p>
+      <w:pPr>
+        <w:spacing w:after="120" w:line="240" w:lineRule="auto"/>
+        <w:ind w:left="720"/>
+        <w:jc w:val="both"/>
+        <w:rPr>
+          <w:rFonts w:ascii="Times New Roman" w:hAnsi="Times New Roman" w:cs="Times New Roman"/>
+          <w:bCs/>
+          <w:sz w:val="26"/>
+          <w:szCs w:val="26"/>
+          <w:lang w:val="vi-VN"/>
+        </w:rPr>
+      </w:pPr>
+      <w:r>
+        <w:rPr>
+          <w:rFonts w:ascii="Times New Roman" w:hAnsi="Times New Roman" w:cs="Times New Roman"/>
+          <w:bCs/>
+          <w:sz w:val="26"/>
+          <w:szCs w:val="26"/>
+          <w:lang w:val="vi-VN"/>
+        </w:rPr>
+        <w:t>+Nha sĩ tìm kiếm hồ sơ bệnh nhân theo nhiều bộ lọc (Tên, Số điện thoại, CCCD, Mã bệnh nhân, Khoảng thời gian khám/chữa bệnh…).</w:t>
+      </w:r>
+    </w:p>
+    <w:p>
+      <w:pPr>
+        <w:spacing w:after="120" w:line="240" w:lineRule="auto"/>
+        <w:ind w:left="720"/>
+        <w:jc w:val="both"/>
+        <w:rPr>
+          <w:rFonts w:ascii="Times New Roman" w:hAnsi="Times New Roman" w:cs="Times New Roman"/>
+          <w:bCs/>
+          <w:sz w:val="26"/>
+          <w:szCs w:val="26"/>
+          <w:lang w:val="vi-VN"/>
+        </w:rPr>
+      </w:pPr>
+      <w:r>
+        <w:rPr>
+          <w:rFonts w:ascii="Times New Roman" w:hAnsi="Times New Roman" w:cs="Times New Roman"/>
+          <w:bCs/>
+          <w:sz w:val="26"/>
+          <w:szCs w:val="26"/>
+          <w:lang w:val="vi-VN"/>
+        </w:rPr>
+        <w:t>+Hệ thống tổng hợp toàn bộ thông tin hành chính, danh sách mã điều trị, lịch sử giao dịch thành một file tổng quan.</w:t>
+      </w:r>
+    </w:p>
+    <w:p>
+      <w:pPr>
+        <w:spacing w:after="120" w:line="240" w:lineRule="auto"/>
+        <w:ind w:left="720"/>
+        <w:jc w:val="both"/>
+        <w:rPr>
+          <w:rFonts w:ascii="Times New Roman" w:hAnsi="Times New Roman" w:cs="Times New Roman"/>
+          <w:bCs/>
+          <w:sz w:val="26"/>
+          <w:szCs w:val="26"/>
+          <w:lang w:val="vi-VN"/>
+        </w:rPr>
+      </w:pPr>
+      <w:r>
+        <w:rPr>
+          <w:rFonts w:ascii="Times New Roman" w:hAnsi="Times New Roman" w:cs="Times New Roman"/>
+          <w:bCs/>
+          <w:sz w:val="26"/>
+          <w:szCs w:val="26"/>
+          <w:lang w:val="vi-VN"/>
+        </w:rPr>
+        <w:t>-Xuất hồ sở bệnh nhân:</w:t>
+      </w:r>
+    </w:p>
+    <w:p>
+      <w:pPr>
+        <w:spacing w:after="120" w:line="240" w:lineRule="auto"/>
+        <w:ind w:left="720"/>
+        <w:jc w:val="both"/>
+        <w:rPr>
+          <w:rFonts w:ascii="Times New Roman" w:hAnsi="Times New Roman" w:cs="Times New Roman"/>
+          <w:bCs/>
+          <w:sz w:val="26"/>
+          <w:szCs w:val="26"/>
+          <w:lang w:val="vi-VN"/>
+        </w:rPr>
+      </w:pPr>
+      <w:r>
+        <w:rPr>
+          <w:rFonts w:ascii="Times New Roman" w:hAnsi="Times New Roman" w:cs="Times New Roman"/>
+          <w:bCs/>
+          <w:sz w:val="26"/>
+          <w:szCs w:val="26"/>
+          <w:lang w:val="vi-VN"/>
+        </w:rPr>
+        <w:t>+Nha sĩ tìm kiếm hồ sơ bệnh nhân theo nhiều bộ lọc (Tên, Số điện thoại, CCCD, Mã bệnh nhân, Khoảng thời gian khám/chữa bệnh…).</w:t>
+      </w:r>
+    </w:p>
+    <w:p>
+      <w:pPr>
+        <w:spacing w:after="120" w:line="240" w:lineRule="auto"/>
+        <w:ind w:left="720"/>
+        <w:jc w:val="both"/>
+        <w:rPr>
+          <w:rFonts w:ascii="Times New Roman" w:hAnsi="Times New Roman" w:cs="Times New Roman"/>
+          <w:bCs/>
+          <w:sz w:val="26"/>
+          <w:szCs w:val="26"/>
+          <w:lang w:val="vi-VN"/>
+        </w:rPr>
+      </w:pPr>
+      <w:r>
+        <w:rPr>
+          <w:rFonts w:ascii="Times New Roman" w:hAnsi="Times New Roman" w:cs="Times New Roman"/>
+          <w:bCs/>
+          <w:sz w:val="26"/>
+          <w:szCs w:val="26"/>
+          <w:lang w:val="vi-VN"/>
+        </w:rPr>
+        <w:t>+Hệ thống tổng hợp toàn bộ thông tin hành chính, danh sách mã điều trị, lịch sử giao dịch thành một file tổng quan.</w:t>
+      </w:r>
+    </w:p>
+    <w:p>
+      <w:pPr>
+        <w:spacing w:after="120" w:line="240" w:lineRule="auto"/>
+        <w:ind w:left="720"/>
+        <w:jc w:val="both"/>
+        <w:rPr>
+          <w:rFonts w:ascii="Times New Roman" w:hAnsi="Times New Roman" w:cs="Times New Roman"/>
+          <w:bCs/>
+          <w:sz w:val="26"/>
+          <w:szCs w:val="26"/>
+          <w:lang w:val="vi-VN"/>
+        </w:rPr>
+      </w:pPr>
+      <w:r>
+        <w:rPr>
+          <w:rFonts w:ascii="Times New Roman" w:hAnsi="Times New Roman" w:cs="Times New Roman"/>
+          <w:bCs/>
+          <w:sz w:val="26"/>
+          <w:szCs w:val="26"/>
+          <w:lang w:val="vi-VN"/>
+        </w:rPr>
+        <w:t>+Xuất file PDF hoặc in hồ sơ thông tin bệnh nhân để chuyển cho bệnh nhân hoặc chuyển viện khi có yêu cầu.</w:t>
+      </w:r>
+    </w:p>
+    <w:p>
+      <w:pPr>
+        <w:spacing w:after="120" w:line="240" w:lineRule="auto"/>
+        <w:ind w:left="720"/>
+        <w:jc w:val="both"/>
+        <w:rPr>
+          <w:rFonts w:ascii="Times New Roman" w:hAnsi="Times New Roman" w:cs="Times New Roman"/>
+          <w:bCs/>
+          <w:sz w:val="26"/>
+          <w:szCs w:val="26"/>
+          <w:lang w:val="vi-VN"/>
+        </w:rPr>
+      </w:pPr>
+      <w:r>
+        <w:rPr>
+          <w:rFonts w:ascii="Times New Roman" w:hAnsi="Times New Roman" w:cs="Times New Roman"/>
+          <w:bCs/>
+          <w:sz w:val="26"/>
+          <w:szCs w:val="26"/>
+          <w:lang w:val="vi-VN"/>
+        </w:rPr>
+        <w:t xml:space="preserve">-Xem lịch sử khám: </w:t>
+      </w:r>
+    </w:p>
+    <w:p>
+      <w:pPr>
+        <w:spacing w:after="120" w:line="240" w:lineRule="auto"/>
+        <w:ind w:left="720"/>
+        <w:jc w:val="both"/>
+        <w:rPr>
+          <w:rFonts w:ascii="Times New Roman" w:hAnsi="Times New Roman" w:cs="Times New Roman"/>
+          <w:bCs/>
+          <w:sz w:val="26"/>
+          <w:szCs w:val="26"/>
+          <w:lang w:val="vi-VN"/>
+        </w:rPr>
+      </w:pPr>
+      <w:r>
+        <w:rPr>
+          <w:rFonts w:ascii="Times New Roman" w:hAnsi="Times New Roman" w:cs="Times New Roman"/>
+          <w:bCs/>
+          <w:sz w:val="26"/>
+          <w:szCs w:val="26"/>
+          <w:lang w:val="vi-VN"/>
+        </w:rPr>
+        <w:t>+</w:t>
+      </w:r>
+      <w:r>
+        <w:rPr>
+          <w:rFonts w:ascii="Times New Roman" w:hAnsi="Times New Roman" w:cs="Times New Roman"/>
+          <w:bCs/>
+          <w:sz w:val="26"/>
+          <w:szCs w:val="26"/>
+          <w:lang w:val="vi-VN"/>
+        </w:rPr>
+        <w:t xml:space="preserve"> </w:t>
+      </w:r>
+      <w:r>
+        <w:rPr>
+          <w:rFonts w:ascii="Times New Roman" w:hAnsi="Times New Roman" w:cs="Times New Roman"/>
+          <w:bCs/>
+          <w:sz w:val="26"/>
+          <w:szCs w:val="26"/>
+          <w:lang w:val="vi-VN"/>
+        </w:rPr>
+        <w:t>Nha sĩ tìm kiếm hồ sơ bệnh nhân theo nhiều bộ lọc (Tên, Số điện thoại, CCCD, Mã bệnh nhân, Khoảng thời gian khám/chữa bệnh…).</w:t>
+      </w:r>
+    </w:p>
+    <w:p>
+      <w:pPr>
+        <w:spacing w:after="120" w:line="240" w:lineRule="auto"/>
+        <w:ind w:left="720"/>
+        <w:jc w:val="both"/>
+        <w:rPr>
+          <w:rFonts w:ascii="Times New Roman" w:hAnsi="Times New Roman" w:cs="Times New Roman"/>
+          <w:bCs/>
+          <w:sz w:val="26"/>
+          <w:szCs w:val="26"/>
+          <w:lang w:val="vi-VN"/>
+        </w:rPr>
+      </w:pPr>
+      <w:r>
+        <w:rPr>
+          <w:rFonts w:ascii="Times New Roman" w:hAnsi="Times New Roman" w:cs="Times New Roman"/>
+          <w:bCs/>
+          <w:sz w:val="26"/>
+          <w:szCs w:val="26"/>
+          <w:lang w:val="vi-VN"/>
+        </w:rPr>
+        <w:t>+Hệ thống hiển thị danh sách các đợt khám theo thứ tự thời gian (Ngày khám, Nha sĩ thực hiện, Y tá hỗ trợ, Chi tiết các thủ thuật đã làm).</w:t>
+      </w:r>
+    </w:p>
+    <w:p>
+      <w:pPr>
+        <w:spacing w:after="120" w:line="240" w:lineRule="auto"/>
+        <w:ind w:left="720"/>
+        <w:jc w:val="both"/>
+        <w:rPr>
+          <w:rFonts w:ascii="Times New Roman" w:hAnsi="Times New Roman" w:cs="Times New Roman"/>
+          <w:bCs/>
+          <w:sz w:val="26"/>
+          <w:szCs w:val="26"/>
+          <w:lang w:val="vi-VN"/>
+        </w:rPr>
+      </w:pPr>
+      <w:r>
+        <w:rPr>
+          <w:rFonts w:ascii="Times New Roman" w:hAnsi="Times New Roman" w:cs="Times New Roman"/>
+          <w:bCs/>
+          <w:sz w:val="26"/>
+          <w:szCs w:val="26"/>
+          <w:lang w:val="vi-VN"/>
+        </w:rPr>
+        <w:t>+Nha sĩ có thể xem lại các hình ảnh X-quang, phim chụp khoang miệng hoặc ghi chú cũ của nha sĩ ở các lần khám trước.</w:t>
+      </w:r>
     </w:p>
     <w:p>
       <w:pPr>
@@ -848,14 +2110,186 @@
           <w:szCs w:val="26"/>
         </w:rPr>
       </w:pPr>
-      <w:r>
-        <w:rPr>
-          <w:rFonts w:ascii="Times New Roman" w:hAnsi="Times New Roman" w:cs="Times New Roman"/>
-          <w:b/>
-          <w:sz w:val="26"/>
-          <w:szCs w:val="26"/>
-        </w:rPr>
-        <w:t>Quy định:</w:t>
+      <w:proofErr w:type="spellStart"/>
+      <w:r>
+        <w:rPr>
+          <w:rFonts w:ascii="Times New Roman" w:hAnsi="Times New Roman" w:cs="Times New Roman"/>
+          <w:b/>
+          <w:sz w:val="26"/>
+          <w:szCs w:val="26"/>
+        </w:rPr>
+        <w:t>Quy</w:t>
+      </w:r>
+      <w:proofErr w:type="spellEnd"/>
+      <w:r>
+        <w:rPr>
+          <w:rFonts w:ascii="Times New Roman" w:hAnsi="Times New Roman" w:cs="Times New Roman"/>
+          <w:b/>
+          <w:sz w:val="26"/>
+          <w:szCs w:val="26"/>
+        </w:rPr>
+        <w:t xml:space="preserve"> </w:t>
+      </w:r>
+      <w:proofErr w:type="spellStart"/>
+      <w:r>
+        <w:rPr>
+          <w:rFonts w:ascii="Times New Roman" w:hAnsi="Times New Roman" w:cs="Times New Roman"/>
+          <w:b/>
+          <w:sz w:val="26"/>
+          <w:szCs w:val="26"/>
+        </w:rPr>
+        <w:t>định</w:t>
+      </w:r>
+      <w:proofErr w:type="spellEnd"/>
+      <w:r>
+        <w:rPr>
+          <w:rFonts w:ascii="Times New Roman" w:hAnsi="Times New Roman" w:cs="Times New Roman"/>
+          <w:b/>
+          <w:sz w:val="26"/>
+          <w:szCs w:val="26"/>
+        </w:rPr>
+        <w:t>:</w:t>
+      </w:r>
+    </w:p>
+    <w:p>
+      <w:pPr>
+        <w:spacing w:after="120" w:line="240" w:lineRule="auto"/>
+        <w:ind w:left="720"/>
+        <w:jc w:val="both"/>
+        <w:rPr>
+          <w:rFonts w:ascii="Times New Roman" w:hAnsi="Times New Roman" w:cs="Times New Roman"/>
+          <w:bCs/>
+          <w:sz w:val="26"/>
+          <w:szCs w:val="26"/>
+          <w:lang w:val="vi-VN"/>
+        </w:rPr>
+      </w:pPr>
+      <w:r>
+        <w:rPr>
+          <w:rFonts w:ascii="Times New Roman" w:hAnsi="Times New Roman" w:cs="Times New Roman"/>
+          <w:bCs/>
+          <w:sz w:val="26"/>
+          <w:szCs w:val="26"/>
+          <w:lang w:val="vi-VN"/>
+        </w:rPr>
+        <w:t xml:space="preserve">-Đăng ký </w:t>
+      </w:r>
+      <w:r>
+        <w:rPr>
+          <w:rFonts w:ascii="Times New Roman" w:hAnsi="Times New Roman" w:cs="Times New Roman"/>
+          <w:bCs/>
+          <w:sz w:val="26"/>
+          <w:szCs w:val="26"/>
+          <w:lang w:val="vi-VN"/>
+        </w:rPr>
+        <w:t>bệnh nhân mới: Tiếp nhận thông tin bệnh nhân trực tiếp tại quầy, tra cứu kiểm tra trùng lặp thông tin, nhập dữ liệu hành chính và tiền sử y khoa, gửi yêu câu tạo mã bệnh nhân và đưa bệnh nhân vào danh sách chờ.</w:t>
+      </w:r>
+    </w:p>
+    <w:p>
+      <w:pPr>
+        <w:spacing w:after="120" w:line="240" w:lineRule="auto"/>
+        <w:ind w:left="720"/>
+        <w:jc w:val="both"/>
+        <w:rPr>
+          <w:rFonts w:ascii="Times New Roman" w:hAnsi="Times New Roman" w:cs="Times New Roman"/>
+          <w:bCs/>
+          <w:sz w:val="26"/>
+          <w:szCs w:val="26"/>
+          <w:lang w:val="vi-VN"/>
+        </w:rPr>
+      </w:pPr>
+      <w:r>
+        <w:rPr>
+          <w:rFonts w:ascii="Times New Roman" w:hAnsi="Times New Roman" w:cs="Times New Roman"/>
+          <w:bCs/>
+          <w:sz w:val="26"/>
+          <w:szCs w:val="26"/>
+          <w:lang w:val="vi-VN"/>
+        </w:rPr>
+        <w:t>-Điều phối bệnh nhân: Tra cứu thông tin bệnh nhân, xác nhận lịch hẹn (đối với bệnh nhân đã đặt lịch trước) hoặc xếp lịch (đối với bệnh nhân mới), cập nhật trạng thái bệnh nhân để gửi thông báo đến phòng khám.</w:t>
+      </w:r>
+    </w:p>
+    <w:p>
+      <w:pPr>
+        <w:spacing w:after="120" w:line="240" w:lineRule="auto"/>
+        <w:ind w:left="720"/>
+        <w:jc w:val="both"/>
+        <w:rPr>
+          <w:rFonts w:ascii="Times New Roman" w:hAnsi="Times New Roman" w:cs="Times New Roman"/>
+          <w:bCs/>
+          <w:sz w:val="26"/>
+          <w:szCs w:val="26"/>
+          <w:lang w:val="vi-VN"/>
+        </w:rPr>
+      </w:pPr>
+      <w:r>
+        <w:rPr>
+          <w:rFonts w:ascii="Times New Roman" w:hAnsi="Times New Roman" w:cs="Times New Roman"/>
+          <w:bCs/>
+          <w:sz w:val="26"/>
+          <w:szCs w:val="26"/>
+          <w:lang w:val="vi-VN"/>
+        </w:rPr>
+        <w:t>-Tra cứu hồ sơ bệnh nhân: Sử dụng nhiều bộ lọc để tìm kiếm thông tin bệnh nhân (Tên, Số điện thoại, Mã bệnh nhân…).</w:t>
+      </w:r>
+    </w:p>
+    <w:p>
+      <w:pPr>
+        <w:spacing w:after="120" w:line="240" w:lineRule="auto"/>
+        <w:ind w:left="720"/>
+        <w:jc w:val="both"/>
+        <w:rPr>
+          <w:rFonts w:ascii="Times New Roman" w:hAnsi="Times New Roman" w:cs="Times New Roman"/>
+          <w:bCs/>
+          <w:sz w:val="26"/>
+          <w:szCs w:val="26"/>
+          <w:lang w:val="vi-VN"/>
+        </w:rPr>
+      </w:pPr>
+      <w:r>
+        <w:rPr>
+          <w:rFonts w:ascii="Times New Roman" w:hAnsi="Times New Roman" w:cs="Times New Roman"/>
+          <w:bCs/>
+          <w:sz w:val="26"/>
+          <w:szCs w:val="26"/>
+          <w:lang w:val="vi-VN"/>
+        </w:rPr>
+        <w:t>-Xuất hồ sơ bệnh nhân: Khởi tạo thao tác trích xuất và in/ xác nhận xuất file pdf hồ sơ bệnh nhân phục vụ bàn giao hoặc chuyển viện.</w:t>
+      </w:r>
+    </w:p>
+    <w:p>
+      <w:pPr>
+        <w:spacing w:after="120" w:line="240" w:lineRule="auto"/>
+        <w:ind w:left="720"/>
+        <w:jc w:val="both"/>
+        <w:rPr>
+          <w:rFonts w:ascii="Times New Roman" w:hAnsi="Times New Roman" w:cs="Times New Roman"/>
+          <w:bCs/>
+          <w:sz w:val="26"/>
+          <w:szCs w:val="26"/>
+          <w:lang w:val="vi-VN"/>
+        </w:rPr>
+      </w:pPr>
+      <w:r>
+        <w:rPr>
+          <w:rFonts w:ascii="Times New Roman" w:hAnsi="Times New Roman" w:cs="Times New Roman"/>
+          <w:bCs/>
+          <w:sz w:val="26"/>
+          <w:szCs w:val="26"/>
+          <w:lang w:val="vi-VN"/>
+        </w:rPr>
+        <w:lastRenderedPageBreak/>
+        <w:t xml:space="preserve">-Xem lịch sử khám: </w:t>
+      </w:r>
+      <w:r>
+        <w:rPr>
+          <w:rFonts w:ascii="Times New Roman" w:hAnsi="Times New Roman" w:cs="Times New Roman"/>
+          <w:bCs/>
+          <w:sz w:val="26"/>
+          <w:szCs w:val="26"/>
+          <w:lang w:val="vi-VN"/>
+        </w:rPr>
+        <w:t>Sử dụng nhiều bộ lọc đề tìm kiếm các đợt khám theo tiến trình thời gian, xem lại các ghi chú y khoa, các thủ thuật sử dùng trong đợt điều trị và hình ảnh chẩn đoán (X-ray, phim chụp khoang miệng)</w:t>
       </w:r>
     </w:p>
     <w:p>
@@ -869,6 +2303,7 @@
           <w:b/>
           <w:sz w:val="26"/>
           <w:szCs w:val="26"/>
+          <w:lang w:val="vi-VN"/>
         </w:rPr>
       </w:pPr>
     </w:p>
@@ -889,51 +2324,326 @@
           <w:szCs w:val="26"/>
         </w:rPr>
       </w:pPr>
-      <w:r>
-        <w:rPr>
-          <w:rFonts w:ascii="Times New Roman" w:hAnsi="Times New Roman" w:cs="Times New Roman"/>
-          <w:b/>
-          <w:sz w:val="26"/>
-          <w:szCs w:val="26"/>
-        </w:rPr>
-        <w:t>Danh sách các c</w:t>
-      </w:r>
-      <w:r>
-        <w:rPr>
-          <w:rFonts w:ascii="Times New Roman" w:hAnsi="Times New Roman" w:cs="Times New Roman"/>
-          <w:b/>
-          <w:sz w:val="26"/>
-          <w:szCs w:val="26"/>
-        </w:rPr>
-        <w:t xml:space="preserve">âu hỏi khi thu thập </w:t>
-      </w:r>
-      <w:r>
-        <w:rPr>
-          <w:rFonts w:ascii="Times New Roman" w:hAnsi="Times New Roman" w:cs="Times New Roman"/>
-          <w:b/>
-          <w:sz w:val="26"/>
-          <w:szCs w:val="26"/>
-        </w:rPr>
-        <w:t xml:space="preserve">và làm rõ </w:t>
-      </w:r>
-      <w:r>
-        <w:rPr>
-          <w:rFonts w:ascii="Times New Roman" w:hAnsi="Times New Roman" w:cs="Times New Roman"/>
-          <w:b/>
-          <w:sz w:val="26"/>
-          <w:szCs w:val="26"/>
-        </w:rPr>
-        <w:t>yêu cầu</w:t>
-      </w:r>
-      <w:r>
-        <w:rPr>
-          <w:rFonts w:ascii="Times New Roman" w:hAnsi="Times New Roman" w:cs="Times New Roman"/>
-          <w:b/>
-          <w:sz w:val="26"/>
-          <w:szCs w:val="26"/>
-        </w:rPr>
-        <w:t xml:space="preserve"> của ứng dụng</w:t>
-      </w:r>
+      <w:proofErr w:type="spellStart"/>
+      <w:r>
+        <w:rPr>
+          <w:rFonts w:ascii="Times New Roman" w:hAnsi="Times New Roman" w:cs="Times New Roman"/>
+          <w:b/>
+          <w:sz w:val="26"/>
+          <w:szCs w:val="26"/>
+        </w:rPr>
+        <w:t>Danh</w:t>
+      </w:r>
+      <w:proofErr w:type="spellEnd"/>
+      <w:r>
+        <w:rPr>
+          <w:rFonts w:ascii="Times New Roman" w:hAnsi="Times New Roman" w:cs="Times New Roman"/>
+          <w:b/>
+          <w:sz w:val="26"/>
+          <w:szCs w:val="26"/>
+        </w:rPr>
+        <w:t xml:space="preserve"> </w:t>
+      </w:r>
+      <w:proofErr w:type="spellStart"/>
+      <w:r>
+        <w:rPr>
+          <w:rFonts w:ascii="Times New Roman" w:hAnsi="Times New Roman" w:cs="Times New Roman"/>
+          <w:b/>
+          <w:sz w:val="26"/>
+          <w:szCs w:val="26"/>
+        </w:rPr>
+        <w:t>sách</w:t>
+      </w:r>
+      <w:proofErr w:type="spellEnd"/>
+      <w:r>
+        <w:rPr>
+          <w:rFonts w:ascii="Times New Roman" w:hAnsi="Times New Roman" w:cs="Times New Roman"/>
+          <w:b/>
+          <w:sz w:val="26"/>
+          <w:szCs w:val="26"/>
+        </w:rPr>
+        <w:t xml:space="preserve"> </w:t>
+      </w:r>
+      <w:proofErr w:type="spellStart"/>
+      <w:r>
+        <w:rPr>
+          <w:rFonts w:ascii="Times New Roman" w:hAnsi="Times New Roman" w:cs="Times New Roman"/>
+          <w:b/>
+          <w:sz w:val="26"/>
+          <w:szCs w:val="26"/>
+        </w:rPr>
+        <w:t>các</w:t>
+      </w:r>
+      <w:proofErr w:type="spellEnd"/>
+      <w:r>
+        <w:rPr>
+          <w:rFonts w:ascii="Times New Roman" w:hAnsi="Times New Roman" w:cs="Times New Roman"/>
+          <w:b/>
+          <w:sz w:val="26"/>
+          <w:szCs w:val="26"/>
+        </w:rPr>
+        <w:t xml:space="preserve"> </w:t>
+      </w:r>
+      <w:proofErr w:type="spellStart"/>
+      <w:r>
+        <w:rPr>
+          <w:rFonts w:ascii="Times New Roman" w:hAnsi="Times New Roman" w:cs="Times New Roman"/>
+          <w:b/>
+          <w:sz w:val="26"/>
+          <w:szCs w:val="26"/>
+        </w:rPr>
+        <w:t>c</w:t>
+      </w:r>
+      <w:r>
+        <w:rPr>
+          <w:rFonts w:ascii="Times New Roman" w:hAnsi="Times New Roman" w:cs="Times New Roman"/>
+          <w:b/>
+          <w:sz w:val="26"/>
+          <w:szCs w:val="26"/>
+        </w:rPr>
+        <w:t>âu</w:t>
+      </w:r>
+      <w:proofErr w:type="spellEnd"/>
+      <w:r>
+        <w:rPr>
+          <w:rFonts w:ascii="Times New Roman" w:hAnsi="Times New Roman" w:cs="Times New Roman"/>
+          <w:b/>
+          <w:sz w:val="26"/>
+          <w:szCs w:val="26"/>
+        </w:rPr>
+        <w:t xml:space="preserve"> </w:t>
+      </w:r>
+      <w:proofErr w:type="spellStart"/>
+      <w:r>
+        <w:rPr>
+          <w:rFonts w:ascii="Times New Roman" w:hAnsi="Times New Roman" w:cs="Times New Roman"/>
+          <w:b/>
+          <w:sz w:val="26"/>
+          <w:szCs w:val="26"/>
+        </w:rPr>
+        <w:t>hỏi</w:t>
+      </w:r>
+      <w:proofErr w:type="spellEnd"/>
+      <w:r>
+        <w:rPr>
+          <w:rFonts w:ascii="Times New Roman" w:hAnsi="Times New Roman" w:cs="Times New Roman"/>
+          <w:b/>
+          <w:sz w:val="26"/>
+          <w:szCs w:val="26"/>
+        </w:rPr>
+        <w:t xml:space="preserve"> </w:t>
+      </w:r>
+      <w:proofErr w:type="spellStart"/>
+      <w:r>
+        <w:rPr>
+          <w:rFonts w:ascii="Times New Roman" w:hAnsi="Times New Roman" w:cs="Times New Roman"/>
+          <w:b/>
+          <w:sz w:val="26"/>
+          <w:szCs w:val="26"/>
+        </w:rPr>
+        <w:t>khi</w:t>
+      </w:r>
+      <w:proofErr w:type="spellEnd"/>
+      <w:r>
+        <w:rPr>
+          <w:rFonts w:ascii="Times New Roman" w:hAnsi="Times New Roman" w:cs="Times New Roman"/>
+          <w:b/>
+          <w:sz w:val="26"/>
+          <w:szCs w:val="26"/>
+        </w:rPr>
+        <w:t xml:space="preserve"> </w:t>
+      </w:r>
+      <w:proofErr w:type="spellStart"/>
+      <w:r>
+        <w:rPr>
+          <w:rFonts w:ascii="Times New Roman" w:hAnsi="Times New Roman" w:cs="Times New Roman"/>
+          <w:b/>
+          <w:sz w:val="26"/>
+          <w:szCs w:val="26"/>
+        </w:rPr>
+        <w:t>thu</w:t>
+      </w:r>
+      <w:proofErr w:type="spellEnd"/>
+      <w:r>
+        <w:rPr>
+          <w:rFonts w:ascii="Times New Roman" w:hAnsi="Times New Roman" w:cs="Times New Roman"/>
+          <w:b/>
+          <w:sz w:val="26"/>
+          <w:szCs w:val="26"/>
+        </w:rPr>
+        <w:t xml:space="preserve"> </w:t>
+      </w:r>
+      <w:proofErr w:type="spellStart"/>
+      <w:r>
+        <w:rPr>
+          <w:rFonts w:ascii="Times New Roman" w:hAnsi="Times New Roman" w:cs="Times New Roman"/>
+          <w:b/>
+          <w:sz w:val="26"/>
+          <w:szCs w:val="26"/>
+        </w:rPr>
+        <w:t>thập</w:t>
+      </w:r>
+      <w:proofErr w:type="spellEnd"/>
+      <w:r>
+        <w:rPr>
+          <w:rFonts w:ascii="Times New Roman" w:hAnsi="Times New Roman" w:cs="Times New Roman"/>
+          <w:b/>
+          <w:sz w:val="26"/>
+          <w:szCs w:val="26"/>
+        </w:rPr>
+        <w:t xml:space="preserve"> </w:t>
+      </w:r>
+      <w:proofErr w:type="spellStart"/>
+      <w:r>
+        <w:rPr>
+          <w:rFonts w:ascii="Times New Roman" w:hAnsi="Times New Roman" w:cs="Times New Roman"/>
+          <w:b/>
+          <w:sz w:val="26"/>
+          <w:szCs w:val="26"/>
+        </w:rPr>
+        <w:t>và</w:t>
+      </w:r>
+      <w:proofErr w:type="spellEnd"/>
+      <w:r>
+        <w:rPr>
+          <w:rFonts w:ascii="Times New Roman" w:hAnsi="Times New Roman" w:cs="Times New Roman"/>
+          <w:b/>
+          <w:sz w:val="26"/>
+          <w:szCs w:val="26"/>
+        </w:rPr>
+        <w:t xml:space="preserve"> </w:t>
+      </w:r>
+      <w:proofErr w:type="spellStart"/>
+      <w:r>
+        <w:rPr>
+          <w:rFonts w:ascii="Times New Roman" w:hAnsi="Times New Roman" w:cs="Times New Roman"/>
+          <w:b/>
+          <w:sz w:val="26"/>
+          <w:szCs w:val="26"/>
+        </w:rPr>
+        <w:t>làm</w:t>
+      </w:r>
+      <w:proofErr w:type="spellEnd"/>
+      <w:r>
+        <w:rPr>
+          <w:rFonts w:ascii="Times New Roman" w:hAnsi="Times New Roman" w:cs="Times New Roman"/>
+          <w:b/>
+          <w:sz w:val="26"/>
+          <w:szCs w:val="26"/>
+        </w:rPr>
+        <w:t xml:space="preserve"> </w:t>
+      </w:r>
+      <w:proofErr w:type="spellStart"/>
+      <w:r>
+        <w:rPr>
+          <w:rFonts w:ascii="Times New Roman" w:hAnsi="Times New Roman" w:cs="Times New Roman"/>
+          <w:b/>
+          <w:sz w:val="26"/>
+          <w:szCs w:val="26"/>
+        </w:rPr>
+        <w:t>rõ</w:t>
+      </w:r>
+      <w:proofErr w:type="spellEnd"/>
+      <w:r>
+        <w:rPr>
+          <w:rFonts w:ascii="Times New Roman" w:hAnsi="Times New Roman" w:cs="Times New Roman"/>
+          <w:b/>
+          <w:sz w:val="26"/>
+          <w:szCs w:val="26"/>
+        </w:rPr>
+        <w:t xml:space="preserve"> </w:t>
+      </w:r>
+      <w:proofErr w:type="spellStart"/>
+      <w:r>
+        <w:rPr>
+          <w:rFonts w:ascii="Times New Roman" w:hAnsi="Times New Roman" w:cs="Times New Roman"/>
+          <w:b/>
+          <w:sz w:val="26"/>
+          <w:szCs w:val="26"/>
+        </w:rPr>
+        <w:t>yêu</w:t>
+      </w:r>
+      <w:proofErr w:type="spellEnd"/>
+      <w:r>
+        <w:rPr>
+          <w:rFonts w:ascii="Times New Roman" w:hAnsi="Times New Roman" w:cs="Times New Roman"/>
+          <w:b/>
+          <w:sz w:val="26"/>
+          <w:szCs w:val="26"/>
+        </w:rPr>
+        <w:t xml:space="preserve"> </w:t>
+      </w:r>
+      <w:proofErr w:type="spellStart"/>
+      <w:r>
+        <w:rPr>
+          <w:rFonts w:ascii="Times New Roman" w:hAnsi="Times New Roman" w:cs="Times New Roman"/>
+          <w:b/>
+          <w:sz w:val="26"/>
+          <w:szCs w:val="26"/>
+        </w:rPr>
+        <w:t>cầu</w:t>
+      </w:r>
+      <w:proofErr w:type="spellEnd"/>
+      <w:r>
+        <w:rPr>
+          <w:rFonts w:ascii="Times New Roman" w:hAnsi="Times New Roman" w:cs="Times New Roman"/>
+          <w:b/>
+          <w:sz w:val="26"/>
+          <w:szCs w:val="26"/>
+        </w:rPr>
+        <w:t xml:space="preserve"> </w:t>
+      </w:r>
+      <w:proofErr w:type="spellStart"/>
+      <w:r>
+        <w:rPr>
+          <w:rFonts w:ascii="Times New Roman" w:hAnsi="Times New Roman" w:cs="Times New Roman"/>
+          <w:b/>
+          <w:sz w:val="26"/>
+          <w:szCs w:val="26"/>
+        </w:rPr>
+        <w:t>của</w:t>
+      </w:r>
+      <w:proofErr w:type="spellEnd"/>
+      <w:r>
+        <w:rPr>
+          <w:rFonts w:ascii="Times New Roman" w:hAnsi="Times New Roman" w:cs="Times New Roman"/>
+          <w:b/>
+          <w:sz w:val="26"/>
+          <w:szCs w:val="26"/>
+        </w:rPr>
+        <w:t xml:space="preserve"> </w:t>
+      </w:r>
+      <w:proofErr w:type="spellStart"/>
+      <w:r>
+        <w:rPr>
+          <w:rFonts w:ascii="Times New Roman" w:hAnsi="Times New Roman" w:cs="Times New Roman"/>
+          <w:b/>
+          <w:sz w:val="26"/>
+          <w:szCs w:val="26"/>
+        </w:rPr>
+        <w:t>ứng</w:t>
+      </w:r>
+      <w:proofErr w:type="spellEnd"/>
+      <w:r>
+        <w:rPr>
+          <w:rFonts w:ascii="Times New Roman" w:hAnsi="Times New Roman" w:cs="Times New Roman"/>
+          <w:b/>
+          <w:sz w:val="26"/>
+          <w:szCs w:val="26"/>
+        </w:rPr>
+        <w:t xml:space="preserve"> </w:t>
+      </w:r>
+      <w:proofErr w:type="spellStart"/>
+      <w:r>
+        <w:rPr>
+          <w:rFonts w:ascii="Times New Roman" w:hAnsi="Times New Roman" w:cs="Times New Roman"/>
+          <w:b/>
+          <w:sz w:val="26"/>
+          <w:szCs w:val="26"/>
+        </w:rPr>
+        <w:t>dụng</w:t>
+      </w:r>
+      <w:proofErr w:type="spellEnd"/>
     </w:p>
     <w:tbl>
       <w:tblPr>
@@ -995,6 +2705,7 @@
                 <w:szCs w:val="26"/>
               </w:rPr>
             </w:pPr>
+            <w:proofErr w:type="spellStart"/>
             <w:r>
               <w:rPr>
                 <w:rFonts w:ascii="Times New Roman" w:hAnsi="Times New Roman" w:cs="Times New Roman"/>
@@ -1003,7 +2714,40 @@
                 <w:sz w:val="26"/>
                 <w:szCs w:val="26"/>
               </w:rPr>
-              <w:t>Câu hỏi (Questions)</w:t>
+              <w:t>Câu</w:t>
+            </w:r>
+            <w:proofErr w:type="spellEnd"/>
+            <w:r>
+              <w:rPr>
+                <w:rFonts w:ascii="Times New Roman" w:hAnsi="Times New Roman" w:cs="Times New Roman"/>
+                <w:b/>
+                <w:i/>
+                <w:sz w:val="26"/>
+                <w:szCs w:val="26"/>
+              </w:rPr>
+              <w:t xml:space="preserve"> </w:t>
+            </w:r>
+            <w:proofErr w:type="spellStart"/>
+            <w:r>
+              <w:rPr>
+                <w:rFonts w:ascii="Times New Roman" w:hAnsi="Times New Roman" w:cs="Times New Roman"/>
+                <w:b/>
+                <w:i/>
+                <w:sz w:val="26"/>
+                <w:szCs w:val="26"/>
+              </w:rPr>
+              <w:t>hỏi</w:t>
+            </w:r>
+            <w:proofErr w:type="spellEnd"/>
+            <w:r>
+              <w:rPr>
+                <w:rFonts w:ascii="Times New Roman" w:hAnsi="Times New Roman" w:cs="Times New Roman"/>
+                <w:b/>
+                <w:i/>
+                <w:sz w:val="26"/>
+                <w:szCs w:val="26"/>
+              </w:rPr>
+              <w:t xml:space="preserve"> (Questions)</w:t>
             </w:r>
           </w:p>
         </w:tc>
@@ -1023,6 +2767,7 @@
                 <w:szCs w:val="26"/>
               </w:rPr>
             </w:pPr>
+            <w:proofErr w:type="spellStart"/>
             <w:r>
               <w:rPr>
                 <w:rFonts w:ascii="Times New Roman" w:hAnsi="Times New Roman" w:cs="Times New Roman"/>
@@ -1031,7 +2776,40 @@
                 <w:sz w:val="26"/>
                 <w:szCs w:val="26"/>
               </w:rPr>
-              <w:t>Trả lời (Answers)</w:t>
+              <w:t>Trả</w:t>
+            </w:r>
+            <w:proofErr w:type="spellEnd"/>
+            <w:r>
+              <w:rPr>
+                <w:rFonts w:ascii="Times New Roman" w:hAnsi="Times New Roman" w:cs="Times New Roman"/>
+                <w:b/>
+                <w:i/>
+                <w:sz w:val="26"/>
+                <w:szCs w:val="26"/>
+              </w:rPr>
+              <w:t xml:space="preserve"> </w:t>
+            </w:r>
+            <w:proofErr w:type="spellStart"/>
+            <w:r>
+              <w:rPr>
+                <w:rFonts w:ascii="Times New Roman" w:hAnsi="Times New Roman" w:cs="Times New Roman"/>
+                <w:b/>
+                <w:i/>
+                <w:sz w:val="26"/>
+                <w:szCs w:val="26"/>
+              </w:rPr>
+              <w:t>lời</w:t>
+            </w:r>
+            <w:proofErr w:type="spellEnd"/>
+            <w:r>
+              <w:rPr>
+                <w:rFonts w:ascii="Times New Roman" w:hAnsi="Times New Roman" w:cs="Times New Roman"/>
+                <w:b/>
+                <w:i/>
+                <w:sz w:val="26"/>
+                <w:szCs w:val="26"/>
+              </w:rPr>
+              <w:t xml:space="preserve"> (Answers)</w:t>
             </w:r>
           </w:p>
         </w:tc>
@@ -1051,6 +2829,7 @@
                 <w:szCs w:val="26"/>
               </w:rPr>
             </w:pPr>
+            <w:proofErr w:type="spellStart"/>
             <w:r>
               <w:rPr>
                 <w:rFonts w:ascii="Times New Roman" w:hAnsi="Times New Roman" w:cs="Times New Roman"/>
@@ -1059,8 +2838,31 @@
                 <w:sz w:val="26"/>
                 <w:szCs w:val="26"/>
               </w:rPr>
-              <w:t>Ghi chú</w:t>
+              <w:t>Ghi</w:t>
             </w:r>
+            <w:proofErr w:type="spellEnd"/>
+            <w:r>
+              <w:rPr>
+                <w:rFonts w:ascii="Times New Roman" w:hAnsi="Times New Roman" w:cs="Times New Roman"/>
+                <w:b/>
+                <w:i/>
+                <w:sz w:val="26"/>
+                <w:szCs w:val="26"/>
+              </w:rPr>
+              <w:t xml:space="preserve"> </w:t>
+            </w:r>
+            <w:proofErr w:type="spellStart"/>
+            <w:r>
+              <w:rPr>
+                <w:rFonts w:ascii="Times New Roman" w:hAnsi="Times New Roman" w:cs="Times New Roman"/>
+                <w:b/>
+                <w:i/>
+                <w:sz w:val="26"/>
+                <w:szCs w:val="26"/>
+              </w:rPr>
+              <w:t>chú</w:t>
+            </w:r>
+            <w:proofErr w:type="spellEnd"/>
           </w:p>
         </w:tc>
       </w:tr>
@@ -1891,14 +3693,35 @@
           <w:szCs w:val="26"/>
         </w:rPr>
       </w:pPr>
-      <w:r>
-        <w:rPr>
-          <w:rFonts w:ascii="Times New Roman" w:hAnsi="Times New Roman" w:cs="Times New Roman"/>
-          <w:b/>
-          <w:sz w:val="26"/>
-          <w:szCs w:val="26"/>
-        </w:rPr>
-        <w:t>Yêu cầ</w:t>
+      <w:proofErr w:type="spellStart"/>
+      <w:r>
+        <w:rPr>
+          <w:rFonts w:ascii="Times New Roman" w:hAnsi="Times New Roman" w:cs="Times New Roman"/>
+          <w:b/>
+          <w:sz w:val="26"/>
+          <w:szCs w:val="26"/>
+        </w:rPr>
+        <w:t>Yêu</w:t>
+      </w:r>
+      <w:proofErr w:type="spellEnd"/>
+      <w:r>
+        <w:rPr>
+          <w:rFonts w:ascii="Times New Roman" w:hAnsi="Times New Roman" w:cs="Times New Roman"/>
+          <w:b/>
+          <w:sz w:val="26"/>
+          <w:szCs w:val="26"/>
+        </w:rPr>
+        <w:t xml:space="preserve"> </w:t>
+      </w:r>
+      <w:proofErr w:type="spellStart"/>
+      <w:r>
+        <w:rPr>
+          <w:rFonts w:ascii="Times New Roman" w:hAnsi="Times New Roman" w:cs="Times New Roman"/>
+          <w:b/>
+          <w:sz w:val="26"/>
+          <w:szCs w:val="26"/>
+        </w:rPr>
+        <w:t>cầ</w:t>
       </w:r>
       <w:r>
         <w:rPr>
@@ -1909,15 +3732,147 @@
         </w:rPr>
         <w:t>u</w:t>
       </w:r>
-      <w:r>
-        <w:rPr>
-          <w:rFonts w:ascii="Times New Roman" w:hAnsi="Times New Roman" w:cs="Times New Roman"/>
-          <w:b/>
-          <w:sz w:val="26"/>
-          <w:szCs w:val="26"/>
-        </w:rPr>
-        <w:t xml:space="preserve"> chức năng/phi chức năng của ứng dụng</w:t>
-      </w:r>
+      <w:proofErr w:type="spellEnd"/>
+      <w:r>
+        <w:rPr>
+          <w:rFonts w:ascii="Times New Roman" w:hAnsi="Times New Roman" w:cs="Times New Roman"/>
+          <w:b/>
+          <w:sz w:val="26"/>
+          <w:szCs w:val="26"/>
+        </w:rPr>
+        <w:t xml:space="preserve"> </w:t>
+      </w:r>
+      <w:proofErr w:type="spellStart"/>
+      <w:r>
+        <w:rPr>
+          <w:rFonts w:ascii="Times New Roman" w:hAnsi="Times New Roman" w:cs="Times New Roman"/>
+          <w:b/>
+          <w:sz w:val="26"/>
+          <w:szCs w:val="26"/>
+        </w:rPr>
+        <w:t>chức</w:t>
+      </w:r>
+      <w:proofErr w:type="spellEnd"/>
+      <w:r>
+        <w:rPr>
+          <w:rFonts w:ascii="Times New Roman" w:hAnsi="Times New Roman" w:cs="Times New Roman"/>
+          <w:b/>
+          <w:sz w:val="26"/>
+          <w:szCs w:val="26"/>
+        </w:rPr>
+        <w:t xml:space="preserve"> </w:t>
+      </w:r>
+      <w:proofErr w:type="spellStart"/>
+      <w:r>
+        <w:rPr>
+          <w:rFonts w:ascii="Times New Roman" w:hAnsi="Times New Roman" w:cs="Times New Roman"/>
+          <w:b/>
+          <w:sz w:val="26"/>
+          <w:szCs w:val="26"/>
+        </w:rPr>
+        <w:t>năng</w:t>
+      </w:r>
+      <w:proofErr w:type="spellEnd"/>
+      <w:r>
+        <w:rPr>
+          <w:rFonts w:ascii="Times New Roman" w:hAnsi="Times New Roman" w:cs="Times New Roman"/>
+          <w:b/>
+          <w:sz w:val="26"/>
+          <w:szCs w:val="26"/>
+        </w:rPr>
+        <w:t xml:space="preserve">/phi </w:t>
+      </w:r>
+      <w:proofErr w:type="spellStart"/>
+      <w:r>
+        <w:rPr>
+          <w:rFonts w:ascii="Times New Roman" w:hAnsi="Times New Roman" w:cs="Times New Roman"/>
+          <w:b/>
+          <w:sz w:val="26"/>
+          <w:szCs w:val="26"/>
+        </w:rPr>
+        <w:t>chức</w:t>
+      </w:r>
+      <w:proofErr w:type="spellEnd"/>
+      <w:r>
+        <w:rPr>
+          <w:rFonts w:ascii="Times New Roman" w:hAnsi="Times New Roman" w:cs="Times New Roman"/>
+          <w:b/>
+          <w:sz w:val="26"/>
+          <w:szCs w:val="26"/>
+        </w:rPr>
+        <w:t xml:space="preserve"> </w:t>
+      </w:r>
+      <w:proofErr w:type="spellStart"/>
+      <w:r>
+        <w:rPr>
+          <w:rFonts w:ascii="Times New Roman" w:hAnsi="Times New Roman" w:cs="Times New Roman"/>
+          <w:b/>
+          <w:sz w:val="26"/>
+          <w:szCs w:val="26"/>
+        </w:rPr>
+        <w:t>năng</w:t>
+      </w:r>
+      <w:proofErr w:type="spellEnd"/>
+      <w:r>
+        <w:rPr>
+          <w:rFonts w:ascii="Times New Roman" w:hAnsi="Times New Roman" w:cs="Times New Roman"/>
+          <w:b/>
+          <w:sz w:val="26"/>
+          <w:szCs w:val="26"/>
+        </w:rPr>
+        <w:t xml:space="preserve"> </w:t>
+      </w:r>
+      <w:proofErr w:type="spellStart"/>
+      <w:r>
+        <w:rPr>
+          <w:rFonts w:ascii="Times New Roman" w:hAnsi="Times New Roman" w:cs="Times New Roman"/>
+          <w:b/>
+          <w:sz w:val="26"/>
+          <w:szCs w:val="26"/>
+        </w:rPr>
+        <w:t>của</w:t>
+      </w:r>
+      <w:proofErr w:type="spellEnd"/>
+      <w:r>
+        <w:rPr>
+          <w:rFonts w:ascii="Times New Roman" w:hAnsi="Times New Roman" w:cs="Times New Roman"/>
+          <w:b/>
+          <w:sz w:val="26"/>
+          <w:szCs w:val="26"/>
+        </w:rPr>
+        <w:t xml:space="preserve"> </w:t>
+      </w:r>
+      <w:proofErr w:type="spellStart"/>
+      <w:r>
+        <w:rPr>
+          <w:rFonts w:ascii="Times New Roman" w:hAnsi="Times New Roman" w:cs="Times New Roman"/>
+          <w:b/>
+          <w:sz w:val="26"/>
+          <w:szCs w:val="26"/>
+        </w:rPr>
+        <w:t>ứng</w:t>
+      </w:r>
+      <w:proofErr w:type="spellEnd"/>
+      <w:r>
+        <w:rPr>
+          <w:rFonts w:ascii="Times New Roman" w:hAnsi="Times New Roman" w:cs="Times New Roman"/>
+          <w:b/>
+          <w:sz w:val="26"/>
+          <w:szCs w:val="26"/>
+        </w:rPr>
+        <w:t xml:space="preserve"> </w:t>
+      </w:r>
+      <w:proofErr w:type="spellStart"/>
+      <w:r>
+        <w:rPr>
+          <w:rFonts w:ascii="Times New Roman" w:hAnsi="Times New Roman" w:cs="Times New Roman"/>
+          <w:b/>
+          <w:sz w:val="26"/>
+          <w:szCs w:val="26"/>
+        </w:rPr>
+        <w:t>dụng</w:t>
+      </w:r>
+      <w:proofErr w:type="spellEnd"/>
     </w:p>
     <w:p>
       <w:pPr>
@@ -1948,14 +3903,175 @@
           <w:szCs w:val="26"/>
         </w:rPr>
       </w:pPr>
-      <w:r>
-        <w:rPr>
-          <w:rFonts w:ascii="Times New Roman" w:hAnsi="Times New Roman" w:cs="Times New Roman"/>
-          <w:b/>
-          <w:sz w:val="26"/>
-          <w:szCs w:val="26"/>
-        </w:rPr>
-        <w:t>Sơ đồ phân cấp chức năng của ứng dụn</w:t>
+      <w:proofErr w:type="spellStart"/>
+      <w:r>
+        <w:rPr>
+          <w:rFonts w:ascii="Times New Roman" w:hAnsi="Times New Roman" w:cs="Times New Roman"/>
+          <w:b/>
+          <w:sz w:val="26"/>
+          <w:szCs w:val="26"/>
+        </w:rPr>
+        <w:t>Sơ</w:t>
+      </w:r>
+      <w:proofErr w:type="spellEnd"/>
+      <w:r>
+        <w:rPr>
+          <w:rFonts w:ascii="Times New Roman" w:hAnsi="Times New Roman" w:cs="Times New Roman"/>
+          <w:b/>
+          <w:sz w:val="26"/>
+          <w:szCs w:val="26"/>
+        </w:rPr>
+        <w:t xml:space="preserve"> </w:t>
+      </w:r>
+      <w:proofErr w:type="spellStart"/>
+      <w:r>
+        <w:rPr>
+          <w:rFonts w:ascii="Times New Roman" w:hAnsi="Times New Roman" w:cs="Times New Roman"/>
+          <w:b/>
+          <w:sz w:val="26"/>
+          <w:szCs w:val="26"/>
+        </w:rPr>
+        <w:t>đồ</w:t>
+      </w:r>
+      <w:proofErr w:type="spellEnd"/>
+      <w:r>
+        <w:rPr>
+          <w:rFonts w:ascii="Times New Roman" w:hAnsi="Times New Roman" w:cs="Times New Roman"/>
+          <w:b/>
+          <w:sz w:val="26"/>
+          <w:szCs w:val="26"/>
+        </w:rPr>
+        <w:t xml:space="preserve"> </w:t>
+      </w:r>
+      <w:proofErr w:type="spellStart"/>
+      <w:r>
+        <w:rPr>
+          <w:rFonts w:ascii="Times New Roman" w:hAnsi="Times New Roman" w:cs="Times New Roman"/>
+          <w:b/>
+          <w:sz w:val="26"/>
+          <w:szCs w:val="26"/>
+        </w:rPr>
+        <w:t>phân</w:t>
+      </w:r>
+      <w:proofErr w:type="spellEnd"/>
+      <w:r>
+        <w:rPr>
+          <w:rFonts w:ascii="Times New Roman" w:hAnsi="Times New Roman" w:cs="Times New Roman"/>
+          <w:b/>
+          <w:sz w:val="26"/>
+          <w:szCs w:val="26"/>
+        </w:rPr>
+        <w:t xml:space="preserve"> </w:t>
+      </w:r>
+      <w:proofErr w:type="spellStart"/>
+      <w:r>
+        <w:rPr>
+          <w:rFonts w:ascii="Times New Roman" w:hAnsi="Times New Roman" w:cs="Times New Roman"/>
+          <w:b/>
+          <w:sz w:val="26"/>
+          <w:szCs w:val="26"/>
+        </w:rPr>
+        <w:t>cấp</w:t>
+      </w:r>
+      <w:proofErr w:type="spellEnd"/>
+      <w:r>
+        <w:rPr>
+          <w:rFonts w:ascii="Times New Roman" w:hAnsi="Times New Roman" w:cs="Times New Roman"/>
+          <w:b/>
+          <w:sz w:val="26"/>
+          <w:szCs w:val="26"/>
+        </w:rPr>
+        <w:t xml:space="preserve"> </w:t>
+      </w:r>
+      <w:proofErr w:type="spellStart"/>
+      <w:r>
+        <w:rPr>
+          <w:rFonts w:ascii="Times New Roman" w:hAnsi="Times New Roman" w:cs="Times New Roman"/>
+          <w:b/>
+          <w:sz w:val="26"/>
+          <w:szCs w:val="26"/>
+        </w:rPr>
+        <w:t>chức</w:t>
+      </w:r>
+      <w:proofErr w:type="spellEnd"/>
+      <w:r>
+        <w:rPr>
+          <w:rFonts w:ascii="Times New Roman" w:hAnsi="Times New Roman" w:cs="Times New Roman"/>
+          <w:b/>
+          <w:sz w:val="26"/>
+          <w:szCs w:val="26"/>
+        </w:rPr>
+        <w:t xml:space="preserve"> </w:t>
+      </w:r>
+      <w:proofErr w:type="spellStart"/>
+      <w:r>
+        <w:rPr>
+          <w:rFonts w:ascii="Times New Roman" w:hAnsi="Times New Roman" w:cs="Times New Roman"/>
+          <w:b/>
+          <w:sz w:val="26"/>
+          <w:szCs w:val="26"/>
+        </w:rPr>
+        <w:t>năng</w:t>
+      </w:r>
+      <w:proofErr w:type="spellEnd"/>
+      <w:r>
+        <w:rPr>
+          <w:rFonts w:ascii="Times New Roman" w:hAnsi="Times New Roman" w:cs="Times New Roman"/>
+          <w:b/>
+          <w:sz w:val="26"/>
+          <w:szCs w:val="26"/>
+        </w:rPr>
+        <w:t xml:space="preserve"> </w:t>
+      </w:r>
+      <w:proofErr w:type="spellStart"/>
+      <w:r>
+        <w:rPr>
+          <w:rFonts w:ascii="Times New Roman" w:hAnsi="Times New Roman" w:cs="Times New Roman"/>
+          <w:b/>
+          <w:sz w:val="26"/>
+          <w:szCs w:val="26"/>
+        </w:rPr>
+        <w:t>của</w:t>
+      </w:r>
+      <w:proofErr w:type="spellEnd"/>
+      <w:r>
+        <w:rPr>
+          <w:rFonts w:ascii="Times New Roman" w:hAnsi="Times New Roman" w:cs="Times New Roman"/>
+          <w:b/>
+          <w:sz w:val="26"/>
+          <w:szCs w:val="26"/>
+        </w:rPr>
+        <w:t xml:space="preserve"> </w:t>
+      </w:r>
+      <w:proofErr w:type="spellStart"/>
+      <w:r>
+        <w:rPr>
+          <w:rFonts w:ascii="Times New Roman" w:hAnsi="Times New Roman" w:cs="Times New Roman"/>
+          <w:b/>
+          <w:sz w:val="26"/>
+          <w:szCs w:val="26"/>
+        </w:rPr>
+        <w:t>ứng</w:t>
+      </w:r>
+      <w:proofErr w:type="spellEnd"/>
+      <w:r>
+        <w:rPr>
+          <w:rFonts w:ascii="Times New Roman" w:hAnsi="Times New Roman" w:cs="Times New Roman"/>
+          <w:b/>
+          <w:sz w:val="26"/>
+          <w:szCs w:val="26"/>
+        </w:rPr>
+        <w:t xml:space="preserve"> </w:t>
+      </w:r>
+      <w:proofErr w:type="spellStart"/>
+      <w:r>
+        <w:rPr>
+          <w:rFonts w:ascii="Times New Roman" w:hAnsi="Times New Roman" w:cs="Times New Roman"/>
+          <w:b/>
+          <w:sz w:val="26"/>
+          <w:szCs w:val="26"/>
+        </w:rPr>
+        <w:t>dụn</w:t>
       </w:r>
       <w:r>
         <w:rPr>
@@ -1966,6 +4082,7 @@
         </w:rPr>
         <w:t>g</w:t>
       </w:r>
+      <w:proofErr w:type="spellEnd"/>
     </w:p>
     <w:p>
       <w:pPr>
@@ -1998,12 +4115,197 @@
           <w:szCs w:val="26"/>
         </w:rPr>
       </w:pPr>
-      <w:r>
-        <w:rPr>
-          <w:b/>
-          <w:sz w:val="26"/>
-        </w:rPr>
-        <w:t>Các chức năng chính cho ứng dụng (Mục tiêu của ứng dụng)</w:t>
+      <w:proofErr w:type="spellStart"/>
+      <w:r>
+        <w:rPr>
+          <w:b/>
+          <w:sz w:val="26"/>
+        </w:rPr>
+        <w:t>Các</w:t>
+      </w:r>
+      <w:proofErr w:type="spellEnd"/>
+      <w:r>
+        <w:rPr>
+          <w:b/>
+          <w:sz w:val="26"/>
+        </w:rPr>
+        <w:t xml:space="preserve"> </w:t>
+      </w:r>
+      <w:proofErr w:type="spellStart"/>
+      <w:r>
+        <w:rPr>
+          <w:b/>
+          <w:sz w:val="26"/>
+        </w:rPr>
+        <w:t>chức</w:t>
+      </w:r>
+      <w:proofErr w:type="spellEnd"/>
+      <w:r>
+        <w:rPr>
+          <w:b/>
+          <w:sz w:val="26"/>
+        </w:rPr>
+        <w:t xml:space="preserve"> </w:t>
+      </w:r>
+      <w:proofErr w:type="spellStart"/>
+      <w:r>
+        <w:rPr>
+          <w:b/>
+          <w:sz w:val="26"/>
+        </w:rPr>
+        <w:t>năng</w:t>
+      </w:r>
+      <w:proofErr w:type="spellEnd"/>
+      <w:r>
+        <w:rPr>
+          <w:b/>
+          <w:sz w:val="26"/>
+        </w:rPr>
+        <w:t xml:space="preserve"> </w:t>
+      </w:r>
+      <w:proofErr w:type="spellStart"/>
+      <w:r>
+        <w:rPr>
+          <w:b/>
+          <w:sz w:val="26"/>
+        </w:rPr>
+        <w:t>chính</w:t>
+      </w:r>
+      <w:proofErr w:type="spellEnd"/>
+      <w:r>
+        <w:rPr>
+          <w:b/>
+          <w:sz w:val="26"/>
+        </w:rPr>
+        <w:t xml:space="preserve"> </w:t>
+      </w:r>
+      <w:proofErr w:type="spellStart"/>
+      <w:r>
+        <w:rPr>
+          <w:b/>
+          <w:sz w:val="26"/>
+        </w:rPr>
+        <w:t>cho</w:t>
+      </w:r>
+      <w:proofErr w:type="spellEnd"/>
+      <w:r>
+        <w:rPr>
+          <w:b/>
+          <w:sz w:val="26"/>
+        </w:rPr>
+        <w:t xml:space="preserve"> </w:t>
+      </w:r>
+      <w:proofErr w:type="spellStart"/>
+      <w:r>
+        <w:rPr>
+          <w:b/>
+          <w:sz w:val="26"/>
+        </w:rPr>
+        <w:t>ứng</w:t>
+      </w:r>
+      <w:proofErr w:type="spellEnd"/>
+      <w:r>
+        <w:rPr>
+          <w:b/>
+          <w:sz w:val="26"/>
+        </w:rPr>
+        <w:t xml:space="preserve"> </w:t>
+      </w:r>
+      <w:proofErr w:type="spellStart"/>
+      <w:r>
+        <w:rPr>
+          <w:b/>
+          <w:sz w:val="26"/>
+        </w:rPr>
+        <w:t>dụng</w:t>
+      </w:r>
+      <w:proofErr w:type="spellEnd"/>
+      <w:r>
+        <w:rPr>
+          <w:b/>
+          <w:sz w:val="26"/>
+        </w:rPr>
+        <w:t xml:space="preserve"> (</w:t>
+      </w:r>
+      <w:proofErr w:type="spellStart"/>
+      <w:r>
+        <w:rPr>
+          <w:b/>
+          <w:sz w:val="26"/>
+        </w:rPr>
+        <w:t>Mục</w:t>
+      </w:r>
+      <w:proofErr w:type="spellEnd"/>
+      <w:r>
+        <w:rPr>
+          <w:b/>
+          <w:sz w:val="26"/>
+        </w:rPr>
+        <w:t xml:space="preserve"> </w:t>
+      </w:r>
+      <w:proofErr w:type="spellStart"/>
+      <w:r>
+        <w:rPr>
+          <w:b/>
+          <w:sz w:val="26"/>
+        </w:rPr>
+        <w:t>tiêu</w:t>
+      </w:r>
+      <w:proofErr w:type="spellEnd"/>
+      <w:r>
+        <w:rPr>
+          <w:b/>
+          <w:sz w:val="26"/>
+        </w:rPr>
+        <w:t xml:space="preserve"> </w:t>
+      </w:r>
+      <w:proofErr w:type="spellStart"/>
+      <w:r>
+        <w:rPr>
+          <w:b/>
+          <w:sz w:val="26"/>
+        </w:rPr>
+        <w:t>của</w:t>
+      </w:r>
+      <w:proofErr w:type="spellEnd"/>
+      <w:r>
+        <w:rPr>
+          <w:b/>
+          <w:sz w:val="26"/>
+        </w:rPr>
+        <w:t xml:space="preserve"> </w:t>
+      </w:r>
+      <w:proofErr w:type="spellStart"/>
+      <w:r>
+        <w:rPr>
+          <w:b/>
+          <w:sz w:val="26"/>
+        </w:rPr>
+        <w:t>ứng</w:t>
+      </w:r>
+      <w:proofErr w:type="spellEnd"/>
+      <w:r>
+        <w:rPr>
+          <w:b/>
+          <w:sz w:val="26"/>
+        </w:rPr>
+        <w:t xml:space="preserve"> </w:t>
+      </w:r>
+      <w:proofErr w:type="spellStart"/>
+      <w:r>
+        <w:rPr>
+          <w:b/>
+          <w:sz w:val="26"/>
+        </w:rPr>
+        <w:t>dụng</w:t>
+      </w:r>
+      <w:proofErr w:type="spellEnd"/>
+      <w:r>
+        <w:rPr>
+          <w:b/>
+          <w:sz w:val="26"/>
+        </w:rPr>
+        <w:t>)</w:t>
       </w:r>
     </w:p>
     <w:p>
@@ -2032,8 +4334,48 @@
           <w:sz w:val="26"/>
           <w:szCs w:val="26"/>
         </w:rPr>
-        <w:t>Link nhật ký</w:t>
-      </w:r>
+        <w:t xml:space="preserve">Link </w:t>
+      </w:r>
+      <w:proofErr w:type="spellStart"/>
+      <w:r>
+        <w:rPr>
+          <w:rFonts w:ascii="Times New Roman" w:hAnsi="Times New Roman" w:cs="Times New Roman"/>
+          <w:b/>
+          <w:i/>
+          <w:iCs/>
+          <w:color w:val="FF0000"/>
+          <w:sz w:val="26"/>
+          <w:szCs w:val="26"/>
+        </w:rPr>
+        <w:t>nhật</w:t>
+      </w:r>
+      <w:proofErr w:type="spellEnd"/>
+      <w:r>
+        <w:rPr>
+          <w:rFonts w:ascii="Times New Roman" w:hAnsi="Times New Roman" w:cs="Times New Roman"/>
+          <w:b/>
+          <w:i/>
+          <w:iCs/>
+          <w:color w:val="FF0000"/>
+          <w:sz w:val="26"/>
+          <w:szCs w:val="26"/>
+        </w:rPr>
+        <w:t xml:space="preserve"> </w:t>
+      </w:r>
+      <w:proofErr w:type="spellStart"/>
+      <w:r>
+        <w:rPr>
+          <w:rFonts w:ascii="Times New Roman" w:hAnsi="Times New Roman" w:cs="Times New Roman"/>
+          <w:b/>
+          <w:i/>
+          <w:iCs/>
+          <w:color w:val="FF0000"/>
+          <w:sz w:val="26"/>
+          <w:szCs w:val="26"/>
+        </w:rPr>
+        <w:t>ký</w:t>
+      </w:r>
+      <w:proofErr w:type="spellEnd"/>
     </w:p>
     <w:p>
       <w:pPr>
@@ -2203,7 +4545,7 @@
                 </wp:anchor>
               </w:drawing>
             </mc:Choice>
-            <mc:Fallback xmlns:oel="http://schemas.microsoft.com/office/2019/extlst" xmlns:w16cei="http://schemas.microsoft.com/office/word/2026/wordml/cei" xmlns:w16du="http://schemas.microsoft.com/office/word/2023/wordml/word16du" xmlns:w16sdtfl="http://schemas.microsoft.com/office/word/2024/wordml/sdtformatlock">
+            <mc:Fallback xmlns:w16sdtfl="http://schemas.microsoft.com/office/word/2024/wordml/sdtformatlock" xmlns:w16du="http://schemas.microsoft.com/office/word/2023/wordml/word16du" xmlns:w16cei="http://schemas.microsoft.com/office/word/2026/wordml/cei" xmlns:oel="http://schemas.microsoft.com/office/2019/extlst">
               <w:pict>
                 <v:line w14:anchorId="62D43E4F" id="Straight Connector 1" o:spid="_x0000_s1026" style="position:absolute;z-index:251659264;visibility:visible;mso-wrap-style:square;mso-width-percent:0;mso-wrap-distance-left:9pt;mso-wrap-distance-top:0;mso-wrap-distance-right:9pt;mso-wrap-distance-bottom:0;mso-position-horizontal:absolute;mso-position-horizontal-relative:text;mso-position-vertical:absolute;mso-position-vertical-relative:text;mso-width-percent:0;mso-width-relative:margin" from=".85pt,.5pt" to="525.25pt,.5pt" o:gfxdata="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" strokecolor="black [3200]" strokeweight=".5pt">
                   <v:stroke joinstyle="miter"/>
@@ -2543,6 +4885,119 @@
     </w:lvl>
   </w:abstractNum>
   <w:abstractNum w:abstractNumId="1" w15:restartNumberingAfterBreak="0">
+    <w:nsid w:val="2A595AD1"/>
+    <w:multiLevelType w:val="hybridMultilevel"/>
+    <w:tmpl w:val="3C7829DE"/>
+    <w:lvl w:ilvl="0" w:tplc="04090003">
+      <w:start w:val="1"/>
+      <w:numFmt w:val="bullet"/>
+      <w:lvlText w:val="o"/>
+      <w:lvlJc w:val="left"/>
+      <w:pPr>
+        <w:ind w:left="1440" w:hanging="360"/>
+      </w:pPr>
+      <w:rPr>
+        <w:rFonts w:ascii="Courier New" w:hAnsi="Courier New" w:cs="Courier New" w:hint="default"/>
+      </w:rPr>
+    </w:lvl>
+    <w:lvl w:ilvl="1" w:tplc="042A0003" w:tentative="1">
+      <w:start w:val="1"/>
+      <w:numFmt w:val="bullet"/>
+      <w:lvlText w:val="o"/>
+      <w:lvlJc w:val="left"/>
+      <w:pPr>
+        <w:ind w:left="2160" w:hanging="360"/>
+      </w:pPr>
+      <w:rPr>
+        <w:rFonts w:ascii="Courier New" w:hAnsi="Courier New" w:cs="Courier New" w:hint="default"/>
+      </w:rPr>
+    </w:lvl>
+    <w:lvl w:ilvl="2" w:tplc="042A0005" w:tentative="1">
+      <w:start w:val="1"/>
+      <w:numFmt w:val="bullet"/>
+      <w:lvlText w:val=""/>
+      <w:lvlJc w:val="left"/>
+      <w:pPr>
+        <w:ind w:left="2880" w:hanging="360"/>
+      </w:pPr>
+      <w:rPr>
+        <w:rFonts w:ascii="Wingdings" w:hAnsi="Wingdings" w:hint="default"/>
+      </w:rPr>
+    </w:lvl>
+    <w:lvl w:ilvl="3" w:tplc="042A0001" w:tentative="1">
+      <w:start w:val="1"/>
+      <w:numFmt w:val="bullet"/>
+      <w:lvlText w:val=""/>
+      <w:lvlJc w:val="left"/>
+      <w:pPr>
+        <w:ind w:left="3600" w:hanging="360"/>
+      </w:pPr>
+      <w:rPr>
+        <w:rFonts w:ascii="Symbol" w:hAnsi="Symbol" w:hint="default"/>
+      </w:rPr>
+    </w:lvl>
+    <w:lvl w:ilvl="4" w:tplc="042A0003" w:tentative="1">
+      <w:start w:val="1"/>
+      <w:numFmt w:val="bullet"/>
+      <w:lvlText w:val="o"/>
+      <w:lvlJc w:val="left"/>
+      <w:pPr>
+        <w:ind w:left="4320" w:hanging="360"/>
+      </w:pPr>
+      <w:rPr>
+        <w:rFonts w:ascii="Courier New" w:hAnsi="Courier New" w:cs="Courier New" w:hint="default"/>
+      </w:rPr>
+    </w:lvl>
+    <w:lvl w:ilvl="5" w:tplc="042A0005" w:tentative="1">
+      <w:start w:val="1"/>
+      <w:numFmt w:val="bullet"/>
+      <w:lvlText w:val=""/>
+      <w:lvlJc w:val="left"/>
+      <w:pPr>
+        <w:ind w:left="5040" w:hanging="360"/>
+      </w:pPr>
+      <w:rPr>
+        <w:rFonts w:ascii="Wingdings" w:hAnsi="Wingdings" w:hint="default"/>
+      </w:rPr>
+    </w:lvl>
+    <w:lvl w:ilvl="6" w:tplc="042A0001" w:tentative="1">
+      <w:start w:val="1"/>
+      <w:numFmt w:val="bullet"/>
+      <w:lvlText w:val=""/>
+      <w:lvlJc w:val="left"/>
+      <w:pPr>
+        <w:ind w:left="5760" w:hanging="360"/>
+      </w:pPr>
+      <w:rPr>
+        <w:rFonts w:ascii="Symbol" w:hAnsi="Symbol" w:hint="default"/>
+      </w:rPr>
+    </w:lvl>
+    <w:lvl w:ilvl="7" w:tplc="042A0003" w:tentative="1">
+      <w:start w:val="1"/>
+      <w:numFmt w:val="bullet"/>
+      <w:lvlText w:val="o"/>
+      <w:lvlJc w:val="left"/>
+      <w:pPr>
+        <w:ind w:left="6480" w:hanging="360"/>
+      </w:pPr>
+      <w:rPr>
+        <w:rFonts w:ascii="Courier New" w:hAnsi="Courier New" w:cs="Courier New" w:hint="default"/>
+      </w:rPr>
+    </w:lvl>
+    <w:lvl w:ilvl="8" w:tplc="042A0005" w:tentative="1">
+      <w:start w:val="1"/>
+      <w:numFmt w:val="bullet"/>
+      <w:lvlText w:val=""/>
+      <w:lvlJc w:val="left"/>
+      <w:pPr>
+        <w:ind w:left="7200" w:hanging="360"/>
+      </w:pPr>
+      <w:rPr>
+        <w:rFonts w:ascii="Wingdings" w:hAnsi="Wingdings" w:hint="default"/>
+      </w:rPr>
+    </w:lvl>
+  </w:abstractNum>
+  <w:abstractNum w:abstractNumId="2" w15:restartNumberingAfterBreak="0">
     <w:nsid w:val="2C39406B"/>
     <w:multiLevelType w:val="hybridMultilevel"/>
     <w:tmpl w:val="22FC64EE"/>
@@ -2655,11 +5110,11 @@
       </w:rPr>
     </w:lvl>
   </w:abstractNum>
-  <w:abstractNum w:abstractNumId="2" w15:restartNumberingAfterBreak="0">
+  <w:abstractNum w:abstractNumId="3" w15:restartNumberingAfterBreak="0">
     <w:nsid w:val="53FD5395"/>
     <w:multiLevelType w:val="hybridMultilevel"/>
-    <w:tmpl w:val="A2DA055C"/>
-    <w:lvl w:ilvl="0" w:tplc="04090019">
+    <w:tmpl w:val="6DB679FC"/>
+    <w:lvl w:ilvl="0" w:tplc="29EA708A">
       <w:start w:val="1"/>
       <w:numFmt w:val="lowerLetter"/>
       <w:lvlText w:val="%1."/>
@@ -2669,6 +5124,7 @@
       </w:pPr>
       <w:rPr>
         <w:rFonts w:hint="default"/>
+        <w:lang w:val="vi-VN"/>
       </w:rPr>
     </w:lvl>
     <w:lvl w:ilvl="1" w:tplc="04090019" w:tentative="1">
@@ -2744,7 +5200,7 @@
       </w:pPr>
     </w:lvl>
   </w:abstractNum>
-  <w:abstractNum w:abstractNumId="3" w15:restartNumberingAfterBreak="0">
+  <w:abstractNum w:abstractNumId="4" w15:restartNumberingAfterBreak="0">
     <w:nsid w:val="59FD1723"/>
     <w:multiLevelType w:val="hybridMultilevel"/>
     <w:tmpl w:val="8990CF0E"/>
@@ -2884,7 +5340,120 @@
       </w:rPr>
     </w:lvl>
   </w:abstractNum>
-  <w:abstractNum w:abstractNumId="4" w15:restartNumberingAfterBreak="0">
+  <w:abstractNum w:abstractNumId="5" w15:restartNumberingAfterBreak="0">
+    <w:nsid w:val="5DF9585A"/>
+    <w:multiLevelType w:val="hybridMultilevel"/>
+    <w:tmpl w:val="9E2EF62C"/>
+    <w:lvl w:ilvl="0" w:tplc="04090003">
+      <w:start w:val="1"/>
+      <w:numFmt w:val="bullet"/>
+      <w:lvlText w:val="o"/>
+      <w:lvlJc w:val="left"/>
+      <w:pPr>
+        <w:ind w:left="1500" w:hanging="360"/>
+      </w:pPr>
+      <w:rPr>
+        <w:rFonts w:ascii="Courier New" w:hAnsi="Courier New" w:cs="Courier New" w:hint="default"/>
+      </w:rPr>
+    </w:lvl>
+    <w:lvl w:ilvl="1" w:tplc="042A0003" w:tentative="1">
+      <w:start w:val="1"/>
+      <w:numFmt w:val="bullet"/>
+      <w:lvlText w:val="o"/>
+      <w:lvlJc w:val="left"/>
+      <w:pPr>
+        <w:ind w:left="2220" w:hanging="360"/>
+      </w:pPr>
+      <w:rPr>
+        <w:rFonts w:ascii="Courier New" w:hAnsi="Courier New" w:cs="Courier New" w:hint="default"/>
+      </w:rPr>
+    </w:lvl>
+    <w:lvl w:ilvl="2" w:tplc="042A0005" w:tentative="1">
+      <w:start w:val="1"/>
+      <w:numFmt w:val="bullet"/>
+      <w:lvlText w:val=""/>
+      <w:lvlJc w:val="left"/>
+      <w:pPr>
+        <w:ind w:left="2940" w:hanging="360"/>
+      </w:pPr>
+      <w:rPr>
+        <w:rFonts w:ascii="Wingdings" w:hAnsi="Wingdings" w:hint="default"/>
+      </w:rPr>
+    </w:lvl>
+    <w:lvl w:ilvl="3" w:tplc="042A0001" w:tentative="1">
+      <w:start w:val="1"/>
+      <w:numFmt w:val="bullet"/>
+      <w:lvlText w:val=""/>
+      <w:lvlJc w:val="left"/>
+      <w:pPr>
+        <w:ind w:left="3660" w:hanging="360"/>
+      </w:pPr>
+      <w:rPr>
+        <w:rFonts w:ascii="Symbol" w:hAnsi="Symbol" w:hint="default"/>
+      </w:rPr>
+    </w:lvl>
+    <w:lvl w:ilvl="4" w:tplc="042A0003" w:tentative="1">
+      <w:start w:val="1"/>
+      <w:numFmt w:val="bullet"/>
+      <w:lvlText w:val="o"/>
+      <w:lvlJc w:val="left"/>
+      <w:pPr>
+        <w:ind w:left="4380" w:hanging="360"/>
+      </w:pPr>
+      <w:rPr>
+        <w:rFonts w:ascii="Courier New" w:hAnsi="Courier New" w:cs="Courier New" w:hint="default"/>
+      </w:rPr>
+    </w:lvl>
+    <w:lvl w:ilvl="5" w:tplc="042A0005" w:tentative="1">
+      <w:start w:val="1"/>
+      <w:numFmt w:val="bullet"/>
+      <w:lvlText w:val=""/>
+      <w:lvlJc w:val="left"/>
+      <w:pPr>
+        <w:ind w:left="5100" w:hanging="360"/>
+      </w:pPr>
+      <w:rPr>
+        <w:rFonts w:ascii="Wingdings" w:hAnsi="Wingdings" w:hint="default"/>
+      </w:rPr>
+    </w:lvl>
+    <w:lvl w:ilvl="6" w:tplc="042A0001" w:tentative="1">
+      <w:start w:val="1"/>
+      <w:numFmt w:val="bullet"/>
+      <w:lvlText w:val=""/>
+      <w:lvlJc w:val="left"/>
+      <w:pPr>
+        <w:ind w:left="5820" w:hanging="360"/>
+      </w:pPr>
+      <w:rPr>
+        <w:rFonts w:ascii="Symbol" w:hAnsi="Symbol" w:hint="default"/>
+      </w:rPr>
+    </w:lvl>
+    <w:lvl w:ilvl="7" w:tplc="042A0003" w:tentative="1">
+      <w:start w:val="1"/>
+      <w:numFmt w:val="bullet"/>
+      <w:lvlText w:val="o"/>
+      <w:lvlJc w:val="left"/>
+      <w:pPr>
+        <w:ind w:left="6540" w:hanging="360"/>
+      </w:pPr>
+      <w:rPr>
+        <w:rFonts w:ascii="Courier New" w:hAnsi="Courier New" w:cs="Courier New" w:hint="default"/>
+      </w:rPr>
+    </w:lvl>
+    <w:lvl w:ilvl="8" w:tplc="042A0005" w:tentative="1">
+      <w:start w:val="1"/>
+      <w:numFmt w:val="bullet"/>
+      <w:lvlText w:val=""/>
+      <w:lvlJc w:val="left"/>
+      <w:pPr>
+        <w:ind w:left="7260" w:hanging="360"/>
+      </w:pPr>
+      <w:rPr>
+        <w:rFonts w:ascii="Wingdings" w:hAnsi="Wingdings" w:hint="default"/>
+      </w:rPr>
+    </w:lvl>
+  </w:abstractNum>
+  <w:abstractNum w:abstractNumId="6" w15:restartNumberingAfterBreak="0">
     <w:nsid w:val="664646E2"/>
     <w:multiLevelType w:val="hybridMultilevel"/>
     <w:tmpl w:val="96EAF268"/>
@@ -2973,7 +5542,7 @@
       </w:pPr>
     </w:lvl>
   </w:abstractNum>
-  <w:abstractNum w:abstractNumId="5" w15:restartNumberingAfterBreak="0">
+  <w:abstractNum w:abstractNumId="7" w15:restartNumberingAfterBreak="0">
     <w:nsid w:val="79BF5A33"/>
     <w:multiLevelType w:val="hybridMultilevel"/>
     <w:tmpl w:val="F466ABF6"/>
@@ -3063,22 +5632,28 @@
     </w:lvl>
   </w:abstractNum>
   <w:num w:numId="1">
-    <w:abstractNumId w:val="5"/>
+    <w:abstractNumId w:val="7"/>
   </w:num>
   <w:num w:numId="2">
-    <w:abstractNumId w:val="1"/>
+    <w:abstractNumId w:val="2"/>
   </w:num>
   <w:num w:numId="3">
-    <w:abstractNumId w:val="3"/>
+    <w:abstractNumId w:val="4"/>
   </w:num>
   <w:num w:numId="4">
-    <w:abstractNumId w:val="4"/>
+    <w:abstractNumId w:val="6"/>
   </w:num>
   <w:num w:numId="5">
-    <w:abstractNumId w:val="2"/>
+    <w:abstractNumId w:val="3"/>
   </w:num>
   <w:num w:numId="6">
     <w:abstractNumId w:val="0"/>
+  </w:num>
+  <w:num w:numId="7">
+    <w:abstractNumId w:val="1"/>
+  </w:num>
+  <w:num w:numId="8">
+    <w:abstractNumId w:val="5"/>
   </w:num>
 </w:numbering>
 </file>

</xml_diff>

<commit_message>
chinh sửa lại khảo sát thực trạng, quy trình nghiệp vụ, quy định
</commit_message>
<xml_diff>
--- a/doc/01-HoVanKhanh.docx
+++ b/doc/01-HoVanKhanh.docx
@@ -12,15 +12,15 @@
         <w:rPr>
           <w:rFonts w:ascii="Times New Roman" w:hAnsi="Times New Roman" w:cs="Times New Roman"/>
           <w:b/>
-          <w:sz w:val="34"/>
-          <w:szCs w:val="26"/>
-        </w:rPr>
-      </w:pPr>
-      <w:r>
-        <w:rPr>
-          <w:rFonts w:ascii="Times New Roman" w:hAnsi="Times New Roman" w:cs="Times New Roman"/>
-          <w:b/>
-          <w:sz w:val="34"/>
+          <w:sz w:val="26"/>
+          <w:szCs w:val="26"/>
+        </w:rPr>
+      </w:pPr>
+      <w:r>
+        <w:rPr>
+          <w:rFonts w:ascii="Times New Roman" w:hAnsi="Times New Roman" w:cs="Times New Roman"/>
+          <w:b/>
+          <w:sz w:val="26"/>
           <w:szCs w:val="26"/>
         </w:rPr>
         <w:t>THU THẬ</w:t>
@@ -29,7 +29,7 @@
         <w:rPr>
           <w:rFonts w:ascii="Times New Roman" w:hAnsi="Times New Roman" w:cs="Times New Roman"/>
           <w:b/>
-          <w:sz w:val="34"/>
+          <w:sz w:val="26"/>
           <w:szCs w:val="26"/>
         </w:rPr>
         <w:t xml:space="preserve">P, LÀM RÕ </w:t>
@@ -38,7 +38,7 @@
         <w:rPr>
           <w:rFonts w:ascii="Times New Roman" w:hAnsi="Times New Roman" w:cs="Times New Roman"/>
           <w:b/>
-          <w:sz w:val="34"/>
+          <w:sz w:val="26"/>
           <w:szCs w:val="26"/>
         </w:rPr>
         <w:t>YÊU CẦU</w:t>
@@ -47,7 +47,7 @@
         <w:rPr>
           <w:rFonts w:ascii="Times New Roman" w:hAnsi="Times New Roman" w:cs="Times New Roman"/>
           <w:b/>
-          <w:sz w:val="34"/>
+          <w:sz w:val="26"/>
           <w:szCs w:val="26"/>
         </w:rPr>
         <w:t xml:space="preserve"> </w:t>
@@ -56,7 +56,7 @@
         <w:rPr>
           <w:rFonts w:ascii="Times New Roman" w:hAnsi="Times New Roman" w:cs="Times New Roman"/>
           <w:b/>
-          <w:sz w:val="34"/>
+          <w:sz w:val="26"/>
           <w:szCs w:val="26"/>
         </w:rPr>
         <w:t xml:space="preserve">CỦA </w:t>
@@ -65,7 +65,7 @@
         <w:rPr>
           <w:rFonts w:ascii="Times New Roman" w:hAnsi="Times New Roman" w:cs="Times New Roman"/>
           <w:b/>
-          <w:sz w:val="34"/>
+          <w:sz w:val="26"/>
           <w:szCs w:val="26"/>
         </w:rPr>
         <w:t>ỨNG DỤNG</w:t>
@@ -796,17 +796,7 @@
           <w:sz w:val="26"/>
           <w:szCs w:val="26"/>
         </w:rPr>
-        <w:t xml:space="preserve">CHƯƠNG TRÌNH </w:t>
-      </w:r>
-      <w:r>
-        <w:rPr>
-          <w:rFonts w:ascii="Times New Roman" w:hAnsi="Times New Roman" w:cs="Times New Roman"/>
-          <w:b/>
-          <w:color w:val="FF0000"/>
-          <w:sz w:val="26"/>
-          <w:szCs w:val="26"/>
-        </w:rPr>
-        <w:t>HỆ THỐNG QUẢN LÝ PHÒNG KHÁM NHA KHOA</w:t>
+        <w:t>CHƯƠNG TRÌNH HỆ THỐNG QUẢN LÝ PHÒNG KHÁM NHA KHOA</w:t>
       </w:r>
     </w:p>
     <w:p>
@@ -1253,37 +1243,195 @@
     </w:p>
     <w:p>
       <w:pPr>
+        <w:pStyle w:val="ListParagraph"/>
+        <w:spacing w:after="0" w:line="240" w:lineRule="auto"/>
+        <w:rPr>
+          <w:rFonts w:ascii="Times New Roman" w:eastAsia="Times New Roman" w:hAnsi="Times New Roman" w:cs="Times New Roman"/>
+          <w:color w:val="1F1F1F"/>
+          <w:sz w:val="26"/>
+          <w:szCs w:val="26"/>
+          <w:lang w:val="vi-VN" w:eastAsia="vi-VN"/>
+        </w:rPr>
+      </w:pPr>
+      <w:r>
+        <w:rPr>
+          <w:rFonts w:ascii="Times New Roman" w:eastAsia="Times New Roman" w:hAnsi="Times New Roman" w:cs="Times New Roman"/>
+          <w:color w:val="1F1F1F"/>
+          <w:sz w:val="26"/>
+          <w:szCs w:val="26"/>
+          <w:lang w:val="vi-VN" w:eastAsia="vi-VN"/>
+        </w:rPr>
+        <w:t>Hệ thống phần mềm quản lý phòng khám nha khoa đóng vai trò quan trọng trong việc hiện đại hóa quy trình vận hành và nâng cao chất lượng dịch vụ y tế. Trước khi áp dụng các giải pháp công nghệ thông tin vào quản lý, đa số các phòng khám nha khoa quy mô vừa và nhỏ vận hành phụ thuộc hoàn toàn vào sổ sách, tài liệu giấy và các công cụ thủ công như bảng tính Excel rời rạc. Trong mô hình truyền thống này, quy trình làm việc gặp nhiều rào cản ở hầu hết các công đoạn. Lễ tân ghi nhận lịch hẹn của bệnh nhân qua điện thoại hoặc ghi sổ tay nên rất dễ dẫn đến tình trạng trùng lịch, sót lịch hoặc phân bổ số lượng bệnh nhân không đều giữa các khung giờ. Khi bệnh nhân đến khám, việc tìm kiếm hồ sơ bệnh án giấy trong kho lưu trữ mất nhiều thời gian, khiến bệnh nhân phải chờ đợi lâu tại khu vực tiếp đón. Bên cạnh đó, việc phân công lịch làm việc cho nha sĩ và y tá được thực hiện thủ công, làm cho quản lý khó nắm bắt ca trực, phòng khám trống hay sự sẵn sàng của nhân sự theo thời gian thực. Đặc thù ngành nha khoa đòi hỏi theo dõi sát sao sơ đồ răng, tiền sử y khoa, các công đoạn điều trị kéo dài qua nhiều giai đoạn và lịch tái khám; tuy nhiên, bệnh án giấy lại dễ hư hỏng, thất lạc, gây khó khăn cho việc tra cứu lịch sử điều trị cũ cũng như chia sẻ thông tin giữa các nha sĩ khi có sự luân chuyển ca trực. Cuối cùng, khâu thanh toán thủ công dễ phát sinh sai sót khi áp dụng các chương trình ưu đãi hay chia đợt thanh toán cho các ca điều trị chi phí lớn, đồng thời việc tổng hợp báo cáo doanh thu và hiệu suất làm việc mất rất nhiều thời gian nhưng vẫn thiếu tính chính xác, kịp thời.</w:t>
+      </w:r>
+    </w:p>
+    <w:p>
+      <w:pPr>
+        <w:pStyle w:val="ListParagraph"/>
+        <w:spacing w:after="0" w:line="240" w:lineRule="auto"/>
+        <w:rPr>
+          <w:rFonts w:ascii="Times New Roman" w:eastAsia="Times New Roman" w:hAnsi="Times New Roman" w:cs="Times New Roman"/>
+          <w:color w:val="1F1F1F"/>
+          <w:sz w:val="26"/>
+          <w:szCs w:val="26"/>
+          <w:lang w:val="vi-VN" w:eastAsia="vi-VN"/>
+        </w:rPr>
+      </w:pPr>
+    </w:p>
+    <w:p>
+      <w:pPr>
+        <w:pStyle w:val="ListParagraph"/>
+        <w:spacing w:after="0" w:line="240" w:lineRule="auto"/>
+        <w:rPr>
+          <w:rFonts w:ascii="Times New Roman" w:eastAsia="Times New Roman" w:hAnsi="Times New Roman" w:cs="Times New Roman"/>
+          <w:color w:val="1F1F1F"/>
+          <w:sz w:val="26"/>
+          <w:szCs w:val="26"/>
+          <w:lang w:val="vi-VN" w:eastAsia="vi-VN"/>
+        </w:rPr>
+      </w:pPr>
+      <w:r>
+        <w:rPr>
+          <w:rFonts w:ascii="Times New Roman" w:eastAsia="Times New Roman" w:hAnsi="Times New Roman" w:cs="Times New Roman"/>
+          <w:color w:val="1F1F1F"/>
+          <w:sz w:val="26"/>
+          <w:szCs w:val="26"/>
+          <w:lang w:val="vi-VN" w:eastAsia="vi-VN"/>
+        </w:rPr>
+        <w:t xml:space="preserve">Việc đưa phần mềm quản lý phòng khám nha khoa vào vận hành giúp chuyển đổi toàn bộ quy trình làm việc sang nền tảng số hóa đồng bộ, đem lại những giá trị vượt trội. Hệ thống tối ưu hóa quy trình tiếp đón và điều phối bằng cách giúp lễ tân dễ dàng theo dõi sơ đồ lịch hẹn trực quan, check-in cho bệnh nhân chỉ với vài thao tác và tự động điều phối bệnh nhân vào đúng phòng khám với nha sĩ phụ trách. Toàn bộ thông tin bệnh nhân, tiền sử bệnh, sơ đồ răng trực quan, hình ảnh X-quang, đơn thuốc và lịch sử điều trị được quản lý tập trung </w:t>
+      </w:r>
+      <w:r>
+        <w:rPr>
+          <w:rFonts w:ascii="Times New Roman" w:eastAsia="Times New Roman" w:hAnsi="Times New Roman" w:cs="Times New Roman"/>
+          <w:color w:val="1F1F1F"/>
+          <w:sz w:val="26"/>
+          <w:szCs w:val="26"/>
+          <w:lang w:val="vi-VN" w:eastAsia="vi-VN"/>
+        </w:rPr>
+        <w:lastRenderedPageBreak/>
+        <w:t>trên hồ sơ bệnh án điện tử, giúp nha sĩ và y tá truy xuất tức thì để chuẩn bị dụng cụ và lên phác đồ điều trị hiệu quả. Công tác phân công lịch làm việc cũng được tự động hóa, cho phép quản lý thiết lập lịch ca trực chuyên nghiệp, còn nha sĩ và y tá có thể chủ động theo dõi lịch làm việc cá nhân cùng danh sách bệnh nhân trong ngày. Ngoài ra, quy trình thanh toán được chuẩn hóa minh bạch với khả năng hỗ trợ nhiều hình thức thanh toán khác nhau, kết hợp cùng hệ thống báo cáo tự động giúp nhà quản lý nắm bắt rõ ràng doanh thu và hiệu suất hoạt động theo thời gian thực.</w:t>
+      </w:r>
+    </w:p>
+    <w:p>
+      <w:pPr>
+        <w:pStyle w:val="ListParagraph"/>
+        <w:spacing w:after="0" w:line="240" w:lineRule="auto"/>
+        <w:rPr>
+          <w:rFonts w:ascii="Times New Roman" w:eastAsia="Times New Roman" w:hAnsi="Times New Roman" w:cs="Times New Roman"/>
+          <w:color w:val="1F1F1F"/>
+          <w:sz w:val="26"/>
+          <w:szCs w:val="26"/>
+          <w:lang w:val="vi-VN" w:eastAsia="vi-VN"/>
+        </w:rPr>
+      </w:pPr>
+    </w:p>
+    <w:p>
+      <w:pPr>
+        <w:pStyle w:val="ListParagraph"/>
+        <w:spacing w:after="0" w:line="240" w:lineRule="auto"/>
+        <w:rPr>
+          <w:rFonts w:ascii="Times New Roman" w:eastAsia="Times New Roman" w:hAnsi="Times New Roman" w:cs="Times New Roman"/>
+          <w:color w:val="1F1F1F"/>
+          <w:sz w:val="26"/>
+          <w:szCs w:val="26"/>
+          <w:lang w:val="vi-VN" w:eastAsia="vi-VN"/>
+        </w:rPr>
+      </w:pPr>
+      <w:r>
+        <w:rPr>
+          <w:rFonts w:ascii="Times New Roman" w:eastAsia="Times New Roman" w:hAnsi="Times New Roman" w:cs="Times New Roman"/>
+          <w:color w:val="1F1F1F"/>
+          <w:sz w:val="26"/>
+          <w:szCs w:val="26"/>
+          <w:lang w:val="vi-VN" w:eastAsia="vi-VN"/>
+        </w:rPr>
+        <w:t>Khảo sát tổng quan quy trình vận hành từ các hệ thống quản lý nha khoa lớn hiện nay cho thấy phân hệ quản lý bệnh nhân được thiết kế khép kín dành riêng cho bộ máy nhân sự nội bộ của phòng khám với phân quyền rõ ràng cho từng đối tượng tham gia. Nhân viên quản lý nắm quyền hạn cao nhất để cấu hình hệ thống, quản lý danh mục dịch vụ, bảng giá, hồ sơ nhân sự, phân công lịch làm việc và xem báo cáo tổng quan. Lễ tân tập trung vào việc tiếp nhận lịch hẹn, đón tiếp, check-in, điều phối luồng bệnh nhân, lập hóa đơn thanh toán và hẹn lịch tái khám. Nha sĩ theo dõi lịch làm việc cá nhân, truy xuất hồ sơ bệnh án điện tử, cập nhật sơ đồ răng, ghi nhận tiến trình điều trị và kê đơn thuốc. Y tá theo dõi lịch phân công để chuẩn bị dụng cụ, vật tư y tế và phòng khám nhằm hỗ trợ tốt nhất cho nha sĩ trong từng phiên làm việc.</w:t>
+      </w:r>
+    </w:p>
+    <w:p>
+      <w:pPr>
+        <w:pStyle w:val="ListParagraph"/>
+        <w:spacing w:after="0" w:line="240" w:lineRule="auto"/>
+        <w:rPr>
+          <w:rFonts w:ascii="Times New Roman" w:eastAsia="Times New Roman" w:hAnsi="Times New Roman" w:cs="Times New Roman"/>
+          <w:color w:val="1F1F1F"/>
+          <w:sz w:val="26"/>
+          <w:szCs w:val="26"/>
+          <w:lang w:val="vi-VN" w:eastAsia="vi-VN"/>
+        </w:rPr>
+      </w:pPr>
+    </w:p>
+    <w:p>
+      <w:pPr>
+        <w:pStyle w:val="ListParagraph"/>
+        <w:spacing w:after="0" w:line="240" w:lineRule="auto"/>
+        <w:rPr>
+          <w:rFonts w:ascii="Times New Roman" w:eastAsia="Times New Roman" w:hAnsi="Times New Roman" w:cs="Times New Roman"/>
+          <w:color w:val="1F1F1F"/>
+          <w:sz w:val="26"/>
+          <w:szCs w:val="26"/>
+          <w:lang w:val="vi-VN" w:eastAsia="vi-VN"/>
+        </w:rPr>
+      </w:pPr>
+      <w:r>
+        <w:rPr>
+          <w:rFonts w:ascii="Times New Roman" w:eastAsia="Times New Roman" w:hAnsi="Times New Roman" w:cs="Times New Roman"/>
+          <w:color w:val="1F1F1F"/>
+          <w:sz w:val="26"/>
+          <w:szCs w:val="26"/>
+          <w:lang w:val="vi-VN" w:eastAsia="vi-VN"/>
+        </w:rPr>
+        <w:t>Khi bệnh nhân đến phòng khám hoặc liên hệ đăng ký, lễ tân thực hiện quy trình thu thập thông tin hành chính ban đầu như họ tên, ngày sinh, giới tính, số điện thoại, địa chỉ, tiền sử bệnh lý và nguồn khách hàng. Hệ thống tự động cấp một mã bệnh nhân duy nhất để theo dõi lâu dài và tích hợp cơ chế kiểm tra trùng lặp thông tin nhằm tránh tạo thêm hồ sơ thừa. Trung tâm dữ liệu của hệ thống là hồ sơ bệnh nhân điện tử, bao gồm sơ đồ răng trực quan mô phỏng toàn bộ hệ thống răng, giúp nha sĩ dễ dàng đánh dấu trạng thái từng răng, ghi nhận chỉ số nha chu và cập nhật trực tiếp trong quá trình khám. Mọi nhật ký thủ thuật đã thực hiện, dịch vụ sử dụng, đơn thuốc kê điện tử cũng như các hình ảnh X-quang, hình ảnh thực tế trước và sau điều trị đều được lưu trữ tập trung, phục vụ cho việc so sánh kết quả và hội chẩn.</w:t>
+      </w:r>
+    </w:p>
+    <w:p>
+      <w:pPr>
+        <w:pStyle w:val="ListParagraph"/>
+        <w:spacing w:after="0" w:line="240" w:lineRule="auto"/>
+        <w:rPr>
+          <w:rFonts w:ascii="Times New Roman" w:eastAsia="Times New Roman" w:hAnsi="Times New Roman" w:cs="Times New Roman"/>
+          <w:color w:val="1F1F1F"/>
+          <w:sz w:val="26"/>
+          <w:szCs w:val="26"/>
+          <w:lang w:val="vi-VN" w:eastAsia="vi-VN"/>
+        </w:rPr>
+      </w:pPr>
+    </w:p>
+    <w:p>
+      <w:pPr>
+        <w:pStyle w:val="ListParagraph"/>
+        <w:spacing w:after="0" w:line="240" w:lineRule="auto"/>
+        <w:rPr>
+          <w:rFonts w:ascii="Times New Roman" w:eastAsia="Times New Roman" w:hAnsi="Times New Roman" w:cs="Times New Roman"/>
+          <w:color w:val="1F1F1F"/>
+          <w:sz w:val="26"/>
+          <w:szCs w:val="26"/>
+          <w:lang w:val="vi-VN" w:eastAsia="vi-VN"/>
+        </w:rPr>
+      </w:pPr>
+      <w:r>
+        <w:rPr>
+          <w:rFonts w:ascii="Times New Roman" w:eastAsia="Times New Roman" w:hAnsi="Times New Roman" w:cs="Times New Roman"/>
+          <w:color w:val="1F1F1F"/>
+          <w:sz w:val="26"/>
+          <w:szCs w:val="26"/>
+          <w:lang w:val="vi-VN" w:eastAsia="vi-VN"/>
+        </w:rPr>
+        <w:t>Nghiệp vụ đặt lịch hẹn và điều phối check-in giúp tối ưu hóa thời gian chờ đợi tại phòng khám. Lễ tân dễ dàng quan sát khung giờ trống của nha sĩ và ghế khám để đăng ký lịch hẹn, đồng thời hệ thống tự động tạo danh sách nhắc lịch hoặc gửi thông báo nhắc hẹn cho bệnh nhân trước ngày khám. Khi bệnh nhân đến, lễ tân chuyển trạng thái lịch hẹn sang check-in để xếp bệnh nhân vào danh sách chờ của từng phòng khám. Nha sĩ và y tá tại phòng điều trị lập tức thấy trạng thái bệnh nhân chuyển sang sẵn sàng, và khi tiếp nhận khám, trạng thái được cập nhật thành đang khám trên toàn hệ thống theo thời gian thực. Đối với các liệu trình phức tạp cần điều trị nhiều đợt như niềng răng hay cấy ghép Implant, nha sĩ lập kế hoạch điều trị chi tiết gồm từng giai đoạn và chi phí dự kiến để lưu vào hồ sơ. Sau mỗi buổi điều trị, hệ thống chủ động thiết lập lịch tái khám định kỳ, giúp phòng khám theo dõi sát sao lịch sử khám và duy trì công tác chăm sóc bệnh nhân một cách hiệu quả, chuyên nghiệp.</w:t>
+      </w:r>
+    </w:p>
+    <w:p>
+      <w:pPr>
         <w:spacing w:after="120" w:line="240" w:lineRule="auto"/>
-        <w:ind w:left="720"/>
+        <w:ind w:left="360"/>
         <w:jc w:val="both"/>
         <w:rPr>
           <w:rFonts w:ascii="Times New Roman" w:hAnsi="Times New Roman" w:cs="Times New Roman"/>
-          <w:bCs/>
+          <w:b/>
           <w:sz w:val="26"/>
           <w:szCs w:val="26"/>
           <w:lang w:val="vi-VN"/>
         </w:rPr>
       </w:pPr>
-      <w:r>
-        <w:rPr>
-          <w:rFonts w:ascii="Times New Roman" w:hAnsi="Times New Roman" w:cs="Times New Roman"/>
-          <w:bCs/>
-          <w:sz w:val="26"/>
-          <w:szCs w:val="26"/>
-          <w:lang w:val="vi-VN"/>
-        </w:rPr>
-        <w:t xml:space="preserve">Hệ thống phần mềm quản lý phòng khám nha khoa được xây dựng nhằm giải quyết tình trạng quản lý thủ công, phân tán dữ liệu và thiếu đồng bộ giữa các bộ phận: Nhân viên quản lý, lễ tân, nha sĩ và y tá. Mặc dù chỉ phục vụ cho thao tác nội bộ của nhân viên, hệ thống vẫn lấy bệnh nhân làm trung tâm dữ liệu với quy trình vận hành khép kín: Lễ tân tiếp nhận thông tin </w:t>
-      </w:r>
-      <w:r>
-        <w:rPr>
-          <w:rFonts w:ascii="Times New Roman" w:hAnsi="Times New Roman" w:cs="Times New Roman"/>
-          <w:bCs/>
-          <w:sz w:val="26"/>
-          <w:szCs w:val="26"/>
-          <w:lang w:val="vi-VN"/>
-        </w:rPr>
-        <w:t>hành chính, khởi tạo mã bệnh nhân (đối với khách hàng mới) hoặc tra cứu (đối với khách cũ); Nha sĩ và y tá truy xuất hồ sơ bệnh án điện tử để phục vụ chẩn đoán, lập sơ đồ răng, theo dõi tiền sử bệnh lý và kê đơn thuốc. Đặc biệt, hệ thống tập trung lưu trữ toàn bộ lịch sử khám và điều trị bao gồm: Nhật ký từng phiên làm việc, tiến trình dịch vụ nhiều đợt, theo dõi thanh toán công nợ và lịch hẹn khám, giúp tối ưu hóa quy trình điều trị dài hạn và nâng cao hiệu quả vận hành phòng khám.</w:t>
-      </w:r>
     </w:p>
     <w:p>
       <w:pPr>
@@ -1375,724 +1523,1029 @@
     </w:p>
     <w:p>
       <w:pPr>
+        <w:spacing w:after="0" w:line="240" w:lineRule="auto"/>
+        <w:rPr>
+          <w:rFonts w:ascii="Times New Roman" w:eastAsia="Times New Roman" w:hAnsi="Times New Roman" w:cs="Times New Roman"/>
+          <w:color w:val="1F1F1F"/>
+          <w:sz w:val="26"/>
+          <w:szCs w:val="26"/>
+          <w:lang w:val="vi-VN" w:eastAsia="vi-VN"/>
+        </w:rPr>
+      </w:pPr>
+    </w:p>
+    <w:p>
+      <w:pPr>
+        <w:spacing w:after="0" w:line="240" w:lineRule="auto"/>
+        <w:ind w:firstLine="720"/>
+        <w:rPr>
+          <w:rFonts w:ascii="Times New Roman" w:eastAsia="Times New Roman" w:hAnsi="Times New Roman" w:cs="Times New Roman"/>
+          <w:color w:val="1F1F1F"/>
+          <w:sz w:val="26"/>
+          <w:szCs w:val="26"/>
+          <w:lang w:val="vi-VN" w:eastAsia="vi-VN"/>
+        </w:rPr>
+      </w:pPr>
+      <w:r>
+        <w:rPr>
+          <w:rFonts w:ascii="Times New Roman" w:eastAsia="Times New Roman" w:hAnsi="Times New Roman" w:cs="Times New Roman"/>
+          <w:b/>
+          <w:bCs/>
+          <w:color w:val="1F1F1F"/>
+          <w:sz w:val="26"/>
+          <w:szCs w:val="26"/>
+          <w:bdr w:val="none" w:sz="0" w:space="0" w:color="auto" w:frame="1"/>
+          <w:lang w:val="vi-VN" w:eastAsia="vi-VN"/>
+        </w:rPr>
+        <w:lastRenderedPageBreak/>
+        <w:t>1. Quy trình Quản lý nhân sự và Phân công ca trực</w:t>
+      </w:r>
+    </w:p>
+    <w:p>
+      <w:pPr>
+        <w:spacing w:before="100" w:beforeAutospacing="1" w:after="0" w:line="240" w:lineRule="auto"/>
+        <w:ind w:left="720"/>
+        <w:rPr>
+          <w:rFonts w:ascii="Times New Roman" w:eastAsia="Times New Roman" w:hAnsi="Times New Roman" w:cs="Times New Roman"/>
+          <w:color w:val="1F1F1F"/>
+          <w:sz w:val="26"/>
+          <w:szCs w:val="26"/>
+          <w:lang w:val="vi-VN" w:eastAsia="vi-VN"/>
+        </w:rPr>
+      </w:pPr>
+      <w:r>
+        <w:rPr>
+          <w:rFonts w:ascii="Times New Roman" w:eastAsia="Times New Roman" w:hAnsi="Times New Roman" w:cs="Times New Roman"/>
+          <w:b/>
+          <w:bCs/>
+          <w:color w:val="1F1F1F"/>
+          <w:sz w:val="26"/>
+          <w:szCs w:val="26"/>
+          <w:bdr w:val="none" w:sz="0" w:space="0" w:color="auto" w:frame="1"/>
+          <w:lang w:val="vi-VN" w:eastAsia="vi-VN"/>
+        </w:rPr>
+        <w:t>Bước 1:</w:t>
+      </w:r>
+      <w:r>
+        <w:rPr>
+          <w:rFonts w:ascii="Times New Roman" w:eastAsia="Times New Roman" w:hAnsi="Times New Roman" w:cs="Times New Roman"/>
+          <w:color w:val="1F1F1F"/>
+          <w:sz w:val="26"/>
+          <w:szCs w:val="26"/>
+          <w:lang w:val="vi-VN" w:eastAsia="vi-VN"/>
+        </w:rPr>
+        <w:t xml:space="preserve"> Nhân viên quản lý thiết lập danh mục ca trực, cấu hình phòng khám và danh mục dịch vụ/bảng giá trên hệ thống.</w:t>
+      </w:r>
+    </w:p>
+    <w:p>
+      <w:pPr>
+        <w:spacing w:before="100" w:beforeAutospacing="1" w:after="0" w:line="240" w:lineRule="auto"/>
+        <w:ind w:left="720"/>
+        <w:rPr>
+          <w:rFonts w:ascii="Times New Roman" w:eastAsia="Times New Roman" w:hAnsi="Times New Roman" w:cs="Times New Roman"/>
+          <w:color w:val="1F1F1F"/>
+          <w:sz w:val="26"/>
+          <w:szCs w:val="26"/>
+          <w:lang w:val="vi-VN" w:eastAsia="vi-VN"/>
+        </w:rPr>
+      </w:pPr>
+      <w:r>
+        <w:rPr>
+          <w:rFonts w:ascii="Times New Roman" w:eastAsia="Times New Roman" w:hAnsi="Times New Roman" w:cs="Times New Roman"/>
+          <w:b/>
+          <w:bCs/>
+          <w:color w:val="1F1F1F"/>
+          <w:sz w:val="26"/>
+          <w:szCs w:val="26"/>
+          <w:bdr w:val="none" w:sz="0" w:space="0" w:color="auto" w:frame="1"/>
+          <w:lang w:val="vi-VN" w:eastAsia="vi-VN"/>
+        </w:rPr>
+        <w:t>Bước 2:</w:t>
+      </w:r>
+      <w:r>
+        <w:rPr>
+          <w:rFonts w:ascii="Times New Roman" w:eastAsia="Times New Roman" w:hAnsi="Times New Roman" w:cs="Times New Roman"/>
+          <w:color w:val="1F1F1F"/>
+          <w:sz w:val="26"/>
+          <w:szCs w:val="26"/>
+          <w:lang w:val="vi-VN" w:eastAsia="vi-VN"/>
+        </w:rPr>
+        <w:t xml:space="preserve"> Quản lý lập lịch phân công làm việc chi tiết cho lực lượng Nha sĩ và Y tá theo từng ca hoặc khung giờ trong ngày.</w:t>
+      </w:r>
+    </w:p>
+    <w:p>
+      <w:pPr>
+        <w:spacing w:before="100" w:beforeAutospacing="1" w:after="0" w:line="240" w:lineRule="auto"/>
+        <w:ind w:left="720"/>
+        <w:rPr>
+          <w:rFonts w:ascii="Times New Roman" w:eastAsia="Times New Roman" w:hAnsi="Times New Roman" w:cs="Times New Roman"/>
+          <w:color w:val="1F1F1F"/>
+          <w:sz w:val="26"/>
+          <w:szCs w:val="26"/>
+          <w:lang w:val="vi-VN" w:eastAsia="vi-VN"/>
+        </w:rPr>
+      </w:pPr>
+      <w:r>
+        <w:rPr>
+          <w:rFonts w:ascii="Times New Roman" w:eastAsia="Times New Roman" w:hAnsi="Times New Roman" w:cs="Times New Roman"/>
+          <w:b/>
+          <w:bCs/>
+          <w:color w:val="1F1F1F"/>
+          <w:sz w:val="26"/>
+          <w:szCs w:val="26"/>
+          <w:bdr w:val="none" w:sz="0" w:space="0" w:color="auto" w:frame="1"/>
+          <w:lang w:val="vi-VN" w:eastAsia="vi-VN"/>
+        </w:rPr>
+        <w:t>Bước 3:</w:t>
+      </w:r>
+      <w:r>
+        <w:rPr>
+          <w:rFonts w:ascii="Times New Roman" w:eastAsia="Times New Roman" w:hAnsi="Times New Roman" w:cs="Times New Roman"/>
+          <w:color w:val="1F1F1F"/>
+          <w:sz w:val="26"/>
+          <w:szCs w:val="26"/>
+          <w:lang w:val="vi-VN" w:eastAsia="vi-VN"/>
+        </w:rPr>
+        <w:t xml:space="preserve"> Nha sĩ và Y tá truy cập hệ thống để chủ động xem lịch làm việc cá nhân và danh sách bệnh nhân phân công trong ca trực.</w:t>
+      </w:r>
+    </w:p>
+    <w:p>
+      <w:pPr>
+        <w:spacing w:before="100" w:beforeAutospacing="1" w:after="0" w:line="240" w:lineRule="auto"/>
+        <w:ind w:left="720"/>
+        <w:rPr>
+          <w:rFonts w:ascii="Times New Roman" w:eastAsia="Times New Roman" w:hAnsi="Times New Roman" w:cs="Times New Roman"/>
+          <w:color w:val="1F1F1F"/>
+          <w:sz w:val="26"/>
+          <w:szCs w:val="26"/>
+          <w:lang w:val="vi-VN" w:eastAsia="vi-VN"/>
+        </w:rPr>
+      </w:pPr>
+      <w:r>
+        <w:rPr>
+          <w:rFonts w:ascii="Times New Roman" w:eastAsia="Times New Roman" w:hAnsi="Times New Roman" w:cs="Times New Roman"/>
+          <w:b/>
+          <w:bCs/>
+          <w:color w:val="1F1F1F"/>
+          <w:sz w:val="26"/>
+          <w:szCs w:val="26"/>
+          <w:bdr w:val="none" w:sz="0" w:space="0" w:color="auto" w:frame="1"/>
+          <w:lang w:val="vi-VN" w:eastAsia="vi-VN"/>
+        </w:rPr>
+        <w:t>Bước 4:</w:t>
+      </w:r>
+      <w:r>
+        <w:rPr>
+          <w:rFonts w:ascii="Times New Roman" w:eastAsia="Times New Roman" w:hAnsi="Times New Roman" w:cs="Times New Roman"/>
+          <w:color w:val="1F1F1F"/>
+          <w:sz w:val="26"/>
+          <w:szCs w:val="26"/>
+          <w:lang w:val="vi-VN" w:eastAsia="vi-VN"/>
+        </w:rPr>
+        <w:t xml:space="preserve"> Y tá chuẩn bị dụng cụ, vật tư y tế và sắp xếp phòng khám sẵn sàng theo danh sách phân công trước phiên làm việc.</w:t>
+      </w:r>
+    </w:p>
+    <w:p>
+      <w:pPr>
+        <w:spacing w:before="100" w:beforeAutospacing="1" w:after="0" w:line="240" w:lineRule="auto"/>
+        <w:ind w:firstLine="720"/>
+        <w:outlineLvl w:val="2"/>
+        <w:rPr>
+          <w:rFonts w:ascii="Times New Roman" w:eastAsia="Times New Roman" w:hAnsi="Times New Roman" w:cs="Times New Roman"/>
+          <w:b/>
+          <w:bCs/>
+          <w:color w:val="1F1F1F"/>
+          <w:sz w:val="26"/>
+          <w:szCs w:val="26"/>
+          <w:lang w:val="vi-VN" w:eastAsia="vi-VN"/>
+        </w:rPr>
+      </w:pPr>
+      <w:r>
+        <w:rPr>
+          <w:rFonts w:ascii="Times New Roman" w:eastAsia="Times New Roman" w:hAnsi="Times New Roman" w:cs="Times New Roman"/>
+          <w:b/>
+          <w:bCs/>
+          <w:color w:val="1F1F1F"/>
+          <w:sz w:val="26"/>
+          <w:szCs w:val="26"/>
+          <w:bdr w:val="none" w:sz="0" w:space="0" w:color="auto" w:frame="1"/>
+          <w:lang w:val="vi-VN" w:eastAsia="vi-VN"/>
+        </w:rPr>
+        <w:t>2. Quy trình Đăng ký và Tiếp nhận thông tin Bệnh nhân</w:t>
+      </w:r>
+    </w:p>
+    <w:p>
+      <w:pPr>
+        <w:spacing w:before="100" w:beforeAutospacing="1" w:after="0" w:line="240" w:lineRule="auto"/>
+        <w:ind w:left="720"/>
+        <w:rPr>
+          <w:rFonts w:ascii="Times New Roman" w:eastAsia="Times New Roman" w:hAnsi="Times New Roman" w:cs="Times New Roman"/>
+          <w:color w:val="1F1F1F"/>
+          <w:sz w:val="26"/>
+          <w:szCs w:val="26"/>
+          <w:lang w:val="vi-VN" w:eastAsia="vi-VN"/>
+        </w:rPr>
+      </w:pPr>
+      <w:r>
+        <w:rPr>
+          <w:rFonts w:ascii="Times New Roman" w:eastAsia="Times New Roman" w:hAnsi="Times New Roman" w:cs="Times New Roman"/>
+          <w:b/>
+          <w:bCs/>
+          <w:color w:val="1F1F1F"/>
+          <w:sz w:val="26"/>
+          <w:szCs w:val="26"/>
+          <w:bdr w:val="none" w:sz="0" w:space="0" w:color="auto" w:frame="1"/>
+          <w:lang w:val="vi-VN" w:eastAsia="vi-VN"/>
+        </w:rPr>
+        <w:t>Bước 1:</w:t>
+      </w:r>
+      <w:r>
+        <w:rPr>
+          <w:rFonts w:ascii="Times New Roman" w:eastAsia="Times New Roman" w:hAnsi="Times New Roman" w:cs="Times New Roman"/>
+          <w:color w:val="1F1F1F"/>
+          <w:sz w:val="26"/>
+          <w:szCs w:val="26"/>
+          <w:lang w:val="vi-VN" w:eastAsia="vi-VN"/>
+        </w:rPr>
+        <w:t xml:space="preserve"> Lễ tân tiếp nhận thông tin khi bệnh nhân đến khám trực tiếp hoặc liên hệ từ xa.</w:t>
+      </w:r>
+    </w:p>
+    <w:p>
+      <w:pPr>
+        <w:spacing w:before="100" w:beforeAutospacing="1" w:after="0" w:line="240" w:lineRule="auto"/>
+        <w:ind w:left="720"/>
+        <w:rPr>
+          <w:rFonts w:ascii="Times New Roman" w:eastAsia="Times New Roman" w:hAnsi="Times New Roman" w:cs="Times New Roman"/>
+          <w:color w:val="1F1F1F"/>
+          <w:sz w:val="26"/>
+          <w:szCs w:val="26"/>
+          <w:lang w:val="vi-VN" w:eastAsia="vi-VN"/>
+        </w:rPr>
+      </w:pPr>
+      <w:r>
+        <w:rPr>
+          <w:rFonts w:ascii="Times New Roman" w:eastAsia="Times New Roman" w:hAnsi="Times New Roman" w:cs="Times New Roman"/>
+          <w:b/>
+          <w:bCs/>
+          <w:color w:val="1F1F1F"/>
+          <w:sz w:val="26"/>
+          <w:szCs w:val="26"/>
+          <w:bdr w:val="none" w:sz="0" w:space="0" w:color="auto" w:frame="1"/>
+          <w:lang w:val="vi-VN" w:eastAsia="vi-VN"/>
+        </w:rPr>
+        <w:t>Bước 2:</w:t>
+      </w:r>
+      <w:r>
+        <w:rPr>
+          <w:rFonts w:ascii="Times New Roman" w:eastAsia="Times New Roman" w:hAnsi="Times New Roman" w:cs="Times New Roman"/>
+          <w:color w:val="1F1F1F"/>
+          <w:sz w:val="26"/>
+          <w:szCs w:val="26"/>
+          <w:lang w:val="vi-VN" w:eastAsia="vi-VN"/>
+        </w:rPr>
+        <w:t xml:space="preserve"> Lễ tân thu thập các dữ liệu hành chính (Họ tên, ngày sinh, giới tính, số điện thoại, địa chỉ, nguồn khách hàng) và thông tin y khoa ban đầu (tiền sử dị ứng, bệnh lý nền).</w:t>
+      </w:r>
+    </w:p>
+    <w:p>
+      <w:pPr>
+        <w:spacing w:before="100" w:beforeAutospacing="1" w:after="0" w:line="240" w:lineRule="auto"/>
+        <w:ind w:left="720"/>
+        <w:rPr>
+          <w:rFonts w:ascii="Times New Roman" w:eastAsia="Times New Roman" w:hAnsi="Times New Roman" w:cs="Times New Roman"/>
+          <w:color w:val="1F1F1F"/>
+          <w:sz w:val="26"/>
+          <w:szCs w:val="26"/>
+          <w:lang w:val="vi-VN" w:eastAsia="vi-VN"/>
+        </w:rPr>
+      </w:pPr>
+      <w:r>
+        <w:rPr>
+          <w:rFonts w:ascii="Times New Roman" w:eastAsia="Times New Roman" w:hAnsi="Times New Roman" w:cs="Times New Roman"/>
+          <w:b/>
+          <w:bCs/>
+          <w:color w:val="1F1F1F"/>
+          <w:sz w:val="26"/>
+          <w:szCs w:val="26"/>
+          <w:bdr w:val="none" w:sz="0" w:space="0" w:color="auto" w:frame="1"/>
+          <w:lang w:val="vi-VN" w:eastAsia="vi-VN"/>
+        </w:rPr>
+        <w:t>Bước 3:</w:t>
+      </w:r>
+      <w:r>
+        <w:rPr>
+          <w:rFonts w:ascii="Times New Roman" w:eastAsia="Times New Roman" w:hAnsi="Times New Roman" w:cs="Times New Roman"/>
+          <w:color w:val="1F1F1F"/>
+          <w:sz w:val="26"/>
+          <w:szCs w:val="26"/>
+          <w:lang w:val="vi-VN" w:eastAsia="vi-VN"/>
+        </w:rPr>
+        <w:t xml:space="preserve"> Hệ thống kích hoạt cơ chế kiểm tra trùng lặp thông tin qua số điện thoại để tránh tạo hồ sơ thừa.</w:t>
+      </w:r>
+    </w:p>
+    <w:p>
+      <w:pPr>
+        <w:spacing w:before="100" w:beforeAutospacing="1" w:after="0" w:line="240" w:lineRule="auto"/>
+        <w:ind w:left="720"/>
+        <w:rPr>
+          <w:rFonts w:ascii="Times New Roman" w:eastAsia="Times New Roman" w:hAnsi="Times New Roman" w:cs="Times New Roman"/>
+          <w:color w:val="1F1F1F"/>
+          <w:sz w:val="26"/>
+          <w:szCs w:val="26"/>
+          <w:lang w:val="vi-VN" w:eastAsia="vi-VN"/>
+        </w:rPr>
+      </w:pPr>
+      <w:r>
+        <w:rPr>
+          <w:rFonts w:ascii="Times New Roman" w:eastAsia="Times New Roman" w:hAnsi="Times New Roman" w:cs="Times New Roman"/>
+          <w:b/>
+          <w:bCs/>
+          <w:color w:val="1F1F1F"/>
+          <w:sz w:val="26"/>
+          <w:szCs w:val="26"/>
+          <w:bdr w:val="none" w:sz="0" w:space="0" w:color="auto" w:frame="1"/>
+          <w:lang w:val="vi-VN" w:eastAsia="vi-VN"/>
+        </w:rPr>
+        <w:t>Bước 4:</w:t>
+      </w:r>
+      <w:r>
+        <w:rPr>
+          <w:rFonts w:ascii="Times New Roman" w:eastAsia="Times New Roman" w:hAnsi="Times New Roman" w:cs="Times New Roman"/>
+          <w:color w:val="1F1F1F"/>
+          <w:sz w:val="26"/>
+          <w:szCs w:val="26"/>
+          <w:lang w:val="vi-VN" w:eastAsia="vi-VN"/>
+        </w:rPr>
+        <w:t xml:space="preserve"> Hệ thống tự động khởi tạo Mã bệnh nhân duy nhất và tạo Hồ sơ bệnh nhân điện tử (EMR) lưu trữ tập trung.</w:t>
+      </w:r>
+    </w:p>
+    <w:p>
+      <w:pPr>
+        <w:spacing w:before="100" w:beforeAutospacing="1" w:after="0" w:line="240" w:lineRule="auto"/>
+        <w:ind w:firstLine="720"/>
+        <w:outlineLvl w:val="2"/>
+        <w:rPr>
+          <w:rFonts w:ascii="Times New Roman" w:eastAsia="Times New Roman" w:hAnsi="Times New Roman" w:cs="Times New Roman"/>
+          <w:b/>
+          <w:bCs/>
+          <w:color w:val="1F1F1F"/>
+          <w:sz w:val="26"/>
+          <w:szCs w:val="26"/>
+          <w:lang w:val="vi-VN" w:eastAsia="vi-VN"/>
+        </w:rPr>
+      </w:pPr>
+      <w:r>
+        <w:rPr>
+          <w:rFonts w:ascii="Times New Roman" w:eastAsia="Times New Roman" w:hAnsi="Times New Roman" w:cs="Times New Roman"/>
+          <w:b/>
+          <w:bCs/>
+          <w:color w:val="1F1F1F"/>
+          <w:sz w:val="26"/>
+          <w:szCs w:val="26"/>
+          <w:bdr w:val="none" w:sz="0" w:space="0" w:color="auto" w:frame="1"/>
+          <w:lang w:val="vi-VN" w:eastAsia="vi-VN"/>
+        </w:rPr>
+        <w:t>3. Quy trình Đặt lịch hẹn và Điều phối Check-in</w:t>
+      </w:r>
+    </w:p>
+    <w:p>
+      <w:pPr>
+        <w:spacing w:before="100" w:beforeAutospacing="1" w:after="0" w:line="240" w:lineRule="auto"/>
+        <w:ind w:left="720"/>
+        <w:rPr>
+          <w:rFonts w:ascii="Times New Roman" w:eastAsia="Times New Roman" w:hAnsi="Times New Roman" w:cs="Times New Roman"/>
+          <w:color w:val="1F1F1F"/>
+          <w:sz w:val="26"/>
+          <w:szCs w:val="26"/>
+          <w:lang w:val="vi-VN" w:eastAsia="vi-VN"/>
+        </w:rPr>
+      </w:pPr>
+      <w:r>
+        <w:rPr>
+          <w:rFonts w:ascii="Times New Roman" w:eastAsia="Times New Roman" w:hAnsi="Times New Roman" w:cs="Times New Roman"/>
+          <w:b/>
+          <w:bCs/>
+          <w:color w:val="1F1F1F"/>
+          <w:sz w:val="26"/>
+          <w:szCs w:val="26"/>
+          <w:bdr w:val="none" w:sz="0" w:space="0" w:color="auto" w:frame="1"/>
+          <w:lang w:val="vi-VN" w:eastAsia="vi-VN"/>
+        </w:rPr>
+        <w:t>Bước 1:</w:t>
+      </w:r>
+      <w:r>
+        <w:rPr>
+          <w:rFonts w:ascii="Times New Roman" w:eastAsia="Times New Roman" w:hAnsi="Times New Roman" w:cs="Times New Roman"/>
+          <w:color w:val="1F1F1F"/>
+          <w:sz w:val="26"/>
+          <w:szCs w:val="26"/>
+          <w:lang w:val="vi-VN" w:eastAsia="vi-VN"/>
+        </w:rPr>
+        <w:t xml:space="preserve"> Lễ tân quan sát khung giờ trống của Nha sĩ và ghế khám trên hệ thống để đăng ký lịch hẹn khám mới hoặc tái khám.</w:t>
+      </w:r>
+    </w:p>
+    <w:p>
+      <w:pPr>
+        <w:spacing w:before="100" w:beforeAutospacing="1" w:after="0" w:line="240" w:lineRule="auto"/>
+        <w:ind w:left="720"/>
+        <w:rPr>
+          <w:rFonts w:ascii="Times New Roman" w:eastAsia="Times New Roman" w:hAnsi="Times New Roman" w:cs="Times New Roman"/>
+          <w:color w:val="1F1F1F"/>
+          <w:sz w:val="26"/>
+          <w:szCs w:val="26"/>
+          <w:lang w:val="vi-VN" w:eastAsia="vi-VN"/>
+        </w:rPr>
+      </w:pPr>
+      <w:r>
+        <w:rPr>
+          <w:rFonts w:ascii="Times New Roman" w:eastAsia="Times New Roman" w:hAnsi="Times New Roman" w:cs="Times New Roman"/>
+          <w:b/>
+          <w:bCs/>
+          <w:color w:val="1F1F1F"/>
+          <w:sz w:val="26"/>
+          <w:szCs w:val="26"/>
+          <w:bdr w:val="none" w:sz="0" w:space="0" w:color="auto" w:frame="1"/>
+          <w:lang w:val="vi-VN" w:eastAsia="vi-VN"/>
+        </w:rPr>
+        <w:t>Bước 2:</w:t>
+      </w:r>
+      <w:r>
+        <w:rPr>
+          <w:rFonts w:ascii="Times New Roman" w:eastAsia="Times New Roman" w:hAnsi="Times New Roman" w:cs="Times New Roman"/>
+          <w:color w:val="1F1F1F"/>
+          <w:sz w:val="26"/>
+          <w:szCs w:val="26"/>
+          <w:lang w:val="vi-VN" w:eastAsia="vi-VN"/>
+        </w:rPr>
+        <w:t xml:space="preserve"> Hệ thống tự động tạo danh sách nhắc lịch hoặc gửi thông báo nhắc hẹn cho bệnh nhân trước ngày khám.</w:t>
+      </w:r>
+    </w:p>
+    <w:p>
+      <w:pPr>
+        <w:spacing w:before="100" w:beforeAutospacing="1" w:after="0" w:line="240" w:lineRule="auto"/>
+        <w:ind w:left="720"/>
+        <w:rPr>
+          <w:rFonts w:ascii="Times New Roman" w:eastAsia="Times New Roman" w:hAnsi="Times New Roman" w:cs="Times New Roman"/>
+          <w:color w:val="1F1F1F"/>
+          <w:sz w:val="26"/>
+          <w:szCs w:val="26"/>
+          <w:lang w:val="vi-VN" w:eastAsia="vi-VN"/>
+        </w:rPr>
+      </w:pPr>
+      <w:r>
+        <w:rPr>
+          <w:rFonts w:ascii="Times New Roman" w:eastAsia="Times New Roman" w:hAnsi="Times New Roman" w:cs="Times New Roman"/>
+          <w:b/>
+          <w:bCs/>
+          <w:color w:val="1F1F1F"/>
+          <w:sz w:val="26"/>
+          <w:szCs w:val="26"/>
+          <w:bdr w:val="none" w:sz="0" w:space="0" w:color="auto" w:frame="1"/>
+          <w:lang w:val="vi-VN" w:eastAsia="vi-VN"/>
+        </w:rPr>
+        <w:t>Bước 3:</w:t>
+      </w:r>
+      <w:r>
+        <w:rPr>
+          <w:rFonts w:ascii="Times New Roman" w:eastAsia="Times New Roman" w:hAnsi="Times New Roman" w:cs="Times New Roman"/>
+          <w:color w:val="1F1F1F"/>
+          <w:sz w:val="26"/>
+          <w:szCs w:val="26"/>
+          <w:lang w:val="vi-VN" w:eastAsia="vi-VN"/>
+        </w:rPr>
+        <w:t xml:space="preserve"> Khi bệnh nhân tới phòng khám, Lễ tân thực hiện thao tác Check-in, chuyển trạng thái lịch hẹn sang danh sách chờ của phòng khám tương ứng.</w:t>
+      </w:r>
+    </w:p>
+    <w:p>
+      <w:pPr>
+        <w:spacing w:before="100" w:beforeAutospacing="1" w:after="0" w:line="240" w:lineRule="auto"/>
+        <w:ind w:left="720"/>
+        <w:rPr>
+          <w:rFonts w:ascii="Times New Roman" w:eastAsia="Times New Roman" w:hAnsi="Times New Roman" w:cs="Times New Roman"/>
+          <w:color w:val="1F1F1F"/>
+          <w:sz w:val="26"/>
+          <w:szCs w:val="26"/>
+          <w:lang w:val="vi-VN" w:eastAsia="vi-VN"/>
+        </w:rPr>
+      </w:pPr>
+      <w:r>
+        <w:rPr>
+          <w:rFonts w:ascii="Times New Roman" w:eastAsia="Times New Roman" w:hAnsi="Times New Roman" w:cs="Times New Roman"/>
+          <w:b/>
+          <w:bCs/>
+          <w:color w:val="1F1F1F"/>
+          <w:sz w:val="26"/>
+          <w:szCs w:val="26"/>
+          <w:bdr w:val="none" w:sz="0" w:space="0" w:color="auto" w:frame="1"/>
+          <w:lang w:val="vi-VN" w:eastAsia="vi-VN"/>
+        </w:rPr>
+        <w:t>Bước 4:</w:t>
+      </w:r>
+      <w:r>
+        <w:rPr>
+          <w:rFonts w:ascii="Times New Roman" w:eastAsia="Times New Roman" w:hAnsi="Times New Roman" w:cs="Times New Roman"/>
+          <w:color w:val="1F1F1F"/>
+          <w:sz w:val="26"/>
+          <w:szCs w:val="26"/>
+          <w:lang w:val="vi-VN" w:eastAsia="vi-VN"/>
+        </w:rPr>
+        <w:t xml:space="preserve"> Trạng thái bệnh nhân tự động chuyển thành "Sẵn sàng" tại phòng điều trị. Nha sĩ/Y tá bấm tiếp nhận khám, hệ thống cập nhật trạng thái thành "Đang khám" theo thời gian thực.</w:t>
+      </w:r>
+    </w:p>
+    <w:p>
+      <w:pPr>
+        <w:spacing w:before="100" w:beforeAutospacing="1" w:after="0" w:line="240" w:lineRule="auto"/>
+        <w:ind w:firstLine="720"/>
+        <w:outlineLvl w:val="2"/>
+        <w:rPr>
+          <w:rFonts w:ascii="Times New Roman" w:eastAsia="Times New Roman" w:hAnsi="Times New Roman" w:cs="Times New Roman"/>
+          <w:b/>
+          <w:bCs/>
+          <w:color w:val="1F1F1F"/>
+          <w:sz w:val="26"/>
+          <w:szCs w:val="26"/>
+          <w:lang w:val="vi-VN" w:eastAsia="vi-VN"/>
+        </w:rPr>
+      </w:pPr>
+      <w:r>
+        <w:rPr>
+          <w:rFonts w:ascii="Times New Roman" w:eastAsia="Times New Roman" w:hAnsi="Times New Roman" w:cs="Times New Roman"/>
+          <w:b/>
+          <w:bCs/>
+          <w:color w:val="1F1F1F"/>
+          <w:sz w:val="26"/>
+          <w:szCs w:val="26"/>
+          <w:bdr w:val="none" w:sz="0" w:space="0" w:color="auto" w:frame="1"/>
+          <w:lang w:val="vi-VN" w:eastAsia="vi-VN"/>
+        </w:rPr>
+        <w:t>4. Quy trình Chẩn đoán, Điều trị và Kê đơn</w:t>
+      </w:r>
+    </w:p>
+    <w:p>
+      <w:pPr>
+        <w:spacing w:before="100" w:beforeAutospacing="1" w:after="0" w:line="240" w:lineRule="auto"/>
+        <w:ind w:left="720"/>
+        <w:rPr>
+          <w:rFonts w:ascii="Times New Roman" w:eastAsia="Times New Roman" w:hAnsi="Times New Roman" w:cs="Times New Roman"/>
+          <w:color w:val="1F1F1F"/>
+          <w:sz w:val="26"/>
+          <w:szCs w:val="26"/>
+          <w:lang w:val="vi-VN" w:eastAsia="vi-VN"/>
+        </w:rPr>
+      </w:pPr>
+      <w:r>
+        <w:rPr>
+          <w:rFonts w:ascii="Times New Roman" w:eastAsia="Times New Roman" w:hAnsi="Times New Roman" w:cs="Times New Roman"/>
+          <w:b/>
+          <w:bCs/>
+          <w:color w:val="1F1F1F"/>
+          <w:sz w:val="26"/>
+          <w:szCs w:val="26"/>
+          <w:bdr w:val="none" w:sz="0" w:space="0" w:color="auto" w:frame="1"/>
+          <w:lang w:val="vi-VN" w:eastAsia="vi-VN"/>
+        </w:rPr>
+        <w:t>Bước 1:</w:t>
+      </w:r>
+      <w:r>
+        <w:rPr>
+          <w:rFonts w:ascii="Times New Roman" w:eastAsia="Times New Roman" w:hAnsi="Times New Roman" w:cs="Times New Roman"/>
+          <w:color w:val="1F1F1F"/>
+          <w:sz w:val="26"/>
+          <w:szCs w:val="26"/>
+          <w:lang w:val="vi-VN" w:eastAsia="vi-VN"/>
+        </w:rPr>
+        <w:t xml:space="preserve"> Nha sĩ truy xuất Hồ sơ bệnh án điện tử, xem lại lịch sử khám và tiền sử bệnh lý.</w:t>
+      </w:r>
+    </w:p>
+    <w:p>
+      <w:pPr>
+        <w:spacing w:before="100" w:beforeAutospacing="1" w:after="0" w:line="240" w:lineRule="auto"/>
+        <w:ind w:left="720"/>
+        <w:rPr>
+          <w:rFonts w:ascii="Times New Roman" w:eastAsia="Times New Roman" w:hAnsi="Times New Roman" w:cs="Times New Roman"/>
+          <w:color w:val="1F1F1F"/>
+          <w:sz w:val="26"/>
+          <w:szCs w:val="26"/>
+          <w:lang w:val="vi-VN" w:eastAsia="vi-VN"/>
+        </w:rPr>
+      </w:pPr>
+      <w:r>
+        <w:rPr>
+          <w:rFonts w:ascii="Times New Roman" w:eastAsia="Times New Roman" w:hAnsi="Times New Roman" w:cs="Times New Roman"/>
+          <w:b/>
+          <w:bCs/>
+          <w:color w:val="1F1F1F"/>
+          <w:sz w:val="26"/>
+          <w:szCs w:val="26"/>
+          <w:bdr w:val="none" w:sz="0" w:space="0" w:color="auto" w:frame="1"/>
+          <w:lang w:val="vi-VN" w:eastAsia="vi-VN"/>
+        </w:rPr>
+        <w:lastRenderedPageBreak/>
+        <w:t>Bước 2:</w:t>
+      </w:r>
+      <w:r>
+        <w:rPr>
+          <w:rFonts w:ascii="Times New Roman" w:eastAsia="Times New Roman" w:hAnsi="Times New Roman" w:cs="Times New Roman"/>
+          <w:color w:val="1F1F1F"/>
+          <w:sz w:val="26"/>
+          <w:szCs w:val="26"/>
+          <w:lang w:val="vi-VN" w:eastAsia="vi-VN"/>
+        </w:rPr>
+        <w:t xml:space="preserve"> Nha sĩ cập nhật tình trạng răng, chỉ số nha chu trực tiếp trên sơ đồ răng 2D/3D và tải các tệp phim X-quang, hình ảnh thực tế lên hệ thống.</w:t>
+      </w:r>
+    </w:p>
+    <w:p>
+      <w:pPr>
+        <w:spacing w:before="100" w:beforeAutospacing="1" w:after="0" w:line="240" w:lineRule="auto"/>
+        <w:ind w:left="720"/>
+        <w:rPr>
+          <w:rFonts w:ascii="Times New Roman" w:eastAsia="Times New Roman" w:hAnsi="Times New Roman" w:cs="Times New Roman"/>
+          <w:color w:val="1F1F1F"/>
+          <w:sz w:val="26"/>
+          <w:szCs w:val="26"/>
+          <w:lang w:val="vi-VN" w:eastAsia="vi-VN"/>
+        </w:rPr>
+      </w:pPr>
+      <w:r>
+        <w:rPr>
+          <w:rFonts w:ascii="Times New Roman" w:eastAsia="Times New Roman" w:hAnsi="Times New Roman" w:cs="Times New Roman"/>
+          <w:b/>
+          <w:bCs/>
+          <w:color w:val="1F1F1F"/>
+          <w:sz w:val="26"/>
+          <w:szCs w:val="26"/>
+          <w:bdr w:val="none" w:sz="0" w:space="0" w:color="auto" w:frame="1"/>
+          <w:lang w:val="vi-VN" w:eastAsia="vi-VN"/>
+        </w:rPr>
+        <w:t>Bước 3:</w:t>
+      </w:r>
+      <w:r>
+        <w:rPr>
+          <w:rFonts w:ascii="Times New Roman" w:eastAsia="Times New Roman" w:hAnsi="Times New Roman" w:cs="Times New Roman"/>
+          <w:color w:val="1F1F1F"/>
+          <w:sz w:val="26"/>
+          <w:szCs w:val="26"/>
+          <w:lang w:val="vi-VN" w:eastAsia="vi-VN"/>
+        </w:rPr>
+        <w:t xml:space="preserve"> Nha sĩ thực hiện thủ thuật điều trị, lập kế hoạch điều trị theo giai đoạn (đối với các ca phức tạp như Niềng răng, Implant) và lưu thông tin vào nhật ký thủ thuật.</w:t>
+      </w:r>
+    </w:p>
+    <w:p>
+      <w:pPr>
+        <w:spacing w:before="100" w:beforeAutospacing="1" w:after="0" w:line="240" w:lineRule="auto"/>
+        <w:ind w:left="720"/>
+        <w:rPr>
+          <w:rFonts w:ascii="Times New Roman" w:eastAsia="Times New Roman" w:hAnsi="Times New Roman" w:cs="Times New Roman"/>
+          <w:color w:val="1F1F1F"/>
+          <w:sz w:val="26"/>
+          <w:szCs w:val="26"/>
+          <w:lang w:val="vi-VN" w:eastAsia="vi-VN"/>
+        </w:rPr>
+      </w:pPr>
+      <w:r>
+        <w:rPr>
+          <w:rFonts w:ascii="Times New Roman" w:eastAsia="Times New Roman" w:hAnsi="Times New Roman" w:cs="Times New Roman"/>
+          <w:b/>
+          <w:bCs/>
+          <w:color w:val="1F1F1F"/>
+          <w:sz w:val="26"/>
+          <w:szCs w:val="26"/>
+          <w:bdr w:val="none" w:sz="0" w:space="0" w:color="auto" w:frame="1"/>
+          <w:lang w:val="vi-VN" w:eastAsia="vi-VN"/>
+        </w:rPr>
+        <w:t>Bước 4:</w:t>
+      </w:r>
+      <w:r>
+        <w:rPr>
+          <w:rFonts w:ascii="Times New Roman" w:eastAsia="Times New Roman" w:hAnsi="Times New Roman" w:cs="Times New Roman"/>
+          <w:color w:val="1F1F1F"/>
+          <w:sz w:val="26"/>
+          <w:szCs w:val="26"/>
+          <w:lang w:val="vi-VN" w:eastAsia="vi-VN"/>
+        </w:rPr>
+        <w:t xml:space="preserve"> Nha sĩ kê đơn thuốc điện tử ngay trên hệ thống và chuyển thông tin sang khâu tiếp theo.</w:t>
+      </w:r>
+    </w:p>
+    <w:p>
+      <w:pPr>
+        <w:spacing w:before="100" w:beforeAutospacing="1" w:after="0" w:line="240" w:lineRule="auto"/>
+        <w:ind w:firstLine="720"/>
+        <w:outlineLvl w:val="2"/>
+        <w:rPr>
+          <w:rFonts w:ascii="Times New Roman" w:eastAsia="Times New Roman" w:hAnsi="Times New Roman" w:cs="Times New Roman"/>
+          <w:b/>
+          <w:bCs/>
+          <w:color w:val="1F1F1F"/>
+          <w:sz w:val="26"/>
+          <w:szCs w:val="26"/>
+          <w:lang w:val="vi-VN" w:eastAsia="vi-VN"/>
+        </w:rPr>
+      </w:pPr>
+      <w:r>
+        <w:rPr>
+          <w:rFonts w:ascii="Times New Roman" w:eastAsia="Times New Roman" w:hAnsi="Times New Roman" w:cs="Times New Roman"/>
+          <w:b/>
+          <w:bCs/>
+          <w:color w:val="1F1F1F"/>
+          <w:sz w:val="26"/>
+          <w:szCs w:val="26"/>
+          <w:bdr w:val="none" w:sz="0" w:space="0" w:color="auto" w:frame="1"/>
+          <w:lang w:val="vi-VN" w:eastAsia="vi-VN"/>
+        </w:rPr>
+        <w:t>5. Quy trình Thanh toán và Hẹn tái khám</w:t>
+      </w:r>
+    </w:p>
+    <w:p>
+      <w:pPr>
+        <w:spacing w:before="100" w:beforeAutospacing="1" w:after="0" w:line="240" w:lineRule="auto"/>
+        <w:ind w:left="720"/>
+        <w:rPr>
+          <w:rFonts w:ascii="Times New Roman" w:eastAsia="Times New Roman" w:hAnsi="Times New Roman" w:cs="Times New Roman"/>
+          <w:color w:val="1F1F1F"/>
+          <w:sz w:val="26"/>
+          <w:szCs w:val="26"/>
+          <w:lang w:val="vi-VN" w:eastAsia="vi-VN"/>
+        </w:rPr>
+      </w:pPr>
+      <w:r>
+        <w:rPr>
+          <w:rFonts w:ascii="Times New Roman" w:eastAsia="Times New Roman" w:hAnsi="Times New Roman" w:cs="Times New Roman"/>
+          <w:b/>
+          <w:bCs/>
+          <w:color w:val="1F1F1F"/>
+          <w:sz w:val="26"/>
+          <w:szCs w:val="26"/>
+          <w:bdr w:val="none" w:sz="0" w:space="0" w:color="auto" w:frame="1"/>
+          <w:lang w:val="vi-VN" w:eastAsia="vi-VN"/>
+        </w:rPr>
+        <w:t>Bước 1:</w:t>
+      </w:r>
+      <w:r>
+        <w:rPr>
+          <w:rFonts w:ascii="Times New Roman" w:eastAsia="Times New Roman" w:hAnsi="Times New Roman" w:cs="Times New Roman"/>
+          <w:color w:val="1F1F1F"/>
+          <w:sz w:val="26"/>
+          <w:szCs w:val="26"/>
+          <w:lang w:val="vi-VN" w:eastAsia="vi-VN"/>
+        </w:rPr>
+        <w:t xml:space="preserve"> Lễ tân tiếp nhận chỉ định điều trị và danh mục dịch vụ/thuốc từ Nha sĩ để lập hóa đơn thanh toán.</w:t>
+      </w:r>
+    </w:p>
+    <w:p>
+      <w:pPr>
+        <w:spacing w:before="100" w:beforeAutospacing="1" w:after="0" w:line="240" w:lineRule="auto"/>
+        <w:ind w:left="720"/>
+        <w:rPr>
+          <w:rFonts w:ascii="Times New Roman" w:eastAsia="Times New Roman" w:hAnsi="Times New Roman" w:cs="Times New Roman"/>
+          <w:color w:val="1F1F1F"/>
+          <w:sz w:val="26"/>
+          <w:szCs w:val="26"/>
+          <w:lang w:val="vi-VN" w:eastAsia="vi-VN"/>
+        </w:rPr>
+      </w:pPr>
+      <w:r>
+        <w:rPr>
+          <w:rFonts w:ascii="Times New Roman" w:eastAsia="Times New Roman" w:hAnsi="Times New Roman" w:cs="Times New Roman"/>
+          <w:b/>
+          <w:bCs/>
+          <w:color w:val="1F1F1F"/>
+          <w:sz w:val="26"/>
+          <w:szCs w:val="26"/>
+          <w:bdr w:val="none" w:sz="0" w:space="0" w:color="auto" w:frame="1"/>
+          <w:lang w:val="vi-VN" w:eastAsia="vi-VN"/>
+        </w:rPr>
+        <w:t>Bước 2:</w:t>
+      </w:r>
+      <w:r>
+        <w:rPr>
+          <w:rFonts w:ascii="Times New Roman" w:eastAsia="Times New Roman" w:hAnsi="Times New Roman" w:cs="Times New Roman"/>
+          <w:color w:val="1F1F1F"/>
+          <w:sz w:val="26"/>
+          <w:szCs w:val="26"/>
+          <w:lang w:val="vi-VN" w:eastAsia="vi-VN"/>
+        </w:rPr>
+        <w:t xml:space="preserve"> Lễ tân áp dụng các chương trình ưu đãi hoặc chia đợt thanh toán (nếu có) và thực hiện thu tiền qua các hình thức thanh toán được hỗ trợ.</w:t>
+      </w:r>
+    </w:p>
+    <w:p>
+      <w:pPr>
+        <w:spacing w:before="100" w:beforeAutospacing="1" w:after="0" w:line="240" w:lineRule="auto"/>
+        <w:ind w:left="720"/>
+        <w:rPr>
+          <w:rFonts w:ascii="Times New Roman" w:eastAsia="Times New Roman" w:hAnsi="Times New Roman" w:cs="Times New Roman"/>
+          <w:color w:val="1F1F1F"/>
+          <w:sz w:val="26"/>
+          <w:szCs w:val="26"/>
+          <w:lang w:val="vi-VN" w:eastAsia="vi-VN"/>
+        </w:rPr>
+      </w:pPr>
+      <w:r>
+        <w:rPr>
+          <w:rFonts w:ascii="Times New Roman" w:eastAsia="Times New Roman" w:hAnsi="Times New Roman" w:cs="Times New Roman"/>
+          <w:b/>
+          <w:bCs/>
+          <w:color w:val="1F1F1F"/>
+          <w:sz w:val="26"/>
+          <w:szCs w:val="26"/>
+          <w:bdr w:val="none" w:sz="0" w:space="0" w:color="auto" w:frame="1"/>
+          <w:lang w:val="vi-VN" w:eastAsia="vi-VN"/>
+        </w:rPr>
+        <w:t>Bước 3:</w:t>
+      </w:r>
+      <w:r>
+        <w:rPr>
+          <w:rFonts w:ascii="Times New Roman" w:eastAsia="Times New Roman" w:hAnsi="Times New Roman" w:cs="Times New Roman"/>
+          <w:color w:val="1F1F1F"/>
+          <w:sz w:val="26"/>
+          <w:szCs w:val="26"/>
+          <w:lang w:val="vi-VN" w:eastAsia="vi-VN"/>
+        </w:rPr>
+        <w:t xml:space="preserve"> Lễ tân hoặc Nha sĩ thiết lập lịch hẹn tái khám định kỳ trên hệ thống để theo dõi tiến trình điều trị.</w:t>
+      </w:r>
+    </w:p>
+    <w:p>
+      <w:pPr>
+        <w:spacing w:before="100" w:beforeAutospacing="1" w:after="0" w:line="240" w:lineRule="auto"/>
+        <w:ind w:left="720"/>
+        <w:rPr>
+          <w:rFonts w:ascii="Times New Roman" w:eastAsia="Times New Roman" w:hAnsi="Times New Roman" w:cs="Times New Roman"/>
+          <w:color w:val="1F1F1F"/>
+          <w:sz w:val="26"/>
+          <w:szCs w:val="26"/>
+          <w:lang w:val="vi-VN" w:eastAsia="vi-VN"/>
+        </w:rPr>
+      </w:pPr>
+      <w:r>
+        <w:rPr>
+          <w:rFonts w:ascii="Times New Roman" w:eastAsia="Times New Roman" w:hAnsi="Times New Roman" w:cs="Times New Roman"/>
+          <w:b/>
+          <w:bCs/>
+          <w:color w:val="1F1F1F"/>
+          <w:sz w:val="26"/>
+          <w:szCs w:val="26"/>
+          <w:bdr w:val="none" w:sz="0" w:space="0" w:color="auto" w:frame="1"/>
+          <w:lang w:val="vi-VN" w:eastAsia="vi-VN"/>
+        </w:rPr>
+        <w:t>Bước 4:</w:t>
+      </w:r>
+      <w:r>
+        <w:rPr>
+          <w:rFonts w:ascii="Times New Roman" w:eastAsia="Times New Roman" w:hAnsi="Times New Roman" w:cs="Times New Roman"/>
+          <w:color w:val="1F1F1F"/>
+          <w:sz w:val="26"/>
+          <w:szCs w:val="26"/>
+          <w:lang w:val="vi-VN" w:eastAsia="vi-VN"/>
+        </w:rPr>
+        <w:t xml:space="preserve"> Hệ thống ghi nhận hoàn tất phiên khám, tự động đẩy dữ liệu giao dịch vào hệ thống báo cáo tổng hợp.</w:t>
+      </w:r>
+    </w:p>
+    <w:p>
+      <w:pPr>
+        <w:spacing w:before="100" w:beforeAutospacing="1" w:after="0" w:line="240" w:lineRule="auto"/>
+        <w:ind w:firstLine="720"/>
+        <w:outlineLvl w:val="2"/>
+        <w:rPr>
+          <w:rFonts w:ascii="Times New Roman" w:eastAsia="Times New Roman" w:hAnsi="Times New Roman" w:cs="Times New Roman"/>
+          <w:b/>
+          <w:bCs/>
+          <w:color w:val="1F1F1F"/>
+          <w:sz w:val="26"/>
+          <w:szCs w:val="26"/>
+          <w:lang w:val="vi-VN" w:eastAsia="vi-VN"/>
+        </w:rPr>
+      </w:pPr>
+      <w:r>
+        <w:rPr>
+          <w:rFonts w:ascii="Times New Roman" w:eastAsia="Times New Roman" w:hAnsi="Times New Roman" w:cs="Times New Roman"/>
+          <w:b/>
+          <w:bCs/>
+          <w:color w:val="1F1F1F"/>
+          <w:sz w:val="26"/>
+          <w:szCs w:val="26"/>
+          <w:bdr w:val="none" w:sz="0" w:space="0" w:color="auto" w:frame="1"/>
+          <w:lang w:val="vi-VN" w:eastAsia="vi-VN"/>
+        </w:rPr>
+        <w:t>6. Quy trình Tổng hợp Báo cáo và Thống kê Doanh thu</w:t>
+      </w:r>
+    </w:p>
+    <w:p>
+      <w:pPr>
+        <w:spacing w:before="100" w:beforeAutospacing="1" w:after="0" w:line="240" w:lineRule="auto"/>
+        <w:ind w:left="720"/>
+        <w:rPr>
+          <w:rFonts w:ascii="Times New Roman" w:eastAsia="Times New Roman" w:hAnsi="Times New Roman" w:cs="Times New Roman"/>
+          <w:color w:val="1F1F1F"/>
+          <w:sz w:val="26"/>
+          <w:szCs w:val="26"/>
+          <w:lang w:val="vi-VN" w:eastAsia="vi-VN"/>
+        </w:rPr>
+      </w:pPr>
+      <w:r>
+        <w:rPr>
+          <w:rFonts w:ascii="Times New Roman" w:eastAsia="Times New Roman" w:hAnsi="Times New Roman" w:cs="Times New Roman"/>
+          <w:b/>
+          <w:bCs/>
+          <w:color w:val="1F1F1F"/>
+          <w:sz w:val="26"/>
+          <w:szCs w:val="26"/>
+          <w:bdr w:val="none" w:sz="0" w:space="0" w:color="auto" w:frame="1"/>
+          <w:lang w:val="vi-VN" w:eastAsia="vi-VN"/>
+        </w:rPr>
+        <w:t>Bước 1:</w:t>
+      </w:r>
+      <w:r>
+        <w:rPr>
+          <w:rFonts w:ascii="Times New Roman" w:eastAsia="Times New Roman" w:hAnsi="Times New Roman" w:cs="Times New Roman"/>
+          <w:color w:val="1F1F1F"/>
+          <w:sz w:val="26"/>
+          <w:szCs w:val="26"/>
+          <w:lang w:val="vi-VN" w:eastAsia="vi-VN"/>
+        </w:rPr>
+        <w:t xml:space="preserve"> Hệ thống tự động thu thập dữ liệu giao dịch thanh toán, vật tư tiêu hao và lượt khám từ các phân hệ vận hành.</w:t>
+      </w:r>
+    </w:p>
+    <w:p>
+      <w:pPr>
+        <w:spacing w:before="100" w:beforeAutospacing="1" w:after="0" w:line="240" w:lineRule="auto"/>
+        <w:ind w:left="720"/>
+        <w:rPr>
+          <w:rFonts w:ascii="Times New Roman" w:eastAsia="Times New Roman" w:hAnsi="Times New Roman" w:cs="Times New Roman"/>
+          <w:color w:val="1F1F1F"/>
+          <w:sz w:val="26"/>
+          <w:szCs w:val="26"/>
+          <w:lang w:val="vi-VN" w:eastAsia="vi-VN"/>
+        </w:rPr>
+      </w:pPr>
+      <w:r>
+        <w:rPr>
+          <w:rFonts w:ascii="Times New Roman" w:eastAsia="Times New Roman" w:hAnsi="Times New Roman" w:cs="Times New Roman"/>
+          <w:b/>
+          <w:bCs/>
+          <w:color w:val="1F1F1F"/>
+          <w:sz w:val="26"/>
+          <w:szCs w:val="26"/>
+          <w:bdr w:val="none" w:sz="0" w:space="0" w:color="auto" w:frame="1"/>
+          <w:lang w:val="vi-VN" w:eastAsia="vi-VN"/>
+        </w:rPr>
+        <w:t>Bước 2:</w:t>
+      </w:r>
+      <w:r>
+        <w:rPr>
+          <w:rFonts w:ascii="Times New Roman" w:eastAsia="Times New Roman" w:hAnsi="Times New Roman" w:cs="Times New Roman"/>
+          <w:color w:val="1F1F1F"/>
+          <w:sz w:val="26"/>
+          <w:szCs w:val="26"/>
+          <w:lang w:val="vi-VN" w:eastAsia="vi-VN"/>
+        </w:rPr>
+        <w:t xml:space="preserve"> Hệ thống xử lý, tính toán báo cáo doanh thu theo ngày/tháng/năm và đo lường hiệu suất làm việc của đội ngũ bác sĩ/nhân sự.</w:t>
+      </w:r>
+    </w:p>
+    <w:p>
+      <w:pPr>
+        <w:spacing w:before="100" w:beforeAutospacing="1" w:after="0" w:line="240" w:lineRule="auto"/>
+        <w:ind w:left="720"/>
+        <w:rPr>
+          <w:rFonts w:ascii="Times New Roman" w:eastAsia="Times New Roman" w:hAnsi="Times New Roman" w:cs="Times New Roman"/>
+          <w:color w:val="1F1F1F"/>
+          <w:sz w:val="26"/>
+          <w:szCs w:val="26"/>
+          <w:lang w:val="vi-VN" w:eastAsia="vi-VN"/>
+        </w:rPr>
+      </w:pPr>
+      <w:r>
+        <w:rPr>
+          <w:rFonts w:ascii="Times New Roman" w:eastAsia="Times New Roman" w:hAnsi="Times New Roman" w:cs="Times New Roman"/>
+          <w:b/>
+          <w:bCs/>
+          <w:color w:val="1F1F1F"/>
+          <w:sz w:val="26"/>
+          <w:szCs w:val="26"/>
+          <w:bdr w:val="none" w:sz="0" w:space="0" w:color="auto" w:frame="1"/>
+          <w:lang w:val="vi-VN" w:eastAsia="vi-VN"/>
+        </w:rPr>
+        <w:t>Bước 3:</w:t>
+      </w:r>
+      <w:r>
+        <w:rPr>
+          <w:rFonts w:ascii="Times New Roman" w:eastAsia="Times New Roman" w:hAnsi="Times New Roman" w:cs="Times New Roman"/>
+          <w:color w:val="1F1F1F"/>
+          <w:sz w:val="26"/>
+          <w:szCs w:val="26"/>
+          <w:lang w:val="vi-VN" w:eastAsia="vi-VN"/>
+        </w:rPr>
+        <w:t xml:space="preserve"> Nhân viên quản lý truy cập bảng điều khiển (Dashboard) để theo dõi tổng quan và truy xuất báo cáo realtime phục vụ công tác điều hành.</w:t>
+      </w:r>
+    </w:p>
+    <w:p>
+      <w:pPr>
         <w:pStyle w:val="ListParagraph"/>
         <w:spacing w:after="120" w:line="240" w:lineRule="auto"/>
         <w:jc w:val="both"/>
         <w:rPr>
           <w:rFonts w:ascii="Times New Roman" w:hAnsi="Times New Roman" w:cs="Times New Roman"/>
-          <w:bCs/>
-          <w:sz w:val="26"/>
-          <w:szCs w:val="26"/>
-          <w:lang w:val="vi-VN"/>
-        </w:rPr>
-      </w:pPr>
-      <w:r>
-        <w:rPr>
-          <w:rFonts w:ascii="Times New Roman" w:hAnsi="Times New Roman" w:cs="Times New Roman"/>
-          <w:b/>
-          <w:sz w:val="26"/>
-          <w:szCs w:val="26"/>
-          <w:lang w:val="vi-VN"/>
-        </w:rPr>
-        <w:t>-</w:t>
-      </w:r>
-      <w:r>
-        <w:rPr>
-          <w:rFonts w:ascii="Times New Roman" w:hAnsi="Times New Roman" w:cs="Times New Roman"/>
-          <w:bCs/>
-          <w:sz w:val="26"/>
-          <w:szCs w:val="26"/>
-          <w:lang w:val="vi-VN"/>
-        </w:rPr>
-        <w:t>Đăng ký bệnh nhân mới:</w:t>
-      </w:r>
-    </w:p>
-    <w:p>
-      <w:pPr>
-        <w:pStyle w:val="ListParagraph"/>
-        <w:spacing w:after="120" w:line="240" w:lineRule="auto"/>
-        <w:jc w:val="both"/>
-        <w:rPr>
-          <w:rFonts w:ascii="Times New Roman" w:hAnsi="Times New Roman" w:cs="Times New Roman"/>
-          <w:bCs/>
-          <w:sz w:val="26"/>
-          <w:szCs w:val="26"/>
-          <w:lang w:val="vi-VN"/>
-        </w:rPr>
-      </w:pPr>
-      <w:r>
-        <w:rPr>
-          <w:rFonts w:ascii="Times New Roman" w:hAnsi="Times New Roman" w:cs="Times New Roman"/>
-          <w:bCs/>
-          <w:sz w:val="26"/>
-          <w:szCs w:val="26"/>
-          <w:lang w:val="vi-VN"/>
-        </w:rPr>
-        <w:t xml:space="preserve">+Lễ tân tiếp nhận thông tin </w:t>
-      </w:r>
-      <w:r>
-        <w:rPr>
-          <w:rFonts w:ascii="Times New Roman" w:hAnsi="Times New Roman" w:cs="Times New Roman"/>
-          <w:bCs/>
-          <w:sz w:val="26"/>
-          <w:szCs w:val="26"/>
-          <w:lang w:val="vi-VN"/>
-        </w:rPr>
-        <w:t>từ bệnh nhân trực tiếp tại quầy.</w:t>
-      </w:r>
-    </w:p>
-    <w:p>
-      <w:pPr>
-        <w:pStyle w:val="ListParagraph"/>
-        <w:spacing w:after="120" w:line="240" w:lineRule="auto"/>
-        <w:jc w:val="both"/>
-        <w:rPr>
-          <w:rFonts w:ascii="Times New Roman" w:hAnsi="Times New Roman" w:cs="Times New Roman"/>
-          <w:bCs/>
-          <w:sz w:val="26"/>
-          <w:szCs w:val="26"/>
-          <w:lang w:val="vi-VN"/>
-        </w:rPr>
-      </w:pPr>
-      <w:r>
-        <w:rPr>
-          <w:rFonts w:ascii="Times New Roman" w:hAnsi="Times New Roman" w:cs="Times New Roman"/>
-          <w:bCs/>
-          <w:sz w:val="26"/>
-          <w:szCs w:val="26"/>
-          <w:lang w:val="vi-VN"/>
-        </w:rPr>
-        <w:t>+Lễ tân nhập thông tin của bệnh nhân vào hệ thống kiểm tra trùng lặp:</w:t>
-      </w:r>
-    </w:p>
-    <w:p>
-      <w:pPr>
-        <w:pStyle w:val="ListParagraph"/>
-        <w:numPr>
-          <w:ilvl w:val="0"/>
-          <w:numId w:val="7"/>
-        </w:numPr>
-        <w:spacing w:after="120" w:line="240" w:lineRule="auto"/>
-        <w:jc w:val="both"/>
-        <w:rPr>
-          <w:rFonts w:ascii="Times New Roman" w:hAnsi="Times New Roman" w:cs="Times New Roman"/>
-          <w:bCs/>
-          <w:sz w:val="26"/>
-          <w:szCs w:val="26"/>
-          <w:lang w:val="vi-VN"/>
-        </w:rPr>
-      </w:pPr>
-      <w:r>
-        <w:rPr>
-          <w:rFonts w:ascii="Times New Roman" w:hAnsi="Times New Roman" w:cs="Times New Roman"/>
-          <w:bCs/>
-          <w:sz w:val="26"/>
-          <w:szCs w:val="26"/>
-          <w:lang w:val="vi-VN"/>
-        </w:rPr>
-        <w:t>Nếu đã có: Chuyển sang điều phối bệnh nhân.</w:t>
-      </w:r>
-    </w:p>
-    <w:p>
-      <w:pPr>
-        <w:pStyle w:val="ListParagraph"/>
-        <w:numPr>
-          <w:ilvl w:val="0"/>
-          <w:numId w:val="7"/>
-        </w:numPr>
-        <w:spacing w:after="120" w:line="240" w:lineRule="auto"/>
-        <w:jc w:val="both"/>
-        <w:rPr>
-          <w:rFonts w:ascii="Times New Roman" w:hAnsi="Times New Roman" w:cs="Times New Roman"/>
-          <w:bCs/>
-          <w:sz w:val="26"/>
-          <w:szCs w:val="26"/>
-          <w:lang w:val="vi-VN"/>
-        </w:rPr>
-      </w:pPr>
-      <w:r>
-        <w:rPr>
-          <w:rFonts w:ascii="Times New Roman" w:hAnsi="Times New Roman" w:cs="Times New Roman"/>
-          <w:bCs/>
-          <w:sz w:val="26"/>
-          <w:szCs w:val="26"/>
-          <w:lang w:val="vi-VN"/>
-        </w:rPr>
-        <w:t>Nếu chưa có: Chuyển sang tạo hồ sơ mới.</w:t>
-      </w:r>
-    </w:p>
-    <w:p>
-      <w:pPr>
-        <w:spacing w:after="120" w:line="240" w:lineRule="auto"/>
-        <w:ind w:left="720"/>
-        <w:jc w:val="both"/>
-        <w:rPr>
-          <w:rFonts w:ascii="Times New Roman" w:hAnsi="Times New Roman" w:cs="Times New Roman"/>
-          <w:bCs/>
-          <w:sz w:val="26"/>
-          <w:szCs w:val="26"/>
-          <w:lang w:val="vi-VN"/>
-        </w:rPr>
-      </w:pPr>
-      <w:r>
-        <w:rPr>
-          <w:rFonts w:ascii="Times New Roman" w:hAnsi="Times New Roman" w:cs="Times New Roman"/>
-          <w:bCs/>
-          <w:sz w:val="26"/>
-          <w:szCs w:val="26"/>
-          <w:lang w:val="vi-VN"/>
-        </w:rPr>
-        <w:t>+Lễ tân nhập thông tin hành chính (Họ tên, Ngày sinh, Giới tính, Số điện thoại, Địa chỉ) và thông tin tiền sử y khoa (Dị ứng thuốc, bệnh lý nền nhu tim mạch, tiểu đường…).</w:t>
-      </w:r>
-    </w:p>
-    <w:p>
-      <w:pPr>
-        <w:spacing w:after="120" w:line="240" w:lineRule="auto"/>
-        <w:ind w:left="720"/>
-        <w:jc w:val="both"/>
-        <w:rPr>
-          <w:rFonts w:ascii="Times New Roman" w:hAnsi="Times New Roman" w:cs="Times New Roman"/>
-          <w:bCs/>
-          <w:sz w:val="26"/>
-          <w:szCs w:val="26"/>
-          <w:lang w:val="vi-VN"/>
-        </w:rPr>
-      </w:pPr>
-      <w:r>
-        <w:rPr>
-          <w:rFonts w:ascii="Times New Roman" w:hAnsi="Times New Roman" w:cs="Times New Roman"/>
-          <w:bCs/>
-          <w:sz w:val="26"/>
-          <w:szCs w:val="26"/>
-          <w:lang w:val="vi-VN"/>
-        </w:rPr>
-        <w:t>+Hệ thống khởi tạo mã bệnh nhân và lưu vào cơ sở dữ liệu.</w:t>
-      </w:r>
-    </w:p>
-    <w:p>
-      <w:pPr>
-        <w:spacing w:after="120" w:line="240" w:lineRule="auto"/>
-        <w:ind w:left="720"/>
-        <w:jc w:val="both"/>
-        <w:rPr>
-          <w:rFonts w:ascii="Times New Roman" w:hAnsi="Times New Roman" w:cs="Times New Roman"/>
-          <w:bCs/>
-          <w:sz w:val="26"/>
-          <w:szCs w:val="26"/>
-          <w:lang w:val="vi-VN"/>
-        </w:rPr>
-      </w:pPr>
-      <w:r>
-        <w:rPr>
-          <w:rFonts w:ascii="Times New Roman" w:hAnsi="Times New Roman" w:cs="Times New Roman"/>
-          <w:bCs/>
-          <w:sz w:val="26"/>
-          <w:szCs w:val="26"/>
-          <w:lang w:val="vi-VN"/>
-        </w:rPr>
-        <w:t xml:space="preserve">+Lễ tân xếp bệnh nhân vào danh sách </w:t>
-      </w:r>
-      <w:r>
-        <w:rPr>
-          <w:rFonts w:ascii="Times New Roman" w:hAnsi="Times New Roman" w:cs="Times New Roman"/>
-          <w:bCs/>
-          <w:sz w:val="26"/>
-          <w:szCs w:val="26"/>
-          <w:lang w:val="vi-VN"/>
-        </w:rPr>
-        <w:t>chờ.</w:t>
-      </w:r>
-    </w:p>
-    <w:p>
-      <w:pPr>
-        <w:spacing w:after="120" w:line="240" w:lineRule="auto"/>
-        <w:ind w:left="720"/>
-        <w:jc w:val="both"/>
-        <w:rPr>
-          <w:rFonts w:ascii="Times New Roman" w:hAnsi="Times New Roman" w:cs="Times New Roman"/>
-          <w:bCs/>
-          <w:sz w:val="26"/>
-          <w:szCs w:val="26"/>
-          <w:lang w:val="vi-VN"/>
-        </w:rPr>
-      </w:pPr>
-      <w:r>
-        <w:rPr>
-          <w:rFonts w:ascii="Times New Roman" w:hAnsi="Times New Roman" w:cs="Times New Roman"/>
-          <w:bCs/>
-          <w:sz w:val="26"/>
-          <w:szCs w:val="26"/>
-          <w:lang w:val="vi-VN"/>
-        </w:rPr>
-        <w:t>-Điều phối bệnh nhân:</w:t>
-      </w:r>
-    </w:p>
-    <w:p>
-      <w:pPr>
-        <w:spacing w:after="120" w:line="240" w:lineRule="auto"/>
-        <w:ind w:left="720"/>
-        <w:jc w:val="both"/>
-        <w:rPr>
-          <w:rFonts w:ascii="Times New Roman" w:hAnsi="Times New Roman" w:cs="Times New Roman"/>
-          <w:bCs/>
-          <w:sz w:val="26"/>
-          <w:szCs w:val="26"/>
-          <w:lang w:val="vi-VN"/>
-        </w:rPr>
-      </w:pPr>
-      <w:r>
-        <w:rPr>
-          <w:rFonts w:ascii="Times New Roman" w:hAnsi="Times New Roman" w:cs="Times New Roman"/>
-          <w:bCs/>
-          <w:sz w:val="26"/>
-          <w:szCs w:val="26"/>
-          <w:lang w:val="vi-VN"/>
-        </w:rPr>
-        <w:t>+Lễ tân tra cứu mã bệnh nhân.</w:t>
-      </w:r>
-    </w:p>
-    <w:p>
-      <w:pPr>
-        <w:spacing w:after="120" w:line="240" w:lineRule="auto"/>
-        <w:ind w:left="720"/>
-        <w:jc w:val="both"/>
-        <w:rPr>
-          <w:rFonts w:ascii="Times New Roman" w:hAnsi="Times New Roman" w:cs="Times New Roman"/>
-          <w:bCs/>
-          <w:sz w:val="26"/>
-          <w:szCs w:val="26"/>
-          <w:lang w:val="vi-VN"/>
-        </w:rPr>
-      </w:pPr>
-      <w:r>
-        <w:rPr>
-          <w:rFonts w:ascii="Times New Roman" w:hAnsi="Times New Roman" w:cs="Times New Roman"/>
-          <w:bCs/>
-          <w:sz w:val="26"/>
-          <w:szCs w:val="26"/>
-          <w:lang w:val="vi-VN"/>
-        </w:rPr>
-        <w:lastRenderedPageBreak/>
-        <w:t xml:space="preserve">+Xác nhận lịch hẹn: </w:t>
-      </w:r>
-    </w:p>
-    <w:p>
-      <w:pPr>
-        <w:pStyle w:val="ListParagraph"/>
-        <w:numPr>
-          <w:ilvl w:val="0"/>
-          <w:numId w:val="8"/>
-        </w:numPr>
-        <w:spacing w:after="120" w:line="240" w:lineRule="auto"/>
-        <w:jc w:val="both"/>
-        <w:rPr>
-          <w:rFonts w:ascii="Times New Roman" w:hAnsi="Times New Roman" w:cs="Times New Roman"/>
-          <w:bCs/>
-          <w:sz w:val="26"/>
-          <w:szCs w:val="26"/>
-          <w:lang w:val="vi-VN"/>
-        </w:rPr>
-      </w:pPr>
-      <w:r>
-        <w:rPr>
-          <w:rFonts w:ascii="Times New Roman" w:hAnsi="Times New Roman" w:cs="Times New Roman"/>
-          <w:bCs/>
-          <w:sz w:val="26"/>
-          <w:szCs w:val="26"/>
-          <w:lang w:val="vi-VN"/>
-        </w:rPr>
-        <w:t>Trường hợp có đặt lịch trước: Lễ tân xác nhận lịch hẹn.</w:t>
-      </w:r>
-    </w:p>
-    <w:p>
-      <w:pPr>
-        <w:pStyle w:val="ListParagraph"/>
-        <w:numPr>
-          <w:ilvl w:val="0"/>
-          <w:numId w:val="8"/>
-        </w:numPr>
-        <w:spacing w:after="120" w:line="240" w:lineRule="auto"/>
-        <w:jc w:val="both"/>
-        <w:rPr>
-          <w:rFonts w:ascii="Times New Roman" w:hAnsi="Times New Roman" w:cs="Times New Roman"/>
-          <w:bCs/>
-          <w:sz w:val="26"/>
-          <w:szCs w:val="26"/>
-          <w:lang w:val="vi-VN"/>
-        </w:rPr>
-      </w:pPr>
-      <w:r>
-        <w:rPr>
-          <w:rFonts w:ascii="Times New Roman" w:hAnsi="Times New Roman" w:cs="Times New Roman"/>
-          <w:bCs/>
-          <w:sz w:val="26"/>
-          <w:szCs w:val="26"/>
-          <w:lang w:val="vi-VN"/>
-        </w:rPr>
-        <w:t>Trường hợp chưa có đặt lịch trước: Lễ tân kiểm tra lịch trống của nha sĩ để xếp ca hoặc nếu hết lịch trống sẽ đặt lịch hẹn khác vào thời gian trống khác.</w:t>
-      </w:r>
-    </w:p>
-    <w:p>
-      <w:pPr>
-        <w:spacing w:after="120" w:line="240" w:lineRule="auto"/>
-        <w:ind w:left="720"/>
-        <w:jc w:val="both"/>
-        <w:rPr>
-          <w:rFonts w:ascii="Times New Roman" w:hAnsi="Times New Roman" w:cs="Times New Roman"/>
-          <w:bCs/>
-          <w:sz w:val="26"/>
-          <w:szCs w:val="26"/>
-          <w:lang w:val="vi-VN"/>
-        </w:rPr>
-      </w:pPr>
-      <w:r>
-        <w:rPr>
-          <w:rFonts w:ascii="Times New Roman" w:hAnsi="Times New Roman" w:cs="Times New Roman"/>
-          <w:bCs/>
-          <w:sz w:val="26"/>
-          <w:szCs w:val="26"/>
-          <w:lang w:val="vi-VN"/>
-        </w:rPr>
-        <w:t xml:space="preserve">+Lễ tân cập nhật trạng thái của bệnh nhân từ “Đã </w:t>
-      </w:r>
-      <w:r>
-        <w:rPr>
-          <w:rFonts w:ascii="Times New Roman" w:hAnsi="Times New Roman" w:cs="Times New Roman"/>
-          <w:bCs/>
-          <w:sz w:val="26"/>
-          <w:szCs w:val="26"/>
-          <w:lang w:val="vi-VN"/>
-        </w:rPr>
-        <w:t>đặt</w:t>
-      </w:r>
-      <w:r>
-        <w:rPr>
-          <w:rFonts w:ascii="Times New Roman" w:hAnsi="Times New Roman" w:cs="Times New Roman"/>
-          <w:bCs/>
-          <w:sz w:val="26"/>
-          <w:szCs w:val="26"/>
-          <w:lang w:val="vi-VN"/>
-        </w:rPr>
-        <w:t>”</w:t>
-      </w:r>
-      <w:r>
-        <w:rPr>
-          <w:rFonts w:ascii="Times New Roman" w:hAnsi="Times New Roman" w:cs="Times New Roman"/>
-          <w:bCs/>
-          <w:sz w:val="26"/>
-          <w:szCs w:val="26"/>
-          <w:lang w:val="vi-VN"/>
-        </w:rPr>
-        <w:t xml:space="preserve"> hoặc “Chờ” sang trạng thái “Đang chờ khám”.</w:t>
-      </w:r>
-    </w:p>
-    <w:p>
-      <w:pPr>
-        <w:spacing w:after="120" w:line="240" w:lineRule="auto"/>
-        <w:ind w:left="720"/>
-        <w:jc w:val="both"/>
-        <w:rPr>
-          <w:rFonts w:ascii="Times New Roman" w:hAnsi="Times New Roman" w:cs="Times New Roman"/>
-          <w:bCs/>
-          <w:sz w:val="26"/>
-          <w:szCs w:val="26"/>
-          <w:lang w:val="vi-VN"/>
-        </w:rPr>
-      </w:pPr>
-      <w:r>
-        <w:rPr>
-          <w:rFonts w:ascii="Times New Roman" w:hAnsi="Times New Roman" w:cs="Times New Roman"/>
-          <w:bCs/>
-          <w:sz w:val="26"/>
-          <w:szCs w:val="26"/>
-          <w:lang w:val="vi-VN"/>
-        </w:rPr>
-        <w:t>+Hệ thống sẽ gửi thông báo danh sách chờ đến màn hình làm việc của nha sĩ, y tá tương ứng.</w:t>
-      </w:r>
-    </w:p>
-    <w:p>
-      <w:pPr>
-        <w:spacing w:after="120" w:line="240" w:lineRule="auto"/>
-        <w:ind w:left="720"/>
-        <w:jc w:val="both"/>
-        <w:rPr>
-          <w:rFonts w:ascii="Times New Roman" w:hAnsi="Times New Roman" w:cs="Times New Roman"/>
-          <w:bCs/>
-          <w:sz w:val="26"/>
-          <w:szCs w:val="26"/>
-          <w:lang w:val="vi-VN"/>
-        </w:rPr>
-      </w:pPr>
-      <w:r>
-        <w:rPr>
-          <w:rFonts w:ascii="Times New Roman" w:hAnsi="Times New Roman" w:cs="Times New Roman"/>
-          <w:bCs/>
-          <w:sz w:val="26"/>
-          <w:szCs w:val="26"/>
-          <w:lang w:val="vi-VN"/>
-        </w:rPr>
-        <w:t xml:space="preserve">-Tra cứu hồ sơ bệnh nhân: </w:t>
-      </w:r>
-    </w:p>
-    <w:p>
-      <w:pPr>
-        <w:spacing w:after="120" w:line="240" w:lineRule="auto"/>
-        <w:ind w:left="720"/>
-        <w:jc w:val="both"/>
-        <w:rPr>
-          <w:rFonts w:ascii="Times New Roman" w:hAnsi="Times New Roman" w:cs="Times New Roman"/>
-          <w:bCs/>
-          <w:sz w:val="26"/>
-          <w:szCs w:val="26"/>
-          <w:lang w:val="vi-VN"/>
-        </w:rPr>
-      </w:pPr>
-      <w:r>
-        <w:rPr>
-          <w:rFonts w:ascii="Times New Roman" w:hAnsi="Times New Roman" w:cs="Times New Roman"/>
-          <w:bCs/>
-          <w:sz w:val="26"/>
-          <w:szCs w:val="26"/>
-          <w:lang w:val="vi-VN"/>
-        </w:rPr>
-        <w:t>+Nha sĩ tìm kiếm hồ sơ bệnh nhân theo nhiều bộ lọc (Tên, Số điện thoại, CCCD, Mã bệnh nhân, Khoảng thời gian khám/chữa bệnh…).</w:t>
-      </w:r>
-    </w:p>
-    <w:p>
-      <w:pPr>
-        <w:spacing w:after="120" w:line="240" w:lineRule="auto"/>
-        <w:ind w:left="720"/>
-        <w:jc w:val="both"/>
-        <w:rPr>
-          <w:rFonts w:ascii="Times New Roman" w:hAnsi="Times New Roman" w:cs="Times New Roman"/>
-          <w:bCs/>
-          <w:sz w:val="26"/>
-          <w:szCs w:val="26"/>
-          <w:lang w:val="vi-VN"/>
-        </w:rPr>
-      </w:pPr>
-      <w:r>
-        <w:rPr>
-          <w:rFonts w:ascii="Times New Roman" w:hAnsi="Times New Roman" w:cs="Times New Roman"/>
-          <w:bCs/>
-          <w:sz w:val="26"/>
-          <w:szCs w:val="26"/>
-          <w:lang w:val="vi-VN"/>
-        </w:rPr>
-        <w:t>+Hệ thống tổng hợp toàn bộ thông tin hành chính, danh sách mã điều trị, lịch sử giao dịch thành một file tổng quan.</w:t>
-      </w:r>
-    </w:p>
-    <w:p>
-      <w:pPr>
-        <w:spacing w:after="120" w:line="240" w:lineRule="auto"/>
-        <w:ind w:left="720"/>
-        <w:jc w:val="both"/>
-        <w:rPr>
-          <w:rFonts w:ascii="Times New Roman" w:hAnsi="Times New Roman" w:cs="Times New Roman"/>
-          <w:bCs/>
-          <w:sz w:val="26"/>
-          <w:szCs w:val="26"/>
-          <w:lang w:val="vi-VN"/>
-        </w:rPr>
-      </w:pPr>
-      <w:r>
-        <w:rPr>
-          <w:rFonts w:ascii="Times New Roman" w:hAnsi="Times New Roman" w:cs="Times New Roman"/>
-          <w:bCs/>
-          <w:sz w:val="26"/>
-          <w:szCs w:val="26"/>
-          <w:lang w:val="vi-VN"/>
-        </w:rPr>
-        <w:t>-Xuất hồ sở bệnh nhân:</w:t>
-      </w:r>
-    </w:p>
-    <w:p>
-      <w:pPr>
-        <w:spacing w:after="120" w:line="240" w:lineRule="auto"/>
-        <w:ind w:left="720"/>
-        <w:jc w:val="both"/>
-        <w:rPr>
-          <w:rFonts w:ascii="Times New Roman" w:hAnsi="Times New Roman" w:cs="Times New Roman"/>
-          <w:bCs/>
-          <w:sz w:val="26"/>
-          <w:szCs w:val="26"/>
-          <w:lang w:val="vi-VN"/>
-        </w:rPr>
-      </w:pPr>
-      <w:r>
-        <w:rPr>
-          <w:rFonts w:ascii="Times New Roman" w:hAnsi="Times New Roman" w:cs="Times New Roman"/>
-          <w:bCs/>
-          <w:sz w:val="26"/>
-          <w:szCs w:val="26"/>
-          <w:lang w:val="vi-VN"/>
-        </w:rPr>
-        <w:t>+Nha sĩ tìm kiếm hồ sơ bệnh nhân theo nhiều bộ lọc (Tên, Số điện thoại, CCCD, Mã bệnh nhân, Khoảng thời gian khám/chữa bệnh…).</w:t>
-      </w:r>
-    </w:p>
-    <w:p>
-      <w:pPr>
-        <w:spacing w:after="120" w:line="240" w:lineRule="auto"/>
-        <w:ind w:left="720"/>
-        <w:jc w:val="both"/>
-        <w:rPr>
-          <w:rFonts w:ascii="Times New Roman" w:hAnsi="Times New Roman" w:cs="Times New Roman"/>
-          <w:bCs/>
-          <w:sz w:val="26"/>
-          <w:szCs w:val="26"/>
-          <w:lang w:val="vi-VN"/>
-        </w:rPr>
-      </w:pPr>
-      <w:r>
-        <w:rPr>
-          <w:rFonts w:ascii="Times New Roman" w:hAnsi="Times New Roman" w:cs="Times New Roman"/>
-          <w:bCs/>
-          <w:sz w:val="26"/>
-          <w:szCs w:val="26"/>
-          <w:lang w:val="vi-VN"/>
-        </w:rPr>
-        <w:t>+Hệ thống tổng hợp toàn bộ thông tin hành chính, danh sách mã điều trị, lịch sử giao dịch thành một file tổng quan.</w:t>
-      </w:r>
-    </w:p>
-    <w:p>
-      <w:pPr>
-        <w:spacing w:after="120" w:line="240" w:lineRule="auto"/>
-        <w:ind w:left="720"/>
-        <w:jc w:val="both"/>
-        <w:rPr>
-          <w:rFonts w:ascii="Times New Roman" w:hAnsi="Times New Roman" w:cs="Times New Roman"/>
-          <w:bCs/>
-          <w:sz w:val="26"/>
-          <w:szCs w:val="26"/>
-          <w:lang w:val="vi-VN"/>
-        </w:rPr>
-      </w:pPr>
-      <w:r>
-        <w:rPr>
-          <w:rFonts w:ascii="Times New Roman" w:hAnsi="Times New Roman" w:cs="Times New Roman"/>
-          <w:bCs/>
-          <w:sz w:val="26"/>
-          <w:szCs w:val="26"/>
-          <w:lang w:val="vi-VN"/>
-        </w:rPr>
-        <w:t>+Xuất file PDF hoặc in hồ sơ thông tin bệnh nhân để chuyển cho bệnh nhân hoặc chuyển viện khi có yêu cầu.</w:t>
-      </w:r>
-    </w:p>
-    <w:p>
-      <w:pPr>
-        <w:spacing w:after="120" w:line="240" w:lineRule="auto"/>
-        <w:ind w:left="720"/>
-        <w:jc w:val="both"/>
-        <w:rPr>
-          <w:rFonts w:ascii="Times New Roman" w:hAnsi="Times New Roman" w:cs="Times New Roman"/>
-          <w:bCs/>
-          <w:sz w:val="26"/>
-          <w:szCs w:val="26"/>
-          <w:lang w:val="vi-VN"/>
-        </w:rPr>
-      </w:pPr>
-      <w:r>
-        <w:rPr>
-          <w:rFonts w:ascii="Times New Roman" w:hAnsi="Times New Roman" w:cs="Times New Roman"/>
-          <w:bCs/>
-          <w:sz w:val="26"/>
-          <w:szCs w:val="26"/>
-          <w:lang w:val="vi-VN"/>
-        </w:rPr>
-        <w:t xml:space="preserve">-Xem lịch sử khám: </w:t>
-      </w:r>
-    </w:p>
-    <w:p>
-      <w:pPr>
-        <w:spacing w:after="120" w:line="240" w:lineRule="auto"/>
-        <w:ind w:left="720"/>
-        <w:jc w:val="both"/>
-        <w:rPr>
-          <w:rFonts w:ascii="Times New Roman" w:hAnsi="Times New Roman" w:cs="Times New Roman"/>
-          <w:bCs/>
-          <w:sz w:val="26"/>
-          <w:szCs w:val="26"/>
-          <w:lang w:val="vi-VN"/>
-        </w:rPr>
-      </w:pPr>
-      <w:r>
-        <w:rPr>
-          <w:rFonts w:ascii="Times New Roman" w:hAnsi="Times New Roman" w:cs="Times New Roman"/>
-          <w:bCs/>
-          <w:sz w:val="26"/>
-          <w:szCs w:val="26"/>
-          <w:lang w:val="vi-VN"/>
-        </w:rPr>
-        <w:t>+</w:t>
-      </w:r>
-      <w:r>
-        <w:rPr>
-          <w:rFonts w:ascii="Times New Roman" w:hAnsi="Times New Roman" w:cs="Times New Roman"/>
-          <w:bCs/>
-          <w:sz w:val="26"/>
-          <w:szCs w:val="26"/>
-          <w:lang w:val="vi-VN"/>
-        </w:rPr>
-        <w:t xml:space="preserve"> </w:t>
-      </w:r>
-      <w:r>
-        <w:rPr>
-          <w:rFonts w:ascii="Times New Roman" w:hAnsi="Times New Roman" w:cs="Times New Roman"/>
-          <w:bCs/>
-          <w:sz w:val="26"/>
-          <w:szCs w:val="26"/>
-          <w:lang w:val="vi-VN"/>
-        </w:rPr>
-        <w:t>Nha sĩ tìm kiếm hồ sơ bệnh nhân theo nhiều bộ lọc (Tên, Số điện thoại, CCCD, Mã bệnh nhân, Khoảng thời gian khám/chữa bệnh…).</w:t>
-      </w:r>
-    </w:p>
-    <w:p>
-      <w:pPr>
-        <w:spacing w:after="120" w:line="240" w:lineRule="auto"/>
-        <w:ind w:left="720"/>
-        <w:jc w:val="both"/>
-        <w:rPr>
-          <w:rFonts w:ascii="Times New Roman" w:hAnsi="Times New Roman" w:cs="Times New Roman"/>
-          <w:bCs/>
-          <w:sz w:val="26"/>
-          <w:szCs w:val="26"/>
-          <w:lang w:val="vi-VN"/>
-        </w:rPr>
-      </w:pPr>
-      <w:r>
-        <w:rPr>
-          <w:rFonts w:ascii="Times New Roman" w:hAnsi="Times New Roman" w:cs="Times New Roman"/>
-          <w:bCs/>
-          <w:sz w:val="26"/>
-          <w:szCs w:val="26"/>
-          <w:lang w:val="vi-VN"/>
-        </w:rPr>
-        <w:t>+Hệ thống hiển thị danh sách các đợt khám theo thứ tự thời gian (Ngày khám, Nha sĩ thực hiện, Y tá hỗ trợ, Chi tiết các thủ thuật đã làm).</w:t>
-      </w:r>
-    </w:p>
-    <w:p>
-      <w:pPr>
-        <w:spacing w:after="120" w:line="240" w:lineRule="auto"/>
-        <w:ind w:left="720"/>
-        <w:jc w:val="both"/>
-        <w:rPr>
-          <w:rFonts w:ascii="Times New Roman" w:hAnsi="Times New Roman" w:cs="Times New Roman"/>
-          <w:bCs/>
-          <w:sz w:val="26"/>
-          <w:szCs w:val="26"/>
-          <w:lang w:val="vi-VN"/>
-        </w:rPr>
-      </w:pPr>
-      <w:r>
-        <w:rPr>
-          <w:rFonts w:ascii="Times New Roman" w:hAnsi="Times New Roman" w:cs="Times New Roman"/>
-          <w:bCs/>
-          <w:sz w:val="26"/>
-          <w:szCs w:val="26"/>
-          <w:lang w:val="vi-VN"/>
-        </w:rPr>
-        <w:t>+Nha sĩ có thể xem lại các hình ảnh X-quang, phim chụp khoang miệng hoặc ghi chú cũ của nha sĩ ở các lần khám trước.</w:t>
-      </w:r>
+          <w:b/>
+          <w:sz w:val="26"/>
+          <w:szCs w:val="26"/>
+        </w:rPr>
+      </w:pPr>
     </w:p>
     <w:p>
       <w:pPr>
@@ -2153,143 +2606,396 @@
     </w:p>
     <w:p>
       <w:pPr>
+        <w:pStyle w:val="ListParagraph"/>
         <w:spacing w:after="120" w:line="240" w:lineRule="auto"/>
-        <w:ind w:left="720"/>
         <w:jc w:val="both"/>
         <w:rPr>
           <w:rFonts w:ascii="Times New Roman" w:hAnsi="Times New Roman" w:cs="Times New Roman"/>
+          <w:b/>
+          <w:sz w:val="26"/>
+          <w:szCs w:val="26"/>
+        </w:rPr>
+      </w:pPr>
+    </w:p>
+    <w:p>
+      <w:pPr>
+        <w:pStyle w:val="ListParagraph"/>
+        <w:spacing w:after="0" w:line="240" w:lineRule="auto"/>
+        <w:rPr>
+          <w:rFonts w:ascii="Times New Roman" w:eastAsia="Times New Roman" w:hAnsi="Times New Roman" w:cs="Times New Roman"/>
+          <w:color w:val="1F1F1F"/>
+          <w:sz w:val="26"/>
+          <w:szCs w:val="26"/>
+          <w:lang w:val="vi-VN" w:eastAsia="vi-VN"/>
+        </w:rPr>
+      </w:pPr>
+      <w:r>
+        <w:rPr>
+          <w:rFonts w:ascii="Times New Roman" w:eastAsia="Times New Roman" w:hAnsi="Times New Roman" w:cs="Times New Roman"/>
+          <w:b/>
           <w:bCs/>
-          <w:sz w:val="26"/>
-          <w:szCs w:val="26"/>
-          <w:lang w:val="vi-VN"/>
-        </w:rPr>
-      </w:pPr>
-      <w:r>
-        <w:rPr>
-          <w:rFonts w:ascii="Times New Roman" w:hAnsi="Times New Roman" w:cs="Times New Roman"/>
+          <w:color w:val="1F1F1F"/>
+          <w:sz w:val="26"/>
+          <w:szCs w:val="26"/>
+          <w:bdr w:val="none" w:sz="0" w:space="0" w:color="auto" w:frame="1"/>
+          <w:lang w:val="vi-VN" w:eastAsia="vi-VN"/>
+        </w:rPr>
+        <w:t>Quy định 1: Về phân công ca trực và công tác chuẩn bị</w:t>
+      </w:r>
+    </w:p>
+    <w:p>
+      <w:pPr>
+        <w:pStyle w:val="ListParagraph"/>
+        <w:spacing w:after="0" w:line="240" w:lineRule="auto"/>
+        <w:rPr>
+          <w:rFonts w:ascii="Times New Roman" w:eastAsia="Times New Roman" w:hAnsi="Times New Roman" w:cs="Times New Roman"/>
+          <w:color w:val="1F1F1F"/>
+          <w:sz w:val="26"/>
+          <w:szCs w:val="26"/>
+          <w:lang w:val="vi-VN" w:eastAsia="vi-VN"/>
+        </w:rPr>
+      </w:pPr>
+      <w:r>
+        <w:rPr>
+          <w:rFonts w:ascii="Times New Roman" w:eastAsia="Times New Roman" w:hAnsi="Times New Roman" w:cs="Times New Roman"/>
+          <w:color w:val="1F1F1F"/>
+          <w:sz w:val="26"/>
+          <w:szCs w:val="26"/>
+          <w:lang w:val="vi-VN" w:eastAsia="vi-VN"/>
+        </w:rPr>
+        <w:t>Lịch làm việc của Nha sĩ và Y tá do Nhân viên quản lý phân công trên hệ thống. Y tá có trách nhiệm kiểm tra lịch cá nhân và hoàn tất chuẩn bị dụng cụ, vật tư y tế, phòng khám trước khi phiên làm việc bắt đầu.</w:t>
+      </w:r>
+    </w:p>
+    <w:p>
+      <w:pPr>
+        <w:pStyle w:val="ListParagraph"/>
+        <w:spacing w:after="0" w:line="240" w:lineRule="auto"/>
+        <w:rPr>
+          <w:rFonts w:ascii="Times New Roman" w:eastAsia="Times New Roman" w:hAnsi="Times New Roman" w:cs="Times New Roman"/>
+          <w:color w:val="1F1F1F"/>
+          <w:sz w:val="26"/>
+          <w:szCs w:val="26"/>
+          <w:lang w:val="vi-VN" w:eastAsia="vi-VN"/>
+        </w:rPr>
+      </w:pPr>
+    </w:p>
+    <w:p>
+      <w:pPr>
+        <w:pStyle w:val="ListParagraph"/>
+        <w:spacing w:after="0" w:line="240" w:lineRule="auto"/>
+        <w:rPr>
+          <w:rFonts w:ascii="Times New Roman" w:eastAsia="Times New Roman" w:hAnsi="Times New Roman" w:cs="Times New Roman"/>
+          <w:color w:val="1F1F1F"/>
+          <w:sz w:val="26"/>
+          <w:szCs w:val="26"/>
+          <w:lang w:val="vi-VN" w:eastAsia="vi-VN"/>
+        </w:rPr>
+      </w:pPr>
+      <w:r>
+        <w:rPr>
+          <w:rFonts w:ascii="Times New Roman" w:eastAsia="Times New Roman" w:hAnsi="Times New Roman" w:cs="Times New Roman"/>
+          <w:b/>
           <w:bCs/>
-          <w:sz w:val="26"/>
-          <w:szCs w:val="26"/>
-          <w:lang w:val="vi-VN"/>
-        </w:rPr>
-        <w:t xml:space="preserve">-Đăng ký </w:t>
-      </w:r>
-      <w:r>
-        <w:rPr>
-          <w:rFonts w:ascii="Times New Roman" w:hAnsi="Times New Roman" w:cs="Times New Roman"/>
+          <w:color w:val="1F1F1F"/>
+          <w:sz w:val="26"/>
+          <w:szCs w:val="26"/>
+          <w:bdr w:val="none" w:sz="0" w:space="0" w:color="auto" w:frame="1"/>
+          <w:lang w:val="vi-VN" w:eastAsia="vi-VN"/>
+        </w:rPr>
+        <w:t>Quy định 2: Về duy nhất mã bệnh nhân và hồ sơ điện tử</w:t>
+      </w:r>
+    </w:p>
+    <w:p>
+      <w:pPr>
+        <w:pStyle w:val="ListParagraph"/>
+        <w:spacing w:after="0" w:line="240" w:lineRule="auto"/>
+        <w:rPr>
+          <w:rFonts w:ascii="Times New Roman" w:eastAsia="Times New Roman" w:hAnsi="Times New Roman" w:cs="Times New Roman"/>
+          <w:color w:val="1F1F1F"/>
+          <w:sz w:val="26"/>
+          <w:szCs w:val="26"/>
+          <w:lang w:val="vi-VN" w:eastAsia="vi-VN"/>
+        </w:rPr>
+      </w:pPr>
+      <w:r>
+        <w:rPr>
+          <w:rFonts w:ascii="Times New Roman" w:eastAsia="Times New Roman" w:hAnsi="Times New Roman" w:cs="Times New Roman"/>
+          <w:color w:val="1F1F1F"/>
+          <w:sz w:val="26"/>
+          <w:szCs w:val="26"/>
+          <w:lang w:val="vi-VN" w:eastAsia="vi-VN"/>
+        </w:rPr>
+        <w:t>Mỗi bệnh nhân chỉ được cấp một Mã bệnh nhân duy nhất dựa trên cơ chế kiểm tra trùng lặp qua số điện thoại. Toàn bộ thông tin hành chính, tiền sử bệnh lý bắt buộc phải ghi nhận đầy đủ để khởi tạo Hồ sơ bệnh nhân điện tử (EMR) tập trung.</w:t>
+      </w:r>
+    </w:p>
+    <w:p>
+      <w:pPr>
+        <w:pStyle w:val="ListParagraph"/>
+        <w:spacing w:after="0" w:line="240" w:lineRule="auto"/>
+        <w:rPr>
+          <w:rFonts w:ascii="Times New Roman" w:eastAsia="Times New Roman" w:hAnsi="Times New Roman" w:cs="Times New Roman"/>
+          <w:color w:val="1F1F1F"/>
+          <w:sz w:val="26"/>
+          <w:szCs w:val="26"/>
+          <w:lang w:val="vi-VN" w:eastAsia="vi-VN"/>
+        </w:rPr>
+      </w:pPr>
+    </w:p>
+    <w:p>
+      <w:pPr>
+        <w:pStyle w:val="ListParagraph"/>
+        <w:spacing w:after="0" w:line="240" w:lineRule="auto"/>
+        <w:rPr>
+          <w:rFonts w:ascii="Times New Roman" w:eastAsia="Times New Roman" w:hAnsi="Times New Roman" w:cs="Times New Roman"/>
+          <w:color w:val="1F1F1F"/>
+          <w:sz w:val="26"/>
+          <w:szCs w:val="26"/>
+          <w:lang w:val="vi-VN" w:eastAsia="vi-VN"/>
+        </w:rPr>
+      </w:pPr>
+      <w:r>
+        <w:rPr>
+          <w:rFonts w:ascii="Times New Roman" w:eastAsia="Times New Roman" w:hAnsi="Times New Roman" w:cs="Times New Roman"/>
+          <w:b/>
           <w:bCs/>
-          <w:sz w:val="26"/>
-          <w:szCs w:val="26"/>
-          <w:lang w:val="vi-VN"/>
-        </w:rPr>
-        <w:t>bệnh nhân mới: Tiếp nhận thông tin bệnh nhân trực tiếp tại quầy, tra cứu kiểm tra trùng lặp thông tin, nhập dữ liệu hành chính và tiền sử y khoa, gửi yêu câu tạo mã bệnh nhân và đưa bệnh nhân vào danh sách chờ.</w:t>
-      </w:r>
-    </w:p>
-    <w:p>
-      <w:pPr>
-        <w:spacing w:after="120" w:line="240" w:lineRule="auto"/>
-        <w:ind w:left="720"/>
-        <w:jc w:val="both"/>
-        <w:rPr>
-          <w:rFonts w:ascii="Times New Roman" w:hAnsi="Times New Roman" w:cs="Times New Roman"/>
+          <w:color w:val="1F1F1F"/>
+          <w:sz w:val="26"/>
+          <w:szCs w:val="26"/>
+          <w:bdr w:val="none" w:sz="0" w:space="0" w:color="auto" w:frame="1"/>
+          <w:lang w:val="vi-VN" w:eastAsia="vi-VN"/>
+        </w:rPr>
+        <w:lastRenderedPageBreak/>
+        <w:t>Quy định 3: Về quản lý lịch hẹn và luồng trạng thái check-in</w:t>
+      </w:r>
+    </w:p>
+    <w:p>
+      <w:pPr>
+        <w:pStyle w:val="ListParagraph"/>
+        <w:spacing w:after="0" w:line="240" w:lineRule="auto"/>
+        <w:rPr>
+          <w:rFonts w:ascii="Times New Roman" w:eastAsia="Times New Roman" w:hAnsi="Times New Roman" w:cs="Times New Roman"/>
+          <w:color w:val="1F1F1F"/>
+          <w:sz w:val="26"/>
+          <w:szCs w:val="26"/>
+          <w:lang w:val="vi-VN" w:eastAsia="vi-VN"/>
+        </w:rPr>
+      </w:pPr>
+      <w:r>
+        <w:rPr>
+          <w:rFonts w:ascii="Times New Roman" w:eastAsia="Times New Roman" w:hAnsi="Times New Roman" w:cs="Times New Roman"/>
+          <w:color w:val="1F1F1F"/>
+          <w:sz w:val="26"/>
+          <w:szCs w:val="26"/>
+          <w:lang w:val="vi-VN" w:eastAsia="vi-VN"/>
+        </w:rPr>
+        <w:t xml:space="preserve">Lịch hẹn phải được đăng ký dựa trên khung giờ trống thực tế của Nha sĩ và ghế khám. Trạng thái bệnh nhân trên hệ thống phải được cập nhật chính xác theo thời gian thực từ lúc Lễ tân Check-in ("Chờ khám") đến khi Nha sĩ bấm tiếp nhận ("Sẵn sàng" </w:t>
+      </w:r>
+      <w:r>
+        <w:rPr>
+          <w:rFonts w:ascii="Times New Roman" w:eastAsia="Times New Roman" w:hAnsi="Times New Roman" w:cs="Times New Roman"/>
+          <w:color w:val="1F1F1F"/>
+          <w:sz w:val="26"/>
+          <w:szCs w:val="26"/>
+          <w:bdr w:val="none" w:sz="0" w:space="0" w:color="auto" w:frame="1"/>
+          <w:lang w:val="vi-VN" w:eastAsia="vi-VN"/>
+        </w:rPr>
+        <w:t>$\rightarrow$</w:t>
+      </w:r>
+      <w:r>
+        <w:rPr>
+          <w:rFonts w:ascii="Times New Roman" w:eastAsia="Times New Roman" w:hAnsi="Times New Roman" w:cs="Times New Roman"/>
+          <w:color w:val="1F1F1F"/>
+          <w:sz w:val="26"/>
+          <w:szCs w:val="26"/>
+          <w:lang w:val="vi-VN" w:eastAsia="vi-VN"/>
+        </w:rPr>
+        <w:t xml:space="preserve"> "Đang khám").</w:t>
+      </w:r>
+    </w:p>
+    <w:p>
+      <w:pPr>
+        <w:pStyle w:val="ListParagraph"/>
+        <w:spacing w:after="0" w:line="240" w:lineRule="auto"/>
+        <w:rPr>
+          <w:rFonts w:ascii="Times New Roman" w:eastAsia="Times New Roman" w:hAnsi="Times New Roman" w:cs="Times New Roman"/>
+          <w:color w:val="1F1F1F"/>
+          <w:sz w:val="26"/>
+          <w:szCs w:val="26"/>
+          <w:lang w:val="vi-VN" w:eastAsia="vi-VN"/>
+        </w:rPr>
+      </w:pPr>
+    </w:p>
+    <w:p>
+      <w:pPr>
+        <w:pStyle w:val="ListParagraph"/>
+        <w:spacing w:after="0" w:line="240" w:lineRule="auto"/>
+        <w:rPr>
+          <w:rFonts w:ascii="Times New Roman" w:eastAsia="Times New Roman" w:hAnsi="Times New Roman" w:cs="Times New Roman"/>
+          <w:color w:val="1F1F1F"/>
+          <w:sz w:val="26"/>
+          <w:szCs w:val="26"/>
+          <w:lang w:val="vi-VN" w:eastAsia="vi-VN"/>
+        </w:rPr>
+      </w:pPr>
+      <w:r>
+        <w:rPr>
+          <w:rFonts w:ascii="Times New Roman" w:eastAsia="Times New Roman" w:hAnsi="Times New Roman" w:cs="Times New Roman"/>
+          <w:b/>
           <w:bCs/>
-          <w:sz w:val="26"/>
-          <w:szCs w:val="26"/>
-          <w:lang w:val="vi-VN"/>
-        </w:rPr>
-      </w:pPr>
-      <w:r>
-        <w:rPr>
-          <w:rFonts w:ascii="Times New Roman" w:hAnsi="Times New Roman" w:cs="Times New Roman"/>
+          <w:color w:val="1F1F1F"/>
+          <w:sz w:val="26"/>
+          <w:szCs w:val="26"/>
+          <w:bdr w:val="none" w:sz="0" w:space="0" w:color="auto" w:frame="1"/>
+          <w:lang w:val="vi-VN" w:eastAsia="vi-VN"/>
+        </w:rPr>
+        <w:t>Quy định 4: Về cập nhật bệnh án và kê đơn điện tử</w:t>
+      </w:r>
+    </w:p>
+    <w:p>
+      <w:pPr>
+        <w:pStyle w:val="ListParagraph"/>
+        <w:spacing w:after="0" w:line="240" w:lineRule="auto"/>
+        <w:rPr>
+          <w:rFonts w:ascii="Times New Roman" w:eastAsia="Times New Roman" w:hAnsi="Times New Roman" w:cs="Times New Roman"/>
+          <w:color w:val="1F1F1F"/>
+          <w:sz w:val="26"/>
+          <w:szCs w:val="26"/>
+          <w:lang w:val="vi-VN" w:eastAsia="vi-VN"/>
+        </w:rPr>
+      </w:pPr>
+      <w:r>
+        <w:rPr>
+          <w:rFonts w:ascii="Times New Roman" w:eastAsia="Times New Roman" w:hAnsi="Times New Roman" w:cs="Times New Roman"/>
+          <w:color w:val="1F1F1F"/>
+          <w:sz w:val="26"/>
+          <w:szCs w:val="26"/>
+          <w:lang w:val="vi-VN" w:eastAsia="vi-VN"/>
+        </w:rPr>
+        <w:t>Nha sĩ bắt buộc phải cập nhật tình trạng lâm sàng, sơ đồ răng, phim X-quang và nhật ký thủ thuật trực tiếp trên Hồ sơ bệnh án điện tử. Đơn thuốc phải được kê điện tử trên hệ thống ngay sau khi hoàn tất thủ thuật.</w:t>
+      </w:r>
+    </w:p>
+    <w:p>
+      <w:pPr>
+        <w:pStyle w:val="ListParagraph"/>
+        <w:spacing w:after="0" w:line="240" w:lineRule="auto"/>
+        <w:rPr>
+          <w:rFonts w:ascii="Times New Roman" w:eastAsia="Times New Roman" w:hAnsi="Times New Roman" w:cs="Times New Roman"/>
+          <w:color w:val="1F1F1F"/>
+          <w:sz w:val="26"/>
+          <w:szCs w:val="26"/>
+          <w:lang w:val="vi-VN" w:eastAsia="vi-VN"/>
+        </w:rPr>
+      </w:pPr>
+    </w:p>
+    <w:p>
+      <w:pPr>
+        <w:pStyle w:val="ListParagraph"/>
+        <w:spacing w:after="0" w:line="240" w:lineRule="auto"/>
+        <w:rPr>
+          <w:rFonts w:ascii="Times New Roman" w:eastAsia="Times New Roman" w:hAnsi="Times New Roman" w:cs="Times New Roman"/>
+          <w:color w:val="1F1F1F"/>
+          <w:sz w:val="26"/>
+          <w:szCs w:val="26"/>
+          <w:lang w:val="vi-VN" w:eastAsia="vi-VN"/>
+        </w:rPr>
+      </w:pPr>
+      <w:r>
+        <w:rPr>
+          <w:rFonts w:ascii="Times New Roman" w:eastAsia="Times New Roman" w:hAnsi="Times New Roman" w:cs="Times New Roman"/>
+          <w:b/>
           <w:bCs/>
-          <w:sz w:val="26"/>
-          <w:szCs w:val="26"/>
-          <w:lang w:val="vi-VN"/>
-        </w:rPr>
-        <w:t>-Điều phối bệnh nhân: Tra cứu thông tin bệnh nhân, xác nhận lịch hẹn (đối với bệnh nhân đã đặt lịch trước) hoặc xếp lịch (đối với bệnh nhân mới), cập nhật trạng thái bệnh nhân để gửi thông báo đến phòng khám.</w:t>
-      </w:r>
-    </w:p>
-    <w:p>
-      <w:pPr>
-        <w:spacing w:after="120" w:line="240" w:lineRule="auto"/>
-        <w:ind w:left="720"/>
-        <w:jc w:val="both"/>
-        <w:rPr>
-          <w:rFonts w:ascii="Times New Roman" w:hAnsi="Times New Roman" w:cs="Times New Roman"/>
+          <w:color w:val="1F1F1F"/>
+          <w:sz w:val="26"/>
+          <w:szCs w:val="26"/>
+          <w:bdr w:val="none" w:sz="0" w:space="0" w:color="auto" w:frame="1"/>
+          <w:lang w:val="vi-VN" w:eastAsia="vi-VN"/>
+        </w:rPr>
+        <w:t>Quy định 5: Về minh bạch thanh toán và chốt lịch tái khám</w:t>
+      </w:r>
+    </w:p>
+    <w:p>
+      <w:pPr>
+        <w:pStyle w:val="ListParagraph"/>
+        <w:spacing w:after="0" w:line="240" w:lineRule="auto"/>
+        <w:rPr>
+          <w:rFonts w:ascii="Times New Roman" w:eastAsia="Times New Roman" w:hAnsi="Times New Roman" w:cs="Times New Roman"/>
+          <w:color w:val="1F1F1F"/>
+          <w:sz w:val="26"/>
+          <w:szCs w:val="26"/>
+          <w:lang w:val="vi-VN" w:eastAsia="vi-VN"/>
+        </w:rPr>
+      </w:pPr>
+      <w:r>
+        <w:rPr>
+          <w:rFonts w:ascii="Times New Roman" w:eastAsia="Times New Roman" w:hAnsi="Times New Roman" w:cs="Times New Roman"/>
+          <w:color w:val="1F1F1F"/>
+          <w:sz w:val="26"/>
+          <w:szCs w:val="26"/>
+          <w:lang w:val="vi-VN" w:eastAsia="vi-VN"/>
+        </w:rPr>
+        <w:t>Hóa đơn thanh toán phải lập đúng theo chỉ định dịch vụ của Nha sĩ, ghi nhận rõ ưu đãi hoặc giá trị chia đợt thanh toán (nếu có). Đối với các ca điều trị cần theo dõi, lịch tái khám phải được thiết lập trên hệ thống trước khi hoàn tất phiên khám.</w:t>
+      </w:r>
+    </w:p>
+    <w:p>
+      <w:pPr>
+        <w:pStyle w:val="ListParagraph"/>
+        <w:spacing w:after="0" w:line="240" w:lineRule="auto"/>
+        <w:rPr>
+          <w:rFonts w:ascii="Times New Roman" w:eastAsia="Times New Roman" w:hAnsi="Times New Roman" w:cs="Times New Roman"/>
+          <w:color w:val="1F1F1F"/>
+          <w:sz w:val="26"/>
+          <w:szCs w:val="26"/>
+          <w:lang w:val="vi-VN" w:eastAsia="vi-VN"/>
+        </w:rPr>
+      </w:pPr>
+    </w:p>
+    <w:p>
+      <w:pPr>
+        <w:pStyle w:val="ListParagraph"/>
+        <w:spacing w:after="0" w:line="240" w:lineRule="auto"/>
+        <w:rPr>
+          <w:rFonts w:ascii="Times New Roman" w:eastAsia="Times New Roman" w:hAnsi="Times New Roman" w:cs="Times New Roman"/>
+          <w:color w:val="1F1F1F"/>
+          <w:sz w:val="26"/>
+          <w:szCs w:val="26"/>
+          <w:lang w:val="vi-VN" w:eastAsia="vi-VN"/>
+        </w:rPr>
+      </w:pPr>
+      <w:r>
+        <w:rPr>
+          <w:rFonts w:ascii="Times New Roman" w:eastAsia="Times New Roman" w:hAnsi="Times New Roman" w:cs="Times New Roman"/>
+          <w:b/>
           <w:bCs/>
-          <w:sz w:val="26"/>
-          <w:szCs w:val="26"/>
-          <w:lang w:val="vi-VN"/>
-        </w:rPr>
-      </w:pPr>
-      <w:r>
-        <w:rPr>
-          <w:rFonts w:ascii="Times New Roman" w:hAnsi="Times New Roman" w:cs="Times New Roman"/>
-          <w:bCs/>
-          <w:sz w:val="26"/>
-          <w:szCs w:val="26"/>
-          <w:lang w:val="vi-VN"/>
-        </w:rPr>
-        <w:t>-Tra cứu hồ sơ bệnh nhân: Sử dụng nhiều bộ lọc để tìm kiếm thông tin bệnh nhân (Tên, Số điện thoại, Mã bệnh nhân…).</w:t>
-      </w:r>
-    </w:p>
-    <w:p>
-      <w:pPr>
-        <w:spacing w:after="120" w:line="240" w:lineRule="auto"/>
-        <w:ind w:left="720"/>
-        <w:jc w:val="both"/>
-        <w:rPr>
-          <w:rFonts w:ascii="Times New Roman" w:hAnsi="Times New Roman" w:cs="Times New Roman"/>
-          <w:bCs/>
-          <w:sz w:val="26"/>
-          <w:szCs w:val="26"/>
-          <w:lang w:val="vi-VN"/>
-        </w:rPr>
-      </w:pPr>
-      <w:r>
-        <w:rPr>
-          <w:rFonts w:ascii="Times New Roman" w:hAnsi="Times New Roman" w:cs="Times New Roman"/>
-          <w:bCs/>
-          <w:sz w:val="26"/>
-          <w:szCs w:val="26"/>
-          <w:lang w:val="vi-VN"/>
-        </w:rPr>
-        <w:t>-Xuất hồ sơ bệnh nhân: Khởi tạo thao tác trích xuất và in/ xác nhận xuất file pdf hồ sơ bệnh nhân phục vụ bàn giao hoặc chuyển viện.</w:t>
-      </w:r>
-    </w:p>
-    <w:p>
-      <w:pPr>
-        <w:spacing w:after="120" w:line="240" w:lineRule="auto"/>
-        <w:ind w:left="720"/>
-        <w:jc w:val="both"/>
-        <w:rPr>
-          <w:rFonts w:ascii="Times New Roman" w:hAnsi="Times New Roman" w:cs="Times New Roman"/>
-          <w:bCs/>
-          <w:sz w:val="26"/>
-          <w:szCs w:val="26"/>
-          <w:lang w:val="vi-VN"/>
-        </w:rPr>
-      </w:pPr>
-      <w:r>
-        <w:rPr>
-          <w:rFonts w:ascii="Times New Roman" w:hAnsi="Times New Roman" w:cs="Times New Roman"/>
-          <w:bCs/>
-          <w:sz w:val="26"/>
-          <w:szCs w:val="26"/>
-          <w:lang w:val="vi-VN"/>
-        </w:rPr>
-        <w:lastRenderedPageBreak/>
-        <w:t xml:space="preserve">-Xem lịch sử khám: </w:t>
-      </w:r>
-      <w:r>
-        <w:rPr>
-          <w:rFonts w:ascii="Times New Roman" w:hAnsi="Times New Roman" w:cs="Times New Roman"/>
-          <w:bCs/>
-          <w:sz w:val="26"/>
-          <w:szCs w:val="26"/>
-          <w:lang w:val="vi-VN"/>
-        </w:rPr>
-        <w:t>Sử dụng nhiều bộ lọc đề tìm kiếm các đợt khám theo tiến trình thời gian, xem lại các ghi chú y khoa, các thủ thuật sử dùng trong đợt điều trị và hình ảnh chẩn đoán (X-ray, phim chụp khoang miệng)</w:t>
+          <w:color w:val="1F1F1F"/>
+          <w:sz w:val="26"/>
+          <w:szCs w:val="26"/>
+          <w:bdr w:val="none" w:sz="0" w:space="0" w:color="auto" w:frame="1"/>
+          <w:lang w:val="vi-VN" w:eastAsia="vi-VN"/>
+        </w:rPr>
+        <w:t>Quy định 6: Về tự động hóa và bảo mật dữ liệu báo cáo</w:t>
+      </w:r>
+    </w:p>
+    <w:p>
+      <w:pPr>
+        <w:pStyle w:val="ListParagraph"/>
+        <w:spacing w:after="0" w:line="240" w:lineRule="auto"/>
+        <w:rPr>
+          <w:rFonts w:ascii="Times New Roman" w:eastAsia="Times New Roman" w:hAnsi="Times New Roman" w:cs="Times New Roman"/>
+          <w:color w:val="1F1F1F"/>
+          <w:sz w:val="26"/>
+          <w:szCs w:val="26"/>
+          <w:lang w:val="vi-VN" w:eastAsia="vi-VN"/>
+        </w:rPr>
+      </w:pPr>
+      <w:r>
+        <w:rPr>
+          <w:rFonts w:ascii="Times New Roman" w:eastAsia="Times New Roman" w:hAnsi="Times New Roman" w:cs="Times New Roman"/>
+          <w:color w:val="1F1F1F"/>
+          <w:sz w:val="26"/>
+          <w:szCs w:val="26"/>
+          <w:lang w:val="vi-VN" w:eastAsia="vi-VN"/>
+        </w:rPr>
+        <w:t>Hệ thống tự động đồng bộ dữ liệu giao dịch, vật tư và lượt khám để kết xuất báo cáo doanh thu, hiệu suất theo thời gian thực. Bảng điều khiển (Dashboard) báo cáo chỉ dành riêng cho Nhân viên quản lý truy cập và điều hành.</w:t>
       </w:r>
     </w:p>
     <w:p>
@@ -2322,328 +3028,59 @@
           <w:b/>
           <w:sz w:val="26"/>
           <w:szCs w:val="26"/>
-        </w:rPr>
-      </w:pPr>
-      <w:proofErr w:type="spellStart"/>
-      <w:r>
-        <w:rPr>
-          <w:rFonts w:ascii="Times New Roman" w:hAnsi="Times New Roman" w:cs="Times New Roman"/>
-          <w:b/>
-          <w:sz w:val="26"/>
-          <w:szCs w:val="26"/>
-        </w:rPr>
-        <w:t>Danh</w:t>
-      </w:r>
-      <w:proofErr w:type="spellEnd"/>
-      <w:r>
-        <w:rPr>
-          <w:rFonts w:ascii="Times New Roman" w:hAnsi="Times New Roman" w:cs="Times New Roman"/>
-          <w:b/>
-          <w:sz w:val="26"/>
-          <w:szCs w:val="26"/>
-        </w:rPr>
-        <w:t xml:space="preserve"> </w:t>
-      </w:r>
-      <w:proofErr w:type="spellStart"/>
-      <w:r>
-        <w:rPr>
-          <w:rFonts w:ascii="Times New Roman" w:hAnsi="Times New Roman" w:cs="Times New Roman"/>
-          <w:b/>
-          <w:sz w:val="26"/>
-          <w:szCs w:val="26"/>
-        </w:rPr>
-        <w:t>sách</w:t>
-      </w:r>
-      <w:proofErr w:type="spellEnd"/>
-      <w:r>
-        <w:rPr>
-          <w:rFonts w:ascii="Times New Roman" w:hAnsi="Times New Roman" w:cs="Times New Roman"/>
-          <w:b/>
-          <w:sz w:val="26"/>
-          <w:szCs w:val="26"/>
-        </w:rPr>
-        <w:t xml:space="preserve"> </w:t>
-      </w:r>
-      <w:proofErr w:type="spellStart"/>
-      <w:r>
-        <w:rPr>
-          <w:rFonts w:ascii="Times New Roman" w:hAnsi="Times New Roman" w:cs="Times New Roman"/>
-          <w:b/>
-          <w:sz w:val="26"/>
-          <w:szCs w:val="26"/>
-        </w:rPr>
-        <w:t>các</w:t>
-      </w:r>
-      <w:proofErr w:type="spellEnd"/>
-      <w:r>
-        <w:rPr>
-          <w:rFonts w:ascii="Times New Roman" w:hAnsi="Times New Roman" w:cs="Times New Roman"/>
-          <w:b/>
-          <w:sz w:val="26"/>
-          <w:szCs w:val="26"/>
-        </w:rPr>
-        <w:t xml:space="preserve"> </w:t>
-      </w:r>
-      <w:proofErr w:type="spellStart"/>
-      <w:r>
-        <w:rPr>
-          <w:rFonts w:ascii="Times New Roman" w:hAnsi="Times New Roman" w:cs="Times New Roman"/>
-          <w:b/>
-          <w:sz w:val="26"/>
-          <w:szCs w:val="26"/>
-        </w:rPr>
-        <w:t>c</w:t>
-      </w:r>
-      <w:r>
-        <w:rPr>
-          <w:rFonts w:ascii="Times New Roman" w:hAnsi="Times New Roman" w:cs="Times New Roman"/>
-          <w:b/>
-          <w:sz w:val="26"/>
-          <w:szCs w:val="26"/>
-        </w:rPr>
-        <w:t>âu</w:t>
-      </w:r>
-      <w:proofErr w:type="spellEnd"/>
-      <w:r>
-        <w:rPr>
-          <w:rFonts w:ascii="Times New Roman" w:hAnsi="Times New Roman" w:cs="Times New Roman"/>
-          <w:b/>
-          <w:sz w:val="26"/>
-          <w:szCs w:val="26"/>
-        </w:rPr>
-        <w:t xml:space="preserve"> </w:t>
-      </w:r>
-      <w:proofErr w:type="spellStart"/>
-      <w:r>
-        <w:rPr>
-          <w:rFonts w:ascii="Times New Roman" w:hAnsi="Times New Roman" w:cs="Times New Roman"/>
-          <w:b/>
-          <w:sz w:val="26"/>
-          <w:szCs w:val="26"/>
-        </w:rPr>
-        <w:t>hỏi</w:t>
-      </w:r>
-      <w:proofErr w:type="spellEnd"/>
-      <w:r>
-        <w:rPr>
-          <w:rFonts w:ascii="Times New Roman" w:hAnsi="Times New Roman" w:cs="Times New Roman"/>
-          <w:b/>
-          <w:sz w:val="26"/>
-          <w:szCs w:val="26"/>
-        </w:rPr>
-        <w:t xml:space="preserve"> </w:t>
-      </w:r>
-      <w:proofErr w:type="spellStart"/>
-      <w:r>
-        <w:rPr>
-          <w:rFonts w:ascii="Times New Roman" w:hAnsi="Times New Roman" w:cs="Times New Roman"/>
-          <w:b/>
-          <w:sz w:val="26"/>
-          <w:szCs w:val="26"/>
-        </w:rPr>
-        <w:t>khi</w:t>
-      </w:r>
-      <w:proofErr w:type="spellEnd"/>
-      <w:r>
-        <w:rPr>
-          <w:rFonts w:ascii="Times New Roman" w:hAnsi="Times New Roman" w:cs="Times New Roman"/>
-          <w:b/>
-          <w:sz w:val="26"/>
-          <w:szCs w:val="26"/>
-        </w:rPr>
-        <w:t xml:space="preserve"> </w:t>
-      </w:r>
-      <w:proofErr w:type="spellStart"/>
-      <w:r>
-        <w:rPr>
-          <w:rFonts w:ascii="Times New Roman" w:hAnsi="Times New Roman" w:cs="Times New Roman"/>
-          <w:b/>
-          <w:sz w:val="26"/>
-          <w:szCs w:val="26"/>
-        </w:rPr>
-        <w:t>thu</w:t>
-      </w:r>
-      <w:proofErr w:type="spellEnd"/>
-      <w:r>
-        <w:rPr>
-          <w:rFonts w:ascii="Times New Roman" w:hAnsi="Times New Roman" w:cs="Times New Roman"/>
-          <w:b/>
-          <w:sz w:val="26"/>
-          <w:szCs w:val="26"/>
-        </w:rPr>
-        <w:t xml:space="preserve"> </w:t>
-      </w:r>
-      <w:proofErr w:type="spellStart"/>
-      <w:r>
-        <w:rPr>
-          <w:rFonts w:ascii="Times New Roman" w:hAnsi="Times New Roman" w:cs="Times New Roman"/>
-          <w:b/>
-          <w:sz w:val="26"/>
-          <w:szCs w:val="26"/>
-        </w:rPr>
-        <w:t>thập</w:t>
-      </w:r>
-      <w:proofErr w:type="spellEnd"/>
-      <w:r>
-        <w:rPr>
-          <w:rFonts w:ascii="Times New Roman" w:hAnsi="Times New Roman" w:cs="Times New Roman"/>
-          <w:b/>
-          <w:sz w:val="26"/>
-          <w:szCs w:val="26"/>
-        </w:rPr>
-        <w:t xml:space="preserve"> </w:t>
-      </w:r>
-      <w:proofErr w:type="spellStart"/>
-      <w:r>
-        <w:rPr>
-          <w:rFonts w:ascii="Times New Roman" w:hAnsi="Times New Roman" w:cs="Times New Roman"/>
-          <w:b/>
-          <w:sz w:val="26"/>
-          <w:szCs w:val="26"/>
-        </w:rPr>
-        <w:t>và</w:t>
-      </w:r>
-      <w:proofErr w:type="spellEnd"/>
-      <w:r>
-        <w:rPr>
-          <w:rFonts w:ascii="Times New Roman" w:hAnsi="Times New Roman" w:cs="Times New Roman"/>
-          <w:b/>
-          <w:sz w:val="26"/>
-          <w:szCs w:val="26"/>
-        </w:rPr>
-        <w:t xml:space="preserve"> </w:t>
-      </w:r>
-      <w:proofErr w:type="spellStart"/>
-      <w:r>
-        <w:rPr>
-          <w:rFonts w:ascii="Times New Roman" w:hAnsi="Times New Roman" w:cs="Times New Roman"/>
-          <w:b/>
-          <w:sz w:val="26"/>
-          <w:szCs w:val="26"/>
-        </w:rPr>
-        <w:t>làm</w:t>
-      </w:r>
-      <w:proofErr w:type="spellEnd"/>
-      <w:r>
-        <w:rPr>
-          <w:rFonts w:ascii="Times New Roman" w:hAnsi="Times New Roman" w:cs="Times New Roman"/>
-          <w:b/>
-          <w:sz w:val="26"/>
-          <w:szCs w:val="26"/>
-        </w:rPr>
-        <w:t xml:space="preserve"> </w:t>
-      </w:r>
-      <w:proofErr w:type="spellStart"/>
-      <w:r>
-        <w:rPr>
-          <w:rFonts w:ascii="Times New Roman" w:hAnsi="Times New Roman" w:cs="Times New Roman"/>
-          <w:b/>
-          <w:sz w:val="26"/>
-          <w:szCs w:val="26"/>
-        </w:rPr>
-        <w:t>rõ</w:t>
-      </w:r>
-      <w:proofErr w:type="spellEnd"/>
-      <w:r>
-        <w:rPr>
-          <w:rFonts w:ascii="Times New Roman" w:hAnsi="Times New Roman" w:cs="Times New Roman"/>
-          <w:b/>
-          <w:sz w:val="26"/>
-          <w:szCs w:val="26"/>
-        </w:rPr>
-        <w:t xml:space="preserve"> </w:t>
-      </w:r>
-      <w:proofErr w:type="spellStart"/>
-      <w:r>
-        <w:rPr>
-          <w:rFonts w:ascii="Times New Roman" w:hAnsi="Times New Roman" w:cs="Times New Roman"/>
-          <w:b/>
-          <w:sz w:val="26"/>
-          <w:szCs w:val="26"/>
-        </w:rPr>
-        <w:t>yêu</w:t>
-      </w:r>
-      <w:proofErr w:type="spellEnd"/>
-      <w:r>
-        <w:rPr>
-          <w:rFonts w:ascii="Times New Roman" w:hAnsi="Times New Roman" w:cs="Times New Roman"/>
-          <w:b/>
-          <w:sz w:val="26"/>
-          <w:szCs w:val="26"/>
-        </w:rPr>
-        <w:t xml:space="preserve"> </w:t>
-      </w:r>
-      <w:proofErr w:type="spellStart"/>
-      <w:r>
-        <w:rPr>
-          <w:rFonts w:ascii="Times New Roman" w:hAnsi="Times New Roman" w:cs="Times New Roman"/>
-          <w:b/>
-          <w:sz w:val="26"/>
-          <w:szCs w:val="26"/>
-        </w:rPr>
-        <w:t>cầu</w:t>
-      </w:r>
-      <w:proofErr w:type="spellEnd"/>
-      <w:r>
-        <w:rPr>
-          <w:rFonts w:ascii="Times New Roman" w:hAnsi="Times New Roman" w:cs="Times New Roman"/>
-          <w:b/>
-          <w:sz w:val="26"/>
-          <w:szCs w:val="26"/>
-        </w:rPr>
-        <w:t xml:space="preserve"> </w:t>
-      </w:r>
-      <w:proofErr w:type="spellStart"/>
-      <w:r>
-        <w:rPr>
-          <w:rFonts w:ascii="Times New Roman" w:hAnsi="Times New Roman" w:cs="Times New Roman"/>
-          <w:b/>
-          <w:sz w:val="26"/>
-          <w:szCs w:val="26"/>
-        </w:rPr>
-        <w:t>của</w:t>
-      </w:r>
-      <w:proofErr w:type="spellEnd"/>
-      <w:r>
-        <w:rPr>
-          <w:rFonts w:ascii="Times New Roman" w:hAnsi="Times New Roman" w:cs="Times New Roman"/>
-          <w:b/>
-          <w:sz w:val="26"/>
-          <w:szCs w:val="26"/>
-        </w:rPr>
-        <w:t xml:space="preserve"> </w:t>
-      </w:r>
-      <w:proofErr w:type="spellStart"/>
-      <w:r>
-        <w:rPr>
-          <w:rFonts w:ascii="Times New Roman" w:hAnsi="Times New Roman" w:cs="Times New Roman"/>
-          <w:b/>
-          <w:sz w:val="26"/>
-          <w:szCs w:val="26"/>
-        </w:rPr>
-        <w:t>ứng</w:t>
-      </w:r>
-      <w:proofErr w:type="spellEnd"/>
-      <w:r>
-        <w:rPr>
-          <w:rFonts w:ascii="Times New Roman" w:hAnsi="Times New Roman" w:cs="Times New Roman"/>
-          <w:b/>
-          <w:sz w:val="26"/>
-          <w:szCs w:val="26"/>
-        </w:rPr>
-        <w:t xml:space="preserve"> </w:t>
-      </w:r>
-      <w:proofErr w:type="spellStart"/>
-      <w:r>
-        <w:rPr>
-          <w:rFonts w:ascii="Times New Roman" w:hAnsi="Times New Roman" w:cs="Times New Roman"/>
-          <w:b/>
-          <w:sz w:val="26"/>
-          <w:szCs w:val="26"/>
-        </w:rPr>
-        <w:t>dụng</w:t>
-      </w:r>
-      <w:proofErr w:type="spellEnd"/>
+          <w:lang w:val="vi-VN"/>
+        </w:rPr>
+      </w:pPr>
+      <w:r>
+        <w:rPr>
+          <w:rFonts w:ascii="Times New Roman" w:hAnsi="Times New Roman" w:cs="Times New Roman"/>
+          <w:b/>
+          <w:sz w:val="26"/>
+          <w:szCs w:val="26"/>
+          <w:lang w:val="vi-VN"/>
+        </w:rPr>
+        <w:t>Danh sách các c</w:t>
+      </w:r>
+      <w:r>
+        <w:rPr>
+          <w:rFonts w:ascii="Times New Roman" w:hAnsi="Times New Roman" w:cs="Times New Roman"/>
+          <w:b/>
+          <w:sz w:val="26"/>
+          <w:szCs w:val="26"/>
+          <w:lang w:val="vi-VN"/>
+        </w:rPr>
+        <w:t xml:space="preserve">âu hỏi khi thu thập </w:t>
+      </w:r>
+      <w:r>
+        <w:rPr>
+          <w:rFonts w:ascii="Times New Roman" w:hAnsi="Times New Roman" w:cs="Times New Roman"/>
+          <w:b/>
+          <w:sz w:val="26"/>
+          <w:szCs w:val="26"/>
+          <w:lang w:val="vi-VN"/>
+        </w:rPr>
+        <w:t xml:space="preserve">và làm rõ </w:t>
+      </w:r>
+      <w:r>
+        <w:rPr>
+          <w:rFonts w:ascii="Times New Roman" w:hAnsi="Times New Roman" w:cs="Times New Roman"/>
+          <w:b/>
+          <w:sz w:val="26"/>
+          <w:szCs w:val="26"/>
+          <w:lang w:val="vi-VN"/>
+        </w:rPr>
+        <w:t>yêu cầu</w:t>
+      </w:r>
+      <w:r>
+        <w:rPr>
+          <w:rFonts w:ascii="Times New Roman" w:hAnsi="Times New Roman" w:cs="Times New Roman"/>
+          <w:b/>
+          <w:sz w:val="26"/>
+          <w:szCs w:val="26"/>
+          <w:lang w:val="vi-VN"/>
+        </w:rPr>
+        <w:t xml:space="preserve"> của ứng dụng</w:t>
+      </w:r>
     </w:p>
     <w:tbl>
       <w:tblPr>
@@ -2890,15 +3327,7 @@
                 <w:sz w:val="26"/>
                 <w:szCs w:val="26"/>
               </w:rPr>
-              <w:t>1</w:t>
-            </w:r>
-            <w:r>
-              <w:rPr>
-                <w:rFonts w:ascii="Times New Roman" w:hAnsi="Times New Roman" w:cs="Times New Roman"/>
-                <w:sz w:val="26"/>
-                <w:szCs w:val="26"/>
-              </w:rPr>
-              <w:t>.</w:t>
+              <w:t>1.</w:t>
             </w:r>
           </w:p>
         </w:tc>
@@ -4118,192 +4547,240 @@
       <w:proofErr w:type="spellStart"/>
       <w:r>
         <w:rPr>
-          <w:b/>
-          <w:sz w:val="26"/>
+          <w:rFonts w:ascii="Times New Roman" w:hAnsi="Times New Roman" w:cs="Times New Roman"/>
+          <w:b/>
+          <w:sz w:val="26"/>
+          <w:szCs w:val="26"/>
         </w:rPr>
         <w:t>Các</w:t>
       </w:r>
       <w:proofErr w:type="spellEnd"/>
       <w:r>
         <w:rPr>
-          <w:b/>
-          <w:sz w:val="26"/>
+          <w:rFonts w:ascii="Times New Roman" w:hAnsi="Times New Roman" w:cs="Times New Roman"/>
+          <w:b/>
+          <w:sz w:val="26"/>
+          <w:szCs w:val="26"/>
         </w:rPr>
         <w:t xml:space="preserve"> </w:t>
       </w:r>
       <w:proofErr w:type="spellStart"/>
       <w:r>
         <w:rPr>
-          <w:b/>
-          <w:sz w:val="26"/>
+          <w:rFonts w:ascii="Times New Roman" w:hAnsi="Times New Roman" w:cs="Times New Roman"/>
+          <w:b/>
+          <w:sz w:val="26"/>
+          <w:szCs w:val="26"/>
         </w:rPr>
         <w:t>chức</w:t>
       </w:r>
       <w:proofErr w:type="spellEnd"/>
       <w:r>
         <w:rPr>
-          <w:b/>
-          <w:sz w:val="26"/>
+          <w:rFonts w:ascii="Times New Roman" w:hAnsi="Times New Roman" w:cs="Times New Roman"/>
+          <w:b/>
+          <w:sz w:val="26"/>
+          <w:szCs w:val="26"/>
         </w:rPr>
         <w:t xml:space="preserve"> </w:t>
       </w:r>
       <w:proofErr w:type="spellStart"/>
       <w:r>
         <w:rPr>
-          <w:b/>
-          <w:sz w:val="26"/>
+          <w:rFonts w:ascii="Times New Roman" w:hAnsi="Times New Roman" w:cs="Times New Roman"/>
+          <w:b/>
+          <w:sz w:val="26"/>
+          <w:szCs w:val="26"/>
         </w:rPr>
         <w:t>năng</w:t>
       </w:r>
       <w:proofErr w:type="spellEnd"/>
       <w:r>
         <w:rPr>
-          <w:b/>
-          <w:sz w:val="26"/>
+          <w:rFonts w:ascii="Times New Roman" w:hAnsi="Times New Roman" w:cs="Times New Roman"/>
+          <w:b/>
+          <w:sz w:val="26"/>
+          <w:szCs w:val="26"/>
         </w:rPr>
         <w:t xml:space="preserve"> </w:t>
       </w:r>
       <w:proofErr w:type="spellStart"/>
       <w:r>
         <w:rPr>
-          <w:b/>
-          <w:sz w:val="26"/>
+          <w:rFonts w:ascii="Times New Roman" w:hAnsi="Times New Roman" w:cs="Times New Roman"/>
+          <w:b/>
+          <w:sz w:val="26"/>
+          <w:szCs w:val="26"/>
         </w:rPr>
         <w:t>chính</w:t>
       </w:r>
       <w:proofErr w:type="spellEnd"/>
       <w:r>
         <w:rPr>
-          <w:b/>
-          <w:sz w:val="26"/>
+          <w:rFonts w:ascii="Times New Roman" w:hAnsi="Times New Roman" w:cs="Times New Roman"/>
+          <w:b/>
+          <w:sz w:val="26"/>
+          <w:szCs w:val="26"/>
         </w:rPr>
         <w:t xml:space="preserve"> </w:t>
       </w:r>
       <w:proofErr w:type="spellStart"/>
       <w:r>
         <w:rPr>
-          <w:b/>
-          <w:sz w:val="26"/>
+          <w:rFonts w:ascii="Times New Roman" w:hAnsi="Times New Roman" w:cs="Times New Roman"/>
+          <w:b/>
+          <w:sz w:val="26"/>
+          <w:szCs w:val="26"/>
         </w:rPr>
         <w:t>cho</w:t>
       </w:r>
       <w:proofErr w:type="spellEnd"/>
       <w:r>
         <w:rPr>
-          <w:b/>
-          <w:sz w:val="26"/>
+          <w:rFonts w:ascii="Times New Roman" w:hAnsi="Times New Roman" w:cs="Times New Roman"/>
+          <w:b/>
+          <w:sz w:val="26"/>
+          <w:szCs w:val="26"/>
         </w:rPr>
         <w:t xml:space="preserve"> </w:t>
       </w:r>
       <w:proofErr w:type="spellStart"/>
       <w:r>
         <w:rPr>
-          <w:b/>
-          <w:sz w:val="26"/>
+          <w:rFonts w:ascii="Times New Roman" w:hAnsi="Times New Roman" w:cs="Times New Roman"/>
+          <w:b/>
+          <w:sz w:val="26"/>
+          <w:szCs w:val="26"/>
         </w:rPr>
         <w:t>ứng</w:t>
       </w:r>
       <w:proofErr w:type="spellEnd"/>
       <w:r>
         <w:rPr>
-          <w:b/>
-          <w:sz w:val="26"/>
+          <w:rFonts w:ascii="Times New Roman" w:hAnsi="Times New Roman" w:cs="Times New Roman"/>
+          <w:b/>
+          <w:sz w:val="26"/>
+          <w:szCs w:val="26"/>
         </w:rPr>
         <w:t xml:space="preserve"> </w:t>
       </w:r>
       <w:proofErr w:type="spellStart"/>
       <w:r>
         <w:rPr>
-          <w:b/>
-          <w:sz w:val="26"/>
+          <w:rFonts w:ascii="Times New Roman" w:hAnsi="Times New Roman" w:cs="Times New Roman"/>
+          <w:b/>
+          <w:sz w:val="26"/>
+          <w:szCs w:val="26"/>
         </w:rPr>
         <w:t>dụng</w:t>
       </w:r>
       <w:proofErr w:type="spellEnd"/>
       <w:r>
         <w:rPr>
-          <w:b/>
-          <w:sz w:val="26"/>
+          <w:rFonts w:ascii="Times New Roman" w:hAnsi="Times New Roman" w:cs="Times New Roman"/>
+          <w:b/>
+          <w:sz w:val="26"/>
+          <w:szCs w:val="26"/>
         </w:rPr>
         <w:t xml:space="preserve"> (</w:t>
       </w:r>
       <w:proofErr w:type="spellStart"/>
       <w:r>
         <w:rPr>
-          <w:b/>
-          <w:sz w:val="26"/>
+          <w:rFonts w:ascii="Times New Roman" w:hAnsi="Times New Roman" w:cs="Times New Roman"/>
+          <w:b/>
+          <w:sz w:val="26"/>
+          <w:szCs w:val="26"/>
         </w:rPr>
         <w:t>Mục</w:t>
       </w:r>
       <w:proofErr w:type="spellEnd"/>
       <w:r>
         <w:rPr>
-          <w:b/>
-          <w:sz w:val="26"/>
+          <w:rFonts w:ascii="Times New Roman" w:hAnsi="Times New Roman" w:cs="Times New Roman"/>
+          <w:b/>
+          <w:sz w:val="26"/>
+          <w:szCs w:val="26"/>
         </w:rPr>
         <w:t xml:space="preserve"> </w:t>
       </w:r>
       <w:proofErr w:type="spellStart"/>
       <w:r>
         <w:rPr>
-          <w:b/>
-          <w:sz w:val="26"/>
+          <w:rFonts w:ascii="Times New Roman" w:hAnsi="Times New Roman" w:cs="Times New Roman"/>
+          <w:b/>
+          <w:sz w:val="26"/>
+          <w:szCs w:val="26"/>
         </w:rPr>
         <w:t>tiêu</w:t>
       </w:r>
       <w:proofErr w:type="spellEnd"/>
       <w:r>
         <w:rPr>
-          <w:b/>
-          <w:sz w:val="26"/>
+          <w:rFonts w:ascii="Times New Roman" w:hAnsi="Times New Roman" w:cs="Times New Roman"/>
+          <w:b/>
+          <w:sz w:val="26"/>
+          <w:szCs w:val="26"/>
         </w:rPr>
         <w:t xml:space="preserve"> </w:t>
       </w:r>
       <w:proofErr w:type="spellStart"/>
       <w:r>
         <w:rPr>
-          <w:b/>
-          <w:sz w:val="26"/>
+          <w:rFonts w:ascii="Times New Roman" w:hAnsi="Times New Roman" w:cs="Times New Roman"/>
+          <w:b/>
+          <w:sz w:val="26"/>
+          <w:szCs w:val="26"/>
         </w:rPr>
         <w:t>của</w:t>
       </w:r>
       <w:proofErr w:type="spellEnd"/>
       <w:r>
         <w:rPr>
-          <w:b/>
-          <w:sz w:val="26"/>
+          <w:rFonts w:ascii="Times New Roman" w:hAnsi="Times New Roman" w:cs="Times New Roman"/>
+          <w:b/>
+          <w:sz w:val="26"/>
+          <w:szCs w:val="26"/>
         </w:rPr>
         <w:t xml:space="preserve"> </w:t>
       </w:r>
       <w:proofErr w:type="spellStart"/>
       <w:r>
         <w:rPr>
-          <w:b/>
-          <w:sz w:val="26"/>
+          <w:rFonts w:ascii="Times New Roman" w:hAnsi="Times New Roman" w:cs="Times New Roman"/>
+          <w:b/>
+          <w:sz w:val="26"/>
+          <w:szCs w:val="26"/>
         </w:rPr>
         <w:t>ứng</w:t>
       </w:r>
       <w:proofErr w:type="spellEnd"/>
       <w:r>
         <w:rPr>
-          <w:b/>
-          <w:sz w:val="26"/>
+          <w:rFonts w:ascii="Times New Roman" w:hAnsi="Times New Roman" w:cs="Times New Roman"/>
+          <w:b/>
+          <w:sz w:val="26"/>
+          <w:szCs w:val="26"/>
         </w:rPr>
         <w:t xml:space="preserve"> </w:t>
       </w:r>
       <w:proofErr w:type="spellStart"/>
       <w:r>
         <w:rPr>
-          <w:b/>
-          <w:sz w:val="26"/>
+          <w:rFonts w:ascii="Times New Roman" w:hAnsi="Times New Roman" w:cs="Times New Roman"/>
+          <w:b/>
+          <w:sz w:val="26"/>
+          <w:szCs w:val="26"/>
         </w:rPr>
         <w:t>dụng</w:t>
       </w:r>
       <w:proofErr w:type="spellEnd"/>
       <w:r>
         <w:rPr>
-          <w:b/>
-          <w:sz w:val="26"/>
+          <w:rFonts w:ascii="Times New Roman" w:hAnsi="Times New Roman" w:cs="Times New Roman"/>
+          <w:b/>
+          <w:sz w:val="26"/>
+          <w:szCs w:val="26"/>
         </w:rPr>
         <w:t>)</w:t>
       </w:r>
@@ -4334,6 +4811,7 @@
           <w:sz w:val="26"/>
           <w:szCs w:val="26"/>
         </w:rPr>
+        <w:lastRenderedPageBreak/>
         <w:t xml:space="preserve">Link </w:t>
       </w:r>
       <w:proofErr w:type="spellStart"/>
@@ -4545,7 +5023,7 @@
                 </wp:anchor>
               </w:drawing>
             </mc:Choice>
-            <mc:Fallback xmlns:w16sdtfl="http://schemas.microsoft.com/office/word/2024/wordml/sdtformatlock" xmlns:w16du="http://schemas.microsoft.com/office/word/2023/wordml/word16du" xmlns:w16cei="http://schemas.microsoft.com/office/word/2026/wordml/cei" xmlns:oel="http://schemas.microsoft.com/office/2019/extlst">
+            <mc:Fallback xmlns:oel="http://schemas.microsoft.com/office/2019/extlst" xmlns:w16cei="http://schemas.microsoft.com/office/word/2026/wordml/cei" xmlns:w16du="http://schemas.microsoft.com/office/word/2023/wordml/word16du" xmlns:w16sdtfl="http://schemas.microsoft.com/office/word/2024/wordml/sdtformatlock">
               <w:pict>
                 <v:line w14:anchorId="62D43E4F" id="Straight Connector 1" o:spid="_x0000_s1026" style="position:absolute;z-index:251659264;visibility:visible;mso-wrap-style:square;mso-width-percent:0;mso-wrap-distance-left:9pt;mso-wrap-distance-top:0;mso-wrap-distance-right:9pt;mso-wrap-distance-bottom:0;mso-position-horizontal:absolute;mso-position-horizontal-relative:text;mso-position-vertical:absolute;mso-position-vertical-relative:text;mso-width-percent:0;mso-width-relative:margin" from=".85pt,.5pt" to="525.25pt,.5pt" o:gfxdata="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" strokecolor="black [3200]" strokeweight=".5pt">
                   <v:stroke joinstyle="miter"/>
@@ -4799,6 +5277,453 @@
 <file path=word/numbering.xml><?xml version="1.0" encoding="utf-8"?>
 <w:numbering xmlns:wpc="http://schemas.microsoft.com/office/word/2010/wordprocessingCanvas" xmlns:cx="http://schemas.microsoft.com/office/drawing/2014/chartex" xmlns:cx1="http://schemas.microsoft.com/office/drawing/2015/9/8/chartex" xmlns:cx2="http://schemas.microsoft.com/office/drawing/2015/10/21/chartex" xmlns:cx3="http://schemas.microsoft.com/office/drawing/2016/5/9/chartex" xmlns:cx4="http://schemas.microsoft.com/office/drawing/2016/5/10/chartex" xmlns:cx5="http://schemas.microsoft.com/office/drawing/2016/5/11/chartex" xmlns:cx6="http://schemas.microsoft.com/office/drawing/2016/5/12/chartex" xmlns:cx7="http://schemas.microsoft.com/office/drawing/2016/5/13/chartex" xmlns:cx8="http://schemas.microsoft.com/office/drawing/2016/5/14/chartex" xmlns:mc="http://schemas.openxmlformats.org/markup-compatibility/2006" xmlns:aink="http://schemas.microsoft.com/office/drawing/2016/ink" xmlns:am3d="http://schemas.microsoft.com/office/drawing/2017/model3d" xmlns:o="urn:schemas-microsoft-com:office:office" xmlns:r="http://schemas.openxmlformats.org/officeDocument/2006/relationships" xmlns:m="http://schemas.openxmlformats.org/officeDocument/2006/math" xmlns:v="urn:schemas-microsoft-com:vml" xmlns:wp14="http://schemas.microsoft.com/office/word/2010/wordprocessingDrawing" xmlns:wp="http://schemas.openxmlformats.org/drawingml/2006/wordprocessingDrawing" xmlns:w10="urn:schemas-microsoft-com:office:word" xmlns:w="http://schemas.openxmlformats.org/wordprocessingml/2006/main" xmlns:w14="http://schemas.microsoft.com/office/word/2010/wordml" xmlns:w15="http://schemas.microsoft.com/office/word/2012/wordml" xmlns:w16cex="http://schemas.microsoft.com/office/word/2018/wordml/cex" xmlns:w16cid="http://schemas.microsoft.com/office/word/2016/wordml/cid" xmlns:w16="http://schemas.microsoft.com/office/word/2018/wordml" xmlns:w16sdtdh="http://schemas.microsoft.com/office/word/2020/wordml/sdtdatahash" xmlns:w16se="http://schemas.microsoft.com/office/word/2015/wordml/symex" xmlns:wpg="http://schemas.microsoft.com/office/word/2010/wordprocessingGroup" xmlns:wpi="http://schemas.microsoft.com/office/word/2010/wordprocessingInk" xmlns:wne="http://schemas.microsoft.com/office/word/2006/wordml" xmlns:wps="http://schemas.microsoft.com/office/word/2010/wordprocessingShape" mc:Ignorable="w14 w15 w16se w16cid w16 w16cex w16sdtdh wp14">
   <w:abstractNum w:abstractNumId="0" w15:restartNumberingAfterBreak="0">
+    <w:nsid w:val="0A9C3667"/>
+    <w:multiLevelType w:val="multilevel"/>
+    <w:tmpl w:val="7FA2EAAA"/>
+    <w:lvl w:ilvl="0">
+      <w:start w:val="1"/>
+      <w:numFmt w:val="bullet"/>
+      <w:lvlText w:val=""/>
+      <w:lvlJc w:val="left"/>
+      <w:pPr>
+        <w:tabs>
+          <w:tab w:val="num" w:pos="720"/>
+        </w:tabs>
+        <w:ind w:left="720" w:hanging="360"/>
+      </w:pPr>
+      <w:rPr>
+        <w:rFonts w:ascii="Symbol" w:hAnsi="Symbol" w:hint="default"/>
+        <w:sz w:val="20"/>
+      </w:rPr>
+    </w:lvl>
+    <w:lvl w:ilvl="1" w:tentative="1">
+      <w:start w:val="1"/>
+      <w:numFmt w:val="bullet"/>
+      <w:lvlText w:val="o"/>
+      <w:lvlJc w:val="left"/>
+      <w:pPr>
+        <w:tabs>
+          <w:tab w:val="num" w:pos="1440"/>
+        </w:tabs>
+        <w:ind w:left="1440" w:hanging="360"/>
+      </w:pPr>
+      <w:rPr>
+        <w:rFonts w:ascii="Courier New" w:hAnsi="Courier New" w:hint="default"/>
+        <w:sz w:val="20"/>
+      </w:rPr>
+    </w:lvl>
+    <w:lvl w:ilvl="2" w:tentative="1">
+      <w:start w:val="1"/>
+      <w:numFmt w:val="bullet"/>
+      <w:lvlText w:val=""/>
+      <w:lvlJc w:val="left"/>
+      <w:pPr>
+        <w:tabs>
+          <w:tab w:val="num" w:pos="2160"/>
+        </w:tabs>
+        <w:ind w:left="2160" w:hanging="360"/>
+      </w:pPr>
+      <w:rPr>
+        <w:rFonts w:ascii="Wingdings" w:hAnsi="Wingdings" w:hint="default"/>
+        <w:sz w:val="20"/>
+      </w:rPr>
+    </w:lvl>
+    <w:lvl w:ilvl="3" w:tentative="1">
+      <w:start w:val="1"/>
+      <w:numFmt w:val="bullet"/>
+      <w:lvlText w:val=""/>
+      <w:lvlJc w:val="left"/>
+      <w:pPr>
+        <w:tabs>
+          <w:tab w:val="num" w:pos="2880"/>
+        </w:tabs>
+        <w:ind w:left="2880" w:hanging="360"/>
+      </w:pPr>
+      <w:rPr>
+        <w:rFonts w:ascii="Wingdings" w:hAnsi="Wingdings" w:hint="default"/>
+        <w:sz w:val="20"/>
+      </w:rPr>
+    </w:lvl>
+    <w:lvl w:ilvl="4" w:tentative="1">
+      <w:start w:val="1"/>
+      <w:numFmt w:val="bullet"/>
+      <w:lvlText w:val=""/>
+      <w:lvlJc w:val="left"/>
+      <w:pPr>
+        <w:tabs>
+          <w:tab w:val="num" w:pos="3600"/>
+        </w:tabs>
+        <w:ind w:left="3600" w:hanging="360"/>
+      </w:pPr>
+      <w:rPr>
+        <w:rFonts w:ascii="Wingdings" w:hAnsi="Wingdings" w:hint="default"/>
+        <w:sz w:val="20"/>
+      </w:rPr>
+    </w:lvl>
+    <w:lvl w:ilvl="5" w:tentative="1">
+      <w:start w:val="1"/>
+      <w:numFmt w:val="bullet"/>
+      <w:lvlText w:val=""/>
+      <w:lvlJc w:val="left"/>
+      <w:pPr>
+        <w:tabs>
+          <w:tab w:val="num" w:pos="4320"/>
+        </w:tabs>
+        <w:ind w:left="4320" w:hanging="360"/>
+      </w:pPr>
+      <w:rPr>
+        <w:rFonts w:ascii="Wingdings" w:hAnsi="Wingdings" w:hint="default"/>
+        <w:sz w:val="20"/>
+      </w:rPr>
+    </w:lvl>
+    <w:lvl w:ilvl="6" w:tentative="1">
+      <w:start w:val="1"/>
+      <w:numFmt w:val="bullet"/>
+      <w:lvlText w:val=""/>
+      <w:lvlJc w:val="left"/>
+      <w:pPr>
+        <w:tabs>
+          <w:tab w:val="num" w:pos="5040"/>
+        </w:tabs>
+        <w:ind w:left="5040" w:hanging="360"/>
+      </w:pPr>
+      <w:rPr>
+        <w:rFonts w:ascii="Wingdings" w:hAnsi="Wingdings" w:hint="default"/>
+        <w:sz w:val="20"/>
+      </w:rPr>
+    </w:lvl>
+    <w:lvl w:ilvl="7" w:tentative="1">
+      <w:start w:val="1"/>
+      <w:numFmt w:val="bullet"/>
+      <w:lvlText w:val=""/>
+      <w:lvlJc w:val="left"/>
+      <w:pPr>
+        <w:tabs>
+          <w:tab w:val="num" w:pos="5760"/>
+        </w:tabs>
+        <w:ind w:left="5760" w:hanging="360"/>
+      </w:pPr>
+      <w:rPr>
+        <w:rFonts w:ascii="Wingdings" w:hAnsi="Wingdings" w:hint="default"/>
+        <w:sz w:val="20"/>
+      </w:rPr>
+    </w:lvl>
+    <w:lvl w:ilvl="8" w:tentative="1">
+      <w:start w:val="1"/>
+      <w:numFmt w:val="bullet"/>
+      <w:lvlText w:val=""/>
+      <w:lvlJc w:val="left"/>
+      <w:pPr>
+        <w:tabs>
+          <w:tab w:val="num" w:pos="6480"/>
+        </w:tabs>
+        <w:ind w:left="6480" w:hanging="360"/>
+      </w:pPr>
+      <w:rPr>
+        <w:rFonts w:ascii="Wingdings" w:hAnsi="Wingdings" w:hint="default"/>
+        <w:sz w:val="20"/>
+      </w:rPr>
+    </w:lvl>
+  </w:abstractNum>
+  <w:abstractNum w:abstractNumId="1" w15:restartNumberingAfterBreak="0">
+    <w:nsid w:val="13BD5F36"/>
+    <w:multiLevelType w:val="multilevel"/>
+    <w:tmpl w:val="B0E009CC"/>
+    <w:lvl w:ilvl="0">
+      <w:start w:val="1"/>
+      <w:numFmt w:val="bullet"/>
+      <w:lvlText w:val=""/>
+      <w:lvlJc w:val="left"/>
+      <w:pPr>
+        <w:tabs>
+          <w:tab w:val="num" w:pos="720"/>
+        </w:tabs>
+        <w:ind w:left="720" w:hanging="360"/>
+      </w:pPr>
+      <w:rPr>
+        <w:rFonts w:ascii="Symbol" w:hAnsi="Symbol" w:hint="default"/>
+        <w:sz w:val="20"/>
+      </w:rPr>
+    </w:lvl>
+    <w:lvl w:ilvl="1" w:tentative="1">
+      <w:start w:val="1"/>
+      <w:numFmt w:val="bullet"/>
+      <w:lvlText w:val="o"/>
+      <w:lvlJc w:val="left"/>
+      <w:pPr>
+        <w:tabs>
+          <w:tab w:val="num" w:pos="1440"/>
+        </w:tabs>
+        <w:ind w:left="1440" w:hanging="360"/>
+      </w:pPr>
+      <w:rPr>
+        <w:rFonts w:ascii="Courier New" w:hAnsi="Courier New" w:hint="default"/>
+        <w:sz w:val="20"/>
+      </w:rPr>
+    </w:lvl>
+    <w:lvl w:ilvl="2" w:tentative="1">
+      <w:start w:val="1"/>
+      <w:numFmt w:val="bullet"/>
+      <w:lvlText w:val=""/>
+      <w:lvlJc w:val="left"/>
+      <w:pPr>
+        <w:tabs>
+          <w:tab w:val="num" w:pos="2160"/>
+        </w:tabs>
+        <w:ind w:left="2160" w:hanging="360"/>
+      </w:pPr>
+      <w:rPr>
+        <w:rFonts w:ascii="Wingdings" w:hAnsi="Wingdings" w:hint="default"/>
+        <w:sz w:val="20"/>
+      </w:rPr>
+    </w:lvl>
+    <w:lvl w:ilvl="3" w:tentative="1">
+      <w:start w:val="1"/>
+      <w:numFmt w:val="bullet"/>
+      <w:lvlText w:val=""/>
+      <w:lvlJc w:val="left"/>
+      <w:pPr>
+        <w:tabs>
+          <w:tab w:val="num" w:pos="2880"/>
+        </w:tabs>
+        <w:ind w:left="2880" w:hanging="360"/>
+      </w:pPr>
+      <w:rPr>
+        <w:rFonts w:ascii="Wingdings" w:hAnsi="Wingdings" w:hint="default"/>
+        <w:sz w:val="20"/>
+      </w:rPr>
+    </w:lvl>
+    <w:lvl w:ilvl="4" w:tentative="1">
+      <w:start w:val="1"/>
+      <w:numFmt w:val="bullet"/>
+      <w:lvlText w:val=""/>
+      <w:lvlJc w:val="left"/>
+      <w:pPr>
+        <w:tabs>
+          <w:tab w:val="num" w:pos="3600"/>
+        </w:tabs>
+        <w:ind w:left="3600" w:hanging="360"/>
+      </w:pPr>
+      <w:rPr>
+        <w:rFonts w:ascii="Wingdings" w:hAnsi="Wingdings" w:hint="default"/>
+        <w:sz w:val="20"/>
+      </w:rPr>
+    </w:lvl>
+    <w:lvl w:ilvl="5" w:tentative="1">
+      <w:start w:val="1"/>
+      <w:numFmt w:val="bullet"/>
+      <w:lvlText w:val=""/>
+      <w:lvlJc w:val="left"/>
+      <w:pPr>
+        <w:tabs>
+          <w:tab w:val="num" w:pos="4320"/>
+        </w:tabs>
+        <w:ind w:left="4320" w:hanging="360"/>
+      </w:pPr>
+      <w:rPr>
+        <w:rFonts w:ascii="Wingdings" w:hAnsi="Wingdings" w:hint="default"/>
+        <w:sz w:val="20"/>
+      </w:rPr>
+    </w:lvl>
+    <w:lvl w:ilvl="6" w:tentative="1">
+      <w:start w:val="1"/>
+      <w:numFmt w:val="bullet"/>
+      <w:lvlText w:val=""/>
+      <w:lvlJc w:val="left"/>
+      <w:pPr>
+        <w:tabs>
+          <w:tab w:val="num" w:pos="5040"/>
+        </w:tabs>
+        <w:ind w:left="5040" w:hanging="360"/>
+      </w:pPr>
+      <w:rPr>
+        <w:rFonts w:ascii="Wingdings" w:hAnsi="Wingdings" w:hint="default"/>
+        <w:sz w:val="20"/>
+      </w:rPr>
+    </w:lvl>
+    <w:lvl w:ilvl="7" w:tentative="1">
+      <w:start w:val="1"/>
+      <w:numFmt w:val="bullet"/>
+      <w:lvlText w:val=""/>
+      <w:lvlJc w:val="left"/>
+      <w:pPr>
+        <w:tabs>
+          <w:tab w:val="num" w:pos="5760"/>
+        </w:tabs>
+        <w:ind w:left="5760" w:hanging="360"/>
+      </w:pPr>
+      <w:rPr>
+        <w:rFonts w:ascii="Wingdings" w:hAnsi="Wingdings" w:hint="default"/>
+        <w:sz w:val="20"/>
+      </w:rPr>
+    </w:lvl>
+    <w:lvl w:ilvl="8" w:tentative="1">
+      <w:start w:val="1"/>
+      <w:numFmt w:val="bullet"/>
+      <w:lvlText w:val=""/>
+      <w:lvlJc w:val="left"/>
+      <w:pPr>
+        <w:tabs>
+          <w:tab w:val="num" w:pos="6480"/>
+        </w:tabs>
+        <w:ind w:left="6480" w:hanging="360"/>
+      </w:pPr>
+      <w:rPr>
+        <w:rFonts w:ascii="Wingdings" w:hAnsi="Wingdings" w:hint="default"/>
+        <w:sz w:val="20"/>
+      </w:rPr>
+    </w:lvl>
+  </w:abstractNum>
+  <w:abstractNum w:abstractNumId="2" w15:restartNumberingAfterBreak="0">
+    <w:nsid w:val="195C0407"/>
+    <w:multiLevelType w:val="multilevel"/>
+    <w:tmpl w:val="56FEBE86"/>
+    <w:lvl w:ilvl="0">
+      <w:start w:val="1"/>
+      <w:numFmt w:val="bullet"/>
+      <w:lvlText w:val=""/>
+      <w:lvlJc w:val="left"/>
+      <w:pPr>
+        <w:tabs>
+          <w:tab w:val="num" w:pos="720"/>
+        </w:tabs>
+        <w:ind w:left="720" w:hanging="360"/>
+      </w:pPr>
+      <w:rPr>
+        <w:rFonts w:ascii="Symbol" w:hAnsi="Symbol" w:hint="default"/>
+        <w:sz w:val="20"/>
+      </w:rPr>
+    </w:lvl>
+    <w:lvl w:ilvl="1" w:tentative="1">
+      <w:start w:val="1"/>
+      <w:numFmt w:val="bullet"/>
+      <w:lvlText w:val="o"/>
+      <w:lvlJc w:val="left"/>
+      <w:pPr>
+        <w:tabs>
+          <w:tab w:val="num" w:pos="1440"/>
+        </w:tabs>
+        <w:ind w:left="1440" w:hanging="360"/>
+      </w:pPr>
+      <w:rPr>
+        <w:rFonts w:ascii="Courier New" w:hAnsi="Courier New" w:hint="default"/>
+        <w:sz w:val="20"/>
+      </w:rPr>
+    </w:lvl>
+    <w:lvl w:ilvl="2" w:tentative="1">
+      <w:start w:val="1"/>
+      <w:numFmt w:val="bullet"/>
+      <w:lvlText w:val=""/>
+      <w:lvlJc w:val="left"/>
+      <w:pPr>
+        <w:tabs>
+          <w:tab w:val="num" w:pos="2160"/>
+        </w:tabs>
+        <w:ind w:left="2160" w:hanging="360"/>
+      </w:pPr>
+      <w:rPr>
+        <w:rFonts w:ascii="Wingdings" w:hAnsi="Wingdings" w:hint="default"/>
+        <w:sz w:val="20"/>
+      </w:rPr>
+    </w:lvl>
+    <w:lvl w:ilvl="3" w:tentative="1">
+      <w:start w:val="1"/>
+      <w:numFmt w:val="bullet"/>
+      <w:lvlText w:val=""/>
+      <w:lvlJc w:val="left"/>
+      <w:pPr>
+        <w:tabs>
+          <w:tab w:val="num" w:pos="2880"/>
+        </w:tabs>
+        <w:ind w:left="2880" w:hanging="360"/>
+      </w:pPr>
+      <w:rPr>
+        <w:rFonts w:ascii="Wingdings" w:hAnsi="Wingdings" w:hint="default"/>
+        <w:sz w:val="20"/>
+      </w:rPr>
+    </w:lvl>
+    <w:lvl w:ilvl="4" w:tentative="1">
+      <w:start w:val="1"/>
+      <w:numFmt w:val="bullet"/>
+      <w:lvlText w:val=""/>
+      <w:lvlJc w:val="left"/>
+      <w:pPr>
+        <w:tabs>
+          <w:tab w:val="num" w:pos="3600"/>
+        </w:tabs>
+        <w:ind w:left="3600" w:hanging="360"/>
+      </w:pPr>
+      <w:rPr>
+        <w:rFonts w:ascii="Wingdings" w:hAnsi="Wingdings" w:hint="default"/>
+        <w:sz w:val="20"/>
+      </w:rPr>
+    </w:lvl>
+    <w:lvl w:ilvl="5" w:tentative="1">
+      <w:start w:val="1"/>
+      <w:numFmt w:val="bullet"/>
+      <w:lvlText w:val=""/>
+      <w:lvlJc w:val="left"/>
+      <w:pPr>
+        <w:tabs>
+          <w:tab w:val="num" w:pos="4320"/>
+        </w:tabs>
+        <w:ind w:left="4320" w:hanging="360"/>
+      </w:pPr>
+      <w:rPr>
+        <w:rFonts w:ascii="Wingdings" w:hAnsi="Wingdings" w:hint="default"/>
+        <w:sz w:val="20"/>
+      </w:rPr>
+    </w:lvl>
+    <w:lvl w:ilvl="6" w:tentative="1">
+      <w:start w:val="1"/>
+      <w:numFmt w:val="bullet"/>
+      <w:lvlText w:val=""/>
+      <w:lvlJc w:val="left"/>
+      <w:pPr>
+        <w:tabs>
+          <w:tab w:val="num" w:pos="5040"/>
+        </w:tabs>
+        <w:ind w:left="5040" w:hanging="360"/>
+      </w:pPr>
+      <w:rPr>
+        <w:rFonts w:ascii="Wingdings" w:hAnsi="Wingdings" w:hint="default"/>
+        <w:sz w:val="20"/>
+      </w:rPr>
+    </w:lvl>
+    <w:lvl w:ilvl="7" w:tentative="1">
+      <w:start w:val="1"/>
+      <w:numFmt w:val="bullet"/>
+      <w:lvlText w:val=""/>
+      <w:lvlJc w:val="left"/>
+      <w:pPr>
+        <w:tabs>
+          <w:tab w:val="num" w:pos="5760"/>
+        </w:tabs>
+        <w:ind w:left="5760" w:hanging="360"/>
+      </w:pPr>
+      <w:rPr>
+        <w:rFonts w:ascii="Wingdings" w:hAnsi="Wingdings" w:hint="default"/>
+        <w:sz w:val="20"/>
+      </w:rPr>
+    </w:lvl>
+    <w:lvl w:ilvl="8" w:tentative="1">
+      <w:start w:val="1"/>
+      <w:numFmt w:val="bullet"/>
+      <w:lvlText w:val=""/>
+      <w:lvlJc w:val="left"/>
+      <w:pPr>
+        <w:tabs>
+          <w:tab w:val="num" w:pos="6480"/>
+        </w:tabs>
+        <w:ind w:left="6480" w:hanging="360"/>
+      </w:pPr>
+      <w:rPr>
+        <w:rFonts w:ascii="Wingdings" w:hAnsi="Wingdings" w:hint="default"/>
+        <w:sz w:val="20"/>
+      </w:rPr>
+    </w:lvl>
+  </w:abstractNum>
+  <w:abstractNum w:abstractNumId="3" w15:restartNumberingAfterBreak="0">
     <w:nsid w:val="22956ADA"/>
     <w:multiLevelType w:val="hybridMultilevel"/>
     <w:tmpl w:val="152EDC48"/>
@@ -4884,7 +5809,156 @@
       </w:pPr>
     </w:lvl>
   </w:abstractNum>
-  <w:abstractNum w:abstractNumId="1" w15:restartNumberingAfterBreak="0">
+  <w:abstractNum w:abstractNumId="4" w15:restartNumberingAfterBreak="0">
+    <w:nsid w:val="255B48AE"/>
+    <w:multiLevelType w:val="multilevel"/>
+    <w:tmpl w:val="106C8210"/>
+    <w:lvl w:ilvl="0">
+      <w:start w:val="1"/>
+      <w:numFmt w:val="bullet"/>
+      <w:lvlText w:val=""/>
+      <w:lvlJc w:val="left"/>
+      <w:pPr>
+        <w:tabs>
+          <w:tab w:val="num" w:pos="720"/>
+        </w:tabs>
+        <w:ind w:left="720" w:hanging="360"/>
+      </w:pPr>
+      <w:rPr>
+        <w:rFonts w:ascii="Symbol" w:hAnsi="Symbol" w:hint="default"/>
+        <w:sz w:val="20"/>
+      </w:rPr>
+    </w:lvl>
+    <w:lvl w:ilvl="1" w:tentative="1">
+      <w:start w:val="1"/>
+      <w:numFmt w:val="bullet"/>
+      <w:lvlText w:val="o"/>
+      <w:lvlJc w:val="left"/>
+      <w:pPr>
+        <w:tabs>
+          <w:tab w:val="num" w:pos="1440"/>
+        </w:tabs>
+        <w:ind w:left="1440" w:hanging="360"/>
+      </w:pPr>
+      <w:rPr>
+        <w:rFonts w:ascii="Courier New" w:hAnsi="Courier New" w:hint="default"/>
+        <w:sz w:val="20"/>
+      </w:rPr>
+    </w:lvl>
+    <w:lvl w:ilvl="2" w:tentative="1">
+      <w:start w:val="1"/>
+      <w:numFmt w:val="bullet"/>
+      <w:lvlText w:val=""/>
+      <w:lvlJc w:val="left"/>
+      <w:pPr>
+        <w:tabs>
+          <w:tab w:val="num" w:pos="2160"/>
+        </w:tabs>
+        <w:ind w:left="2160" w:hanging="360"/>
+      </w:pPr>
+      <w:rPr>
+        <w:rFonts w:ascii="Wingdings" w:hAnsi="Wingdings" w:hint="default"/>
+        <w:sz w:val="20"/>
+      </w:rPr>
+    </w:lvl>
+    <w:lvl w:ilvl="3" w:tentative="1">
+      <w:start w:val="1"/>
+      <w:numFmt w:val="bullet"/>
+      <w:lvlText w:val=""/>
+      <w:lvlJc w:val="left"/>
+      <w:pPr>
+        <w:tabs>
+          <w:tab w:val="num" w:pos="2880"/>
+        </w:tabs>
+        <w:ind w:left="2880" w:hanging="360"/>
+      </w:pPr>
+      <w:rPr>
+        <w:rFonts w:ascii="Wingdings" w:hAnsi="Wingdings" w:hint="default"/>
+        <w:sz w:val="20"/>
+      </w:rPr>
+    </w:lvl>
+    <w:lvl w:ilvl="4" w:tentative="1">
+      <w:start w:val="1"/>
+      <w:numFmt w:val="bullet"/>
+      <w:lvlText w:val=""/>
+      <w:lvlJc w:val="left"/>
+      <w:pPr>
+        <w:tabs>
+          <w:tab w:val="num" w:pos="3600"/>
+        </w:tabs>
+        <w:ind w:left="3600" w:hanging="360"/>
+      </w:pPr>
+      <w:rPr>
+        <w:rFonts w:ascii="Wingdings" w:hAnsi="Wingdings" w:hint="default"/>
+        <w:sz w:val="20"/>
+      </w:rPr>
+    </w:lvl>
+    <w:lvl w:ilvl="5" w:tentative="1">
+      <w:start w:val="1"/>
+      <w:numFmt w:val="bullet"/>
+      <w:lvlText w:val=""/>
+      <w:lvlJc w:val="left"/>
+      <w:pPr>
+        <w:tabs>
+          <w:tab w:val="num" w:pos="4320"/>
+        </w:tabs>
+        <w:ind w:left="4320" w:hanging="360"/>
+      </w:pPr>
+      <w:rPr>
+        <w:rFonts w:ascii="Wingdings" w:hAnsi="Wingdings" w:hint="default"/>
+        <w:sz w:val="20"/>
+      </w:rPr>
+    </w:lvl>
+    <w:lvl w:ilvl="6" w:tentative="1">
+      <w:start w:val="1"/>
+      <w:numFmt w:val="bullet"/>
+      <w:lvlText w:val=""/>
+      <w:lvlJc w:val="left"/>
+      <w:pPr>
+        <w:tabs>
+          <w:tab w:val="num" w:pos="5040"/>
+        </w:tabs>
+        <w:ind w:left="5040" w:hanging="360"/>
+      </w:pPr>
+      <w:rPr>
+        <w:rFonts w:ascii="Wingdings" w:hAnsi="Wingdings" w:hint="default"/>
+        <w:sz w:val="20"/>
+      </w:rPr>
+    </w:lvl>
+    <w:lvl w:ilvl="7" w:tentative="1">
+      <w:start w:val="1"/>
+      <w:numFmt w:val="bullet"/>
+      <w:lvlText w:val=""/>
+      <w:lvlJc w:val="left"/>
+      <w:pPr>
+        <w:tabs>
+          <w:tab w:val="num" w:pos="5760"/>
+        </w:tabs>
+        <w:ind w:left="5760" w:hanging="360"/>
+      </w:pPr>
+      <w:rPr>
+        <w:rFonts w:ascii="Wingdings" w:hAnsi="Wingdings" w:hint="default"/>
+        <w:sz w:val="20"/>
+      </w:rPr>
+    </w:lvl>
+    <w:lvl w:ilvl="8" w:tentative="1">
+      <w:start w:val="1"/>
+      <w:numFmt w:val="bullet"/>
+      <w:lvlText w:val=""/>
+      <w:lvlJc w:val="left"/>
+      <w:pPr>
+        <w:tabs>
+          <w:tab w:val="num" w:pos="6480"/>
+        </w:tabs>
+        <w:ind w:left="6480" w:hanging="360"/>
+      </w:pPr>
+      <w:rPr>
+        <w:rFonts w:ascii="Wingdings" w:hAnsi="Wingdings" w:hint="default"/>
+        <w:sz w:val="20"/>
+      </w:rPr>
+    </w:lvl>
+  </w:abstractNum>
+  <w:abstractNum w:abstractNumId="5" w15:restartNumberingAfterBreak="0">
     <w:nsid w:val="2A595AD1"/>
     <w:multiLevelType w:val="hybridMultilevel"/>
     <w:tmpl w:val="3C7829DE"/>
@@ -4997,7 +6071,7 @@
       </w:rPr>
     </w:lvl>
   </w:abstractNum>
-  <w:abstractNum w:abstractNumId="2" w15:restartNumberingAfterBreak="0">
+  <w:abstractNum w:abstractNumId="6" w15:restartNumberingAfterBreak="0">
     <w:nsid w:val="2C39406B"/>
     <w:multiLevelType w:val="hybridMultilevel"/>
     <w:tmpl w:val="22FC64EE"/>
@@ -5110,7 +6184,305 @@
       </w:rPr>
     </w:lvl>
   </w:abstractNum>
-  <w:abstractNum w:abstractNumId="3" w15:restartNumberingAfterBreak="0">
+  <w:abstractNum w:abstractNumId="7" w15:restartNumberingAfterBreak="0">
+    <w:nsid w:val="2F521F27"/>
+    <w:multiLevelType w:val="multilevel"/>
+    <w:tmpl w:val="8AAC7FB0"/>
+    <w:lvl w:ilvl="0">
+      <w:start w:val="1"/>
+      <w:numFmt w:val="bullet"/>
+      <w:lvlText w:val=""/>
+      <w:lvlJc w:val="left"/>
+      <w:pPr>
+        <w:tabs>
+          <w:tab w:val="num" w:pos="720"/>
+        </w:tabs>
+        <w:ind w:left="720" w:hanging="360"/>
+      </w:pPr>
+      <w:rPr>
+        <w:rFonts w:ascii="Symbol" w:hAnsi="Symbol" w:hint="default"/>
+        <w:sz w:val="20"/>
+      </w:rPr>
+    </w:lvl>
+    <w:lvl w:ilvl="1" w:tentative="1">
+      <w:start w:val="1"/>
+      <w:numFmt w:val="bullet"/>
+      <w:lvlText w:val="o"/>
+      <w:lvlJc w:val="left"/>
+      <w:pPr>
+        <w:tabs>
+          <w:tab w:val="num" w:pos="1440"/>
+        </w:tabs>
+        <w:ind w:left="1440" w:hanging="360"/>
+      </w:pPr>
+      <w:rPr>
+        <w:rFonts w:ascii="Courier New" w:hAnsi="Courier New" w:hint="default"/>
+        <w:sz w:val="20"/>
+      </w:rPr>
+    </w:lvl>
+    <w:lvl w:ilvl="2" w:tentative="1">
+      <w:start w:val="1"/>
+      <w:numFmt w:val="bullet"/>
+      <w:lvlText w:val=""/>
+      <w:lvlJc w:val="left"/>
+      <w:pPr>
+        <w:tabs>
+          <w:tab w:val="num" w:pos="2160"/>
+        </w:tabs>
+        <w:ind w:left="2160" w:hanging="360"/>
+      </w:pPr>
+      <w:rPr>
+        <w:rFonts w:ascii="Wingdings" w:hAnsi="Wingdings" w:hint="default"/>
+        <w:sz w:val="20"/>
+      </w:rPr>
+    </w:lvl>
+    <w:lvl w:ilvl="3" w:tentative="1">
+      <w:start w:val="1"/>
+      <w:numFmt w:val="bullet"/>
+      <w:lvlText w:val=""/>
+      <w:lvlJc w:val="left"/>
+      <w:pPr>
+        <w:tabs>
+          <w:tab w:val="num" w:pos="2880"/>
+        </w:tabs>
+        <w:ind w:left="2880" w:hanging="360"/>
+      </w:pPr>
+      <w:rPr>
+        <w:rFonts w:ascii="Wingdings" w:hAnsi="Wingdings" w:hint="default"/>
+        <w:sz w:val="20"/>
+      </w:rPr>
+    </w:lvl>
+    <w:lvl w:ilvl="4" w:tentative="1">
+      <w:start w:val="1"/>
+      <w:numFmt w:val="bullet"/>
+      <w:lvlText w:val=""/>
+      <w:lvlJc w:val="left"/>
+      <w:pPr>
+        <w:tabs>
+          <w:tab w:val="num" w:pos="3600"/>
+        </w:tabs>
+        <w:ind w:left="3600" w:hanging="360"/>
+      </w:pPr>
+      <w:rPr>
+        <w:rFonts w:ascii="Wingdings" w:hAnsi="Wingdings" w:hint="default"/>
+        <w:sz w:val="20"/>
+      </w:rPr>
+    </w:lvl>
+    <w:lvl w:ilvl="5" w:tentative="1">
+      <w:start w:val="1"/>
+      <w:numFmt w:val="bullet"/>
+      <w:lvlText w:val=""/>
+      <w:lvlJc w:val="left"/>
+      <w:pPr>
+        <w:tabs>
+          <w:tab w:val="num" w:pos="4320"/>
+        </w:tabs>
+        <w:ind w:left="4320" w:hanging="360"/>
+      </w:pPr>
+      <w:rPr>
+        <w:rFonts w:ascii="Wingdings" w:hAnsi="Wingdings" w:hint="default"/>
+        <w:sz w:val="20"/>
+      </w:rPr>
+    </w:lvl>
+    <w:lvl w:ilvl="6" w:tentative="1">
+      <w:start w:val="1"/>
+      <w:numFmt w:val="bullet"/>
+      <w:lvlText w:val=""/>
+      <w:lvlJc w:val="left"/>
+      <w:pPr>
+        <w:tabs>
+          <w:tab w:val="num" w:pos="5040"/>
+        </w:tabs>
+        <w:ind w:left="5040" w:hanging="360"/>
+      </w:pPr>
+      <w:rPr>
+        <w:rFonts w:ascii="Wingdings" w:hAnsi="Wingdings" w:hint="default"/>
+        <w:sz w:val="20"/>
+      </w:rPr>
+    </w:lvl>
+    <w:lvl w:ilvl="7" w:tentative="1">
+      <w:start w:val="1"/>
+      <w:numFmt w:val="bullet"/>
+      <w:lvlText w:val=""/>
+      <w:lvlJc w:val="left"/>
+      <w:pPr>
+        <w:tabs>
+          <w:tab w:val="num" w:pos="5760"/>
+        </w:tabs>
+        <w:ind w:left="5760" w:hanging="360"/>
+      </w:pPr>
+      <w:rPr>
+        <w:rFonts w:ascii="Wingdings" w:hAnsi="Wingdings" w:hint="default"/>
+        <w:sz w:val="20"/>
+      </w:rPr>
+    </w:lvl>
+    <w:lvl w:ilvl="8" w:tentative="1">
+      <w:start w:val="1"/>
+      <w:numFmt w:val="bullet"/>
+      <w:lvlText w:val=""/>
+      <w:lvlJc w:val="left"/>
+      <w:pPr>
+        <w:tabs>
+          <w:tab w:val="num" w:pos="6480"/>
+        </w:tabs>
+        <w:ind w:left="6480" w:hanging="360"/>
+      </w:pPr>
+      <w:rPr>
+        <w:rFonts w:ascii="Wingdings" w:hAnsi="Wingdings" w:hint="default"/>
+        <w:sz w:val="20"/>
+      </w:rPr>
+    </w:lvl>
+  </w:abstractNum>
+  <w:abstractNum w:abstractNumId="8" w15:restartNumberingAfterBreak="0">
+    <w:nsid w:val="51D93193"/>
+    <w:multiLevelType w:val="multilevel"/>
+    <w:tmpl w:val="42A62AE0"/>
+    <w:lvl w:ilvl="0">
+      <w:start w:val="1"/>
+      <w:numFmt w:val="bullet"/>
+      <w:lvlText w:val=""/>
+      <w:lvlJc w:val="left"/>
+      <w:pPr>
+        <w:tabs>
+          <w:tab w:val="num" w:pos="720"/>
+        </w:tabs>
+        <w:ind w:left="720" w:hanging="360"/>
+      </w:pPr>
+      <w:rPr>
+        <w:rFonts w:ascii="Symbol" w:hAnsi="Symbol" w:hint="default"/>
+        <w:sz w:val="20"/>
+      </w:rPr>
+    </w:lvl>
+    <w:lvl w:ilvl="1" w:tentative="1">
+      <w:start w:val="1"/>
+      <w:numFmt w:val="bullet"/>
+      <w:lvlText w:val="o"/>
+      <w:lvlJc w:val="left"/>
+      <w:pPr>
+        <w:tabs>
+          <w:tab w:val="num" w:pos="1440"/>
+        </w:tabs>
+        <w:ind w:left="1440" w:hanging="360"/>
+      </w:pPr>
+      <w:rPr>
+        <w:rFonts w:ascii="Courier New" w:hAnsi="Courier New" w:hint="default"/>
+        <w:sz w:val="20"/>
+      </w:rPr>
+    </w:lvl>
+    <w:lvl w:ilvl="2" w:tentative="1">
+      <w:start w:val="1"/>
+      <w:numFmt w:val="bullet"/>
+      <w:lvlText w:val=""/>
+      <w:lvlJc w:val="left"/>
+      <w:pPr>
+        <w:tabs>
+          <w:tab w:val="num" w:pos="2160"/>
+        </w:tabs>
+        <w:ind w:left="2160" w:hanging="360"/>
+      </w:pPr>
+      <w:rPr>
+        <w:rFonts w:ascii="Wingdings" w:hAnsi="Wingdings" w:hint="default"/>
+        <w:sz w:val="20"/>
+      </w:rPr>
+    </w:lvl>
+    <w:lvl w:ilvl="3" w:tentative="1">
+      <w:start w:val="1"/>
+      <w:numFmt w:val="bullet"/>
+      <w:lvlText w:val=""/>
+      <w:lvlJc w:val="left"/>
+      <w:pPr>
+        <w:tabs>
+          <w:tab w:val="num" w:pos="2880"/>
+        </w:tabs>
+        <w:ind w:left="2880" w:hanging="360"/>
+      </w:pPr>
+      <w:rPr>
+        <w:rFonts w:ascii="Wingdings" w:hAnsi="Wingdings" w:hint="default"/>
+        <w:sz w:val="20"/>
+      </w:rPr>
+    </w:lvl>
+    <w:lvl w:ilvl="4" w:tentative="1">
+      <w:start w:val="1"/>
+      <w:numFmt w:val="bullet"/>
+      <w:lvlText w:val=""/>
+      <w:lvlJc w:val="left"/>
+      <w:pPr>
+        <w:tabs>
+          <w:tab w:val="num" w:pos="3600"/>
+        </w:tabs>
+        <w:ind w:left="3600" w:hanging="360"/>
+      </w:pPr>
+      <w:rPr>
+        <w:rFonts w:ascii="Wingdings" w:hAnsi="Wingdings" w:hint="default"/>
+        <w:sz w:val="20"/>
+      </w:rPr>
+    </w:lvl>
+    <w:lvl w:ilvl="5" w:tentative="1">
+      <w:start w:val="1"/>
+      <w:numFmt w:val="bullet"/>
+      <w:lvlText w:val=""/>
+      <w:lvlJc w:val="left"/>
+      <w:pPr>
+        <w:tabs>
+          <w:tab w:val="num" w:pos="4320"/>
+        </w:tabs>
+        <w:ind w:left="4320" w:hanging="360"/>
+      </w:pPr>
+      <w:rPr>
+        <w:rFonts w:ascii="Wingdings" w:hAnsi="Wingdings" w:hint="default"/>
+        <w:sz w:val="20"/>
+      </w:rPr>
+    </w:lvl>
+    <w:lvl w:ilvl="6" w:tentative="1">
+      <w:start w:val="1"/>
+      <w:numFmt w:val="bullet"/>
+      <w:lvlText w:val=""/>
+      <w:lvlJc w:val="left"/>
+      <w:pPr>
+        <w:tabs>
+          <w:tab w:val="num" w:pos="5040"/>
+        </w:tabs>
+        <w:ind w:left="5040" w:hanging="360"/>
+      </w:pPr>
+      <w:rPr>
+        <w:rFonts w:ascii="Wingdings" w:hAnsi="Wingdings" w:hint="default"/>
+        <w:sz w:val="20"/>
+      </w:rPr>
+    </w:lvl>
+    <w:lvl w:ilvl="7" w:tentative="1">
+      <w:start w:val="1"/>
+      <w:numFmt w:val="bullet"/>
+      <w:lvlText w:val=""/>
+      <w:lvlJc w:val="left"/>
+      <w:pPr>
+        <w:tabs>
+          <w:tab w:val="num" w:pos="5760"/>
+        </w:tabs>
+        <w:ind w:left="5760" w:hanging="360"/>
+      </w:pPr>
+      <w:rPr>
+        <w:rFonts w:ascii="Wingdings" w:hAnsi="Wingdings" w:hint="default"/>
+        <w:sz w:val="20"/>
+      </w:rPr>
+    </w:lvl>
+    <w:lvl w:ilvl="8" w:tentative="1">
+      <w:start w:val="1"/>
+      <w:numFmt w:val="bullet"/>
+      <w:lvlText w:val=""/>
+      <w:lvlJc w:val="left"/>
+      <w:pPr>
+        <w:tabs>
+          <w:tab w:val="num" w:pos="6480"/>
+        </w:tabs>
+        <w:ind w:left="6480" w:hanging="360"/>
+      </w:pPr>
+      <w:rPr>
+        <w:rFonts w:ascii="Wingdings" w:hAnsi="Wingdings" w:hint="default"/>
+        <w:sz w:val="20"/>
+      </w:rPr>
+    </w:lvl>
+  </w:abstractNum>
+  <w:abstractNum w:abstractNumId="9" w15:restartNumberingAfterBreak="0">
     <w:nsid w:val="53FD5395"/>
     <w:multiLevelType w:val="hybridMultilevel"/>
     <w:tmpl w:val="6DB679FC"/>
@@ -5200,7 +6572,7 @@
       </w:pPr>
     </w:lvl>
   </w:abstractNum>
-  <w:abstractNum w:abstractNumId="4" w15:restartNumberingAfterBreak="0">
+  <w:abstractNum w:abstractNumId="10" w15:restartNumberingAfterBreak="0">
     <w:nsid w:val="59FD1723"/>
     <w:multiLevelType w:val="hybridMultilevel"/>
     <w:tmpl w:val="8990CF0E"/>
@@ -5340,7 +6712,7 @@
       </w:rPr>
     </w:lvl>
   </w:abstractNum>
-  <w:abstractNum w:abstractNumId="5" w15:restartNumberingAfterBreak="0">
+  <w:abstractNum w:abstractNumId="11" w15:restartNumberingAfterBreak="0">
     <w:nsid w:val="5DF9585A"/>
     <w:multiLevelType w:val="hybridMultilevel"/>
     <w:tmpl w:val="9E2EF62C"/>
@@ -5453,7 +6825,7 @@
       </w:rPr>
     </w:lvl>
   </w:abstractNum>
-  <w:abstractNum w:abstractNumId="6" w15:restartNumberingAfterBreak="0">
+  <w:abstractNum w:abstractNumId="12" w15:restartNumberingAfterBreak="0">
     <w:nsid w:val="664646E2"/>
     <w:multiLevelType w:val="hybridMultilevel"/>
     <w:tmpl w:val="96EAF268"/>
@@ -5542,7 +6914,7 @@
       </w:pPr>
     </w:lvl>
   </w:abstractNum>
-  <w:abstractNum w:abstractNumId="7" w15:restartNumberingAfterBreak="0">
+  <w:abstractNum w:abstractNumId="13" w15:restartNumberingAfterBreak="0">
     <w:nsid w:val="79BF5A33"/>
     <w:multiLevelType w:val="hybridMultilevel"/>
     <w:tmpl w:val="F466ABF6"/>
@@ -5632,28 +7004,46 @@
     </w:lvl>
   </w:abstractNum>
   <w:num w:numId="1">
+    <w:abstractNumId w:val="13"/>
+  </w:num>
+  <w:num w:numId="2">
+    <w:abstractNumId w:val="6"/>
+  </w:num>
+  <w:num w:numId="3">
+    <w:abstractNumId w:val="10"/>
+  </w:num>
+  <w:num w:numId="4">
+    <w:abstractNumId w:val="12"/>
+  </w:num>
+  <w:num w:numId="5">
+    <w:abstractNumId w:val="9"/>
+  </w:num>
+  <w:num w:numId="6">
+    <w:abstractNumId w:val="3"/>
+  </w:num>
+  <w:num w:numId="7">
+    <w:abstractNumId w:val="5"/>
+  </w:num>
+  <w:num w:numId="8">
+    <w:abstractNumId w:val="11"/>
+  </w:num>
+  <w:num w:numId="9">
+    <w:abstractNumId w:val="8"/>
+  </w:num>
+  <w:num w:numId="10">
     <w:abstractNumId w:val="7"/>
   </w:num>
-  <w:num w:numId="2">
-    <w:abstractNumId w:val="2"/>
+  <w:num w:numId="11">
+    <w:abstractNumId w:val="0"/>
   </w:num>
-  <w:num w:numId="3">
+  <w:num w:numId="12">
+    <w:abstractNumId w:val="1"/>
+  </w:num>
+  <w:num w:numId="13">
     <w:abstractNumId w:val="4"/>
   </w:num>
-  <w:num w:numId="4">
-    <w:abstractNumId w:val="6"/>
-  </w:num>
-  <w:num w:numId="5">
-    <w:abstractNumId w:val="3"/>
-  </w:num>
-  <w:num w:numId="6">
-    <w:abstractNumId w:val="0"/>
-  </w:num>
-  <w:num w:numId="7">
-    <w:abstractNumId w:val="1"/>
-  </w:num>
-  <w:num w:numId="8">
-    <w:abstractNumId w:val="5"/>
+  <w:num w:numId="14">
+    <w:abstractNumId w:val="2"/>
   </w:num>
 </w:numbering>
 </file>
@@ -6057,6 +7447,26 @@
     <w:name w:val="Normal"/>
     <w:qFormat/>
   </w:style>
+  <w:style w:type="paragraph" w:styleId="Heading3">
+    <w:name w:val="heading 3"/>
+    <w:basedOn w:val="Normal"/>
+    <w:link w:val="Heading3Char"/>
+    <w:uiPriority w:val="9"/>
+    <w:qFormat/>
+    <w:rsid w:val="00DA0DED"/>
+    <w:pPr>
+      <w:spacing w:before="100" w:beforeAutospacing="1" w:after="100" w:afterAutospacing="1" w:line="240" w:lineRule="auto"/>
+      <w:outlineLvl w:val="2"/>
+    </w:pPr>
+    <w:rPr>
+      <w:rFonts w:ascii="Times New Roman" w:eastAsia="Times New Roman" w:hAnsi="Times New Roman" w:cs="Times New Roman"/>
+      <w:b/>
+      <w:bCs/>
+      <w:sz w:val="27"/>
+      <w:szCs w:val="27"/>
+      <w:lang w:val="vi-VN" w:eastAsia="vi-VN"/>
+    </w:rPr>
+  </w:style>
   <w:style w:type="character" w:default="1" w:styleId="DefaultParagraphFont">
     <w:name w:val="Default Paragraph Font"/>
     <w:uiPriority w:val="1"/>
@@ -6157,6 +7567,26 @@
     <w:link w:val="Footer"/>
     <w:uiPriority w:val="99"/>
     <w:rsid w:val="0007450D"/>
+  </w:style>
+  <w:style w:type="character" w:customStyle="1" w:styleId="Heading3Char">
+    <w:name w:val="Heading 3 Char"/>
+    <w:basedOn w:val="DefaultParagraphFont"/>
+    <w:link w:val="Heading3"/>
+    <w:uiPriority w:val="9"/>
+    <w:rsid w:val="00DA0DED"/>
+    <w:rPr>
+      <w:rFonts w:ascii="Times New Roman" w:eastAsia="Times New Roman" w:hAnsi="Times New Roman" w:cs="Times New Roman"/>
+      <w:b/>
+      <w:bCs/>
+      <w:sz w:val="27"/>
+      <w:szCs w:val="27"/>
+      <w:lang w:val="vi-VN" w:eastAsia="vi-VN"/>
+    </w:rPr>
+  </w:style>
+  <w:style w:type="character" w:customStyle="1" w:styleId="math-inline">
+    <w:name w:val="math-inline"/>
+    <w:basedOn w:val="DefaultParagraphFont"/>
+    <w:rsid w:val="00C00927"/>
   </w:style>
 </w:styles>
 </file>

</xml_diff>

<commit_message>
chỉnh sửa lại lần n
</commit_message>
<xml_diff>
--- a/doc/01-HoVanKhanh.docx
+++ b/doc/01-HoVanKhanh.docx
@@ -162,7 +162,6 @@
         <w:t xml:space="preserve"> </w:t>
       </w:r>
       <w:proofErr w:type="spellStart"/>
-      <w:proofErr w:type="gramStart"/>
       <w:r>
         <w:rPr>
           <w:rFonts w:ascii="Times New Roman" w:hAnsi="Times New Roman" w:cs="Times New Roman"/>
@@ -180,7 +179,6 @@
         </w:rPr>
         <w:t xml:space="preserve"> :</w:t>
       </w:r>
-      <w:proofErr w:type="gramEnd"/>
     </w:p>
     <w:p>
       <w:pPr>
@@ -1349,7 +1347,6 @@
     </w:p>
     <w:p>
       <w:pPr>
-        <w:pStyle w:val="ListParagraph"/>
         <w:spacing w:after="0" w:line="240" w:lineRule="auto"/>
         <w:rPr>
           <w:rFonts w:ascii="Times New Roman" w:eastAsia="Times New Roman" w:hAnsi="Times New Roman" w:cs="Times New Roman"/>
@@ -1380,7 +1377,43 @@
           <w:szCs w:val="26"/>
           <w:lang w:val="vi-VN" w:eastAsia="vi-VN"/>
         </w:rPr>
-        <w:t>Khi bệnh nhân đến phòng khám hoặc liên hệ đăng ký, lễ tân thực hiện thu thập các thông tin hành chính ban đầu như họ tên, ngày sinh, giới tính, số điện thoại, địa chỉ, tiền sử bệnh lý và nguồn khách hàng, sau đó hệ thống tự động cấp một mã bệnh nhân duy nhất cùng cơ chế kiểm tra trùng lặp thông tin nhằm tránh tạo thêm hồ sơ thừa. Trong trường hợp cần điều chỉnh dữ liệu sau đăng ký, quy trình cập nhật thông tin được phân quyền rõ ràng: lễ tân chỉ có thẩm quyền sửa đổi các thông tin hành chính khi phát hiện có sai sót, nhầm lẫn ở khâu tiếp nhận ban đầu, trong khi các thông tin y khoa chuyên sâu như tiền sử bệnh, chỉ số nha chu hay sơ đồ răng bắt buộc do nha sĩ cập nhật, đồng thời hệ thống luôn tự động lưu vết lịch sử người sửa, thời gian và nội dung chỉnh sửa để đảm bảo tính minh bạch. Bên cạnh đó, quy trình tra cứu thông tin cho phép nhân sự phòng khám chủ động tìm kiếm hồ sơ bệnh nhân thông qua mã định danh, số điện thoại hoặc họ tên; hệ thống sẽ trả về dữ liệu chuẩn xác theo đúng phân quyền vai trò (lễ tân tra cứu thông tin hành chính, lịch hẹn, hóa đơn; nha sĩ và y tá tra cứu bệnh án, lịch sử điều trị) và tự động ghi nhận nhật ký truy cập để bảo mật toàn bộ dữ liệu y tế.</w:t>
+        <w:t>Khi bệnh nhân đến phòng khám hoặc liên hệ đặt lịch, lễ tân tiến hành tiếp nhận và thu thập các thông tin hành chính ban đầu gồm họ tên, ngày sinh, giới tính, số điện thoại, địa chỉ và nguồn khách hàng; riêng các thông tin y khoa chuyên sâu như tiền sử bệnh nền hay tiền sử dị ứng thuốc sẽ do nha sĩ trực tiếp thăm khám, đối soát và ghi nhận nhằm đảm bảo tính chính xác tuyệt đối theo chuẩn y khoa. Ngay sau khi nhập dữ liệu hành chính, hệ thống tự động cấp một mã bệnh nhân duy nhất và đối soát trên cơ sở dữ liệu để phát hiện, ngăn chặn việc tạo hồ sơ trùng lặp. Đối với quy trình cập nhật thông tin, hệ thống áp dụng cơ chế phân quyền nghiêm ngặt: lễ tân chỉ được phép chỉnh sửa các thông tin hành chính khi phát hiện có sai sót hay nhầm lẫn ở khâu tiếp nhận ban đầu, trong khi các dữ liệu y khoa như bệnh nền, dị ứng, chỉ số nha chu hay sơ đồ răng hoàn toàn thuộc thẩm quyền cập nhật của nha sĩ. Mọi thao tác chỉnh sửa đều được hệ thống tự động lưu lại nhật ký thay đổi gồm ID người thực hiện, mốc thời gian và chi tiết dữ liệu trước - sau khi sửa để phục vụ công tác kiểm soát.</w:t>
+      </w:r>
+    </w:p>
+    <w:p>
+      <w:pPr>
+        <w:spacing w:after="0" w:line="240" w:lineRule="auto"/>
+        <w:ind w:left="720"/>
+        <w:rPr>
+          <w:rFonts w:ascii="Times New Roman" w:eastAsia="Times New Roman" w:hAnsi="Times New Roman" w:cs="Times New Roman"/>
+          <w:color w:val="1F1F1F"/>
+          <w:sz w:val="26"/>
+          <w:szCs w:val="26"/>
+          <w:lang w:val="vi-VN" w:eastAsia="vi-VN"/>
+        </w:rPr>
+      </w:pPr>
+    </w:p>
+    <w:p>
+      <w:pPr>
+        <w:spacing w:after="0" w:line="240" w:lineRule="auto"/>
+        <w:ind w:left="720"/>
+        <w:rPr>
+          <w:rFonts w:ascii="Times New Roman" w:eastAsia="Times New Roman" w:hAnsi="Times New Roman" w:cs="Times New Roman"/>
+          <w:color w:val="1F1F1F"/>
+          <w:sz w:val="26"/>
+          <w:szCs w:val="26"/>
+          <w:lang w:val="vi-VN" w:eastAsia="vi-VN"/>
+        </w:rPr>
+      </w:pPr>
+      <w:r>
+        <w:rPr>
+          <w:rFonts w:ascii="Times New Roman" w:eastAsia="Times New Roman" w:hAnsi="Times New Roman" w:cs="Times New Roman"/>
+          <w:color w:val="1F1F1F"/>
+          <w:sz w:val="26"/>
+          <w:szCs w:val="26"/>
+          <w:lang w:val="vi-VN" w:eastAsia="vi-VN"/>
+        </w:rPr>
+        <w:t>Song song với đó, quy trình tra cứu thông tin bệnh nhân cho phép nhân sự phòng khám chủ động tìm kiếm hồ sơ thông qua mã bệnh nhân, số điện thoại hoặc họ tên. Hệ thống xử lý dữ liệu và hiển thị giao diện tùy theo vai trò người dùng: lễ tân chỉ truy cập danh mục thông tin hành chính, lịch hẹn và lịch sử thanh toán; nha sĩ và y tá được phép truy cập đầy đủ thông tin chuyên môn như tiền sử y khoa, kết quả chẩn đoán và sơ đồ điều trị, đồng thời hệ thống tự động lưu vết nhật ký truy cập để bảo đảm an toàn dữ liệu cá nhân. Đặc biệt, quy trình tra cứu lịch sử khám hỗ trợ nha sĩ và y tá truy xuất toàn bộ nhật ký các lần điều trị trong quá khứ theo trục thời gian. Thông qua phân hệ này, nha sĩ dễ dàng đối soát lại các thủ thuật đã thực hiện, danh mục dịch vụ đã sử dụng, các tệp phim X-quang (Panorama, Cephalo, CT Conebeam), hình ảnh thực tế trước - sau điều trị cũng như đơn thuốc đã kê trong các phiên khám trước. Dữ liệu lịch sử khám được hệ thống lưu trữ tập trung và đồng bộ tức thì, giúp bác sĩ đánh giá chính xác tiến triển sức khỏe răng miệng của bệnh nhân, từ đó đưa ra phác đồ điều trị hoặc kế hoạch tái khám phù hợp cho các giai đoạn tiếp theo.</w:t>
       </w:r>
     </w:p>
     <w:p>
@@ -1486,31 +1519,407 @@
     </w:p>
     <w:p>
       <w:pPr>
-        <w:spacing w:before="100" w:beforeAutospacing="1" w:after="0" w:line="240" w:lineRule="auto"/>
+        <w:pStyle w:val="NormalWeb"/>
         <w:ind w:firstLine="720"/>
-        <w:outlineLvl w:val="2"/>
-        <w:rPr>
-          <w:rFonts w:ascii="Times New Roman" w:eastAsia="Times New Roman" w:hAnsi="Times New Roman" w:cs="Times New Roman"/>
+        <w:rPr>
+          <w:sz w:val="26"/>
+          <w:szCs w:val="26"/>
+        </w:rPr>
+      </w:pPr>
+      <w:r>
+        <w:rPr>
           <w:b/>
           <w:bCs/>
           <w:color w:val="1F1F1F"/>
           <w:sz w:val="26"/>
           <w:szCs w:val="26"/>
-          <w:lang w:val="vi-VN" w:eastAsia="vi-VN"/>
-        </w:rPr>
-      </w:pPr>
-      <w:r>
-        <w:rPr>
-          <w:rFonts w:ascii="Times New Roman" w:eastAsia="Times New Roman" w:hAnsi="Times New Roman" w:cs="Times New Roman"/>
+          <w:bdr w:val="none" w:sz="0" w:space="0" w:color="auto" w:frame="1"/>
+        </w:rPr>
+        <w:t>1</w:t>
+      </w:r>
+      <w:r>
+        <w:rPr>
           <w:b/>
           <w:bCs/>
           <w:color w:val="1F1F1F"/>
           <w:sz w:val="26"/>
           <w:szCs w:val="26"/>
           <w:bdr w:val="none" w:sz="0" w:space="0" w:color="auto" w:frame="1"/>
-          <w:lang w:val="vi-VN" w:eastAsia="vi-VN"/>
-        </w:rPr>
-        <w:t>1</w:t>
+        </w:rPr>
+        <w:t xml:space="preserve">. </w:t>
+      </w:r>
+      <w:r>
+        <w:rPr>
+          <w:b/>
+          <w:bCs/>
+          <w:sz w:val="26"/>
+          <w:szCs w:val="26"/>
+        </w:rPr>
+        <w:t>Quy trình Đăng ký và Tiếp nhận thông tin Bệnh nhân</w:t>
+      </w:r>
+    </w:p>
+    <w:p>
+      <w:pPr>
+        <w:spacing w:before="100" w:beforeAutospacing="1" w:after="100" w:afterAutospacing="1" w:line="240" w:lineRule="auto"/>
+        <w:ind w:left="720"/>
+        <w:rPr>
+          <w:rFonts w:ascii="Times New Roman" w:eastAsia="Times New Roman" w:hAnsi="Times New Roman" w:cs="Times New Roman"/>
+          <w:sz w:val="26"/>
+          <w:szCs w:val="26"/>
+          <w:lang w:val="vi-VN" w:eastAsia="vi-VN"/>
+        </w:rPr>
+      </w:pPr>
+      <w:r>
+        <w:rPr>
+          <w:rFonts w:ascii="Times New Roman" w:eastAsia="Times New Roman" w:hAnsi="Times New Roman" w:cs="Times New Roman"/>
+          <w:b/>
+          <w:bCs/>
+          <w:sz w:val="26"/>
+          <w:szCs w:val="26"/>
+          <w:lang w:val="vi-VN" w:eastAsia="vi-VN"/>
+        </w:rPr>
+        <w:t>Bước 1:</w:t>
+      </w:r>
+      <w:r>
+        <w:rPr>
+          <w:rFonts w:ascii="Times New Roman" w:eastAsia="Times New Roman" w:hAnsi="Times New Roman" w:cs="Times New Roman"/>
+          <w:sz w:val="26"/>
+          <w:szCs w:val="26"/>
+          <w:lang w:val="vi-VN" w:eastAsia="vi-VN"/>
+        </w:rPr>
+        <w:t xml:space="preserve"> Lễ tân tiếp nhận bệnh nhân khi đến khám trực tiếp tại phòng khám hoặc liên hệ đăng ký từ xa.</w:t>
+      </w:r>
+    </w:p>
+    <w:p>
+      <w:pPr>
+        <w:spacing w:before="100" w:beforeAutospacing="1" w:after="100" w:afterAutospacing="1" w:line="240" w:lineRule="auto"/>
+        <w:ind w:left="720"/>
+        <w:rPr>
+          <w:rFonts w:ascii="Times New Roman" w:eastAsia="Times New Roman" w:hAnsi="Times New Roman" w:cs="Times New Roman"/>
+          <w:sz w:val="26"/>
+          <w:szCs w:val="26"/>
+          <w:lang w:val="vi-VN" w:eastAsia="vi-VN"/>
+        </w:rPr>
+      </w:pPr>
+      <w:r>
+        <w:rPr>
+          <w:rFonts w:ascii="Times New Roman" w:eastAsia="Times New Roman" w:hAnsi="Times New Roman" w:cs="Times New Roman"/>
+          <w:b/>
+          <w:bCs/>
+          <w:sz w:val="26"/>
+          <w:szCs w:val="26"/>
+          <w:lang w:val="vi-VN" w:eastAsia="vi-VN"/>
+        </w:rPr>
+        <w:t>Bước 2:</w:t>
+      </w:r>
+      <w:r>
+        <w:rPr>
+          <w:rFonts w:ascii="Times New Roman" w:eastAsia="Times New Roman" w:hAnsi="Times New Roman" w:cs="Times New Roman"/>
+          <w:sz w:val="26"/>
+          <w:szCs w:val="26"/>
+          <w:lang w:val="vi-VN" w:eastAsia="vi-VN"/>
+        </w:rPr>
+        <w:t xml:space="preserve"> Lễ tân thu thập các dữ liệu hành chính ban đầu của bệnh nhân bao gồm: Họ tên, ngày sinh, giới tính, số điện thoại, địa chỉ và nguồn khách hàng </w:t>
+      </w:r>
+      <w:r>
+        <w:rPr>
+          <w:rFonts w:ascii="Times New Roman" w:eastAsia="Times New Roman" w:hAnsi="Times New Roman" w:cs="Times New Roman"/>
+          <w:i/>
+          <w:iCs/>
+          <w:sz w:val="26"/>
+          <w:szCs w:val="26"/>
+          <w:lang w:val="vi-VN" w:eastAsia="vi-VN"/>
+        </w:rPr>
+        <w:t>(lưu ý: các thông tin y khoa như tiền sử dị ứng, bệnh lý nền sẽ do Bác sĩ trực tiếp kiểm tra và ghi nhận sau)</w:t>
+      </w:r>
+      <w:r>
+        <w:rPr>
+          <w:rFonts w:ascii="Times New Roman" w:eastAsia="Times New Roman" w:hAnsi="Times New Roman" w:cs="Times New Roman"/>
+          <w:sz w:val="26"/>
+          <w:szCs w:val="26"/>
+          <w:lang w:val="vi-VN" w:eastAsia="vi-VN"/>
+        </w:rPr>
+        <w:t>.</w:t>
+      </w:r>
+    </w:p>
+    <w:p>
+      <w:pPr>
+        <w:spacing w:before="100" w:beforeAutospacing="1" w:after="100" w:afterAutospacing="1" w:line="240" w:lineRule="auto"/>
+        <w:ind w:left="720"/>
+        <w:rPr>
+          <w:rFonts w:ascii="Times New Roman" w:eastAsia="Times New Roman" w:hAnsi="Times New Roman" w:cs="Times New Roman"/>
+          <w:sz w:val="26"/>
+          <w:szCs w:val="26"/>
+          <w:lang w:val="vi-VN" w:eastAsia="vi-VN"/>
+        </w:rPr>
+      </w:pPr>
+      <w:r>
+        <w:rPr>
+          <w:rFonts w:ascii="Times New Roman" w:eastAsia="Times New Roman" w:hAnsi="Times New Roman" w:cs="Times New Roman"/>
+          <w:b/>
+          <w:bCs/>
+          <w:sz w:val="26"/>
+          <w:szCs w:val="26"/>
+          <w:lang w:val="vi-VN" w:eastAsia="vi-VN"/>
+        </w:rPr>
+        <w:t>Bước 3:</w:t>
+      </w:r>
+      <w:r>
+        <w:rPr>
+          <w:rFonts w:ascii="Times New Roman" w:eastAsia="Times New Roman" w:hAnsi="Times New Roman" w:cs="Times New Roman"/>
+          <w:sz w:val="26"/>
+          <w:szCs w:val="26"/>
+          <w:lang w:val="vi-VN" w:eastAsia="vi-VN"/>
+        </w:rPr>
+        <w:t xml:space="preserve"> Hệ thống tự động kích hoạt cơ chế kiểm tra trùng lặp dữ liệu thông qua Số điện thoại hoặc Mã định danh trên cơ sở dữ liệu để ngăn chặn việc khởi tạo hồ sơ thừa.</w:t>
+      </w:r>
+    </w:p>
+    <w:p>
+      <w:pPr>
+        <w:spacing w:before="100" w:beforeAutospacing="1" w:after="100" w:afterAutospacing="1" w:line="240" w:lineRule="auto"/>
+        <w:ind w:left="720"/>
+        <w:rPr>
+          <w:rFonts w:ascii="Times New Roman" w:eastAsia="Times New Roman" w:hAnsi="Times New Roman" w:cs="Times New Roman"/>
+          <w:sz w:val="26"/>
+          <w:szCs w:val="26"/>
+          <w:lang w:val="vi-VN" w:eastAsia="vi-VN"/>
+        </w:rPr>
+      </w:pPr>
+      <w:r>
+        <w:rPr>
+          <w:rFonts w:ascii="Times New Roman" w:eastAsia="Times New Roman" w:hAnsi="Times New Roman" w:cs="Times New Roman"/>
+          <w:b/>
+          <w:bCs/>
+          <w:sz w:val="26"/>
+          <w:szCs w:val="26"/>
+          <w:lang w:val="vi-VN" w:eastAsia="vi-VN"/>
+        </w:rPr>
+        <w:t>Bước 4:</w:t>
+      </w:r>
+      <w:r>
+        <w:rPr>
+          <w:rFonts w:ascii="Times New Roman" w:eastAsia="Times New Roman" w:hAnsi="Times New Roman" w:cs="Times New Roman"/>
+          <w:sz w:val="26"/>
+          <w:szCs w:val="26"/>
+          <w:lang w:val="vi-VN" w:eastAsia="vi-VN"/>
+        </w:rPr>
+        <w:t xml:space="preserve"> Hệ thống tự động cấp một Mã bệnh nhân duy nhất và khởi tạo Hồ sơ bệnh nhân điện tử để lưu trữ, theo dõi tập trung trên toàn hệ thống.</w:t>
+      </w:r>
+    </w:p>
+    <w:p>
+      <w:pPr>
+        <w:pStyle w:val="NormalWeb"/>
+        <w:ind w:firstLine="720"/>
+        <w:rPr>
+          <w:sz w:val="26"/>
+          <w:szCs w:val="26"/>
+        </w:rPr>
+      </w:pPr>
+      <w:r>
+        <w:rPr>
+          <w:b/>
+          <w:bCs/>
+          <w:sz w:val="26"/>
+          <w:szCs w:val="26"/>
+        </w:rPr>
+        <w:t xml:space="preserve">2. </w:t>
+      </w:r>
+      <w:r>
+        <w:rPr>
+          <w:b/>
+          <w:bCs/>
+          <w:sz w:val="26"/>
+          <w:szCs w:val="26"/>
+        </w:rPr>
+        <w:t>Quy trình Cập nhật Thông tin Bệnh nhân</w:t>
+      </w:r>
+    </w:p>
+    <w:p>
+      <w:pPr>
+        <w:spacing w:before="100" w:beforeAutospacing="1" w:after="100" w:afterAutospacing="1" w:line="240" w:lineRule="auto"/>
+        <w:ind w:left="720"/>
+        <w:rPr>
+          <w:rFonts w:ascii="Times New Roman" w:eastAsia="Times New Roman" w:hAnsi="Times New Roman" w:cs="Times New Roman"/>
+          <w:sz w:val="26"/>
+          <w:szCs w:val="26"/>
+          <w:lang w:val="vi-VN" w:eastAsia="vi-VN"/>
+        </w:rPr>
+      </w:pPr>
+      <w:r>
+        <w:rPr>
+          <w:rFonts w:ascii="Times New Roman" w:eastAsia="Times New Roman" w:hAnsi="Times New Roman" w:cs="Times New Roman"/>
+          <w:b/>
+          <w:bCs/>
+          <w:sz w:val="26"/>
+          <w:szCs w:val="26"/>
+          <w:lang w:val="vi-VN" w:eastAsia="vi-VN"/>
+        </w:rPr>
+        <w:t>Bước 1:</w:t>
+      </w:r>
+      <w:r>
+        <w:rPr>
+          <w:rFonts w:ascii="Times New Roman" w:eastAsia="Times New Roman" w:hAnsi="Times New Roman" w:cs="Times New Roman"/>
+          <w:sz w:val="26"/>
+          <w:szCs w:val="26"/>
+          <w:lang w:val="vi-VN" w:eastAsia="vi-VN"/>
+        </w:rPr>
+        <w:t xml:space="preserve"> Nhân sự (Lễ tân hoặc Nha sĩ) tra cứu và mở Hồ sơ bệnh nhân điện tử cần điều chỉnh thông </w:t>
+      </w:r>
+      <w:r>
+        <w:rPr>
+          <w:rFonts w:ascii="Times New Roman" w:eastAsia="Times New Roman" w:hAnsi="Times New Roman" w:cs="Times New Roman"/>
+          <w:sz w:val="26"/>
+          <w:szCs w:val="26"/>
+          <w:lang w:val="vi-VN" w:eastAsia="vi-VN"/>
+        </w:rPr>
+        <w:t>qu</w:t>
+      </w:r>
+      <w:r>
+        <w:rPr>
+          <w:rFonts w:ascii="Times New Roman" w:eastAsia="Times New Roman" w:hAnsi="Times New Roman" w:cs="Times New Roman"/>
+          <w:sz w:val="26"/>
+          <w:szCs w:val="26"/>
+          <w:lang w:val="vi-VN" w:eastAsia="vi-VN"/>
+        </w:rPr>
+        <w:t>a Mã bệnh nhân, Số điện thoại hoặc Họ tên.</w:t>
+      </w:r>
+    </w:p>
+    <w:p>
+      <w:pPr>
+        <w:spacing w:before="100" w:beforeAutospacing="1" w:after="100" w:afterAutospacing="1" w:line="240" w:lineRule="auto"/>
+        <w:ind w:left="720"/>
+        <w:rPr>
+          <w:rFonts w:ascii="Times New Roman" w:eastAsia="Times New Roman" w:hAnsi="Times New Roman" w:cs="Times New Roman"/>
+          <w:sz w:val="26"/>
+          <w:szCs w:val="26"/>
+          <w:lang w:val="vi-VN" w:eastAsia="vi-VN"/>
+        </w:rPr>
+      </w:pPr>
+      <w:r>
+        <w:rPr>
+          <w:rFonts w:ascii="Times New Roman" w:eastAsia="Times New Roman" w:hAnsi="Times New Roman" w:cs="Times New Roman"/>
+          <w:b/>
+          <w:bCs/>
+          <w:sz w:val="26"/>
+          <w:szCs w:val="26"/>
+          <w:lang w:val="vi-VN" w:eastAsia="vi-VN"/>
+        </w:rPr>
+        <w:t>Bước 2:</w:t>
+      </w:r>
+      <w:r>
+        <w:rPr>
+          <w:rFonts w:ascii="Times New Roman" w:eastAsia="Times New Roman" w:hAnsi="Times New Roman" w:cs="Times New Roman"/>
+          <w:sz w:val="26"/>
+          <w:szCs w:val="26"/>
+          <w:lang w:val="vi-VN" w:eastAsia="vi-VN"/>
+        </w:rPr>
+        <w:t xml:space="preserve"> Chọn mục thông tin cần thay đổi theo đúng thẩm quyền phân quyền: Lễ tân</w:t>
+      </w:r>
+      <w:r>
+        <w:rPr>
+          <w:rFonts w:ascii="Times New Roman" w:eastAsia="Times New Roman" w:hAnsi="Times New Roman" w:cs="Times New Roman"/>
+          <w:sz w:val="26"/>
+          <w:szCs w:val="26"/>
+          <w:lang w:val="vi-VN" w:eastAsia="vi-VN"/>
+        </w:rPr>
+        <w:t xml:space="preserve"> chỉ có thể</w:t>
+      </w:r>
+      <w:r>
+        <w:rPr>
+          <w:rFonts w:ascii="Times New Roman" w:eastAsia="Times New Roman" w:hAnsi="Times New Roman" w:cs="Times New Roman"/>
+          <w:sz w:val="26"/>
+          <w:szCs w:val="26"/>
+          <w:lang w:val="vi-VN" w:eastAsia="vi-VN"/>
+        </w:rPr>
+        <w:t xml:space="preserve"> chọn cập nhật thông tin hành chính (họ tên, ngày sinh, số điện thoại, địa chỉ) khi phát hiện nhầm lẫn ở khâu tiếp nhận; Nha sĩ chọn cập nhật dữ liệu y khoa chuyên sâu (bệnh nền, tiền sử dị ứng, chỉ số nha chu, sơ đồ răng, phim X-quang).</w:t>
+      </w:r>
+    </w:p>
+    <w:p>
+      <w:pPr>
+        <w:spacing w:before="100" w:beforeAutospacing="1" w:after="100" w:afterAutospacing="1" w:line="240" w:lineRule="auto"/>
+        <w:ind w:left="720"/>
+        <w:rPr>
+          <w:rFonts w:ascii="Times New Roman" w:eastAsia="Times New Roman" w:hAnsi="Times New Roman" w:cs="Times New Roman"/>
+          <w:sz w:val="26"/>
+          <w:szCs w:val="26"/>
+          <w:lang w:val="vi-VN" w:eastAsia="vi-VN"/>
+        </w:rPr>
+      </w:pPr>
+      <w:r>
+        <w:rPr>
+          <w:rFonts w:ascii="Times New Roman" w:eastAsia="Times New Roman" w:hAnsi="Times New Roman" w:cs="Times New Roman"/>
+          <w:b/>
+          <w:bCs/>
+          <w:sz w:val="26"/>
+          <w:szCs w:val="26"/>
+          <w:lang w:val="vi-VN" w:eastAsia="vi-VN"/>
+        </w:rPr>
+        <w:t>Bước 3:</w:t>
+      </w:r>
+      <w:r>
+        <w:rPr>
+          <w:rFonts w:ascii="Times New Roman" w:eastAsia="Times New Roman" w:hAnsi="Times New Roman" w:cs="Times New Roman"/>
+          <w:sz w:val="26"/>
+          <w:szCs w:val="26"/>
+          <w:lang w:val="vi-VN" w:eastAsia="vi-VN"/>
+        </w:rPr>
+        <w:t xml:space="preserve"> Nhập dữ liệu mới hoặc điều chỉnh thông tin hiện tại trên hệ thống.</w:t>
+      </w:r>
+    </w:p>
+    <w:p>
+      <w:pPr>
+        <w:spacing w:before="100" w:beforeAutospacing="1" w:after="100" w:afterAutospacing="1" w:line="240" w:lineRule="auto"/>
+        <w:ind w:left="720"/>
+        <w:rPr>
+          <w:rFonts w:ascii="Times New Roman" w:eastAsia="Times New Roman" w:hAnsi="Times New Roman" w:cs="Times New Roman"/>
+          <w:sz w:val="26"/>
+          <w:szCs w:val="26"/>
+          <w:lang w:val="vi-VN" w:eastAsia="vi-VN"/>
+        </w:rPr>
+      </w:pPr>
+      <w:r>
+        <w:rPr>
+          <w:rFonts w:ascii="Times New Roman" w:eastAsia="Times New Roman" w:hAnsi="Times New Roman" w:cs="Times New Roman"/>
+          <w:b/>
+          <w:bCs/>
+          <w:sz w:val="26"/>
+          <w:szCs w:val="26"/>
+          <w:lang w:val="vi-VN" w:eastAsia="vi-VN"/>
+        </w:rPr>
+        <w:t>Bước 4:</w:t>
+      </w:r>
+      <w:r>
+        <w:rPr>
+          <w:rFonts w:ascii="Times New Roman" w:eastAsia="Times New Roman" w:hAnsi="Times New Roman" w:cs="Times New Roman"/>
+          <w:sz w:val="26"/>
+          <w:szCs w:val="26"/>
+          <w:lang w:val="vi-VN" w:eastAsia="vi-VN"/>
+        </w:rPr>
+        <w:t xml:space="preserve"> Xác nhận lưu thông tin. Hệ thống tự động ghi nhận nhật ký lưu vết bao gồm ID người thực hiện, thời gian chỉnh sửa, chi tiết dữ liệu trước và sau khi sửa, đồng thời đồng bộ dữ liệu trên toàn hệ thống.</w:t>
+      </w:r>
+    </w:p>
+    <w:p>
+      <w:pPr>
+        <w:spacing w:line="240" w:lineRule="auto"/>
+        <w:ind w:firstLine="720"/>
+        <w:rPr>
+          <w:rFonts w:ascii="Times New Roman" w:eastAsia="Times New Roman" w:hAnsi="Times New Roman" w:cs="Times New Roman"/>
+          <w:color w:val="1F1F1F"/>
+          <w:sz w:val="26"/>
+          <w:szCs w:val="26"/>
+          <w:lang w:val="vi-VN" w:eastAsia="vi-VN"/>
+        </w:rPr>
+      </w:pPr>
+      <w:r>
+        <w:rPr>
+          <w:rFonts w:ascii="Times New Roman" w:hAnsi="Times New Roman" w:cs="Times New Roman"/>
+          <w:b/>
+          <w:bCs/>
+          <w:sz w:val="26"/>
+          <w:szCs w:val="26"/>
+          <w:lang w:val="vi-VN"/>
+        </w:rPr>
+        <w:t xml:space="preserve">3. </w:t>
       </w:r>
       <w:r>
         <w:rPr>
@@ -1523,7 +1932,7 @@
           <w:bdr w:val="none" w:sz="0" w:space="0" w:color="auto" w:frame="1"/>
           <w:lang w:val="vi-VN" w:eastAsia="vi-VN"/>
         </w:rPr>
-        <w:t>. Quy trình Đăng ký và Tiếp nhận thông tin Bệnh nhân</w:t>
+        <w:t>Quy trình Tra cứu Thông tin Bệnh nhân</w:t>
       </w:r>
     </w:p>
     <w:p>
@@ -1559,7 +1968,7 @@
           <w:szCs w:val="26"/>
           <w:lang w:val="vi-VN" w:eastAsia="vi-VN"/>
         </w:rPr>
-        <w:t xml:space="preserve"> Lễ tân tiếp nhận thông tin khi bệnh nhân đến khám trực tiếp hoặc liên hệ từ xa.</w:t>
+        <w:t xml:space="preserve"> Nhân sự (Lễ tân, Nha sĩ, Y tá) nhập thông tin tra cứu như Mã bệnh nhân, Số điện thoại hoặc Họ tên vào ô tìm kiếm trên hệ thống.</w:t>
       </w:r>
     </w:p>
     <w:p>
@@ -1595,7 +2004,7 @@
           <w:szCs w:val="26"/>
           <w:lang w:val="vi-VN" w:eastAsia="vi-VN"/>
         </w:rPr>
-        <w:t xml:space="preserve"> Lễ tân thu thập các dữ liệu hành chính (Họ tên, ngày sinh, giới tính, số điện thoại, địa chỉ, nguồn khách hàng) và thông tin y khoa ban đầu (tiền sử dị ứng, bệnh lý nền).</w:t>
+        <w:t xml:space="preserve"> Hệ thống xử lý dữ liệu và trả về danh sách kết quả phù hợp kèm các thông tin định danh cơ bản để người dùng xác nhận đúng bệnh nhân.</w:t>
       </w:r>
     </w:p>
     <w:p>
@@ -1631,7 +2040,7 @@
           <w:szCs w:val="26"/>
           <w:lang w:val="vi-VN" w:eastAsia="vi-VN"/>
         </w:rPr>
-        <w:t xml:space="preserve"> Hệ thống kích hoạt cơ chế kiểm tra trùng lặp thông tin qua số điện thoại để tránh tạo hồ sơ thừa.</w:t>
+        <w:t xml:space="preserve"> Nhân sự chọn xem chi tiết; hệ thống truy xuất và hiển thị dữ liệu hồ sơ theo đúng phân quyền vai trò (Lễ tân xem thông tin hành chính, lịch hẹn, hóa đơn thanh toán; Nha sĩ và Y tá xem đầy đủ thông tin chuyên môn như tiền sử y khoa, kết quả chẩn đoán và sơ đồ điều trị).</w:t>
       </w:r>
     </w:p>
     <w:p>
@@ -1668,309 +2077,188 @@
           <w:szCs w:val="26"/>
           <w:lang w:val="vi-VN" w:eastAsia="vi-VN"/>
         </w:rPr>
-        <w:t xml:space="preserve"> Hệ thống tự động khởi tạo Mã bệnh nhân duy nhất và tạo Hồ sơ bệnh nhân điện tử</w:t>
-      </w:r>
-      <w:r>
-        <w:rPr>
-          <w:rFonts w:ascii="Times New Roman" w:eastAsia="Times New Roman" w:hAnsi="Times New Roman" w:cs="Times New Roman"/>
-          <w:color w:val="1F1F1F"/>
-          <w:sz w:val="26"/>
-          <w:szCs w:val="26"/>
-          <w:lang w:val="vi-VN" w:eastAsia="vi-VN"/>
-        </w:rPr>
-        <w:t xml:space="preserve"> </w:t>
-      </w:r>
-      <w:r>
-        <w:rPr>
-          <w:rFonts w:ascii="Times New Roman" w:eastAsia="Times New Roman" w:hAnsi="Times New Roman" w:cs="Times New Roman"/>
-          <w:color w:val="1F1F1F"/>
-          <w:sz w:val="26"/>
-          <w:szCs w:val="26"/>
-          <w:lang w:val="vi-VN" w:eastAsia="vi-VN"/>
-        </w:rPr>
-        <w:t>lưu trữ tập trung.</w:t>
+        <w:t xml:space="preserve"> Hệ thống tự động ghi nhận nhật ký truy cập thông tin của nhân sự để phục vụ công tác kiểm soát an toàn và bảo mật dữ liệu cá nhân.</w:t>
       </w:r>
     </w:p>
     <w:p>
       <w:pPr>
-        <w:pStyle w:val="NormalWeb"/>
+        <w:spacing w:after="0" w:line="240" w:lineRule="auto"/>
         <w:ind w:firstLine="720"/>
         <w:rPr>
-          <w:sz w:val="26"/>
-          <w:szCs w:val="26"/>
-        </w:rPr>
-      </w:pPr>
-      <w:r>
-        <w:rPr>
+          <w:rFonts w:ascii="Times New Roman" w:eastAsia="Times New Roman" w:hAnsi="Times New Roman" w:cs="Times New Roman"/>
+          <w:color w:val="1F1F1F"/>
+          <w:sz w:val="26"/>
+          <w:szCs w:val="26"/>
+          <w:lang w:val="vi-VN" w:eastAsia="vi-VN"/>
+        </w:rPr>
+      </w:pPr>
+      <w:r>
+        <w:rPr>
+          <w:rFonts w:ascii="Times New Roman" w:eastAsia="Times New Roman" w:hAnsi="Times New Roman" w:cs="Times New Roman"/>
           <w:b/>
           <w:bCs/>
-          <w:sz w:val="26"/>
-          <w:szCs w:val="26"/>
-        </w:rPr>
-        <w:t>2</w:t>
-      </w:r>
-      <w:r>
-        <w:rPr>
+          <w:color w:val="1F1F1F"/>
+          <w:sz w:val="26"/>
+          <w:szCs w:val="26"/>
+          <w:bdr w:val="none" w:sz="0" w:space="0" w:color="auto" w:frame="1"/>
+          <w:lang w:val="vi-VN" w:eastAsia="vi-VN"/>
+        </w:rPr>
+        <w:t xml:space="preserve">4. </w:t>
+      </w:r>
+      <w:r>
+        <w:rPr>
+          <w:rFonts w:ascii="Times New Roman" w:eastAsia="Times New Roman" w:hAnsi="Times New Roman" w:cs="Times New Roman"/>
           <w:b/>
           <w:bCs/>
-          <w:sz w:val="26"/>
-          <w:szCs w:val="26"/>
-        </w:rPr>
-        <w:t>. Quy trình Cập nhật Thông tin Bệnh nhân</w:t>
+          <w:color w:val="1F1F1F"/>
+          <w:sz w:val="26"/>
+          <w:szCs w:val="26"/>
+          <w:bdr w:val="none" w:sz="0" w:space="0" w:color="auto" w:frame="1"/>
+          <w:lang w:val="vi-VN" w:eastAsia="vi-VN"/>
+        </w:rPr>
+        <w:t>Quy trình Tra cứu Lịch sử Khám</w:t>
       </w:r>
     </w:p>
     <w:p>
       <w:pPr>
-        <w:pStyle w:val="NormalWeb"/>
+        <w:spacing w:after="0" w:line="240" w:lineRule="auto"/>
         <w:ind w:left="720"/>
         <w:rPr>
-          <w:sz w:val="26"/>
-          <w:szCs w:val="26"/>
-        </w:rPr>
-      </w:pPr>
-      <w:r>
-        <w:rPr>
+          <w:rFonts w:ascii="Times New Roman" w:eastAsia="Times New Roman" w:hAnsi="Times New Roman" w:cs="Times New Roman"/>
+          <w:color w:val="1F1F1F"/>
+          <w:sz w:val="26"/>
+          <w:szCs w:val="26"/>
+          <w:lang w:val="vi-VN" w:eastAsia="vi-VN"/>
+        </w:rPr>
+      </w:pPr>
+      <w:r>
+        <w:rPr>
+          <w:rFonts w:ascii="Times New Roman" w:eastAsia="Times New Roman" w:hAnsi="Times New Roman" w:cs="Times New Roman"/>
+          <w:color w:val="1F1F1F"/>
+          <w:sz w:val="26"/>
+          <w:szCs w:val="26"/>
+          <w:lang w:val="vi-VN" w:eastAsia="vi-VN"/>
+        </w:rPr>
+        <w:br/>
+      </w:r>
+      <w:r>
+        <w:rPr>
+          <w:rFonts w:ascii="Times New Roman" w:eastAsia="Times New Roman" w:hAnsi="Times New Roman" w:cs="Times New Roman"/>
           <w:b/>
           <w:bCs/>
-          <w:sz w:val="26"/>
-          <w:szCs w:val="26"/>
+          <w:color w:val="1F1F1F"/>
+          <w:sz w:val="26"/>
+          <w:szCs w:val="26"/>
+          <w:bdr w:val="none" w:sz="0" w:space="0" w:color="auto" w:frame="1"/>
+          <w:lang w:val="vi-VN" w:eastAsia="vi-VN"/>
         </w:rPr>
         <w:t>Bước 1:</w:t>
       </w:r>
       <w:r>
         <w:rPr>
-          <w:sz w:val="26"/>
-          <w:szCs w:val="26"/>
-        </w:rPr>
-        <w:t xml:space="preserve"> </w:t>
-      </w:r>
-      <w:r>
-        <w:rPr>
-          <w:sz w:val="26"/>
-          <w:szCs w:val="26"/>
-        </w:rPr>
-        <w:t xml:space="preserve">Lễ tân </w:t>
-      </w:r>
-      <w:r>
-        <w:rPr>
-          <w:sz w:val="26"/>
-          <w:szCs w:val="26"/>
-        </w:rPr>
-        <w:t>tìm kiếm và mở Hồ sơ bệnh nhân điện tử cần điều chỉnh thông qua Mã bệnh nhân hoặc Số điện thoại.</w:t>
+          <w:rFonts w:ascii="Times New Roman" w:eastAsia="Times New Roman" w:hAnsi="Times New Roman" w:cs="Times New Roman"/>
+          <w:color w:val="1F1F1F"/>
+          <w:sz w:val="26"/>
+          <w:szCs w:val="26"/>
+          <w:lang w:val="vi-VN" w:eastAsia="vi-VN"/>
+        </w:rPr>
+        <w:t xml:space="preserve"> Nha sĩ hoặc Y tá truy cập vào phần thông tin bệnh nhân bằng cách tìm kiếm theo Mã bệnh nhân, Số điện thoại hoặc Họ tên.</w:t>
       </w:r>
     </w:p>
     <w:p>
       <w:pPr>
-        <w:pStyle w:val="NormalWeb"/>
+        <w:spacing w:before="100" w:beforeAutospacing="1" w:after="0" w:line="240" w:lineRule="auto"/>
         <w:ind w:left="720"/>
         <w:rPr>
-          <w:sz w:val="26"/>
-          <w:szCs w:val="26"/>
-        </w:rPr>
-      </w:pPr>
-      <w:r>
-        <w:rPr>
+          <w:rFonts w:ascii="Times New Roman" w:eastAsia="Times New Roman" w:hAnsi="Times New Roman" w:cs="Times New Roman"/>
+          <w:color w:val="1F1F1F"/>
+          <w:sz w:val="26"/>
+          <w:szCs w:val="26"/>
+          <w:lang w:val="vi-VN" w:eastAsia="vi-VN"/>
+        </w:rPr>
+      </w:pPr>
+      <w:r>
+        <w:rPr>
+          <w:rFonts w:ascii="Times New Roman" w:eastAsia="Times New Roman" w:hAnsi="Times New Roman" w:cs="Times New Roman"/>
           <w:b/>
           <w:bCs/>
-          <w:sz w:val="26"/>
-          <w:szCs w:val="26"/>
+          <w:color w:val="1F1F1F"/>
+          <w:sz w:val="26"/>
+          <w:szCs w:val="26"/>
+          <w:bdr w:val="none" w:sz="0" w:space="0" w:color="auto" w:frame="1"/>
+          <w:lang w:val="vi-VN" w:eastAsia="vi-VN"/>
         </w:rPr>
         <w:t>Bước 2:</w:t>
       </w:r>
       <w:r>
         <w:rPr>
-          <w:sz w:val="26"/>
-          <w:szCs w:val="26"/>
-        </w:rPr>
-        <w:t xml:space="preserve"> Lựa chọn mục thông tin cần thay đổi (chỉnh sửa dữ liệu hành chính như địa chỉ, số điện thoại hoặc cập nhật thêm tiền sử bệnh lý, dị ứng, sơ đồ răng, phim X-quang mới).</w:t>
+          <w:rFonts w:ascii="Times New Roman" w:eastAsia="Times New Roman" w:hAnsi="Times New Roman" w:cs="Times New Roman"/>
+          <w:color w:val="1F1F1F"/>
+          <w:sz w:val="26"/>
+          <w:szCs w:val="26"/>
+          <w:lang w:val="vi-VN" w:eastAsia="vi-VN"/>
+        </w:rPr>
+        <w:t xml:space="preserve"> </w:t>
+      </w:r>
+      <w:r>
+        <w:rPr>
+          <w:rFonts w:ascii="Times New Roman" w:eastAsia="Times New Roman" w:hAnsi="Times New Roman" w:cs="Times New Roman"/>
+          <w:color w:val="1F1F1F"/>
+          <w:sz w:val="26"/>
+          <w:szCs w:val="26"/>
+          <w:lang w:val="vi-VN" w:eastAsia="vi-VN"/>
+        </w:rPr>
+        <w:t xml:space="preserve">Hệ thống xử lý dữ liệu và trả về danh sách kết quả phù hợp; nha sĩ hoặc y tá chọn xem chi tiết. </w:t>
+      </w:r>
+      <w:r>
+        <w:rPr>
+          <w:rFonts w:ascii="Times New Roman" w:eastAsia="Times New Roman" w:hAnsi="Times New Roman" w:cs="Times New Roman"/>
+          <w:color w:val="1F1F1F"/>
+          <w:sz w:val="26"/>
+          <w:szCs w:val="26"/>
+          <w:lang w:val="vi-VN" w:eastAsia="vi-VN"/>
+        </w:rPr>
+        <w:t>Tại giao diện thông tin bệnh nhân, chọn mục "Lịch sử khám"; hệ thống truy xuất và hiển thị danh sách toàn bộ các phiên khám, điều trị trong quá khứ theo thứ tự thời gian.</w:t>
       </w:r>
     </w:p>
     <w:p>
       <w:pPr>
-        <w:pStyle w:val="NormalWeb"/>
+        <w:spacing w:before="100" w:beforeAutospacing="1" w:after="0" w:line="240" w:lineRule="auto"/>
         <w:ind w:left="720"/>
         <w:rPr>
-          <w:sz w:val="26"/>
-          <w:szCs w:val="26"/>
-        </w:rPr>
-      </w:pPr>
-      <w:r>
-        <w:rPr>
+          <w:rFonts w:ascii="Times New Roman" w:eastAsia="Times New Roman" w:hAnsi="Times New Roman" w:cs="Times New Roman"/>
+          <w:color w:val="1F1F1F"/>
+          <w:sz w:val="26"/>
+          <w:szCs w:val="26"/>
+          <w:lang w:val="vi-VN" w:eastAsia="vi-VN"/>
+        </w:rPr>
+      </w:pPr>
+      <w:r>
+        <w:rPr>
+          <w:rFonts w:ascii="Times New Roman" w:eastAsia="Times New Roman" w:hAnsi="Times New Roman" w:cs="Times New Roman"/>
           <w:b/>
           <w:bCs/>
-          <w:sz w:val="26"/>
-          <w:szCs w:val="26"/>
+          <w:color w:val="1F1F1F"/>
+          <w:sz w:val="26"/>
+          <w:szCs w:val="26"/>
+          <w:bdr w:val="none" w:sz="0" w:space="0" w:color="auto" w:frame="1"/>
+          <w:lang w:val="vi-VN" w:eastAsia="vi-VN"/>
         </w:rPr>
         <w:t>Bước 3:</w:t>
       </w:r>
       <w:r>
         <w:rPr>
-          <w:sz w:val="26"/>
-          <w:szCs w:val="26"/>
-        </w:rPr>
-        <w:t xml:space="preserve"> Nhập thông tin mới hoặc điều chỉnh dữ liệu hiện tại, đồng thời ghi nhận rõ lý do cập nhật (đối với các chỉ số y khoa hoặc thông tin định danh).</w:t>
+          <w:rFonts w:ascii="Times New Roman" w:eastAsia="Times New Roman" w:hAnsi="Times New Roman" w:cs="Times New Roman"/>
+          <w:color w:val="1F1F1F"/>
+          <w:sz w:val="26"/>
+          <w:szCs w:val="26"/>
+          <w:lang w:val="vi-VN" w:eastAsia="vi-VN"/>
+        </w:rPr>
+        <w:t xml:space="preserve"> Chọn một phiên khám cụ thể để xem chi tiết nhật ký thủ thuật đã thực hiện, dịch vụ đã sử dụng, các tệp phim X-quang (Panorama, Cephalo, CT Conebeam), hình ảnh thực tế trước – sau điều trị và đơn thuốc đã kê.</w:t>
       </w:r>
     </w:p>
     <w:p>
       <w:pPr>
-        <w:pStyle w:val="NormalWeb"/>
-        <w:ind w:left="720"/>
-        <w:rPr>
-          <w:sz w:val="26"/>
-          <w:szCs w:val="26"/>
-        </w:rPr>
-      </w:pPr>
-      <w:r>
-        <w:rPr>
-          <w:b/>
-          <w:bCs/>
-          <w:sz w:val="26"/>
-          <w:szCs w:val="26"/>
-        </w:rPr>
-        <w:t>Bước 4:</w:t>
-      </w:r>
-      <w:r>
-        <w:rPr>
-          <w:sz w:val="26"/>
-          <w:szCs w:val="26"/>
-        </w:rPr>
-        <w:t xml:space="preserve"> Xác nhận lưu thông tin. Hệ thống tự động lưu lại phiên bản mới, ghi vết lịch sử chỉnh sửa và đồng bộ dữ liệu trên toàn hệ thống.</w:t>
-      </w:r>
-    </w:p>
-    <w:p>
-      <w:pPr>
-        <w:pStyle w:val="NormalWeb"/>
-        <w:ind w:firstLine="720"/>
-        <w:rPr>
-          <w:sz w:val="26"/>
-          <w:szCs w:val="26"/>
-        </w:rPr>
-      </w:pPr>
-      <w:r>
-        <w:rPr>
-          <w:b/>
-          <w:bCs/>
-          <w:sz w:val="26"/>
-          <w:szCs w:val="26"/>
-        </w:rPr>
-        <w:t>3</w:t>
-      </w:r>
-      <w:r>
-        <w:rPr>
-          <w:b/>
-          <w:bCs/>
-          <w:sz w:val="26"/>
-          <w:szCs w:val="26"/>
-        </w:rPr>
-        <w:t>. Quy trình Tra cứu Thông tin Bệnh nhân</w:t>
-      </w:r>
-    </w:p>
-    <w:p>
-      <w:pPr>
-        <w:pStyle w:val="NormalWeb"/>
-        <w:ind w:left="720"/>
-        <w:rPr>
-          <w:sz w:val="26"/>
-          <w:szCs w:val="26"/>
-        </w:rPr>
-      </w:pPr>
-      <w:r>
-        <w:rPr>
-          <w:b/>
-          <w:bCs/>
-          <w:sz w:val="26"/>
-          <w:szCs w:val="26"/>
-        </w:rPr>
-        <w:t>Bước 1:</w:t>
-      </w:r>
-      <w:r>
-        <w:rPr>
-          <w:sz w:val="26"/>
-          <w:szCs w:val="26"/>
-        </w:rPr>
-        <w:t xml:space="preserve"> Nhân sự nhập thông tin tra cứu (Mã bệnh nhân, Họ tên, Số điện thoại hoặc Số CCCD/CMND) vào ô tìm kiếm trên hệ thống.</w:t>
-      </w:r>
-    </w:p>
-    <w:p>
-      <w:pPr>
-        <w:pStyle w:val="NormalWeb"/>
-        <w:ind w:left="720"/>
-        <w:rPr>
-          <w:sz w:val="26"/>
-          <w:szCs w:val="26"/>
-        </w:rPr>
-      </w:pPr>
-      <w:r>
-        <w:rPr>
-          <w:b/>
-          <w:bCs/>
-          <w:sz w:val="26"/>
-          <w:szCs w:val="26"/>
-        </w:rPr>
-        <w:t>Bước 2:</w:t>
-      </w:r>
-      <w:r>
-        <w:rPr>
-          <w:sz w:val="26"/>
-          <w:szCs w:val="26"/>
-        </w:rPr>
-        <w:t xml:space="preserve"> Hệ thống trả về danh sách kết quả phù hợp kèm các thông tin định danh cơ bản để người dùng chọn đúng bệnh nhân.</w:t>
-      </w:r>
-    </w:p>
-    <w:p>
-      <w:pPr>
-        <w:pStyle w:val="NormalWeb"/>
-        <w:ind w:left="720"/>
-        <w:rPr>
-          <w:sz w:val="26"/>
-          <w:szCs w:val="26"/>
-        </w:rPr>
-      </w:pPr>
-      <w:r>
-        <w:rPr>
-          <w:b/>
-          <w:bCs/>
-          <w:sz w:val="26"/>
-          <w:szCs w:val="26"/>
-        </w:rPr>
-        <w:t>Bước 3:</w:t>
-      </w:r>
-      <w:r>
-        <w:rPr>
-          <w:sz w:val="26"/>
-          <w:szCs w:val="26"/>
-        </w:rPr>
-        <w:t xml:space="preserve"> Nhân sự chọn xem chi tiết; hệ thống truy xuất và hiển thị dữ liệu hồ sơ theo đúng phân quyền vai trò sử dụng.</w:t>
-      </w:r>
-    </w:p>
-    <w:p>
-      <w:pPr>
-        <w:pStyle w:val="NormalWeb"/>
-        <w:ind w:left="720"/>
-        <w:rPr>
-          <w:sz w:val="26"/>
-          <w:szCs w:val="26"/>
-        </w:rPr>
-      </w:pPr>
-      <w:r>
-        <w:rPr>
-          <w:b/>
-          <w:bCs/>
-          <w:sz w:val="26"/>
-          <w:szCs w:val="26"/>
-        </w:rPr>
-        <w:t>Bước 4:</w:t>
-      </w:r>
-      <w:r>
-        <w:rPr>
-          <w:sz w:val="26"/>
-          <w:szCs w:val="26"/>
-        </w:rPr>
-        <w:t xml:space="preserve"> Hệ thống tự động ghi nhận nhật ký truy cập (log) của nhân sự phục vụ công tác kiểm soát an toàn dữ liệu.</w:t>
-      </w:r>
-    </w:p>
-    <w:p>
-      <w:pPr>
         <w:spacing w:before="100" w:beforeAutospacing="1" w:after="0" w:line="240" w:lineRule="auto"/>
         <w:ind w:left="720"/>
         <w:rPr>
@@ -1981,6 +2269,29 @@
           <w:lang w:val="vi-VN" w:eastAsia="vi-VN"/>
         </w:rPr>
       </w:pPr>
+      <w:r>
+        <w:rPr>
+          <w:rFonts w:ascii="Times New Roman" w:eastAsia="Times New Roman" w:hAnsi="Times New Roman" w:cs="Times New Roman"/>
+          <w:b/>
+          <w:bCs/>
+          <w:color w:val="1F1F1F"/>
+          <w:sz w:val="26"/>
+          <w:szCs w:val="26"/>
+          <w:bdr w:val="none" w:sz="0" w:space="0" w:color="auto" w:frame="1"/>
+          <w:lang w:val="vi-VN" w:eastAsia="vi-VN"/>
+        </w:rPr>
+        <w:t>Bước 4:</w:t>
+      </w:r>
+      <w:r>
+        <w:rPr>
+          <w:rFonts w:ascii="Times New Roman" w:eastAsia="Times New Roman" w:hAnsi="Times New Roman" w:cs="Times New Roman"/>
+          <w:color w:val="1F1F1F"/>
+          <w:sz w:val="26"/>
+          <w:szCs w:val="26"/>
+          <w:lang w:val="vi-VN" w:eastAsia="vi-VN"/>
+        </w:rPr>
+        <w:t xml:space="preserve"> Bác sĩ đánh giá tiến triển sức khỏe răng miệng của bệnh nhân dựa trên lịch sử điều trị lưu trong hồ sơ, làm cơ sở chẩn đoán và lập phác đồ hoặc hẹn lịch tái khám cho các giai đoạn tiếp theo.</w:t>
+      </w:r>
     </w:p>
     <w:p>
       <w:pPr>
@@ -2041,14 +2352,13 @@
     </w:p>
     <w:p>
       <w:pPr>
-        <w:pStyle w:val="ListParagraph"/>
-        <w:spacing w:after="120" w:line="240" w:lineRule="auto"/>
-        <w:jc w:val="both"/>
-        <w:rPr>
-          <w:rFonts w:ascii="Times New Roman" w:hAnsi="Times New Roman" w:cs="Times New Roman"/>
-          <w:b/>
-          <w:sz w:val="26"/>
-          <w:szCs w:val="26"/>
+        <w:spacing w:before="100" w:beforeAutospacing="1" w:after="100" w:afterAutospacing="1" w:line="240" w:lineRule="auto"/>
+        <w:ind w:firstLine="720"/>
+        <w:rPr>
+          <w:rFonts w:ascii="Times New Roman" w:eastAsia="Times New Roman" w:hAnsi="Times New Roman" w:cs="Times New Roman"/>
+          <w:sz w:val="26"/>
+          <w:szCs w:val="26"/>
+          <w:lang w:val="vi-VN" w:eastAsia="vi-VN"/>
         </w:rPr>
       </w:pPr>
       <w:r>
@@ -2056,62 +2366,32 @@
           <w:rFonts w:ascii="Times New Roman" w:eastAsia="Times New Roman" w:hAnsi="Times New Roman" w:cs="Times New Roman"/>
           <w:b/>
           <w:bCs/>
-          <w:color w:val="1F1F1F"/>
-          <w:sz w:val="26"/>
-          <w:szCs w:val="26"/>
-          <w:bdr w:val="none" w:sz="0" w:space="0" w:color="auto" w:frame="1"/>
-          <w:lang w:val="vi-VN" w:eastAsia="vi-VN"/>
-        </w:rPr>
-        <w:t xml:space="preserve">Quy định </w:t>
-      </w:r>
-      <w:r>
-        <w:rPr>
-          <w:rFonts w:ascii="Times New Roman" w:eastAsia="Times New Roman" w:hAnsi="Times New Roman" w:cs="Times New Roman"/>
-          <w:b/>
-          <w:bCs/>
-          <w:color w:val="1F1F1F"/>
-          <w:sz w:val="26"/>
-          <w:szCs w:val="26"/>
-          <w:bdr w:val="none" w:sz="0" w:space="0" w:color="auto" w:frame="1"/>
-          <w:lang w:val="vi-VN" w:eastAsia="vi-VN"/>
-        </w:rPr>
-        <w:t>1</w:t>
-      </w:r>
-      <w:r>
-        <w:rPr>
-          <w:rFonts w:ascii="Times New Roman" w:eastAsia="Times New Roman" w:hAnsi="Times New Roman" w:cs="Times New Roman"/>
-          <w:b/>
-          <w:bCs/>
-          <w:color w:val="1F1F1F"/>
-          <w:sz w:val="26"/>
-          <w:szCs w:val="26"/>
-          <w:bdr w:val="none" w:sz="0" w:space="0" w:color="auto" w:frame="1"/>
-          <w:lang w:val="vi-VN" w:eastAsia="vi-VN"/>
-        </w:rPr>
-        <w:t>: Về duy nhất mã bệnh nhân và hồ sơ điện tử</w:t>
+          <w:sz w:val="26"/>
+          <w:szCs w:val="26"/>
+          <w:lang w:val="vi-VN" w:eastAsia="vi-VN"/>
+        </w:rPr>
+        <w:t>Quy định 1: Về tiếp nhận, kiểm tra trùng lặp và cấp mã định danh bệnh nhân</w:t>
       </w:r>
     </w:p>
     <w:p>
       <w:pPr>
-        <w:pStyle w:val="ListParagraph"/>
-        <w:spacing w:after="0" w:line="240" w:lineRule="auto"/>
-        <w:rPr>
-          <w:rFonts w:ascii="Times New Roman" w:eastAsia="Times New Roman" w:hAnsi="Times New Roman" w:cs="Times New Roman"/>
-          <w:color w:val="1F1F1F"/>
-          <w:sz w:val="26"/>
-          <w:szCs w:val="26"/>
-          <w:lang w:val="vi-VN" w:eastAsia="vi-VN"/>
-        </w:rPr>
-      </w:pPr>
-      <w:r>
-        <w:rPr>
-          <w:rFonts w:ascii="Times New Roman" w:eastAsia="Times New Roman" w:hAnsi="Times New Roman" w:cs="Times New Roman"/>
-          <w:color w:val="1F1F1F"/>
-          <w:sz w:val="26"/>
-          <w:szCs w:val="26"/>
-          <w:lang w:val="vi-VN" w:eastAsia="vi-VN"/>
-        </w:rPr>
-        <w:t>Mỗi bệnh nhân chỉ được cấp một Mã bệnh nhân duy nhất dựa trên cơ chế kiểm tra trùng lặp qua số điện thoại. Toàn bộ thông tin hành chính, tiền sử bệnh lý bắt buộc phải ghi nhận đầy đủ để khởi tạo Hồ sơ bệnh nhân điện tử tập trung.</w:t>
+        <w:spacing w:before="100" w:beforeAutospacing="1" w:after="100" w:afterAutospacing="1" w:line="240" w:lineRule="auto"/>
+        <w:ind w:left="720"/>
+        <w:rPr>
+          <w:rFonts w:ascii="Times New Roman" w:eastAsia="Times New Roman" w:hAnsi="Times New Roman" w:cs="Times New Roman"/>
+          <w:sz w:val="26"/>
+          <w:szCs w:val="26"/>
+          <w:lang w:val="vi-VN" w:eastAsia="vi-VN"/>
+        </w:rPr>
+      </w:pPr>
+      <w:r>
+        <w:rPr>
+          <w:rFonts w:ascii="Times New Roman" w:eastAsia="Times New Roman" w:hAnsi="Times New Roman" w:cs="Times New Roman"/>
+          <w:sz w:val="26"/>
+          <w:szCs w:val="26"/>
+          <w:lang w:val="vi-VN" w:eastAsia="vi-VN"/>
+        </w:rPr>
+        <w:t>Lễ tân có trách nhiệm thu thập chính xác các thông tin hành chính ban đầu. Tuyệt đối không tự ý ghi nhận hay nhập thông tin chẩn đoán y khoa (như bệnh lý nền, tiền sử dị ứng) khi chưa có sự thăm khám và xác nhận trực tiếp từ Bác sĩ.</w:t>
       </w:r>
     </w:p>
     <w:p>
@@ -2128,55 +2408,11 @@
       <w:r>
         <w:rPr>
           <w:rFonts w:ascii="Times New Roman" w:eastAsia="Times New Roman" w:hAnsi="Times New Roman" w:cs="Times New Roman"/>
-          <w:b/>
-          <w:bCs/>
-          <w:sz w:val="26"/>
-          <w:szCs w:val="26"/>
-          <w:lang w:val="vi-VN" w:eastAsia="vi-VN"/>
-        </w:rPr>
-        <w:t xml:space="preserve">Quy định </w:t>
-      </w:r>
-      <w:r>
-        <w:rPr>
-          <w:rFonts w:ascii="Times New Roman" w:eastAsia="Times New Roman" w:hAnsi="Times New Roman" w:cs="Times New Roman"/>
-          <w:b/>
-          <w:bCs/>
-          <w:sz w:val="26"/>
-          <w:szCs w:val="26"/>
-          <w:lang w:val="vi-VN" w:eastAsia="vi-VN"/>
-        </w:rPr>
-        <w:t>2</w:t>
-      </w:r>
-      <w:r>
-        <w:rPr>
-          <w:rFonts w:ascii="Times New Roman" w:eastAsia="Times New Roman" w:hAnsi="Times New Roman" w:cs="Times New Roman"/>
-          <w:b/>
-          <w:bCs/>
-          <w:sz w:val="26"/>
-          <w:szCs w:val="26"/>
-          <w:lang w:val="vi-VN" w:eastAsia="vi-VN"/>
-        </w:rPr>
-        <w:t>:</w:t>
-      </w:r>
-      <w:r>
-        <w:rPr>
-          <w:rFonts w:ascii="Times New Roman" w:eastAsia="Times New Roman" w:hAnsi="Times New Roman" w:cs="Times New Roman"/>
-          <w:b/>
-          <w:bCs/>
-          <w:sz w:val="26"/>
-          <w:szCs w:val="26"/>
-          <w:lang w:val="vi-VN" w:eastAsia="vi-VN"/>
-        </w:rPr>
-        <w:t xml:space="preserve"> </w:t>
-      </w:r>
-      <w:r>
-        <w:rPr>
-          <w:rFonts w:ascii="Times New Roman" w:hAnsi="Times New Roman" w:cs="Times New Roman"/>
-          <w:sz w:val="26"/>
-          <w:szCs w:val="26"/>
-          <w:lang w:val="vi-VN"/>
-        </w:rPr>
-        <w:t>Lễ tân chỉ được phép chỉnh sửa thông tin hành chính của bệnh nhân (như họ tên, ngày sinh, số điện thoại, địa chỉ) trong trường hợp có sai sót, nhầm lẫn ở khâu đăng ký tiếp nhận ban đầu. Mọi cập nhật liên quan đến tiền sử bệnh lý, chỉ số y khoa, sơ đồ răng hay nhật ký điều trị thuộc thẩm quyền riêng của Nha sĩ phụ trách và phải được hệ thống lưu vết chi tiết (người sửa, thời gian, nội dung trước và sau khi chỉnh sửa).</w:t>
+          <w:sz w:val="26"/>
+          <w:szCs w:val="26"/>
+          <w:lang w:val="vi-VN" w:eastAsia="vi-VN"/>
+        </w:rPr>
+        <w:t>Hệ thống bắt buộc phải tự động kiểm tra trùng lặp dữ liệu qua Số điện thoại hoặc Mã định danh trước khi khởi tạo. Mỗi bệnh nhân chỉ được cấp duy nhất một Mã bệnh nhân gắn liền với Hồ sơ bệnh nhân điện tử để theo dõi xuyên suốt.</w:t>
       </w:r>
     </w:p>
     <w:p>
@@ -2199,88 +2435,199 @@
           <w:szCs w:val="26"/>
           <w:lang w:val="vi-VN" w:eastAsia="vi-VN"/>
         </w:rPr>
-        <w:t xml:space="preserve">Quy định </w:t>
-      </w:r>
-      <w:r>
-        <w:rPr>
-          <w:rFonts w:ascii="Times New Roman" w:eastAsia="Times New Roman" w:hAnsi="Times New Roman" w:cs="Times New Roman"/>
-          <w:b/>
-          <w:bCs/>
-          <w:sz w:val="26"/>
-          <w:szCs w:val="26"/>
-          <w:lang w:val="vi-VN" w:eastAsia="vi-VN"/>
-        </w:rPr>
-        <w:t>3</w:t>
-      </w:r>
-      <w:r>
-        <w:rPr>
-          <w:rFonts w:ascii="Times New Roman" w:eastAsia="Times New Roman" w:hAnsi="Times New Roman" w:cs="Times New Roman"/>
-          <w:b/>
-          <w:bCs/>
-          <w:sz w:val="26"/>
-          <w:szCs w:val="26"/>
-          <w:lang w:val="vi-VN" w:eastAsia="vi-VN"/>
-        </w:rPr>
-        <w:t>:</w:t>
-      </w:r>
-      <w:r>
-        <w:rPr>
-          <w:rFonts w:ascii="Times New Roman" w:eastAsia="Times New Roman" w:hAnsi="Times New Roman" w:cs="Times New Roman"/>
-          <w:b/>
-          <w:bCs/>
-          <w:sz w:val="26"/>
-          <w:szCs w:val="26"/>
-          <w:lang w:val="vi-VN" w:eastAsia="vi-VN"/>
-        </w:rPr>
-        <w:t xml:space="preserve"> </w:t>
-      </w:r>
-      <w:r>
-        <w:rPr>
-          <w:rFonts w:ascii="Times New Roman" w:eastAsia="Times New Roman" w:hAnsi="Times New Roman" w:cs="Times New Roman"/>
-          <w:sz w:val="26"/>
-          <w:szCs w:val="26"/>
-          <w:lang w:val="vi-VN" w:eastAsia="vi-VN"/>
-        </w:rPr>
-        <w:t xml:space="preserve">Việc tra cứu thông tin bệnh nhân phải tuân thủ nghiêm ngặt theo phân quyền tài khoản (Lễ tân xem thông tin hành chính, lịch hẹn và thanh toán; Nha sĩ/Y tá xem chi tiết </w:t>
-      </w:r>
-      <w:r>
-        <w:rPr>
-          <w:rFonts w:ascii="Times New Roman" w:eastAsia="Times New Roman" w:hAnsi="Times New Roman" w:cs="Times New Roman"/>
-          <w:sz w:val="26"/>
-          <w:szCs w:val="26"/>
-          <w:lang w:val="vi-VN" w:eastAsia="vi-VN"/>
-        </w:rPr>
-        <w:lastRenderedPageBreak/>
-        <w:t>bệnh án và tiền sử điều trị). Mọi hành vi tra cứu không đúng mục đích hoặc xuất dữ liệu bệnh nhân ra ngoài khi chưa được duyệt đều bị nghiêm cấm.</w:t>
+        <w:t>Quy định 2: Về phân quyền và lưu vết lịch sử khi cập nhật thông tin</w:t>
       </w:r>
     </w:p>
     <w:p>
       <w:pPr>
-        <w:pStyle w:val="ListParagraph"/>
-        <w:spacing w:after="0" w:line="240" w:lineRule="auto"/>
-        <w:rPr>
-          <w:rFonts w:ascii="Times New Roman" w:eastAsia="Times New Roman" w:hAnsi="Times New Roman" w:cs="Times New Roman"/>
-          <w:color w:val="1F1F1F"/>
-          <w:sz w:val="26"/>
-          <w:szCs w:val="26"/>
-          <w:lang w:val="vi-VN" w:eastAsia="vi-VN"/>
-        </w:rPr>
-      </w:pPr>
+        <w:spacing w:before="100" w:beforeAutospacing="1" w:after="100" w:afterAutospacing="1" w:line="240" w:lineRule="auto"/>
+        <w:ind w:left="720"/>
+        <w:rPr>
+          <w:rFonts w:ascii="Times New Roman" w:eastAsia="Times New Roman" w:hAnsi="Times New Roman" w:cs="Times New Roman"/>
+          <w:sz w:val="26"/>
+          <w:szCs w:val="26"/>
+          <w:lang w:val="vi-VN" w:eastAsia="vi-VN"/>
+        </w:rPr>
+      </w:pPr>
+      <w:r>
+        <w:rPr>
+          <w:rFonts w:ascii="Times New Roman" w:eastAsia="Times New Roman" w:hAnsi="Times New Roman" w:cs="Times New Roman"/>
+          <w:sz w:val="26"/>
+          <w:szCs w:val="26"/>
+          <w:lang w:val="vi-VN" w:eastAsia="vi-VN"/>
+        </w:rPr>
+        <w:t>Phân quyền thao tác: Lễ tân chỉ có thẩm quyền chỉnh sửa các thông tin hành chính khi phát hiện có sai sót hay nhầm lẫn ở khâu đăng ký ban đầu. Mọi cập nhật liên quan đến dữ liệu y khoa chuyên sâu (bệnh nền, tiền sử dị ứng, chỉ số nha chu, sơ đồ răng, phim X-quang) thuộc thẩm quyền riêng của Nha sĩ.</w:t>
+      </w:r>
     </w:p>
     <w:p>
       <w:pPr>
-        <w:pStyle w:val="ListParagraph"/>
-        <w:spacing w:after="120" w:line="240" w:lineRule="auto"/>
-        <w:ind w:left="284"/>
-        <w:jc w:val="both"/>
-        <w:rPr>
-          <w:rFonts w:ascii="Times New Roman" w:hAnsi="Times New Roman" w:cs="Times New Roman"/>
-          <w:b/>
-          <w:sz w:val="26"/>
-          <w:szCs w:val="26"/>
-          <w:lang w:val="vi-VN"/>
-        </w:rPr>
-      </w:pPr>
+        <w:spacing w:before="100" w:beforeAutospacing="1" w:after="100" w:afterAutospacing="1" w:line="240" w:lineRule="auto"/>
+        <w:ind w:left="720"/>
+        <w:rPr>
+          <w:rFonts w:ascii="Times New Roman" w:eastAsia="Times New Roman" w:hAnsi="Times New Roman" w:cs="Times New Roman"/>
+          <w:sz w:val="26"/>
+          <w:szCs w:val="26"/>
+          <w:lang w:val="vi-VN" w:eastAsia="vi-VN"/>
+        </w:rPr>
+      </w:pPr>
+      <w:r>
+        <w:rPr>
+          <w:rFonts w:ascii="Times New Roman" w:eastAsia="Times New Roman" w:hAnsi="Times New Roman" w:cs="Times New Roman"/>
+          <w:sz w:val="26"/>
+          <w:szCs w:val="26"/>
+          <w:lang w:val="vi-VN" w:eastAsia="vi-VN"/>
+        </w:rPr>
+        <w:t>Yêu cầu lưu vết: Mọi thao tác cập nhật, điều chỉnh thông tin bắt buộc phải được hệ thống tự động ghi vết lịch sử gồm: Tài khoản người thực hiện, thời gian chỉnh sửa, chi tiết dữ liệu trước và sau khi sửa để đảm bảo tính minh bạch và pháp lý của hồ sơ.</w:t>
+      </w:r>
+    </w:p>
+    <w:p>
+      <w:pPr>
+        <w:spacing w:before="100" w:beforeAutospacing="1" w:after="100" w:afterAutospacing="1" w:line="240" w:lineRule="auto"/>
+        <w:ind w:left="720"/>
+        <w:rPr>
+          <w:rFonts w:ascii="Times New Roman" w:eastAsia="Times New Roman" w:hAnsi="Times New Roman" w:cs="Times New Roman"/>
+          <w:sz w:val="26"/>
+          <w:szCs w:val="26"/>
+          <w:lang w:val="vi-VN" w:eastAsia="vi-VN"/>
+        </w:rPr>
+      </w:pPr>
+      <w:r>
+        <w:rPr>
+          <w:rFonts w:ascii="Times New Roman" w:eastAsia="Times New Roman" w:hAnsi="Times New Roman" w:cs="Times New Roman"/>
+          <w:b/>
+          <w:bCs/>
+          <w:sz w:val="26"/>
+          <w:szCs w:val="26"/>
+          <w:lang w:val="vi-VN" w:eastAsia="vi-VN"/>
+        </w:rPr>
+        <w:t>Quy định 3: Về phân quyền truy cập và bảo mật dữ liệu khi tra cứu</w:t>
+      </w:r>
+    </w:p>
+    <w:p>
+      <w:pPr>
+        <w:spacing w:before="100" w:beforeAutospacing="1" w:after="100" w:afterAutospacing="1" w:line="240" w:lineRule="auto"/>
+        <w:ind w:left="720"/>
+        <w:rPr>
+          <w:rFonts w:ascii="Times New Roman" w:eastAsia="Times New Roman" w:hAnsi="Times New Roman" w:cs="Times New Roman"/>
+          <w:sz w:val="26"/>
+          <w:szCs w:val="26"/>
+          <w:lang w:val="vi-VN" w:eastAsia="vi-VN"/>
+        </w:rPr>
+      </w:pPr>
+      <w:r>
+        <w:rPr>
+          <w:rFonts w:ascii="Times New Roman" w:eastAsia="Times New Roman" w:hAnsi="Times New Roman" w:cs="Times New Roman"/>
+          <w:sz w:val="26"/>
+          <w:szCs w:val="26"/>
+          <w:lang w:val="vi-VN" w:eastAsia="vi-VN"/>
+        </w:rPr>
+        <w:lastRenderedPageBreak/>
+        <w:t>Nhân sự phòng khám chỉ được phép tra cứu thông tin bệnh nhân theo đúng phân quyền vai trò: Lễ tân tra cứu thông tin hành chính, lịch hẹn và hóa đơn thanh toán; Nha sĩ và Y tá tra cứu đầy đủ thông tin bệnh án, tiền sử y khoa và sơ đồ điều trị.</w:t>
+      </w:r>
+    </w:p>
+    <w:p>
+      <w:pPr>
+        <w:spacing w:before="100" w:beforeAutospacing="1" w:after="100" w:afterAutospacing="1" w:line="240" w:lineRule="auto"/>
+        <w:ind w:left="720"/>
+        <w:rPr>
+          <w:rFonts w:ascii="Times New Roman" w:eastAsia="Times New Roman" w:hAnsi="Times New Roman" w:cs="Times New Roman"/>
+          <w:sz w:val="26"/>
+          <w:szCs w:val="26"/>
+          <w:lang w:val="vi-VN" w:eastAsia="vi-VN"/>
+        </w:rPr>
+      </w:pPr>
+      <w:r>
+        <w:rPr>
+          <w:rFonts w:ascii="Times New Roman" w:eastAsia="Times New Roman" w:hAnsi="Times New Roman" w:cs="Times New Roman"/>
+          <w:sz w:val="26"/>
+          <w:szCs w:val="26"/>
+          <w:lang w:val="vi-VN" w:eastAsia="vi-VN"/>
+        </w:rPr>
+        <w:t>Nghiêm cấm các hành vi tra cứu vượt thẩm quyền, sao chép hoặc trích xuất dữ liệu bệnh nhân ra ngoài hệ thống khi chưa có sự phê duyệt của cấp quản lý. Hệ thống phải tự động lưu nhật ký truy cập để phục vụ công tác kiểm tra an toàn thông tin.</w:t>
+      </w:r>
+    </w:p>
+    <w:p>
+      <w:pPr>
+        <w:spacing w:before="100" w:beforeAutospacing="1" w:after="100" w:afterAutospacing="1" w:line="240" w:lineRule="auto"/>
+        <w:ind w:left="720"/>
+        <w:rPr>
+          <w:rFonts w:ascii="Times New Roman" w:eastAsia="Times New Roman" w:hAnsi="Times New Roman" w:cs="Times New Roman"/>
+          <w:sz w:val="26"/>
+          <w:szCs w:val="26"/>
+          <w:lang w:val="vi-VN" w:eastAsia="vi-VN"/>
+        </w:rPr>
+      </w:pPr>
+      <w:r>
+        <w:rPr>
+          <w:rFonts w:ascii="Times New Roman" w:eastAsia="Times New Roman" w:hAnsi="Times New Roman" w:cs="Times New Roman"/>
+          <w:b/>
+          <w:bCs/>
+          <w:sz w:val="26"/>
+          <w:szCs w:val="26"/>
+          <w:lang w:val="vi-VN" w:eastAsia="vi-VN"/>
+        </w:rPr>
+        <w:t>Quy định 4: Về quản lý và khai thác dữ liệu lịch sử khám</w:t>
+      </w:r>
+    </w:p>
+    <w:p>
+      <w:pPr>
+        <w:spacing w:before="100" w:beforeAutospacing="1" w:after="100" w:afterAutospacing="1" w:line="240" w:lineRule="auto"/>
+        <w:ind w:left="720"/>
+        <w:rPr>
+          <w:rFonts w:ascii="Times New Roman" w:eastAsia="Times New Roman" w:hAnsi="Times New Roman" w:cs="Times New Roman"/>
+          <w:sz w:val="26"/>
+          <w:szCs w:val="26"/>
+          <w:lang w:val="vi-VN" w:eastAsia="vi-VN"/>
+        </w:rPr>
+      </w:pPr>
+      <w:r>
+        <w:rPr>
+          <w:rFonts w:ascii="Times New Roman" w:eastAsia="Times New Roman" w:hAnsi="Times New Roman" w:cs="Times New Roman"/>
+          <w:sz w:val="26"/>
+          <w:szCs w:val="26"/>
+          <w:lang w:val="vi-VN" w:eastAsia="vi-VN"/>
+        </w:rPr>
+        <w:t>Dữ liệu lịch sử khám (nhật ký thủ thuật, danh mục dịch vụ, hình ảnh X-quang/thực tế, đơn thuốc điện tử) phải được đồng bộ tập trung và hiển thị theo đúng thứ tự thời gian trong Hồ sơ bệnh nhân điện tử.</w:t>
+      </w:r>
+    </w:p>
+    <w:p>
+      <w:pPr>
+        <w:spacing w:before="100" w:beforeAutospacing="1" w:after="100" w:afterAutospacing="1" w:line="240" w:lineRule="auto"/>
+        <w:ind w:left="720"/>
+        <w:rPr>
+          <w:rFonts w:ascii="Times New Roman" w:eastAsia="Times New Roman" w:hAnsi="Times New Roman" w:cs="Times New Roman"/>
+          <w:sz w:val="26"/>
+          <w:szCs w:val="26"/>
+          <w:lang w:val="vi-VN" w:eastAsia="vi-VN"/>
+        </w:rPr>
+      </w:pPr>
+      <w:r>
+        <w:rPr>
+          <w:rFonts w:ascii="Times New Roman" w:eastAsia="Times New Roman" w:hAnsi="Times New Roman" w:cs="Times New Roman"/>
+          <w:sz w:val="26"/>
+          <w:szCs w:val="26"/>
+          <w:lang w:val="vi-VN" w:eastAsia="vi-VN"/>
+        </w:rPr>
+        <w:t>Nha sĩ và Y tá có trách nhiệm đối soát lịch sử điều trị cũ trước khi đưa ra chẩn đoán, lập phác đồ hoặc chỉ định tái khám cho phiên làm việc mới. Dữ liệu lịch sử khám tuyệt đối không được xóa bỏ hay</w:t>
+      </w:r>
+      <w:r>
+        <w:rPr>
+          <w:rFonts w:ascii="Times New Roman" w:eastAsia="Times New Roman" w:hAnsi="Times New Roman" w:cs="Times New Roman"/>
+          <w:sz w:val="26"/>
+          <w:szCs w:val="26"/>
+          <w:lang w:val="vi-VN" w:eastAsia="vi-VN"/>
+        </w:rPr>
+        <w:t xml:space="preserve"> </w:t>
+      </w:r>
+      <w:r>
+        <w:rPr>
+          <w:rFonts w:ascii="Times New Roman" w:eastAsia="Times New Roman" w:hAnsi="Times New Roman" w:cs="Times New Roman"/>
+          <w:sz w:val="26"/>
+          <w:szCs w:val="26"/>
+          <w:lang w:val="vi-VN" w:eastAsia="vi-VN"/>
+        </w:rPr>
+        <w:t>chỉnh sửa làm sai lệch diễn biến điều trị của bệnh nhân.</w:t>
+      </w:r>
     </w:p>
     <w:p>
       <w:pPr>
@@ -4291,7 +4638,7 @@
                 </wp:anchor>
               </w:drawing>
             </mc:Choice>
-            <mc:Fallback xmlns:oel="http://schemas.microsoft.com/office/2019/extlst" xmlns:w16cei="http://schemas.microsoft.com/office/word/2026/wordml/cei" xmlns:w16du="http://schemas.microsoft.com/office/word/2023/wordml/word16du" xmlns:w16sdtfl="http://schemas.microsoft.com/office/word/2024/wordml/sdtformatlock">
+            <mc:Fallback xmlns:w16sdtfl="http://schemas.microsoft.com/office/word/2024/wordml/sdtformatlock" xmlns:w16du="http://schemas.microsoft.com/office/word/2023/wordml/word16du" xmlns:w16cei="http://schemas.microsoft.com/office/word/2026/wordml/cei" xmlns:oel="http://schemas.microsoft.com/office/2019/extlst">
               <w:pict>
                 <v:line w14:anchorId="62D43E4F" id="Straight Connector 1" o:spid="_x0000_s1026" style="position:absolute;z-index:251659264;visibility:visible;mso-wrap-style:square;mso-width-percent:0;mso-wrap-distance-left:9pt;mso-wrap-distance-top:0;mso-wrap-distance-right:9pt;mso-wrap-distance-bottom:0;mso-position-horizontal:absolute;mso-position-horizontal-relative:text;mso-position-vertical:absolute;mso-position-vertical-relative:text;mso-width-percent:0;mso-width-relative:margin" from=".85pt,.5pt" to="525.25pt,.5pt" o:gfxdata="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" strokecolor="black [3200]" strokeweight=".5pt">
                   <v:stroke joinstyle="miter"/>
@@ -4545,6 +4892,155 @@
 <file path=word/numbering.xml><?xml version="1.0" encoding="utf-8"?>
 <w:numbering xmlns:wpc="http://schemas.microsoft.com/office/word/2010/wordprocessingCanvas" xmlns:cx="http://schemas.microsoft.com/office/drawing/2014/chartex" xmlns:cx1="http://schemas.microsoft.com/office/drawing/2015/9/8/chartex" xmlns:cx2="http://schemas.microsoft.com/office/drawing/2015/10/21/chartex" xmlns:cx3="http://schemas.microsoft.com/office/drawing/2016/5/9/chartex" xmlns:cx4="http://schemas.microsoft.com/office/drawing/2016/5/10/chartex" xmlns:cx5="http://schemas.microsoft.com/office/drawing/2016/5/11/chartex" xmlns:cx6="http://schemas.microsoft.com/office/drawing/2016/5/12/chartex" xmlns:cx7="http://schemas.microsoft.com/office/drawing/2016/5/13/chartex" xmlns:cx8="http://schemas.microsoft.com/office/drawing/2016/5/14/chartex" xmlns:mc="http://schemas.openxmlformats.org/markup-compatibility/2006" xmlns:aink="http://schemas.microsoft.com/office/drawing/2016/ink" xmlns:am3d="http://schemas.microsoft.com/office/drawing/2017/model3d" xmlns:o="urn:schemas-microsoft-com:office:office" xmlns:r="http://schemas.openxmlformats.org/officeDocument/2006/relationships" xmlns:m="http://schemas.openxmlformats.org/officeDocument/2006/math" xmlns:v="urn:schemas-microsoft-com:vml" xmlns:wp14="http://schemas.microsoft.com/office/word/2010/wordprocessingDrawing" xmlns:wp="http://schemas.openxmlformats.org/drawingml/2006/wordprocessingDrawing" xmlns:w10="urn:schemas-microsoft-com:office:word" xmlns:w="http://schemas.openxmlformats.org/wordprocessingml/2006/main" xmlns:w14="http://schemas.microsoft.com/office/word/2010/wordml" xmlns:w15="http://schemas.microsoft.com/office/word/2012/wordml" xmlns:w16cex="http://schemas.microsoft.com/office/word/2018/wordml/cex" xmlns:w16cid="http://schemas.microsoft.com/office/word/2016/wordml/cid" xmlns:w16="http://schemas.microsoft.com/office/word/2018/wordml" xmlns:w16sdtdh="http://schemas.microsoft.com/office/word/2020/wordml/sdtdatahash" xmlns:w16se="http://schemas.microsoft.com/office/word/2015/wordml/symex" xmlns:wpg="http://schemas.microsoft.com/office/word/2010/wordprocessingGroup" xmlns:wpi="http://schemas.microsoft.com/office/word/2010/wordprocessingInk" xmlns:wne="http://schemas.microsoft.com/office/word/2006/wordml" xmlns:wps="http://schemas.microsoft.com/office/word/2010/wordprocessingShape" mc:Ignorable="w14 w15 w16se w16cid w16 w16cex w16sdtdh wp14">
   <w:abstractNum w:abstractNumId="0" w15:restartNumberingAfterBreak="0">
+    <w:nsid w:val="078A6751"/>
+    <w:multiLevelType w:val="multilevel"/>
+    <w:tmpl w:val="92B49012"/>
+    <w:lvl w:ilvl="0">
+      <w:start w:val="1"/>
+      <w:numFmt w:val="bullet"/>
+      <w:lvlText w:val=""/>
+      <w:lvlJc w:val="left"/>
+      <w:pPr>
+        <w:tabs>
+          <w:tab w:val="num" w:pos="720"/>
+        </w:tabs>
+        <w:ind w:left="720" w:hanging="360"/>
+      </w:pPr>
+      <w:rPr>
+        <w:rFonts w:ascii="Symbol" w:hAnsi="Symbol" w:hint="default"/>
+        <w:sz w:val="20"/>
+      </w:rPr>
+    </w:lvl>
+    <w:lvl w:ilvl="1" w:tentative="1">
+      <w:start w:val="1"/>
+      <w:numFmt w:val="bullet"/>
+      <w:lvlText w:val="o"/>
+      <w:lvlJc w:val="left"/>
+      <w:pPr>
+        <w:tabs>
+          <w:tab w:val="num" w:pos="1440"/>
+        </w:tabs>
+        <w:ind w:left="1440" w:hanging="360"/>
+      </w:pPr>
+      <w:rPr>
+        <w:rFonts w:ascii="Courier New" w:hAnsi="Courier New" w:hint="default"/>
+        <w:sz w:val="20"/>
+      </w:rPr>
+    </w:lvl>
+    <w:lvl w:ilvl="2" w:tentative="1">
+      <w:start w:val="1"/>
+      <w:numFmt w:val="bullet"/>
+      <w:lvlText w:val=""/>
+      <w:lvlJc w:val="left"/>
+      <w:pPr>
+        <w:tabs>
+          <w:tab w:val="num" w:pos="2160"/>
+        </w:tabs>
+        <w:ind w:left="2160" w:hanging="360"/>
+      </w:pPr>
+      <w:rPr>
+        <w:rFonts w:ascii="Wingdings" w:hAnsi="Wingdings" w:hint="default"/>
+        <w:sz w:val="20"/>
+      </w:rPr>
+    </w:lvl>
+    <w:lvl w:ilvl="3" w:tentative="1">
+      <w:start w:val="1"/>
+      <w:numFmt w:val="bullet"/>
+      <w:lvlText w:val=""/>
+      <w:lvlJc w:val="left"/>
+      <w:pPr>
+        <w:tabs>
+          <w:tab w:val="num" w:pos="2880"/>
+        </w:tabs>
+        <w:ind w:left="2880" w:hanging="360"/>
+      </w:pPr>
+      <w:rPr>
+        <w:rFonts w:ascii="Wingdings" w:hAnsi="Wingdings" w:hint="default"/>
+        <w:sz w:val="20"/>
+      </w:rPr>
+    </w:lvl>
+    <w:lvl w:ilvl="4" w:tentative="1">
+      <w:start w:val="1"/>
+      <w:numFmt w:val="bullet"/>
+      <w:lvlText w:val=""/>
+      <w:lvlJc w:val="left"/>
+      <w:pPr>
+        <w:tabs>
+          <w:tab w:val="num" w:pos="3600"/>
+        </w:tabs>
+        <w:ind w:left="3600" w:hanging="360"/>
+      </w:pPr>
+      <w:rPr>
+        <w:rFonts w:ascii="Wingdings" w:hAnsi="Wingdings" w:hint="default"/>
+        <w:sz w:val="20"/>
+      </w:rPr>
+    </w:lvl>
+    <w:lvl w:ilvl="5" w:tentative="1">
+      <w:start w:val="1"/>
+      <w:numFmt w:val="bullet"/>
+      <w:lvlText w:val=""/>
+      <w:lvlJc w:val="left"/>
+      <w:pPr>
+        <w:tabs>
+          <w:tab w:val="num" w:pos="4320"/>
+        </w:tabs>
+        <w:ind w:left="4320" w:hanging="360"/>
+      </w:pPr>
+      <w:rPr>
+        <w:rFonts w:ascii="Wingdings" w:hAnsi="Wingdings" w:hint="default"/>
+        <w:sz w:val="20"/>
+      </w:rPr>
+    </w:lvl>
+    <w:lvl w:ilvl="6" w:tentative="1">
+      <w:start w:val="1"/>
+      <w:numFmt w:val="bullet"/>
+      <w:lvlText w:val=""/>
+      <w:lvlJc w:val="left"/>
+      <w:pPr>
+        <w:tabs>
+          <w:tab w:val="num" w:pos="5040"/>
+        </w:tabs>
+        <w:ind w:left="5040" w:hanging="360"/>
+      </w:pPr>
+      <w:rPr>
+        <w:rFonts w:ascii="Wingdings" w:hAnsi="Wingdings" w:hint="default"/>
+        <w:sz w:val="20"/>
+      </w:rPr>
+    </w:lvl>
+    <w:lvl w:ilvl="7" w:tentative="1">
+      <w:start w:val="1"/>
+      <w:numFmt w:val="bullet"/>
+      <w:lvlText w:val=""/>
+      <w:lvlJc w:val="left"/>
+      <w:pPr>
+        <w:tabs>
+          <w:tab w:val="num" w:pos="5760"/>
+        </w:tabs>
+        <w:ind w:left="5760" w:hanging="360"/>
+      </w:pPr>
+      <w:rPr>
+        <w:rFonts w:ascii="Wingdings" w:hAnsi="Wingdings" w:hint="default"/>
+        <w:sz w:val="20"/>
+      </w:rPr>
+    </w:lvl>
+    <w:lvl w:ilvl="8" w:tentative="1">
+      <w:start w:val="1"/>
+      <w:numFmt w:val="bullet"/>
+      <w:lvlText w:val=""/>
+      <w:lvlJc w:val="left"/>
+      <w:pPr>
+        <w:tabs>
+          <w:tab w:val="num" w:pos="6480"/>
+        </w:tabs>
+        <w:ind w:left="6480" w:hanging="360"/>
+      </w:pPr>
+      <w:rPr>
+        <w:rFonts w:ascii="Wingdings" w:hAnsi="Wingdings" w:hint="default"/>
+        <w:sz w:val="20"/>
+      </w:rPr>
+    </w:lvl>
+  </w:abstractNum>
+  <w:abstractNum w:abstractNumId="1" w15:restartNumberingAfterBreak="0">
     <w:nsid w:val="0A9C3667"/>
     <w:multiLevelType w:val="multilevel"/>
     <w:tmpl w:val="7FA2EAAA"/>
@@ -4693,7 +5189,7 @@
       </w:rPr>
     </w:lvl>
   </w:abstractNum>
-  <w:abstractNum w:abstractNumId="1" w15:restartNumberingAfterBreak="0">
+  <w:abstractNum w:abstractNumId="2" w15:restartNumberingAfterBreak="0">
     <w:nsid w:val="13BD5F36"/>
     <w:multiLevelType w:val="multilevel"/>
     <w:tmpl w:val="B0E009CC"/>
@@ -4842,7 +5338,156 @@
       </w:rPr>
     </w:lvl>
   </w:abstractNum>
-  <w:abstractNum w:abstractNumId="2" w15:restartNumberingAfterBreak="0">
+  <w:abstractNum w:abstractNumId="3" w15:restartNumberingAfterBreak="0">
+    <w:nsid w:val="17710F88"/>
+    <w:multiLevelType w:val="multilevel"/>
+    <w:tmpl w:val="2BE2F5F6"/>
+    <w:lvl w:ilvl="0">
+      <w:start w:val="1"/>
+      <w:numFmt w:val="bullet"/>
+      <w:lvlText w:val=""/>
+      <w:lvlJc w:val="left"/>
+      <w:pPr>
+        <w:tabs>
+          <w:tab w:val="num" w:pos="720"/>
+        </w:tabs>
+        <w:ind w:left="720" w:hanging="360"/>
+      </w:pPr>
+      <w:rPr>
+        <w:rFonts w:ascii="Symbol" w:hAnsi="Symbol" w:hint="default"/>
+        <w:sz w:val="20"/>
+      </w:rPr>
+    </w:lvl>
+    <w:lvl w:ilvl="1" w:tentative="1">
+      <w:start w:val="1"/>
+      <w:numFmt w:val="bullet"/>
+      <w:lvlText w:val="o"/>
+      <w:lvlJc w:val="left"/>
+      <w:pPr>
+        <w:tabs>
+          <w:tab w:val="num" w:pos="1440"/>
+        </w:tabs>
+        <w:ind w:left="1440" w:hanging="360"/>
+      </w:pPr>
+      <w:rPr>
+        <w:rFonts w:ascii="Courier New" w:hAnsi="Courier New" w:hint="default"/>
+        <w:sz w:val="20"/>
+      </w:rPr>
+    </w:lvl>
+    <w:lvl w:ilvl="2" w:tentative="1">
+      <w:start w:val="1"/>
+      <w:numFmt w:val="bullet"/>
+      <w:lvlText w:val=""/>
+      <w:lvlJc w:val="left"/>
+      <w:pPr>
+        <w:tabs>
+          <w:tab w:val="num" w:pos="2160"/>
+        </w:tabs>
+        <w:ind w:left="2160" w:hanging="360"/>
+      </w:pPr>
+      <w:rPr>
+        <w:rFonts w:ascii="Wingdings" w:hAnsi="Wingdings" w:hint="default"/>
+        <w:sz w:val="20"/>
+      </w:rPr>
+    </w:lvl>
+    <w:lvl w:ilvl="3" w:tentative="1">
+      <w:start w:val="1"/>
+      <w:numFmt w:val="bullet"/>
+      <w:lvlText w:val=""/>
+      <w:lvlJc w:val="left"/>
+      <w:pPr>
+        <w:tabs>
+          <w:tab w:val="num" w:pos="2880"/>
+        </w:tabs>
+        <w:ind w:left="2880" w:hanging="360"/>
+      </w:pPr>
+      <w:rPr>
+        <w:rFonts w:ascii="Wingdings" w:hAnsi="Wingdings" w:hint="default"/>
+        <w:sz w:val="20"/>
+      </w:rPr>
+    </w:lvl>
+    <w:lvl w:ilvl="4" w:tentative="1">
+      <w:start w:val="1"/>
+      <w:numFmt w:val="bullet"/>
+      <w:lvlText w:val=""/>
+      <w:lvlJc w:val="left"/>
+      <w:pPr>
+        <w:tabs>
+          <w:tab w:val="num" w:pos="3600"/>
+        </w:tabs>
+        <w:ind w:left="3600" w:hanging="360"/>
+      </w:pPr>
+      <w:rPr>
+        <w:rFonts w:ascii="Wingdings" w:hAnsi="Wingdings" w:hint="default"/>
+        <w:sz w:val="20"/>
+      </w:rPr>
+    </w:lvl>
+    <w:lvl w:ilvl="5" w:tentative="1">
+      <w:start w:val="1"/>
+      <w:numFmt w:val="bullet"/>
+      <w:lvlText w:val=""/>
+      <w:lvlJc w:val="left"/>
+      <w:pPr>
+        <w:tabs>
+          <w:tab w:val="num" w:pos="4320"/>
+        </w:tabs>
+        <w:ind w:left="4320" w:hanging="360"/>
+      </w:pPr>
+      <w:rPr>
+        <w:rFonts w:ascii="Wingdings" w:hAnsi="Wingdings" w:hint="default"/>
+        <w:sz w:val="20"/>
+      </w:rPr>
+    </w:lvl>
+    <w:lvl w:ilvl="6" w:tentative="1">
+      <w:start w:val="1"/>
+      <w:numFmt w:val="bullet"/>
+      <w:lvlText w:val=""/>
+      <w:lvlJc w:val="left"/>
+      <w:pPr>
+        <w:tabs>
+          <w:tab w:val="num" w:pos="5040"/>
+        </w:tabs>
+        <w:ind w:left="5040" w:hanging="360"/>
+      </w:pPr>
+      <w:rPr>
+        <w:rFonts w:ascii="Wingdings" w:hAnsi="Wingdings" w:hint="default"/>
+        <w:sz w:val="20"/>
+      </w:rPr>
+    </w:lvl>
+    <w:lvl w:ilvl="7" w:tentative="1">
+      <w:start w:val="1"/>
+      <w:numFmt w:val="bullet"/>
+      <w:lvlText w:val=""/>
+      <w:lvlJc w:val="left"/>
+      <w:pPr>
+        <w:tabs>
+          <w:tab w:val="num" w:pos="5760"/>
+        </w:tabs>
+        <w:ind w:left="5760" w:hanging="360"/>
+      </w:pPr>
+      <w:rPr>
+        <w:rFonts w:ascii="Wingdings" w:hAnsi="Wingdings" w:hint="default"/>
+        <w:sz w:val="20"/>
+      </w:rPr>
+    </w:lvl>
+    <w:lvl w:ilvl="8" w:tentative="1">
+      <w:start w:val="1"/>
+      <w:numFmt w:val="bullet"/>
+      <w:lvlText w:val=""/>
+      <w:lvlJc w:val="left"/>
+      <w:pPr>
+        <w:tabs>
+          <w:tab w:val="num" w:pos="6480"/>
+        </w:tabs>
+        <w:ind w:left="6480" w:hanging="360"/>
+      </w:pPr>
+      <w:rPr>
+        <w:rFonts w:ascii="Wingdings" w:hAnsi="Wingdings" w:hint="default"/>
+        <w:sz w:val="20"/>
+      </w:rPr>
+    </w:lvl>
+  </w:abstractNum>
+  <w:abstractNum w:abstractNumId="4" w15:restartNumberingAfterBreak="0">
     <w:nsid w:val="195C0407"/>
     <w:multiLevelType w:val="multilevel"/>
     <w:tmpl w:val="56FEBE86"/>
@@ -4991,7 +5636,7 @@
       </w:rPr>
     </w:lvl>
   </w:abstractNum>
-  <w:abstractNum w:abstractNumId="3" w15:restartNumberingAfterBreak="0">
+  <w:abstractNum w:abstractNumId="5" w15:restartNumberingAfterBreak="0">
     <w:nsid w:val="22956ADA"/>
     <w:multiLevelType w:val="hybridMultilevel"/>
     <w:tmpl w:val="152EDC48"/>
@@ -5077,7 +5722,7 @@
       </w:pPr>
     </w:lvl>
   </w:abstractNum>
-  <w:abstractNum w:abstractNumId="4" w15:restartNumberingAfterBreak="0">
+  <w:abstractNum w:abstractNumId="6" w15:restartNumberingAfterBreak="0">
     <w:nsid w:val="255B48AE"/>
     <w:multiLevelType w:val="multilevel"/>
     <w:tmpl w:val="106C8210"/>
@@ -5226,7 +5871,156 @@
       </w:rPr>
     </w:lvl>
   </w:abstractNum>
-  <w:abstractNum w:abstractNumId="5" w15:restartNumberingAfterBreak="0">
+  <w:abstractNum w:abstractNumId="7" w15:restartNumberingAfterBreak="0">
+    <w:nsid w:val="28811187"/>
+    <w:multiLevelType w:val="multilevel"/>
+    <w:tmpl w:val="2334D384"/>
+    <w:lvl w:ilvl="0">
+      <w:start w:val="1"/>
+      <w:numFmt w:val="bullet"/>
+      <w:lvlText w:val=""/>
+      <w:lvlJc w:val="left"/>
+      <w:pPr>
+        <w:tabs>
+          <w:tab w:val="num" w:pos="720"/>
+        </w:tabs>
+        <w:ind w:left="720" w:hanging="360"/>
+      </w:pPr>
+      <w:rPr>
+        <w:rFonts w:ascii="Symbol" w:hAnsi="Symbol" w:hint="default"/>
+        <w:sz w:val="20"/>
+      </w:rPr>
+    </w:lvl>
+    <w:lvl w:ilvl="1" w:tentative="1">
+      <w:start w:val="1"/>
+      <w:numFmt w:val="bullet"/>
+      <w:lvlText w:val="o"/>
+      <w:lvlJc w:val="left"/>
+      <w:pPr>
+        <w:tabs>
+          <w:tab w:val="num" w:pos="1440"/>
+        </w:tabs>
+        <w:ind w:left="1440" w:hanging="360"/>
+      </w:pPr>
+      <w:rPr>
+        <w:rFonts w:ascii="Courier New" w:hAnsi="Courier New" w:hint="default"/>
+        <w:sz w:val="20"/>
+      </w:rPr>
+    </w:lvl>
+    <w:lvl w:ilvl="2" w:tentative="1">
+      <w:start w:val="1"/>
+      <w:numFmt w:val="bullet"/>
+      <w:lvlText w:val=""/>
+      <w:lvlJc w:val="left"/>
+      <w:pPr>
+        <w:tabs>
+          <w:tab w:val="num" w:pos="2160"/>
+        </w:tabs>
+        <w:ind w:left="2160" w:hanging="360"/>
+      </w:pPr>
+      <w:rPr>
+        <w:rFonts w:ascii="Wingdings" w:hAnsi="Wingdings" w:hint="default"/>
+        <w:sz w:val="20"/>
+      </w:rPr>
+    </w:lvl>
+    <w:lvl w:ilvl="3" w:tentative="1">
+      <w:start w:val="1"/>
+      <w:numFmt w:val="bullet"/>
+      <w:lvlText w:val=""/>
+      <w:lvlJc w:val="left"/>
+      <w:pPr>
+        <w:tabs>
+          <w:tab w:val="num" w:pos="2880"/>
+        </w:tabs>
+        <w:ind w:left="2880" w:hanging="360"/>
+      </w:pPr>
+      <w:rPr>
+        <w:rFonts w:ascii="Wingdings" w:hAnsi="Wingdings" w:hint="default"/>
+        <w:sz w:val="20"/>
+      </w:rPr>
+    </w:lvl>
+    <w:lvl w:ilvl="4" w:tentative="1">
+      <w:start w:val="1"/>
+      <w:numFmt w:val="bullet"/>
+      <w:lvlText w:val=""/>
+      <w:lvlJc w:val="left"/>
+      <w:pPr>
+        <w:tabs>
+          <w:tab w:val="num" w:pos="3600"/>
+        </w:tabs>
+        <w:ind w:left="3600" w:hanging="360"/>
+      </w:pPr>
+      <w:rPr>
+        <w:rFonts w:ascii="Wingdings" w:hAnsi="Wingdings" w:hint="default"/>
+        <w:sz w:val="20"/>
+      </w:rPr>
+    </w:lvl>
+    <w:lvl w:ilvl="5" w:tentative="1">
+      <w:start w:val="1"/>
+      <w:numFmt w:val="bullet"/>
+      <w:lvlText w:val=""/>
+      <w:lvlJc w:val="left"/>
+      <w:pPr>
+        <w:tabs>
+          <w:tab w:val="num" w:pos="4320"/>
+        </w:tabs>
+        <w:ind w:left="4320" w:hanging="360"/>
+      </w:pPr>
+      <w:rPr>
+        <w:rFonts w:ascii="Wingdings" w:hAnsi="Wingdings" w:hint="default"/>
+        <w:sz w:val="20"/>
+      </w:rPr>
+    </w:lvl>
+    <w:lvl w:ilvl="6" w:tentative="1">
+      <w:start w:val="1"/>
+      <w:numFmt w:val="bullet"/>
+      <w:lvlText w:val=""/>
+      <w:lvlJc w:val="left"/>
+      <w:pPr>
+        <w:tabs>
+          <w:tab w:val="num" w:pos="5040"/>
+        </w:tabs>
+        <w:ind w:left="5040" w:hanging="360"/>
+      </w:pPr>
+      <w:rPr>
+        <w:rFonts w:ascii="Wingdings" w:hAnsi="Wingdings" w:hint="default"/>
+        <w:sz w:val="20"/>
+      </w:rPr>
+    </w:lvl>
+    <w:lvl w:ilvl="7" w:tentative="1">
+      <w:start w:val="1"/>
+      <w:numFmt w:val="bullet"/>
+      <w:lvlText w:val=""/>
+      <w:lvlJc w:val="left"/>
+      <w:pPr>
+        <w:tabs>
+          <w:tab w:val="num" w:pos="5760"/>
+        </w:tabs>
+        <w:ind w:left="5760" w:hanging="360"/>
+      </w:pPr>
+      <w:rPr>
+        <w:rFonts w:ascii="Wingdings" w:hAnsi="Wingdings" w:hint="default"/>
+        <w:sz w:val="20"/>
+      </w:rPr>
+    </w:lvl>
+    <w:lvl w:ilvl="8" w:tentative="1">
+      <w:start w:val="1"/>
+      <w:numFmt w:val="bullet"/>
+      <w:lvlText w:val=""/>
+      <w:lvlJc w:val="left"/>
+      <w:pPr>
+        <w:tabs>
+          <w:tab w:val="num" w:pos="6480"/>
+        </w:tabs>
+        <w:ind w:left="6480" w:hanging="360"/>
+      </w:pPr>
+      <w:rPr>
+        <w:rFonts w:ascii="Wingdings" w:hAnsi="Wingdings" w:hint="default"/>
+        <w:sz w:val="20"/>
+      </w:rPr>
+    </w:lvl>
+  </w:abstractNum>
+  <w:abstractNum w:abstractNumId="8" w15:restartNumberingAfterBreak="0">
     <w:nsid w:val="2A595AD1"/>
     <w:multiLevelType w:val="hybridMultilevel"/>
     <w:tmpl w:val="3C7829DE"/>
@@ -5339,7 +6133,7 @@
       </w:rPr>
     </w:lvl>
   </w:abstractNum>
-  <w:abstractNum w:abstractNumId="6" w15:restartNumberingAfterBreak="0">
+  <w:abstractNum w:abstractNumId="9" w15:restartNumberingAfterBreak="0">
     <w:nsid w:val="2C39406B"/>
     <w:multiLevelType w:val="hybridMultilevel"/>
     <w:tmpl w:val="22FC64EE"/>
@@ -5452,7 +6246,7 @@
       </w:rPr>
     </w:lvl>
   </w:abstractNum>
-  <w:abstractNum w:abstractNumId="7" w15:restartNumberingAfterBreak="0">
+  <w:abstractNum w:abstractNumId="10" w15:restartNumberingAfterBreak="0">
     <w:nsid w:val="2F521F27"/>
     <w:multiLevelType w:val="multilevel"/>
     <w:tmpl w:val="8AAC7FB0"/>
@@ -5601,7 +6395,156 @@
       </w:rPr>
     </w:lvl>
   </w:abstractNum>
-  <w:abstractNum w:abstractNumId="8" w15:restartNumberingAfterBreak="0">
+  <w:abstractNum w:abstractNumId="11" w15:restartNumberingAfterBreak="0">
+    <w:nsid w:val="2FD537C8"/>
+    <w:multiLevelType w:val="multilevel"/>
+    <w:tmpl w:val="50A897B0"/>
+    <w:lvl w:ilvl="0">
+      <w:start w:val="1"/>
+      <w:numFmt w:val="bullet"/>
+      <w:lvlText w:val=""/>
+      <w:lvlJc w:val="left"/>
+      <w:pPr>
+        <w:tabs>
+          <w:tab w:val="num" w:pos="720"/>
+        </w:tabs>
+        <w:ind w:left="720" w:hanging="360"/>
+      </w:pPr>
+      <w:rPr>
+        <w:rFonts w:ascii="Symbol" w:hAnsi="Symbol" w:hint="default"/>
+        <w:sz w:val="20"/>
+      </w:rPr>
+    </w:lvl>
+    <w:lvl w:ilvl="1" w:tentative="1">
+      <w:start w:val="1"/>
+      <w:numFmt w:val="bullet"/>
+      <w:lvlText w:val="o"/>
+      <w:lvlJc w:val="left"/>
+      <w:pPr>
+        <w:tabs>
+          <w:tab w:val="num" w:pos="1440"/>
+        </w:tabs>
+        <w:ind w:left="1440" w:hanging="360"/>
+      </w:pPr>
+      <w:rPr>
+        <w:rFonts w:ascii="Courier New" w:hAnsi="Courier New" w:hint="default"/>
+        <w:sz w:val="20"/>
+      </w:rPr>
+    </w:lvl>
+    <w:lvl w:ilvl="2" w:tentative="1">
+      <w:start w:val="1"/>
+      <w:numFmt w:val="bullet"/>
+      <w:lvlText w:val=""/>
+      <w:lvlJc w:val="left"/>
+      <w:pPr>
+        <w:tabs>
+          <w:tab w:val="num" w:pos="2160"/>
+        </w:tabs>
+        <w:ind w:left="2160" w:hanging="360"/>
+      </w:pPr>
+      <w:rPr>
+        <w:rFonts w:ascii="Wingdings" w:hAnsi="Wingdings" w:hint="default"/>
+        <w:sz w:val="20"/>
+      </w:rPr>
+    </w:lvl>
+    <w:lvl w:ilvl="3" w:tentative="1">
+      <w:start w:val="1"/>
+      <w:numFmt w:val="bullet"/>
+      <w:lvlText w:val=""/>
+      <w:lvlJc w:val="left"/>
+      <w:pPr>
+        <w:tabs>
+          <w:tab w:val="num" w:pos="2880"/>
+        </w:tabs>
+        <w:ind w:left="2880" w:hanging="360"/>
+      </w:pPr>
+      <w:rPr>
+        <w:rFonts w:ascii="Wingdings" w:hAnsi="Wingdings" w:hint="default"/>
+        <w:sz w:val="20"/>
+      </w:rPr>
+    </w:lvl>
+    <w:lvl w:ilvl="4" w:tentative="1">
+      <w:start w:val="1"/>
+      <w:numFmt w:val="bullet"/>
+      <w:lvlText w:val=""/>
+      <w:lvlJc w:val="left"/>
+      <w:pPr>
+        <w:tabs>
+          <w:tab w:val="num" w:pos="3600"/>
+        </w:tabs>
+        <w:ind w:left="3600" w:hanging="360"/>
+      </w:pPr>
+      <w:rPr>
+        <w:rFonts w:ascii="Wingdings" w:hAnsi="Wingdings" w:hint="default"/>
+        <w:sz w:val="20"/>
+      </w:rPr>
+    </w:lvl>
+    <w:lvl w:ilvl="5" w:tentative="1">
+      <w:start w:val="1"/>
+      <w:numFmt w:val="bullet"/>
+      <w:lvlText w:val=""/>
+      <w:lvlJc w:val="left"/>
+      <w:pPr>
+        <w:tabs>
+          <w:tab w:val="num" w:pos="4320"/>
+        </w:tabs>
+        <w:ind w:left="4320" w:hanging="360"/>
+      </w:pPr>
+      <w:rPr>
+        <w:rFonts w:ascii="Wingdings" w:hAnsi="Wingdings" w:hint="default"/>
+        <w:sz w:val="20"/>
+      </w:rPr>
+    </w:lvl>
+    <w:lvl w:ilvl="6" w:tentative="1">
+      <w:start w:val="1"/>
+      <w:numFmt w:val="bullet"/>
+      <w:lvlText w:val=""/>
+      <w:lvlJc w:val="left"/>
+      <w:pPr>
+        <w:tabs>
+          <w:tab w:val="num" w:pos="5040"/>
+        </w:tabs>
+        <w:ind w:left="5040" w:hanging="360"/>
+      </w:pPr>
+      <w:rPr>
+        <w:rFonts w:ascii="Wingdings" w:hAnsi="Wingdings" w:hint="default"/>
+        <w:sz w:val="20"/>
+      </w:rPr>
+    </w:lvl>
+    <w:lvl w:ilvl="7" w:tentative="1">
+      <w:start w:val="1"/>
+      <w:numFmt w:val="bullet"/>
+      <w:lvlText w:val=""/>
+      <w:lvlJc w:val="left"/>
+      <w:pPr>
+        <w:tabs>
+          <w:tab w:val="num" w:pos="5760"/>
+        </w:tabs>
+        <w:ind w:left="5760" w:hanging="360"/>
+      </w:pPr>
+      <w:rPr>
+        <w:rFonts w:ascii="Wingdings" w:hAnsi="Wingdings" w:hint="default"/>
+        <w:sz w:val="20"/>
+      </w:rPr>
+    </w:lvl>
+    <w:lvl w:ilvl="8" w:tentative="1">
+      <w:start w:val="1"/>
+      <w:numFmt w:val="bullet"/>
+      <w:lvlText w:val=""/>
+      <w:lvlJc w:val="left"/>
+      <w:pPr>
+        <w:tabs>
+          <w:tab w:val="num" w:pos="6480"/>
+        </w:tabs>
+        <w:ind w:left="6480" w:hanging="360"/>
+      </w:pPr>
+      <w:rPr>
+        <w:rFonts w:ascii="Wingdings" w:hAnsi="Wingdings" w:hint="default"/>
+        <w:sz w:val="20"/>
+      </w:rPr>
+    </w:lvl>
+  </w:abstractNum>
+  <w:abstractNum w:abstractNumId="12" w15:restartNumberingAfterBreak="0">
     <w:nsid w:val="3717318C"/>
     <w:multiLevelType w:val="multilevel"/>
     <w:tmpl w:val="EDA46B90"/>
@@ -5750,7 +6693,305 @@
       </w:rPr>
     </w:lvl>
   </w:abstractNum>
-  <w:abstractNum w:abstractNumId="9" w15:restartNumberingAfterBreak="0">
+  <w:abstractNum w:abstractNumId="13" w15:restartNumberingAfterBreak="0">
+    <w:nsid w:val="49C55587"/>
+    <w:multiLevelType w:val="multilevel"/>
+    <w:tmpl w:val="D5A6C080"/>
+    <w:lvl w:ilvl="0">
+      <w:start w:val="1"/>
+      <w:numFmt w:val="bullet"/>
+      <w:lvlText w:val=""/>
+      <w:lvlJc w:val="left"/>
+      <w:pPr>
+        <w:tabs>
+          <w:tab w:val="num" w:pos="720"/>
+        </w:tabs>
+        <w:ind w:left="720" w:hanging="360"/>
+      </w:pPr>
+      <w:rPr>
+        <w:rFonts w:ascii="Symbol" w:hAnsi="Symbol" w:hint="default"/>
+        <w:sz w:val="20"/>
+      </w:rPr>
+    </w:lvl>
+    <w:lvl w:ilvl="1" w:tentative="1">
+      <w:start w:val="1"/>
+      <w:numFmt w:val="bullet"/>
+      <w:lvlText w:val="o"/>
+      <w:lvlJc w:val="left"/>
+      <w:pPr>
+        <w:tabs>
+          <w:tab w:val="num" w:pos="1440"/>
+        </w:tabs>
+        <w:ind w:left="1440" w:hanging="360"/>
+      </w:pPr>
+      <w:rPr>
+        <w:rFonts w:ascii="Courier New" w:hAnsi="Courier New" w:hint="default"/>
+        <w:sz w:val="20"/>
+      </w:rPr>
+    </w:lvl>
+    <w:lvl w:ilvl="2" w:tentative="1">
+      <w:start w:val="1"/>
+      <w:numFmt w:val="bullet"/>
+      <w:lvlText w:val=""/>
+      <w:lvlJc w:val="left"/>
+      <w:pPr>
+        <w:tabs>
+          <w:tab w:val="num" w:pos="2160"/>
+        </w:tabs>
+        <w:ind w:left="2160" w:hanging="360"/>
+      </w:pPr>
+      <w:rPr>
+        <w:rFonts w:ascii="Wingdings" w:hAnsi="Wingdings" w:hint="default"/>
+        <w:sz w:val="20"/>
+      </w:rPr>
+    </w:lvl>
+    <w:lvl w:ilvl="3" w:tentative="1">
+      <w:start w:val="1"/>
+      <w:numFmt w:val="bullet"/>
+      <w:lvlText w:val=""/>
+      <w:lvlJc w:val="left"/>
+      <w:pPr>
+        <w:tabs>
+          <w:tab w:val="num" w:pos="2880"/>
+        </w:tabs>
+        <w:ind w:left="2880" w:hanging="360"/>
+      </w:pPr>
+      <w:rPr>
+        <w:rFonts w:ascii="Wingdings" w:hAnsi="Wingdings" w:hint="default"/>
+        <w:sz w:val="20"/>
+      </w:rPr>
+    </w:lvl>
+    <w:lvl w:ilvl="4" w:tentative="1">
+      <w:start w:val="1"/>
+      <w:numFmt w:val="bullet"/>
+      <w:lvlText w:val=""/>
+      <w:lvlJc w:val="left"/>
+      <w:pPr>
+        <w:tabs>
+          <w:tab w:val="num" w:pos="3600"/>
+        </w:tabs>
+        <w:ind w:left="3600" w:hanging="360"/>
+      </w:pPr>
+      <w:rPr>
+        <w:rFonts w:ascii="Wingdings" w:hAnsi="Wingdings" w:hint="default"/>
+        <w:sz w:val="20"/>
+      </w:rPr>
+    </w:lvl>
+    <w:lvl w:ilvl="5" w:tentative="1">
+      <w:start w:val="1"/>
+      <w:numFmt w:val="bullet"/>
+      <w:lvlText w:val=""/>
+      <w:lvlJc w:val="left"/>
+      <w:pPr>
+        <w:tabs>
+          <w:tab w:val="num" w:pos="4320"/>
+        </w:tabs>
+        <w:ind w:left="4320" w:hanging="360"/>
+      </w:pPr>
+      <w:rPr>
+        <w:rFonts w:ascii="Wingdings" w:hAnsi="Wingdings" w:hint="default"/>
+        <w:sz w:val="20"/>
+      </w:rPr>
+    </w:lvl>
+    <w:lvl w:ilvl="6" w:tentative="1">
+      <w:start w:val="1"/>
+      <w:numFmt w:val="bullet"/>
+      <w:lvlText w:val=""/>
+      <w:lvlJc w:val="left"/>
+      <w:pPr>
+        <w:tabs>
+          <w:tab w:val="num" w:pos="5040"/>
+        </w:tabs>
+        <w:ind w:left="5040" w:hanging="360"/>
+      </w:pPr>
+      <w:rPr>
+        <w:rFonts w:ascii="Wingdings" w:hAnsi="Wingdings" w:hint="default"/>
+        <w:sz w:val="20"/>
+      </w:rPr>
+    </w:lvl>
+    <w:lvl w:ilvl="7" w:tentative="1">
+      <w:start w:val="1"/>
+      <w:numFmt w:val="bullet"/>
+      <w:lvlText w:val=""/>
+      <w:lvlJc w:val="left"/>
+      <w:pPr>
+        <w:tabs>
+          <w:tab w:val="num" w:pos="5760"/>
+        </w:tabs>
+        <w:ind w:left="5760" w:hanging="360"/>
+      </w:pPr>
+      <w:rPr>
+        <w:rFonts w:ascii="Wingdings" w:hAnsi="Wingdings" w:hint="default"/>
+        <w:sz w:val="20"/>
+      </w:rPr>
+    </w:lvl>
+    <w:lvl w:ilvl="8" w:tentative="1">
+      <w:start w:val="1"/>
+      <w:numFmt w:val="bullet"/>
+      <w:lvlText w:val=""/>
+      <w:lvlJc w:val="left"/>
+      <w:pPr>
+        <w:tabs>
+          <w:tab w:val="num" w:pos="6480"/>
+        </w:tabs>
+        <w:ind w:left="6480" w:hanging="360"/>
+      </w:pPr>
+      <w:rPr>
+        <w:rFonts w:ascii="Wingdings" w:hAnsi="Wingdings" w:hint="default"/>
+        <w:sz w:val="20"/>
+      </w:rPr>
+    </w:lvl>
+  </w:abstractNum>
+  <w:abstractNum w:abstractNumId="14" w15:restartNumberingAfterBreak="0">
+    <w:nsid w:val="50005FC3"/>
+    <w:multiLevelType w:val="multilevel"/>
+    <w:tmpl w:val="2D020F3A"/>
+    <w:lvl w:ilvl="0">
+      <w:start w:val="1"/>
+      <w:numFmt w:val="bullet"/>
+      <w:lvlText w:val=""/>
+      <w:lvlJc w:val="left"/>
+      <w:pPr>
+        <w:tabs>
+          <w:tab w:val="num" w:pos="720"/>
+        </w:tabs>
+        <w:ind w:left="720" w:hanging="360"/>
+      </w:pPr>
+      <w:rPr>
+        <w:rFonts w:ascii="Symbol" w:hAnsi="Symbol" w:hint="default"/>
+        <w:sz w:val="20"/>
+      </w:rPr>
+    </w:lvl>
+    <w:lvl w:ilvl="1" w:tentative="1">
+      <w:start w:val="1"/>
+      <w:numFmt w:val="bullet"/>
+      <w:lvlText w:val="o"/>
+      <w:lvlJc w:val="left"/>
+      <w:pPr>
+        <w:tabs>
+          <w:tab w:val="num" w:pos="1440"/>
+        </w:tabs>
+        <w:ind w:left="1440" w:hanging="360"/>
+      </w:pPr>
+      <w:rPr>
+        <w:rFonts w:ascii="Courier New" w:hAnsi="Courier New" w:hint="default"/>
+        <w:sz w:val="20"/>
+      </w:rPr>
+    </w:lvl>
+    <w:lvl w:ilvl="2" w:tentative="1">
+      <w:start w:val="1"/>
+      <w:numFmt w:val="bullet"/>
+      <w:lvlText w:val=""/>
+      <w:lvlJc w:val="left"/>
+      <w:pPr>
+        <w:tabs>
+          <w:tab w:val="num" w:pos="2160"/>
+        </w:tabs>
+        <w:ind w:left="2160" w:hanging="360"/>
+      </w:pPr>
+      <w:rPr>
+        <w:rFonts w:ascii="Wingdings" w:hAnsi="Wingdings" w:hint="default"/>
+        <w:sz w:val="20"/>
+      </w:rPr>
+    </w:lvl>
+    <w:lvl w:ilvl="3" w:tentative="1">
+      <w:start w:val="1"/>
+      <w:numFmt w:val="bullet"/>
+      <w:lvlText w:val=""/>
+      <w:lvlJc w:val="left"/>
+      <w:pPr>
+        <w:tabs>
+          <w:tab w:val="num" w:pos="2880"/>
+        </w:tabs>
+        <w:ind w:left="2880" w:hanging="360"/>
+      </w:pPr>
+      <w:rPr>
+        <w:rFonts w:ascii="Wingdings" w:hAnsi="Wingdings" w:hint="default"/>
+        <w:sz w:val="20"/>
+      </w:rPr>
+    </w:lvl>
+    <w:lvl w:ilvl="4" w:tentative="1">
+      <w:start w:val="1"/>
+      <w:numFmt w:val="bullet"/>
+      <w:lvlText w:val=""/>
+      <w:lvlJc w:val="left"/>
+      <w:pPr>
+        <w:tabs>
+          <w:tab w:val="num" w:pos="3600"/>
+        </w:tabs>
+        <w:ind w:left="3600" w:hanging="360"/>
+      </w:pPr>
+      <w:rPr>
+        <w:rFonts w:ascii="Wingdings" w:hAnsi="Wingdings" w:hint="default"/>
+        <w:sz w:val="20"/>
+      </w:rPr>
+    </w:lvl>
+    <w:lvl w:ilvl="5" w:tentative="1">
+      <w:start w:val="1"/>
+      <w:numFmt w:val="bullet"/>
+      <w:lvlText w:val=""/>
+      <w:lvlJc w:val="left"/>
+      <w:pPr>
+        <w:tabs>
+          <w:tab w:val="num" w:pos="4320"/>
+        </w:tabs>
+        <w:ind w:left="4320" w:hanging="360"/>
+      </w:pPr>
+      <w:rPr>
+        <w:rFonts w:ascii="Wingdings" w:hAnsi="Wingdings" w:hint="default"/>
+        <w:sz w:val="20"/>
+      </w:rPr>
+    </w:lvl>
+    <w:lvl w:ilvl="6" w:tentative="1">
+      <w:start w:val="1"/>
+      <w:numFmt w:val="bullet"/>
+      <w:lvlText w:val=""/>
+      <w:lvlJc w:val="left"/>
+      <w:pPr>
+        <w:tabs>
+          <w:tab w:val="num" w:pos="5040"/>
+        </w:tabs>
+        <w:ind w:left="5040" w:hanging="360"/>
+      </w:pPr>
+      <w:rPr>
+        <w:rFonts w:ascii="Wingdings" w:hAnsi="Wingdings" w:hint="default"/>
+        <w:sz w:val="20"/>
+      </w:rPr>
+    </w:lvl>
+    <w:lvl w:ilvl="7" w:tentative="1">
+      <w:start w:val="1"/>
+      <w:numFmt w:val="bullet"/>
+      <w:lvlText w:val=""/>
+      <w:lvlJc w:val="left"/>
+      <w:pPr>
+        <w:tabs>
+          <w:tab w:val="num" w:pos="5760"/>
+        </w:tabs>
+        <w:ind w:left="5760" w:hanging="360"/>
+      </w:pPr>
+      <w:rPr>
+        <w:rFonts w:ascii="Wingdings" w:hAnsi="Wingdings" w:hint="default"/>
+        <w:sz w:val="20"/>
+      </w:rPr>
+    </w:lvl>
+    <w:lvl w:ilvl="8" w:tentative="1">
+      <w:start w:val="1"/>
+      <w:numFmt w:val="bullet"/>
+      <w:lvlText w:val=""/>
+      <w:lvlJc w:val="left"/>
+      <w:pPr>
+        <w:tabs>
+          <w:tab w:val="num" w:pos="6480"/>
+        </w:tabs>
+        <w:ind w:left="6480" w:hanging="360"/>
+      </w:pPr>
+      <w:rPr>
+        <w:rFonts w:ascii="Wingdings" w:hAnsi="Wingdings" w:hint="default"/>
+        <w:sz w:val="20"/>
+      </w:rPr>
+    </w:lvl>
+  </w:abstractNum>
+  <w:abstractNum w:abstractNumId="15" w15:restartNumberingAfterBreak="0">
     <w:nsid w:val="51D93193"/>
     <w:multiLevelType w:val="multilevel"/>
     <w:tmpl w:val="42A62AE0"/>
@@ -5899,7 +7140,7 @@
       </w:rPr>
     </w:lvl>
   </w:abstractNum>
-  <w:abstractNum w:abstractNumId="10" w15:restartNumberingAfterBreak="0">
+  <w:abstractNum w:abstractNumId="16" w15:restartNumberingAfterBreak="0">
     <w:nsid w:val="53FD5395"/>
     <w:multiLevelType w:val="hybridMultilevel"/>
     <w:tmpl w:val="6DB679FC"/>
@@ -5989,7 +7230,7 @@
       </w:pPr>
     </w:lvl>
   </w:abstractNum>
-  <w:abstractNum w:abstractNumId="11" w15:restartNumberingAfterBreak="0">
+  <w:abstractNum w:abstractNumId="17" w15:restartNumberingAfterBreak="0">
     <w:nsid w:val="59FD1723"/>
     <w:multiLevelType w:val="hybridMultilevel"/>
     <w:tmpl w:val="8990CF0E"/>
@@ -6129,7 +7370,7 @@
       </w:rPr>
     </w:lvl>
   </w:abstractNum>
-  <w:abstractNum w:abstractNumId="12" w15:restartNumberingAfterBreak="0">
+  <w:abstractNum w:abstractNumId="18" w15:restartNumberingAfterBreak="0">
     <w:nsid w:val="5DF9585A"/>
     <w:multiLevelType w:val="hybridMultilevel"/>
     <w:tmpl w:val="9E2EF62C"/>
@@ -6242,7 +7483,156 @@
       </w:rPr>
     </w:lvl>
   </w:abstractNum>
-  <w:abstractNum w:abstractNumId="13" w15:restartNumberingAfterBreak="0">
+  <w:abstractNum w:abstractNumId="19" w15:restartNumberingAfterBreak="0">
+    <w:nsid w:val="62E06CD4"/>
+    <w:multiLevelType w:val="multilevel"/>
+    <w:tmpl w:val="BC744DD2"/>
+    <w:lvl w:ilvl="0">
+      <w:start w:val="1"/>
+      <w:numFmt w:val="bullet"/>
+      <w:lvlText w:val=""/>
+      <w:lvlJc w:val="left"/>
+      <w:pPr>
+        <w:tabs>
+          <w:tab w:val="num" w:pos="720"/>
+        </w:tabs>
+        <w:ind w:left="720" w:hanging="360"/>
+      </w:pPr>
+      <w:rPr>
+        <w:rFonts w:ascii="Symbol" w:hAnsi="Symbol" w:hint="default"/>
+        <w:sz w:val="20"/>
+      </w:rPr>
+    </w:lvl>
+    <w:lvl w:ilvl="1" w:tentative="1">
+      <w:start w:val="1"/>
+      <w:numFmt w:val="bullet"/>
+      <w:lvlText w:val="o"/>
+      <w:lvlJc w:val="left"/>
+      <w:pPr>
+        <w:tabs>
+          <w:tab w:val="num" w:pos="1440"/>
+        </w:tabs>
+        <w:ind w:left="1440" w:hanging="360"/>
+      </w:pPr>
+      <w:rPr>
+        <w:rFonts w:ascii="Courier New" w:hAnsi="Courier New" w:hint="default"/>
+        <w:sz w:val="20"/>
+      </w:rPr>
+    </w:lvl>
+    <w:lvl w:ilvl="2" w:tentative="1">
+      <w:start w:val="1"/>
+      <w:numFmt w:val="bullet"/>
+      <w:lvlText w:val=""/>
+      <w:lvlJc w:val="left"/>
+      <w:pPr>
+        <w:tabs>
+          <w:tab w:val="num" w:pos="2160"/>
+        </w:tabs>
+        <w:ind w:left="2160" w:hanging="360"/>
+      </w:pPr>
+      <w:rPr>
+        <w:rFonts w:ascii="Wingdings" w:hAnsi="Wingdings" w:hint="default"/>
+        <w:sz w:val="20"/>
+      </w:rPr>
+    </w:lvl>
+    <w:lvl w:ilvl="3" w:tentative="1">
+      <w:start w:val="1"/>
+      <w:numFmt w:val="bullet"/>
+      <w:lvlText w:val=""/>
+      <w:lvlJc w:val="left"/>
+      <w:pPr>
+        <w:tabs>
+          <w:tab w:val="num" w:pos="2880"/>
+        </w:tabs>
+        <w:ind w:left="2880" w:hanging="360"/>
+      </w:pPr>
+      <w:rPr>
+        <w:rFonts w:ascii="Wingdings" w:hAnsi="Wingdings" w:hint="default"/>
+        <w:sz w:val="20"/>
+      </w:rPr>
+    </w:lvl>
+    <w:lvl w:ilvl="4" w:tentative="1">
+      <w:start w:val="1"/>
+      <w:numFmt w:val="bullet"/>
+      <w:lvlText w:val=""/>
+      <w:lvlJc w:val="left"/>
+      <w:pPr>
+        <w:tabs>
+          <w:tab w:val="num" w:pos="3600"/>
+        </w:tabs>
+        <w:ind w:left="3600" w:hanging="360"/>
+      </w:pPr>
+      <w:rPr>
+        <w:rFonts w:ascii="Wingdings" w:hAnsi="Wingdings" w:hint="default"/>
+        <w:sz w:val="20"/>
+      </w:rPr>
+    </w:lvl>
+    <w:lvl w:ilvl="5" w:tentative="1">
+      <w:start w:val="1"/>
+      <w:numFmt w:val="bullet"/>
+      <w:lvlText w:val=""/>
+      <w:lvlJc w:val="left"/>
+      <w:pPr>
+        <w:tabs>
+          <w:tab w:val="num" w:pos="4320"/>
+        </w:tabs>
+        <w:ind w:left="4320" w:hanging="360"/>
+      </w:pPr>
+      <w:rPr>
+        <w:rFonts w:ascii="Wingdings" w:hAnsi="Wingdings" w:hint="default"/>
+        <w:sz w:val="20"/>
+      </w:rPr>
+    </w:lvl>
+    <w:lvl w:ilvl="6" w:tentative="1">
+      <w:start w:val="1"/>
+      <w:numFmt w:val="bullet"/>
+      <w:lvlText w:val=""/>
+      <w:lvlJc w:val="left"/>
+      <w:pPr>
+        <w:tabs>
+          <w:tab w:val="num" w:pos="5040"/>
+        </w:tabs>
+        <w:ind w:left="5040" w:hanging="360"/>
+      </w:pPr>
+      <w:rPr>
+        <w:rFonts w:ascii="Wingdings" w:hAnsi="Wingdings" w:hint="default"/>
+        <w:sz w:val="20"/>
+      </w:rPr>
+    </w:lvl>
+    <w:lvl w:ilvl="7" w:tentative="1">
+      <w:start w:val="1"/>
+      <w:numFmt w:val="bullet"/>
+      <w:lvlText w:val=""/>
+      <w:lvlJc w:val="left"/>
+      <w:pPr>
+        <w:tabs>
+          <w:tab w:val="num" w:pos="5760"/>
+        </w:tabs>
+        <w:ind w:left="5760" w:hanging="360"/>
+      </w:pPr>
+      <w:rPr>
+        <w:rFonts w:ascii="Wingdings" w:hAnsi="Wingdings" w:hint="default"/>
+        <w:sz w:val="20"/>
+      </w:rPr>
+    </w:lvl>
+    <w:lvl w:ilvl="8" w:tentative="1">
+      <w:start w:val="1"/>
+      <w:numFmt w:val="bullet"/>
+      <w:lvlText w:val=""/>
+      <w:lvlJc w:val="left"/>
+      <w:pPr>
+        <w:tabs>
+          <w:tab w:val="num" w:pos="6480"/>
+        </w:tabs>
+        <w:ind w:left="6480" w:hanging="360"/>
+      </w:pPr>
+      <w:rPr>
+        <w:rFonts w:ascii="Wingdings" w:hAnsi="Wingdings" w:hint="default"/>
+        <w:sz w:val="20"/>
+      </w:rPr>
+    </w:lvl>
+  </w:abstractNum>
+  <w:abstractNum w:abstractNumId="20" w15:restartNumberingAfterBreak="0">
     <w:nsid w:val="664646E2"/>
     <w:multiLevelType w:val="hybridMultilevel"/>
     <w:tmpl w:val="96EAF268"/>
@@ -6331,7 +7721,305 @@
       </w:pPr>
     </w:lvl>
   </w:abstractNum>
-  <w:abstractNum w:abstractNumId="14" w15:restartNumberingAfterBreak="0">
+  <w:abstractNum w:abstractNumId="21" w15:restartNumberingAfterBreak="0">
+    <w:nsid w:val="6B5D0B43"/>
+    <w:multiLevelType w:val="multilevel"/>
+    <w:tmpl w:val="78306F24"/>
+    <w:lvl w:ilvl="0">
+      <w:start w:val="1"/>
+      <w:numFmt w:val="bullet"/>
+      <w:lvlText w:val=""/>
+      <w:lvlJc w:val="left"/>
+      <w:pPr>
+        <w:tabs>
+          <w:tab w:val="num" w:pos="720"/>
+        </w:tabs>
+        <w:ind w:left="720" w:hanging="360"/>
+      </w:pPr>
+      <w:rPr>
+        <w:rFonts w:ascii="Symbol" w:hAnsi="Symbol" w:hint="default"/>
+        <w:sz w:val="20"/>
+      </w:rPr>
+    </w:lvl>
+    <w:lvl w:ilvl="1" w:tentative="1">
+      <w:start w:val="1"/>
+      <w:numFmt w:val="bullet"/>
+      <w:lvlText w:val="o"/>
+      <w:lvlJc w:val="left"/>
+      <w:pPr>
+        <w:tabs>
+          <w:tab w:val="num" w:pos="1440"/>
+        </w:tabs>
+        <w:ind w:left="1440" w:hanging="360"/>
+      </w:pPr>
+      <w:rPr>
+        <w:rFonts w:ascii="Courier New" w:hAnsi="Courier New" w:hint="default"/>
+        <w:sz w:val="20"/>
+      </w:rPr>
+    </w:lvl>
+    <w:lvl w:ilvl="2" w:tentative="1">
+      <w:start w:val="1"/>
+      <w:numFmt w:val="bullet"/>
+      <w:lvlText w:val=""/>
+      <w:lvlJc w:val="left"/>
+      <w:pPr>
+        <w:tabs>
+          <w:tab w:val="num" w:pos="2160"/>
+        </w:tabs>
+        <w:ind w:left="2160" w:hanging="360"/>
+      </w:pPr>
+      <w:rPr>
+        <w:rFonts w:ascii="Wingdings" w:hAnsi="Wingdings" w:hint="default"/>
+        <w:sz w:val="20"/>
+      </w:rPr>
+    </w:lvl>
+    <w:lvl w:ilvl="3" w:tentative="1">
+      <w:start w:val="1"/>
+      <w:numFmt w:val="bullet"/>
+      <w:lvlText w:val=""/>
+      <w:lvlJc w:val="left"/>
+      <w:pPr>
+        <w:tabs>
+          <w:tab w:val="num" w:pos="2880"/>
+        </w:tabs>
+        <w:ind w:left="2880" w:hanging="360"/>
+      </w:pPr>
+      <w:rPr>
+        <w:rFonts w:ascii="Wingdings" w:hAnsi="Wingdings" w:hint="default"/>
+        <w:sz w:val="20"/>
+      </w:rPr>
+    </w:lvl>
+    <w:lvl w:ilvl="4" w:tentative="1">
+      <w:start w:val="1"/>
+      <w:numFmt w:val="bullet"/>
+      <w:lvlText w:val=""/>
+      <w:lvlJc w:val="left"/>
+      <w:pPr>
+        <w:tabs>
+          <w:tab w:val="num" w:pos="3600"/>
+        </w:tabs>
+        <w:ind w:left="3600" w:hanging="360"/>
+      </w:pPr>
+      <w:rPr>
+        <w:rFonts w:ascii="Wingdings" w:hAnsi="Wingdings" w:hint="default"/>
+        <w:sz w:val="20"/>
+      </w:rPr>
+    </w:lvl>
+    <w:lvl w:ilvl="5" w:tentative="1">
+      <w:start w:val="1"/>
+      <w:numFmt w:val="bullet"/>
+      <w:lvlText w:val=""/>
+      <w:lvlJc w:val="left"/>
+      <w:pPr>
+        <w:tabs>
+          <w:tab w:val="num" w:pos="4320"/>
+        </w:tabs>
+        <w:ind w:left="4320" w:hanging="360"/>
+      </w:pPr>
+      <w:rPr>
+        <w:rFonts w:ascii="Wingdings" w:hAnsi="Wingdings" w:hint="default"/>
+        <w:sz w:val="20"/>
+      </w:rPr>
+    </w:lvl>
+    <w:lvl w:ilvl="6" w:tentative="1">
+      <w:start w:val="1"/>
+      <w:numFmt w:val="bullet"/>
+      <w:lvlText w:val=""/>
+      <w:lvlJc w:val="left"/>
+      <w:pPr>
+        <w:tabs>
+          <w:tab w:val="num" w:pos="5040"/>
+        </w:tabs>
+        <w:ind w:left="5040" w:hanging="360"/>
+      </w:pPr>
+      <w:rPr>
+        <w:rFonts w:ascii="Wingdings" w:hAnsi="Wingdings" w:hint="default"/>
+        <w:sz w:val="20"/>
+      </w:rPr>
+    </w:lvl>
+    <w:lvl w:ilvl="7" w:tentative="1">
+      <w:start w:val="1"/>
+      <w:numFmt w:val="bullet"/>
+      <w:lvlText w:val=""/>
+      <w:lvlJc w:val="left"/>
+      <w:pPr>
+        <w:tabs>
+          <w:tab w:val="num" w:pos="5760"/>
+        </w:tabs>
+        <w:ind w:left="5760" w:hanging="360"/>
+      </w:pPr>
+      <w:rPr>
+        <w:rFonts w:ascii="Wingdings" w:hAnsi="Wingdings" w:hint="default"/>
+        <w:sz w:val="20"/>
+      </w:rPr>
+    </w:lvl>
+    <w:lvl w:ilvl="8" w:tentative="1">
+      <w:start w:val="1"/>
+      <w:numFmt w:val="bullet"/>
+      <w:lvlText w:val=""/>
+      <w:lvlJc w:val="left"/>
+      <w:pPr>
+        <w:tabs>
+          <w:tab w:val="num" w:pos="6480"/>
+        </w:tabs>
+        <w:ind w:left="6480" w:hanging="360"/>
+      </w:pPr>
+      <w:rPr>
+        <w:rFonts w:ascii="Wingdings" w:hAnsi="Wingdings" w:hint="default"/>
+        <w:sz w:val="20"/>
+      </w:rPr>
+    </w:lvl>
+  </w:abstractNum>
+  <w:abstractNum w:abstractNumId="22" w15:restartNumberingAfterBreak="0">
+    <w:nsid w:val="6BCC3DFC"/>
+    <w:multiLevelType w:val="multilevel"/>
+    <w:tmpl w:val="5C04A06A"/>
+    <w:lvl w:ilvl="0">
+      <w:start w:val="1"/>
+      <w:numFmt w:val="bullet"/>
+      <w:lvlText w:val=""/>
+      <w:lvlJc w:val="left"/>
+      <w:pPr>
+        <w:tabs>
+          <w:tab w:val="num" w:pos="720"/>
+        </w:tabs>
+        <w:ind w:left="720" w:hanging="360"/>
+      </w:pPr>
+      <w:rPr>
+        <w:rFonts w:ascii="Symbol" w:hAnsi="Symbol" w:hint="default"/>
+        <w:sz w:val="20"/>
+      </w:rPr>
+    </w:lvl>
+    <w:lvl w:ilvl="1" w:tentative="1">
+      <w:start w:val="1"/>
+      <w:numFmt w:val="bullet"/>
+      <w:lvlText w:val="o"/>
+      <w:lvlJc w:val="left"/>
+      <w:pPr>
+        <w:tabs>
+          <w:tab w:val="num" w:pos="1440"/>
+        </w:tabs>
+        <w:ind w:left="1440" w:hanging="360"/>
+      </w:pPr>
+      <w:rPr>
+        <w:rFonts w:ascii="Courier New" w:hAnsi="Courier New" w:hint="default"/>
+        <w:sz w:val="20"/>
+      </w:rPr>
+    </w:lvl>
+    <w:lvl w:ilvl="2" w:tentative="1">
+      <w:start w:val="1"/>
+      <w:numFmt w:val="bullet"/>
+      <w:lvlText w:val=""/>
+      <w:lvlJc w:val="left"/>
+      <w:pPr>
+        <w:tabs>
+          <w:tab w:val="num" w:pos="2160"/>
+        </w:tabs>
+        <w:ind w:left="2160" w:hanging="360"/>
+      </w:pPr>
+      <w:rPr>
+        <w:rFonts w:ascii="Wingdings" w:hAnsi="Wingdings" w:hint="default"/>
+        <w:sz w:val="20"/>
+      </w:rPr>
+    </w:lvl>
+    <w:lvl w:ilvl="3" w:tentative="1">
+      <w:start w:val="1"/>
+      <w:numFmt w:val="bullet"/>
+      <w:lvlText w:val=""/>
+      <w:lvlJc w:val="left"/>
+      <w:pPr>
+        <w:tabs>
+          <w:tab w:val="num" w:pos="2880"/>
+        </w:tabs>
+        <w:ind w:left="2880" w:hanging="360"/>
+      </w:pPr>
+      <w:rPr>
+        <w:rFonts w:ascii="Wingdings" w:hAnsi="Wingdings" w:hint="default"/>
+        <w:sz w:val="20"/>
+      </w:rPr>
+    </w:lvl>
+    <w:lvl w:ilvl="4" w:tentative="1">
+      <w:start w:val="1"/>
+      <w:numFmt w:val="bullet"/>
+      <w:lvlText w:val=""/>
+      <w:lvlJc w:val="left"/>
+      <w:pPr>
+        <w:tabs>
+          <w:tab w:val="num" w:pos="3600"/>
+        </w:tabs>
+        <w:ind w:left="3600" w:hanging="360"/>
+      </w:pPr>
+      <w:rPr>
+        <w:rFonts w:ascii="Wingdings" w:hAnsi="Wingdings" w:hint="default"/>
+        <w:sz w:val="20"/>
+      </w:rPr>
+    </w:lvl>
+    <w:lvl w:ilvl="5" w:tentative="1">
+      <w:start w:val="1"/>
+      <w:numFmt w:val="bullet"/>
+      <w:lvlText w:val=""/>
+      <w:lvlJc w:val="left"/>
+      <w:pPr>
+        <w:tabs>
+          <w:tab w:val="num" w:pos="4320"/>
+        </w:tabs>
+        <w:ind w:left="4320" w:hanging="360"/>
+      </w:pPr>
+      <w:rPr>
+        <w:rFonts w:ascii="Wingdings" w:hAnsi="Wingdings" w:hint="default"/>
+        <w:sz w:val="20"/>
+      </w:rPr>
+    </w:lvl>
+    <w:lvl w:ilvl="6" w:tentative="1">
+      <w:start w:val="1"/>
+      <w:numFmt w:val="bullet"/>
+      <w:lvlText w:val=""/>
+      <w:lvlJc w:val="left"/>
+      <w:pPr>
+        <w:tabs>
+          <w:tab w:val="num" w:pos="5040"/>
+        </w:tabs>
+        <w:ind w:left="5040" w:hanging="360"/>
+      </w:pPr>
+      <w:rPr>
+        <w:rFonts w:ascii="Wingdings" w:hAnsi="Wingdings" w:hint="default"/>
+        <w:sz w:val="20"/>
+      </w:rPr>
+    </w:lvl>
+    <w:lvl w:ilvl="7" w:tentative="1">
+      <w:start w:val="1"/>
+      <w:numFmt w:val="bullet"/>
+      <w:lvlText w:val=""/>
+      <w:lvlJc w:val="left"/>
+      <w:pPr>
+        <w:tabs>
+          <w:tab w:val="num" w:pos="5760"/>
+        </w:tabs>
+        <w:ind w:left="5760" w:hanging="360"/>
+      </w:pPr>
+      <w:rPr>
+        <w:rFonts w:ascii="Wingdings" w:hAnsi="Wingdings" w:hint="default"/>
+        <w:sz w:val="20"/>
+      </w:rPr>
+    </w:lvl>
+    <w:lvl w:ilvl="8" w:tentative="1">
+      <w:start w:val="1"/>
+      <w:numFmt w:val="bullet"/>
+      <w:lvlText w:val=""/>
+      <w:lvlJc w:val="left"/>
+      <w:pPr>
+        <w:tabs>
+          <w:tab w:val="num" w:pos="6480"/>
+        </w:tabs>
+        <w:ind w:left="6480" w:hanging="360"/>
+      </w:pPr>
+      <w:rPr>
+        <w:rFonts w:ascii="Wingdings" w:hAnsi="Wingdings" w:hint="default"/>
+        <w:sz w:val="20"/>
+      </w:rPr>
+    </w:lvl>
+  </w:abstractNum>
+  <w:abstractNum w:abstractNumId="23" w15:restartNumberingAfterBreak="0">
     <w:nsid w:val="79BF5A33"/>
     <w:multiLevelType w:val="hybridMultilevel"/>
     <w:tmpl w:val="F466ABF6"/>
@@ -6420,7 +8108,7 @@
       </w:pPr>
     </w:lvl>
   </w:abstractNum>
-  <w:abstractNum w:abstractNumId="15" w15:restartNumberingAfterBreak="0">
+  <w:abstractNum w:abstractNumId="24" w15:restartNumberingAfterBreak="0">
     <w:nsid w:val="7B763A57"/>
     <w:multiLevelType w:val="multilevel"/>
     <w:tmpl w:val="99083A42"/>
@@ -6570,52 +8258,79 @@
     </w:lvl>
   </w:abstractNum>
   <w:num w:numId="1">
+    <w:abstractNumId w:val="23"/>
+  </w:num>
+  <w:num w:numId="2">
+    <w:abstractNumId w:val="9"/>
+  </w:num>
+  <w:num w:numId="3">
+    <w:abstractNumId w:val="17"/>
+  </w:num>
+  <w:num w:numId="4">
+    <w:abstractNumId w:val="20"/>
+  </w:num>
+  <w:num w:numId="5">
+    <w:abstractNumId w:val="16"/>
+  </w:num>
+  <w:num w:numId="6">
+    <w:abstractNumId w:val="5"/>
+  </w:num>
+  <w:num w:numId="7">
+    <w:abstractNumId w:val="8"/>
+  </w:num>
+  <w:num w:numId="8">
+    <w:abstractNumId w:val="18"/>
+  </w:num>
+  <w:num w:numId="9">
+    <w:abstractNumId w:val="15"/>
+  </w:num>
+  <w:num w:numId="10">
+    <w:abstractNumId w:val="10"/>
+  </w:num>
+  <w:num w:numId="11">
+    <w:abstractNumId w:val="1"/>
+  </w:num>
+  <w:num w:numId="12">
+    <w:abstractNumId w:val="2"/>
+  </w:num>
+  <w:num w:numId="13">
+    <w:abstractNumId w:val="6"/>
+  </w:num>
+  <w:num w:numId="14">
+    <w:abstractNumId w:val="4"/>
+  </w:num>
+  <w:num w:numId="15">
+    <w:abstractNumId w:val="12"/>
+  </w:num>
+  <w:num w:numId="16">
+    <w:abstractNumId w:val="24"/>
+  </w:num>
+  <w:num w:numId="17">
+    <w:abstractNumId w:val="7"/>
+  </w:num>
+  <w:num w:numId="18">
+    <w:abstractNumId w:val="21"/>
+  </w:num>
+  <w:num w:numId="19">
+    <w:abstractNumId w:val="19"/>
+  </w:num>
+  <w:num w:numId="20">
+    <w:abstractNumId w:val="22"/>
+  </w:num>
+  <w:num w:numId="21">
+    <w:abstractNumId w:val="0"/>
+  </w:num>
+  <w:num w:numId="22">
+    <w:abstractNumId w:val="3"/>
+  </w:num>
+  <w:num w:numId="23">
+    <w:abstractNumId w:val="11"/>
+  </w:num>
+  <w:num w:numId="24">
     <w:abstractNumId w:val="14"/>
   </w:num>
-  <w:num w:numId="2">
-    <w:abstractNumId w:val="6"/>
-  </w:num>
-  <w:num w:numId="3">
-    <w:abstractNumId w:val="11"/>
-  </w:num>
-  <w:num w:numId="4">
+  <w:num w:numId="25">
     <w:abstractNumId w:val="13"/>
-  </w:num>
-  <w:num w:numId="5">
-    <w:abstractNumId w:val="10"/>
-  </w:num>
-  <w:num w:numId="6">
-    <w:abstractNumId w:val="3"/>
-  </w:num>
-  <w:num w:numId="7">
-    <w:abstractNumId w:val="5"/>
-  </w:num>
-  <w:num w:numId="8">
-    <w:abstractNumId w:val="12"/>
-  </w:num>
-  <w:num w:numId="9">
-    <w:abstractNumId w:val="9"/>
-  </w:num>
-  <w:num w:numId="10">
-    <w:abstractNumId w:val="7"/>
-  </w:num>
-  <w:num w:numId="11">
-    <w:abstractNumId w:val="0"/>
-  </w:num>
-  <w:num w:numId="12">
-    <w:abstractNumId w:val="1"/>
-  </w:num>
-  <w:num w:numId="13">
-    <w:abstractNumId w:val="4"/>
-  </w:num>
-  <w:num w:numId="14">
-    <w:abstractNumId w:val="2"/>
-  </w:num>
-  <w:num w:numId="15">
-    <w:abstractNumId w:val="8"/>
-  </w:num>
-  <w:num w:numId="16">
-    <w:abstractNumId w:val="15"/>
   </w:num>
 </w:numbering>
 </file>

</xml_diff>

<commit_message>
thêm yc chức năng và phi chức năng
</commit_message>
<xml_diff>
--- a/doc/01-HoVanKhanh.docx
+++ b/doc/01-HoVanKhanh.docx
@@ -1690,6 +1690,7 @@
       <w:r>
         <w:rPr>
           <w:rFonts w:ascii="Times New Roman" w:eastAsia="Times New Roman" w:hAnsi="Times New Roman" w:cs="Times New Roman"/>
+          <w:noProof/>
           <w:color w:val="1F1F1F"/>
           <w:sz w:val="26"/>
           <w:szCs w:val="26"/>
@@ -3194,8 +3195,1044 @@
           <w:b/>
           <w:sz w:val="26"/>
           <w:szCs w:val="26"/>
-        </w:rPr>
-      </w:pPr>
+          <w:lang w:val="vi-VN"/>
+        </w:rPr>
+      </w:pPr>
+      <w:r>
+        <w:rPr>
+          <w:rFonts w:ascii="Times New Roman" w:hAnsi="Times New Roman" w:cs="Times New Roman"/>
+          <w:b/>
+          <w:sz w:val="26"/>
+          <w:szCs w:val="26"/>
+          <w:lang w:val="vi-VN"/>
+        </w:rPr>
+        <w:t>a) Yêu cầu chức năng</w:t>
+      </w:r>
+    </w:p>
+    <w:p>
+      <w:pPr>
+        <w:spacing w:after="0" w:line="240" w:lineRule="auto"/>
+        <w:rPr>
+          <w:rFonts w:ascii="Times New Roman" w:eastAsia="Times New Roman" w:hAnsi="Times New Roman" w:cs="Times New Roman"/>
+          <w:color w:val="1F1F1F"/>
+          <w:sz w:val="26"/>
+          <w:szCs w:val="26"/>
+          <w:lang w:val="vi-VN" w:eastAsia="vi-VN"/>
+        </w:rPr>
+      </w:pPr>
+      <w:r>
+        <w:rPr>
+          <w:rFonts w:ascii="Times New Roman" w:eastAsia="Times New Roman" w:hAnsi="Times New Roman" w:cs="Times New Roman"/>
+          <w:b/>
+          <w:bCs/>
+          <w:color w:val="1F1F1F"/>
+          <w:sz w:val="26"/>
+          <w:szCs w:val="26"/>
+          <w:bdr w:val="none" w:sz="0" w:space="0" w:color="auto" w:frame="1"/>
+          <w:lang w:val="vi-VN" w:eastAsia="vi-VN"/>
+        </w:rPr>
+        <w:t>5. Phân tích yêu cầu</w:t>
+      </w:r>
+    </w:p>
+    <w:p>
+      <w:pPr>
+        <w:spacing w:after="0" w:line="240" w:lineRule="auto"/>
+        <w:rPr>
+          <w:rFonts w:ascii="Times New Roman" w:eastAsia="Times New Roman" w:hAnsi="Times New Roman" w:cs="Times New Roman"/>
+          <w:color w:val="1F1F1F"/>
+          <w:sz w:val="26"/>
+          <w:szCs w:val="26"/>
+          <w:lang w:val="vi-VN" w:eastAsia="vi-VN"/>
+        </w:rPr>
+      </w:pPr>
+    </w:p>
+    <w:p>
+      <w:pPr>
+        <w:spacing w:after="0" w:line="240" w:lineRule="auto"/>
+        <w:rPr>
+          <w:rFonts w:ascii="Times New Roman" w:eastAsia="Times New Roman" w:hAnsi="Times New Roman" w:cs="Times New Roman"/>
+          <w:color w:val="1F1F1F"/>
+          <w:sz w:val="26"/>
+          <w:szCs w:val="26"/>
+          <w:lang w:val="vi-VN" w:eastAsia="vi-VN"/>
+        </w:rPr>
+      </w:pPr>
+      <w:r>
+        <w:rPr>
+          <w:rFonts w:ascii="Times New Roman" w:eastAsia="Times New Roman" w:hAnsi="Times New Roman" w:cs="Times New Roman"/>
+          <w:b/>
+          <w:bCs/>
+          <w:color w:val="1F1F1F"/>
+          <w:sz w:val="26"/>
+          <w:szCs w:val="26"/>
+          <w:bdr w:val="none" w:sz="0" w:space="0" w:color="auto" w:frame="1"/>
+          <w:lang w:val="vi-VN" w:eastAsia="vi-VN"/>
+        </w:rPr>
+        <w:t>a) Xác định yêu cầu chức năng</w:t>
+      </w:r>
+    </w:p>
+    <w:p>
+      <w:pPr>
+        <w:spacing w:after="0" w:line="240" w:lineRule="auto"/>
+        <w:rPr>
+          <w:rFonts w:ascii="Times New Roman" w:eastAsia="Times New Roman" w:hAnsi="Times New Roman" w:cs="Times New Roman"/>
+          <w:color w:val="1F1F1F"/>
+          <w:sz w:val="26"/>
+          <w:szCs w:val="26"/>
+          <w:lang w:val="vi-VN" w:eastAsia="vi-VN"/>
+        </w:rPr>
+      </w:pPr>
+    </w:p>
+    <w:p>
+      <w:pPr>
+        <w:spacing w:after="0" w:line="240" w:lineRule="auto"/>
+        <w:rPr>
+          <w:rFonts w:ascii="Times New Roman" w:eastAsia="Times New Roman" w:hAnsi="Times New Roman" w:cs="Times New Roman"/>
+          <w:color w:val="1F1F1F"/>
+          <w:sz w:val="26"/>
+          <w:szCs w:val="26"/>
+          <w:u w:val="single"/>
+          <w:lang w:val="vi-VN" w:eastAsia="vi-VN"/>
+        </w:rPr>
+      </w:pPr>
+      <w:r>
+        <w:rPr>
+          <w:rFonts w:ascii="Times New Roman" w:eastAsia="Times New Roman" w:hAnsi="Times New Roman" w:cs="Times New Roman"/>
+          <w:color w:val="1F1F1F"/>
+          <w:sz w:val="26"/>
+          <w:szCs w:val="26"/>
+          <w:u w:val="single"/>
+          <w:lang w:val="vi-VN" w:eastAsia="vi-VN"/>
+        </w:rPr>
+        <w:t>Lễ tân:</w:t>
+      </w:r>
+    </w:p>
+    <w:p>
+      <w:pPr>
+        <w:spacing w:after="0" w:line="240" w:lineRule="auto"/>
+        <w:rPr>
+          <w:rFonts w:ascii="Times New Roman" w:eastAsia="Times New Roman" w:hAnsi="Times New Roman" w:cs="Times New Roman"/>
+          <w:color w:val="1F1F1F"/>
+          <w:sz w:val="26"/>
+          <w:szCs w:val="26"/>
+          <w:lang w:val="vi-VN" w:eastAsia="vi-VN"/>
+        </w:rPr>
+      </w:pPr>
+      <w:r>
+        <w:rPr>
+          <w:rFonts w:ascii="Times New Roman" w:eastAsia="Times New Roman" w:hAnsi="Times New Roman" w:cs="Times New Roman"/>
+          <w:color w:val="1F1F1F"/>
+          <w:sz w:val="26"/>
+          <w:szCs w:val="26"/>
+          <w:lang w:val="vi-VN" w:eastAsia="vi-VN"/>
+        </w:rPr>
+        <w:t xml:space="preserve">-Đăng </w:t>
+      </w:r>
+      <w:r>
+        <w:rPr>
+          <w:rFonts w:ascii="Times New Roman" w:eastAsia="Times New Roman" w:hAnsi="Times New Roman" w:cs="Times New Roman"/>
+          <w:color w:val="1F1F1F"/>
+          <w:sz w:val="26"/>
+          <w:szCs w:val="26"/>
+          <w:lang w:val="vi-VN" w:eastAsia="vi-VN"/>
+        </w:rPr>
+        <w:t>ký thông tin bệnh nhân (nhập dữ liệu hành chính)</w:t>
+      </w:r>
+      <w:r>
+        <w:rPr>
+          <w:rFonts w:ascii="Times New Roman" w:eastAsia="Times New Roman" w:hAnsi="Times New Roman" w:cs="Times New Roman"/>
+          <w:color w:val="1F1F1F"/>
+          <w:sz w:val="26"/>
+          <w:szCs w:val="26"/>
+          <w:lang w:val="vi-VN" w:eastAsia="vi-VN"/>
+        </w:rPr>
+        <w:t>.</w:t>
+      </w:r>
+    </w:p>
+    <w:p>
+      <w:pPr>
+        <w:spacing w:after="0" w:line="240" w:lineRule="auto"/>
+        <w:rPr>
+          <w:rFonts w:ascii="Times New Roman" w:eastAsia="Times New Roman" w:hAnsi="Times New Roman" w:cs="Times New Roman"/>
+          <w:color w:val="1F1F1F"/>
+          <w:sz w:val="26"/>
+          <w:szCs w:val="26"/>
+          <w:lang w:val="vi-VN" w:eastAsia="vi-VN"/>
+        </w:rPr>
+      </w:pPr>
+      <w:r>
+        <w:rPr>
+          <w:rFonts w:ascii="Times New Roman" w:eastAsia="Times New Roman" w:hAnsi="Times New Roman" w:cs="Times New Roman"/>
+          <w:color w:val="1F1F1F"/>
+          <w:sz w:val="26"/>
+          <w:szCs w:val="26"/>
+          <w:lang w:val="vi-VN" w:eastAsia="vi-VN"/>
+        </w:rPr>
+        <w:t>-</w:t>
+      </w:r>
+      <w:r>
+        <w:rPr>
+          <w:rFonts w:ascii="Times New Roman" w:eastAsia="Times New Roman" w:hAnsi="Times New Roman" w:cs="Times New Roman"/>
+          <w:color w:val="1F1F1F"/>
+          <w:sz w:val="26"/>
+          <w:szCs w:val="26"/>
+          <w:lang w:val="vi-VN" w:eastAsia="vi-VN"/>
+        </w:rPr>
+        <w:t>Cập nhật thông tin hành chính bệnh nhân (khi có sai sót)</w:t>
+      </w:r>
+    </w:p>
+    <w:p>
+      <w:pPr>
+        <w:spacing w:after="0" w:line="240" w:lineRule="auto"/>
+        <w:rPr>
+          <w:rFonts w:ascii="Times New Roman" w:eastAsia="Times New Roman" w:hAnsi="Times New Roman" w:cs="Times New Roman"/>
+          <w:color w:val="1F1F1F"/>
+          <w:sz w:val="26"/>
+          <w:szCs w:val="26"/>
+          <w:lang w:val="vi-VN" w:eastAsia="vi-VN"/>
+        </w:rPr>
+      </w:pPr>
+      <w:r>
+        <w:rPr>
+          <w:rFonts w:ascii="Times New Roman" w:eastAsia="Times New Roman" w:hAnsi="Times New Roman" w:cs="Times New Roman"/>
+          <w:color w:val="1F1F1F"/>
+          <w:sz w:val="26"/>
+          <w:szCs w:val="26"/>
+          <w:lang w:val="vi-VN" w:eastAsia="vi-VN"/>
+        </w:rPr>
+        <w:t>-</w:t>
+      </w:r>
+      <w:r>
+        <w:rPr>
+          <w:rFonts w:ascii="Times New Roman" w:eastAsia="Times New Roman" w:hAnsi="Times New Roman" w:cs="Times New Roman"/>
+          <w:color w:val="1F1F1F"/>
+          <w:sz w:val="26"/>
+          <w:szCs w:val="26"/>
+          <w:lang w:val="vi-VN" w:eastAsia="vi-VN"/>
+        </w:rPr>
+        <w:t>Tra cứu thông tin bệnh nhân (hành chính, lịch hẹn, hóa đơn)</w:t>
+      </w:r>
+    </w:p>
+    <w:p>
+      <w:pPr>
+        <w:spacing w:before="100" w:beforeAutospacing="1" w:after="0" w:line="240" w:lineRule="auto"/>
+        <w:ind w:left="720"/>
+        <w:rPr>
+          <w:rFonts w:ascii="Times New Roman" w:eastAsia="Times New Roman" w:hAnsi="Times New Roman" w:cs="Times New Roman"/>
+          <w:color w:val="1F1F1F"/>
+          <w:sz w:val="26"/>
+          <w:szCs w:val="26"/>
+          <w:lang w:val="vi-VN" w:eastAsia="vi-VN"/>
+        </w:rPr>
+      </w:pPr>
+    </w:p>
+    <w:p>
+      <w:pPr>
+        <w:spacing w:after="0" w:line="240" w:lineRule="auto"/>
+        <w:rPr>
+          <w:rFonts w:ascii="Times New Roman" w:eastAsia="Times New Roman" w:hAnsi="Times New Roman" w:cs="Times New Roman"/>
+          <w:color w:val="1F1F1F"/>
+          <w:sz w:val="26"/>
+          <w:szCs w:val="26"/>
+          <w:u w:val="single"/>
+          <w:lang w:val="vi-VN" w:eastAsia="vi-VN"/>
+        </w:rPr>
+      </w:pPr>
+      <w:r>
+        <w:rPr>
+          <w:rFonts w:ascii="Times New Roman" w:eastAsia="Times New Roman" w:hAnsi="Times New Roman" w:cs="Times New Roman"/>
+          <w:color w:val="1F1F1F"/>
+          <w:sz w:val="26"/>
+          <w:szCs w:val="26"/>
+          <w:u w:val="single"/>
+          <w:lang w:val="vi-VN" w:eastAsia="vi-VN"/>
+        </w:rPr>
+        <w:t>Nha sĩ:</w:t>
+      </w:r>
+    </w:p>
+    <w:p>
+      <w:pPr>
+        <w:spacing w:after="0" w:line="240" w:lineRule="auto"/>
+        <w:rPr>
+          <w:rFonts w:ascii="Times New Roman" w:eastAsia="Times New Roman" w:hAnsi="Times New Roman" w:cs="Times New Roman"/>
+          <w:color w:val="1F1F1F"/>
+          <w:sz w:val="26"/>
+          <w:szCs w:val="26"/>
+          <w:lang w:val="vi-VN" w:eastAsia="vi-VN"/>
+        </w:rPr>
+      </w:pPr>
+      <w:r>
+        <w:rPr>
+          <w:rFonts w:ascii="Times New Roman" w:eastAsia="Times New Roman" w:hAnsi="Times New Roman" w:cs="Times New Roman"/>
+          <w:color w:val="1F1F1F"/>
+          <w:sz w:val="26"/>
+          <w:szCs w:val="26"/>
+          <w:lang w:val="vi-VN" w:eastAsia="vi-VN"/>
+        </w:rPr>
+        <w:t>-</w:t>
+      </w:r>
+      <w:r>
+        <w:rPr>
+          <w:rFonts w:ascii="Times New Roman" w:eastAsia="Times New Roman" w:hAnsi="Times New Roman" w:cs="Times New Roman"/>
+          <w:color w:val="1F1F1F"/>
+          <w:sz w:val="26"/>
+          <w:szCs w:val="26"/>
+          <w:lang w:val="vi-VN" w:eastAsia="vi-VN"/>
+        </w:rPr>
+        <w:t>Cập nhật dữ liệu y khoa chuyên sâu (tiền sử bệnh lý, dị ứng, chỉ số nha chu, sơ đồ răng, phim X-quang)</w:t>
+      </w:r>
+    </w:p>
+    <w:p>
+      <w:pPr>
+        <w:spacing w:after="0" w:line="240" w:lineRule="auto"/>
+        <w:rPr>
+          <w:rFonts w:ascii="Times New Roman" w:eastAsia="Times New Roman" w:hAnsi="Times New Roman" w:cs="Times New Roman"/>
+          <w:color w:val="1F1F1F"/>
+          <w:sz w:val="26"/>
+          <w:szCs w:val="26"/>
+          <w:lang w:val="vi-VN" w:eastAsia="vi-VN"/>
+        </w:rPr>
+      </w:pPr>
+      <w:r>
+        <w:rPr>
+          <w:rFonts w:ascii="Times New Roman" w:eastAsia="Times New Roman" w:hAnsi="Times New Roman" w:cs="Times New Roman"/>
+          <w:color w:val="1F1F1F"/>
+          <w:sz w:val="26"/>
+          <w:szCs w:val="26"/>
+          <w:lang w:val="vi-VN" w:eastAsia="vi-VN"/>
+        </w:rPr>
+        <w:t>-</w:t>
+      </w:r>
+      <w:r>
+        <w:rPr>
+          <w:rFonts w:ascii="Times New Roman" w:eastAsia="Times New Roman" w:hAnsi="Times New Roman" w:cs="Times New Roman"/>
+          <w:color w:val="1F1F1F"/>
+          <w:sz w:val="26"/>
+          <w:szCs w:val="26"/>
+          <w:lang w:val="vi-VN" w:eastAsia="vi-VN"/>
+        </w:rPr>
+        <w:t>Tra cứu thông tin bệnh nhân (hồ sơ chuyên môn, tiền sử y khoa, kết quả chẩn đoán)</w:t>
+      </w:r>
+    </w:p>
+    <w:p>
+      <w:pPr>
+        <w:spacing w:after="0" w:line="240" w:lineRule="auto"/>
+        <w:rPr>
+          <w:rFonts w:ascii="Times New Roman" w:eastAsia="Times New Roman" w:hAnsi="Times New Roman" w:cs="Times New Roman"/>
+          <w:color w:val="1F1F1F"/>
+          <w:sz w:val="26"/>
+          <w:szCs w:val="26"/>
+          <w:lang w:val="vi-VN" w:eastAsia="vi-VN"/>
+        </w:rPr>
+      </w:pPr>
+      <w:r>
+        <w:rPr>
+          <w:rFonts w:ascii="Times New Roman" w:eastAsia="Times New Roman" w:hAnsi="Times New Roman" w:cs="Times New Roman"/>
+          <w:color w:val="1F1F1F"/>
+          <w:sz w:val="26"/>
+          <w:szCs w:val="26"/>
+          <w:lang w:val="vi-VN" w:eastAsia="vi-VN"/>
+        </w:rPr>
+        <w:t>-</w:t>
+      </w:r>
+      <w:r>
+        <w:rPr>
+          <w:rFonts w:ascii="Times New Roman" w:eastAsia="Times New Roman" w:hAnsi="Times New Roman" w:cs="Times New Roman"/>
+          <w:color w:val="1F1F1F"/>
+          <w:sz w:val="26"/>
+          <w:szCs w:val="26"/>
+          <w:lang w:val="vi-VN" w:eastAsia="vi-VN"/>
+        </w:rPr>
+        <w:t>Tra cứu lịch sử khám bệnh nhân (nhật ký thủ thuật, phim chụp X-quang, ảnh điều trị, đơn thuốc)</w:t>
+      </w:r>
+    </w:p>
+    <w:p>
+      <w:pPr>
+        <w:spacing w:after="0" w:line="240" w:lineRule="auto"/>
+        <w:rPr>
+          <w:rFonts w:ascii="Times New Roman" w:eastAsia="Times New Roman" w:hAnsi="Times New Roman" w:cs="Times New Roman"/>
+          <w:color w:val="1F1F1F"/>
+          <w:sz w:val="26"/>
+          <w:szCs w:val="26"/>
+          <w:u w:val="single"/>
+          <w:lang w:val="vi-VN" w:eastAsia="vi-VN"/>
+        </w:rPr>
+      </w:pPr>
+      <w:r>
+        <w:rPr>
+          <w:rFonts w:ascii="Times New Roman" w:eastAsia="Times New Roman" w:hAnsi="Times New Roman" w:cs="Times New Roman"/>
+          <w:color w:val="1F1F1F"/>
+          <w:sz w:val="26"/>
+          <w:szCs w:val="26"/>
+          <w:u w:val="single"/>
+          <w:lang w:val="vi-VN" w:eastAsia="vi-VN"/>
+        </w:rPr>
+        <w:t>Y tá:</w:t>
+      </w:r>
+    </w:p>
+    <w:p>
+      <w:pPr>
+        <w:spacing w:after="0" w:line="240" w:lineRule="auto"/>
+        <w:rPr>
+          <w:rFonts w:ascii="Times New Roman" w:eastAsia="Times New Roman" w:hAnsi="Times New Roman" w:cs="Times New Roman"/>
+          <w:color w:val="1F1F1F"/>
+          <w:sz w:val="26"/>
+          <w:szCs w:val="26"/>
+          <w:lang w:val="vi-VN" w:eastAsia="vi-VN"/>
+        </w:rPr>
+      </w:pPr>
+      <w:r>
+        <w:rPr>
+          <w:rFonts w:ascii="Times New Roman" w:eastAsia="Times New Roman" w:hAnsi="Times New Roman" w:cs="Times New Roman"/>
+          <w:color w:val="1F1F1F"/>
+          <w:sz w:val="26"/>
+          <w:szCs w:val="26"/>
+          <w:lang w:val="vi-VN" w:eastAsia="vi-VN"/>
+        </w:rPr>
+        <w:t>-</w:t>
+      </w:r>
+      <w:r>
+        <w:rPr>
+          <w:rFonts w:ascii="Times New Roman" w:eastAsia="Times New Roman" w:hAnsi="Times New Roman" w:cs="Times New Roman"/>
+          <w:color w:val="1F1F1F"/>
+          <w:sz w:val="26"/>
+          <w:szCs w:val="26"/>
+          <w:lang w:val="vi-VN" w:eastAsia="vi-VN"/>
+        </w:rPr>
+        <w:t>Tra cứu thông tin bệnh nhân</w:t>
+      </w:r>
+    </w:p>
+    <w:p>
+      <w:pPr>
+        <w:spacing w:after="0" w:line="240" w:lineRule="auto"/>
+        <w:rPr>
+          <w:rFonts w:ascii="Times New Roman" w:eastAsia="Times New Roman" w:hAnsi="Times New Roman" w:cs="Times New Roman"/>
+          <w:color w:val="1F1F1F"/>
+          <w:sz w:val="26"/>
+          <w:szCs w:val="26"/>
+          <w:lang w:val="vi-VN" w:eastAsia="vi-VN"/>
+        </w:rPr>
+      </w:pPr>
+      <w:r>
+        <w:rPr>
+          <w:rFonts w:ascii="Times New Roman" w:eastAsia="Times New Roman" w:hAnsi="Times New Roman" w:cs="Times New Roman"/>
+          <w:color w:val="1F1F1F"/>
+          <w:sz w:val="26"/>
+          <w:szCs w:val="26"/>
+          <w:lang w:val="vi-VN" w:eastAsia="vi-VN"/>
+        </w:rPr>
+        <w:t>-</w:t>
+      </w:r>
+      <w:r>
+        <w:rPr>
+          <w:rFonts w:ascii="Times New Roman" w:eastAsia="Times New Roman" w:hAnsi="Times New Roman" w:cs="Times New Roman"/>
+          <w:color w:val="1F1F1F"/>
+          <w:sz w:val="26"/>
+          <w:szCs w:val="26"/>
+          <w:lang w:val="vi-VN" w:eastAsia="vi-VN"/>
+        </w:rPr>
+        <w:t>Tra cứu lịch sử khám bệnh nhân</w:t>
+      </w:r>
+    </w:p>
+    <w:p>
+      <w:pPr>
+        <w:spacing w:after="0" w:line="240" w:lineRule="auto"/>
+        <w:rPr>
+          <w:rFonts w:ascii="Times New Roman" w:eastAsia="Times New Roman" w:hAnsi="Times New Roman" w:cs="Times New Roman"/>
+          <w:color w:val="1F1F1F"/>
+          <w:sz w:val="26"/>
+          <w:szCs w:val="26"/>
+          <w:lang w:val="vi-VN" w:eastAsia="vi-VN"/>
+        </w:rPr>
+      </w:pPr>
+      <w:r>
+        <w:rPr>
+          <w:rFonts w:ascii="Times New Roman" w:eastAsia="Times New Roman" w:hAnsi="Times New Roman" w:cs="Times New Roman"/>
+          <w:color w:val="1F1F1F"/>
+          <w:sz w:val="26"/>
+          <w:szCs w:val="26"/>
+          <w:lang w:val="vi-VN" w:eastAsia="vi-VN"/>
+        </w:rPr>
+        <w:t>b) Yêu cầu phi chức năng</w:t>
+      </w:r>
+    </w:p>
+    <w:p>
+      <w:pPr>
+        <w:spacing w:after="0" w:line="240" w:lineRule="auto"/>
+        <w:rPr>
+          <w:rFonts w:ascii="Times New Roman" w:eastAsia="Times New Roman" w:hAnsi="Times New Roman" w:cs="Times New Roman"/>
+          <w:color w:val="1F1F1F"/>
+          <w:sz w:val="26"/>
+          <w:szCs w:val="26"/>
+          <w:u w:val="single"/>
+          <w:lang w:val="vi-VN" w:eastAsia="vi-VN"/>
+        </w:rPr>
+      </w:pPr>
+      <w:r>
+        <w:rPr>
+          <w:rFonts w:ascii="Times New Roman" w:eastAsia="Times New Roman" w:hAnsi="Times New Roman" w:cs="Times New Roman"/>
+          <w:color w:val="1F1F1F"/>
+          <w:sz w:val="26"/>
+          <w:szCs w:val="26"/>
+          <w:u w:val="single"/>
+          <w:lang w:val="vi-VN" w:eastAsia="vi-VN"/>
+        </w:rPr>
+        <w:t>Hiệu năng (Performance):</w:t>
+      </w:r>
+    </w:p>
+    <w:p>
+      <w:pPr>
+        <w:spacing w:after="0" w:line="240" w:lineRule="auto"/>
+        <w:rPr>
+          <w:rFonts w:ascii="Times New Roman" w:eastAsia="Times New Roman" w:hAnsi="Times New Roman" w:cs="Times New Roman"/>
+          <w:color w:val="1F1F1F"/>
+          <w:sz w:val="26"/>
+          <w:szCs w:val="26"/>
+          <w:lang w:val="vi-VN" w:eastAsia="vi-VN"/>
+        </w:rPr>
+      </w:pPr>
+      <w:r>
+        <w:rPr>
+          <w:rFonts w:ascii="Times New Roman" w:eastAsia="Times New Roman" w:hAnsi="Times New Roman" w:cs="Times New Roman"/>
+          <w:color w:val="1F1F1F"/>
+          <w:sz w:val="26"/>
+          <w:szCs w:val="26"/>
+          <w:lang w:val="vi-VN" w:eastAsia="vi-VN"/>
+        </w:rPr>
+        <w:t>-</w:t>
+      </w:r>
+      <w:r>
+        <w:rPr>
+          <w:rFonts w:ascii="Times New Roman" w:eastAsia="Times New Roman" w:hAnsi="Times New Roman" w:cs="Times New Roman"/>
+          <w:color w:val="1F1F1F"/>
+          <w:sz w:val="26"/>
+          <w:szCs w:val="26"/>
+          <w:lang w:val="vi-VN" w:eastAsia="vi-VN"/>
+        </w:rPr>
+        <w:t>Thời gian tìm kiếm, truy xuất thông tin hành chính, hồ sơ bệnh nhân, lịch sử khám và tải phim X-quang/hình ảnh điều trị phản hồi tức thì (dưới 2 - 3 giây).</w:t>
+      </w:r>
+    </w:p>
+    <w:p>
+      <w:pPr>
+        <w:spacing w:after="0" w:line="240" w:lineRule="auto"/>
+        <w:rPr>
+          <w:rFonts w:ascii="Times New Roman" w:eastAsia="Times New Roman" w:hAnsi="Times New Roman" w:cs="Times New Roman"/>
+          <w:color w:val="1F1F1F"/>
+          <w:sz w:val="26"/>
+          <w:szCs w:val="26"/>
+          <w:lang w:val="vi-VN" w:eastAsia="vi-VN"/>
+        </w:rPr>
+      </w:pPr>
+      <w:r>
+        <w:rPr>
+          <w:rFonts w:ascii="Times New Roman" w:eastAsia="Times New Roman" w:hAnsi="Times New Roman" w:cs="Times New Roman"/>
+          <w:color w:val="1F1F1F"/>
+          <w:sz w:val="26"/>
+          <w:szCs w:val="26"/>
+          <w:lang w:val="vi-VN" w:eastAsia="vi-VN"/>
+        </w:rPr>
+        <w:t>-</w:t>
+      </w:r>
+      <w:r>
+        <w:rPr>
+          <w:rFonts w:ascii="Times New Roman" w:eastAsia="Times New Roman" w:hAnsi="Times New Roman" w:cs="Times New Roman"/>
+          <w:color w:val="1F1F1F"/>
+          <w:sz w:val="26"/>
+          <w:szCs w:val="26"/>
+          <w:lang w:val="vi-VN" w:eastAsia="vi-VN"/>
+        </w:rPr>
+        <w:t>Tốc độ lưu dữ liệu khi đăng ký mới hoặc cập nhật hồ sơ diễn ra nhanh chóng, không gây gián đoạn quy trình tiếp nhận và khám chữa bệnh.</w:t>
+      </w:r>
+    </w:p>
+    <w:p>
+      <w:pPr>
+        <w:spacing w:after="0" w:line="240" w:lineRule="auto"/>
+        <w:rPr>
+          <w:rFonts w:ascii="Times New Roman" w:eastAsia="Times New Roman" w:hAnsi="Times New Roman" w:cs="Times New Roman"/>
+          <w:color w:val="1F1F1F"/>
+          <w:sz w:val="26"/>
+          <w:szCs w:val="26"/>
+          <w:u w:val="single"/>
+          <w:lang w:val="vi-VN" w:eastAsia="vi-VN"/>
+        </w:rPr>
+      </w:pPr>
+      <w:r>
+        <w:rPr>
+          <w:rFonts w:ascii="Times New Roman" w:eastAsia="Times New Roman" w:hAnsi="Times New Roman" w:cs="Times New Roman"/>
+          <w:color w:val="1F1F1F"/>
+          <w:sz w:val="26"/>
+          <w:szCs w:val="26"/>
+          <w:u w:val="single"/>
+          <w:lang w:val="vi-VN" w:eastAsia="vi-VN"/>
+        </w:rPr>
+        <w:t>Khả năng mở rộng (Scalability):</w:t>
+      </w:r>
+    </w:p>
+    <w:p>
+      <w:pPr>
+        <w:spacing w:after="0" w:line="240" w:lineRule="auto"/>
+        <w:rPr>
+          <w:rFonts w:ascii="Times New Roman" w:eastAsia="Times New Roman" w:hAnsi="Times New Roman" w:cs="Times New Roman"/>
+          <w:color w:val="1F1F1F"/>
+          <w:sz w:val="26"/>
+          <w:szCs w:val="26"/>
+          <w:lang w:val="vi-VN" w:eastAsia="vi-VN"/>
+        </w:rPr>
+      </w:pPr>
+      <w:r>
+        <w:rPr>
+          <w:rFonts w:ascii="Times New Roman" w:eastAsia="Times New Roman" w:hAnsi="Times New Roman" w:cs="Times New Roman"/>
+          <w:color w:val="1F1F1F"/>
+          <w:sz w:val="26"/>
+          <w:szCs w:val="26"/>
+          <w:lang w:val="vi-VN" w:eastAsia="vi-VN"/>
+        </w:rPr>
+        <w:t>-</w:t>
+      </w:r>
+      <w:r>
+        <w:rPr>
+          <w:rFonts w:ascii="Times New Roman" w:eastAsia="Times New Roman" w:hAnsi="Times New Roman" w:cs="Times New Roman"/>
+          <w:color w:val="1F1F1F"/>
+          <w:sz w:val="26"/>
+          <w:szCs w:val="26"/>
+          <w:lang w:val="vi-VN" w:eastAsia="vi-VN"/>
+        </w:rPr>
+        <w:t>Hệ thống hỗ trợ mở rộng lưu trữ dung lượng lớn cho các tệp dữ liệu y khoa nặng (phim X-quang, ảnh chụp thực tế) mà không ảnh hưởng đến tốc độ truy xuất.</w:t>
+      </w:r>
+    </w:p>
+    <w:p>
+      <w:pPr>
+        <w:spacing w:after="0" w:line="240" w:lineRule="auto"/>
+        <w:rPr>
+          <w:rFonts w:ascii="Times New Roman" w:eastAsia="Times New Roman" w:hAnsi="Times New Roman" w:cs="Times New Roman"/>
+          <w:color w:val="1F1F1F"/>
+          <w:sz w:val="26"/>
+          <w:szCs w:val="26"/>
+          <w:lang w:val="vi-VN" w:eastAsia="vi-VN"/>
+        </w:rPr>
+      </w:pPr>
+      <w:r>
+        <w:rPr>
+          <w:rFonts w:ascii="Times New Roman" w:eastAsia="Times New Roman" w:hAnsi="Times New Roman" w:cs="Times New Roman"/>
+          <w:color w:val="1F1F1F"/>
+          <w:sz w:val="26"/>
+          <w:szCs w:val="26"/>
+          <w:lang w:val="vi-VN" w:eastAsia="vi-VN"/>
+        </w:rPr>
+        <w:t>-</w:t>
+      </w:r>
+      <w:r>
+        <w:rPr>
+          <w:rFonts w:ascii="Times New Roman" w:eastAsia="Times New Roman" w:hAnsi="Times New Roman" w:cs="Times New Roman"/>
+          <w:color w:val="1F1F1F"/>
+          <w:sz w:val="26"/>
+          <w:szCs w:val="26"/>
+          <w:lang w:val="vi-VN" w:eastAsia="vi-VN"/>
+        </w:rPr>
+        <w:t>Dễ dàng nâng cấp để đáp ứng số lượng lớn bệnh nhân đăng ký mới và lượng tài khoản nhân sự</w:t>
+      </w:r>
+      <w:r>
+        <w:rPr>
+          <w:rFonts w:ascii="Times New Roman" w:eastAsia="Times New Roman" w:hAnsi="Times New Roman" w:cs="Times New Roman"/>
+          <w:color w:val="1F1F1F"/>
+          <w:sz w:val="26"/>
+          <w:szCs w:val="26"/>
+          <w:lang w:val="vi-VN" w:eastAsia="vi-VN"/>
+        </w:rPr>
+        <w:t xml:space="preserve"> </w:t>
+      </w:r>
+      <w:r>
+        <w:rPr>
+          <w:rFonts w:ascii="Times New Roman" w:eastAsia="Times New Roman" w:hAnsi="Times New Roman" w:cs="Times New Roman"/>
+          <w:color w:val="1F1F1F"/>
+          <w:sz w:val="26"/>
+          <w:szCs w:val="26"/>
+          <w:lang w:val="vi-VN" w:eastAsia="vi-VN"/>
+        </w:rPr>
+        <w:t>truy cập đồng thời.</w:t>
+      </w:r>
+    </w:p>
+    <w:p>
+      <w:pPr>
+        <w:spacing w:after="0" w:line="240" w:lineRule="auto"/>
+        <w:rPr>
+          <w:rFonts w:ascii="Times New Roman" w:eastAsia="Times New Roman" w:hAnsi="Times New Roman" w:cs="Times New Roman"/>
+          <w:color w:val="1F1F1F"/>
+          <w:sz w:val="26"/>
+          <w:szCs w:val="26"/>
+          <w:u w:val="single"/>
+          <w:lang w:val="vi-VN" w:eastAsia="vi-VN"/>
+        </w:rPr>
+      </w:pPr>
+      <w:r>
+        <w:rPr>
+          <w:rFonts w:ascii="Times New Roman" w:eastAsia="Times New Roman" w:hAnsi="Times New Roman" w:cs="Times New Roman"/>
+          <w:color w:val="1F1F1F"/>
+          <w:sz w:val="26"/>
+          <w:szCs w:val="26"/>
+          <w:u w:val="single"/>
+          <w:lang w:val="vi-VN" w:eastAsia="vi-VN"/>
+        </w:rPr>
+        <w:t>Bảo mật (Security):</w:t>
+      </w:r>
+    </w:p>
+    <w:p>
+      <w:pPr>
+        <w:spacing w:after="0" w:line="240" w:lineRule="auto"/>
+        <w:rPr>
+          <w:rFonts w:ascii="Times New Roman" w:eastAsia="Times New Roman" w:hAnsi="Times New Roman" w:cs="Times New Roman"/>
+          <w:color w:val="1F1F1F"/>
+          <w:sz w:val="26"/>
+          <w:szCs w:val="26"/>
+          <w:lang w:val="vi-VN" w:eastAsia="vi-VN"/>
+        </w:rPr>
+      </w:pPr>
+      <w:r>
+        <w:rPr>
+          <w:rFonts w:ascii="Times New Roman" w:eastAsia="Times New Roman" w:hAnsi="Times New Roman" w:cs="Times New Roman"/>
+          <w:color w:val="1F1F1F"/>
+          <w:sz w:val="26"/>
+          <w:szCs w:val="26"/>
+          <w:lang w:val="vi-VN" w:eastAsia="vi-VN"/>
+        </w:rPr>
+        <w:t>-</w:t>
+      </w:r>
+      <w:r>
+        <w:rPr>
+          <w:rFonts w:ascii="Times New Roman" w:eastAsia="Times New Roman" w:hAnsi="Times New Roman" w:cs="Times New Roman"/>
+          <w:color w:val="1F1F1F"/>
+          <w:sz w:val="26"/>
+          <w:szCs w:val="26"/>
+          <w:lang w:val="vi-VN" w:eastAsia="vi-VN"/>
+        </w:rPr>
+        <w:t xml:space="preserve">Phân quyền tài khoản nghiêm ngặt theo vai </w:t>
+      </w:r>
+      <w:r>
+        <w:rPr>
+          <w:rFonts w:ascii="Times New Roman" w:eastAsia="Times New Roman" w:hAnsi="Times New Roman" w:cs="Times New Roman"/>
+          <w:color w:val="1F1F1F"/>
+          <w:sz w:val="26"/>
+          <w:szCs w:val="26"/>
+          <w:lang w:val="vi-VN" w:eastAsia="vi-VN"/>
+        </w:rPr>
+        <w:t xml:space="preserve">trò: </w:t>
+      </w:r>
+      <w:r>
+        <w:rPr>
+          <w:rFonts w:ascii="Times New Roman" w:eastAsia="Times New Roman" w:hAnsi="Times New Roman" w:cs="Times New Roman"/>
+          <w:color w:val="1F1F1F"/>
+          <w:sz w:val="26"/>
+          <w:szCs w:val="26"/>
+          <w:lang w:val="vi-VN" w:eastAsia="vi-VN"/>
+        </w:rPr>
+        <w:t>Lễ tân chỉ được truy cập dữ liệu hành chính/hóa đơn; Nha sĩ và Y tá được truy cập hồ sơ chuyên môn và lịch sử khám.</w:t>
+      </w:r>
+    </w:p>
+    <w:p>
+      <w:pPr>
+        <w:spacing w:after="0" w:line="240" w:lineRule="auto"/>
+        <w:rPr>
+          <w:rFonts w:ascii="Times New Roman" w:eastAsia="Times New Roman" w:hAnsi="Times New Roman" w:cs="Times New Roman"/>
+          <w:color w:val="1F1F1F"/>
+          <w:sz w:val="26"/>
+          <w:szCs w:val="26"/>
+          <w:lang w:val="vi-VN" w:eastAsia="vi-VN"/>
+        </w:rPr>
+      </w:pPr>
+      <w:r>
+        <w:rPr>
+          <w:rFonts w:ascii="Times New Roman" w:eastAsia="Times New Roman" w:hAnsi="Times New Roman" w:cs="Times New Roman"/>
+          <w:color w:val="1F1F1F"/>
+          <w:sz w:val="26"/>
+          <w:szCs w:val="26"/>
+          <w:lang w:val="vi-VN" w:eastAsia="vi-VN"/>
+        </w:rPr>
+        <w:t>-</w:t>
+      </w:r>
+      <w:r>
+        <w:rPr>
+          <w:rFonts w:ascii="Times New Roman" w:eastAsia="Times New Roman" w:hAnsi="Times New Roman" w:cs="Times New Roman"/>
+          <w:color w:val="1F1F1F"/>
+          <w:sz w:val="26"/>
+          <w:szCs w:val="26"/>
+          <w:lang w:val="vi-VN" w:eastAsia="vi-VN"/>
+        </w:rPr>
+        <w:t>Mã hóa dữ liệu y tế cá nhân của bệnh nhân và tự động lưu nhật ký truy cập, nhật ký lưu vết chỉnh sửa để chống gian lận dữ liệu.</w:t>
+      </w:r>
+    </w:p>
+    <w:p>
+      <w:pPr>
+        <w:spacing w:after="0" w:line="240" w:lineRule="auto"/>
+        <w:rPr>
+          <w:rFonts w:ascii="Times New Roman" w:eastAsia="Times New Roman" w:hAnsi="Times New Roman" w:cs="Times New Roman"/>
+          <w:color w:val="1F1F1F"/>
+          <w:sz w:val="26"/>
+          <w:szCs w:val="26"/>
+          <w:u w:val="single"/>
+          <w:lang w:val="vi-VN" w:eastAsia="vi-VN"/>
+        </w:rPr>
+      </w:pPr>
+      <w:r>
+        <w:rPr>
+          <w:rFonts w:ascii="Times New Roman" w:eastAsia="Times New Roman" w:hAnsi="Times New Roman" w:cs="Times New Roman"/>
+          <w:color w:val="1F1F1F"/>
+          <w:sz w:val="26"/>
+          <w:szCs w:val="26"/>
+          <w:u w:val="single"/>
+          <w:lang w:val="vi-VN" w:eastAsia="vi-VN"/>
+        </w:rPr>
+        <w:t>Tính khả dụng (Availability):</w:t>
+      </w:r>
+    </w:p>
+    <w:p>
+      <w:pPr>
+        <w:spacing w:after="0" w:line="240" w:lineRule="auto"/>
+        <w:rPr>
+          <w:rFonts w:ascii="Times New Roman" w:eastAsia="Times New Roman" w:hAnsi="Times New Roman" w:cs="Times New Roman"/>
+          <w:color w:val="1F1F1F"/>
+          <w:sz w:val="26"/>
+          <w:szCs w:val="26"/>
+          <w:lang w:val="vi-VN" w:eastAsia="vi-VN"/>
+        </w:rPr>
+      </w:pPr>
+      <w:r>
+        <w:rPr>
+          <w:rFonts w:ascii="Times New Roman" w:eastAsia="Times New Roman" w:hAnsi="Times New Roman" w:cs="Times New Roman"/>
+          <w:color w:val="1F1F1F"/>
+          <w:sz w:val="26"/>
+          <w:szCs w:val="26"/>
+          <w:lang w:val="vi-VN" w:eastAsia="vi-VN"/>
+        </w:rPr>
+        <w:t>-H</w:t>
+      </w:r>
+      <w:r>
+        <w:rPr>
+          <w:rFonts w:ascii="Times New Roman" w:eastAsia="Times New Roman" w:hAnsi="Times New Roman" w:cs="Times New Roman"/>
+          <w:color w:val="1F1F1F"/>
+          <w:sz w:val="26"/>
+          <w:szCs w:val="26"/>
+          <w:lang w:val="vi-VN" w:eastAsia="vi-VN"/>
+        </w:rPr>
+        <w:t>ệ thống duy trì hoạt động liên tục 24/7, đảm bảo Lễ tân luôn tiếp nhận được bệnh nhân và Nha sĩ luôn tra cứu/cập nhật được bệnh án trong giờ làm việc.</w:t>
+      </w:r>
+    </w:p>
+    <w:p>
+      <w:pPr>
+        <w:spacing w:after="0" w:line="240" w:lineRule="auto"/>
+        <w:rPr>
+          <w:rFonts w:ascii="Times New Roman" w:eastAsia="Times New Roman" w:hAnsi="Times New Roman" w:cs="Times New Roman"/>
+          <w:color w:val="1F1F1F"/>
+          <w:sz w:val="26"/>
+          <w:szCs w:val="26"/>
+          <w:lang w:val="vi-VN" w:eastAsia="vi-VN"/>
+        </w:rPr>
+      </w:pPr>
+      <w:r>
+        <w:rPr>
+          <w:rFonts w:ascii="Times New Roman" w:eastAsia="Times New Roman" w:hAnsi="Times New Roman" w:cs="Times New Roman"/>
+          <w:color w:val="1F1F1F"/>
+          <w:sz w:val="26"/>
+          <w:szCs w:val="26"/>
+          <w:lang w:val="vi-VN" w:eastAsia="vi-VN"/>
+        </w:rPr>
+        <w:t>-</w:t>
+      </w:r>
+      <w:r>
+        <w:rPr>
+          <w:rFonts w:ascii="Times New Roman" w:eastAsia="Times New Roman" w:hAnsi="Times New Roman" w:cs="Times New Roman"/>
+          <w:color w:val="1F1F1F"/>
+          <w:sz w:val="26"/>
+          <w:szCs w:val="26"/>
+          <w:lang w:val="vi-VN" w:eastAsia="vi-VN"/>
+        </w:rPr>
+        <w:t xml:space="preserve">Cơ chế đồng bộ dữ liệu tức thì trên toàn hệ thống, đảm bảo dữ liệu vừa đăng ký hoặc cập nhật được hiển thị ngay lập tức ở tất cả các máy </w:t>
+      </w:r>
+      <w:r>
+        <w:rPr>
+          <w:rFonts w:ascii="Times New Roman" w:eastAsia="Times New Roman" w:hAnsi="Times New Roman" w:cs="Times New Roman"/>
+          <w:color w:val="1F1F1F"/>
+          <w:sz w:val="26"/>
+          <w:szCs w:val="26"/>
+          <w:lang w:val="vi-VN" w:eastAsia="vi-VN"/>
+        </w:rPr>
+        <w:t>trạm.</w:t>
+      </w:r>
+    </w:p>
+    <w:p>
+      <w:pPr>
+        <w:spacing w:after="0" w:line="240" w:lineRule="auto"/>
+        <w:rPr>
+          <w:rFonts w:ascii="Times New Roman" w:eastAsia="Times New Roman" w:hAnsi="Times New Roman" w:cs="Times New Roman"/>
+          <w:color w:val="1F1F1F"/>
+          <w:sz w:val="26"/>
+          <w:szCs w:val="26"/>
+          <w:u w:val="single"/>
+          <w:lang w:val="vi-VN" w:eastAsia="vi-VN"/>
+        </w:rPr>
+      </w:pPr>
+      <w:r>
+        <w:rPr>
+          <w:rFonts w:ascii="Times New Roman" w:eastAsia="Times New Roman" w:hAnsi="Times New Roman" w:cs="Times New Roman"/>
+          <w:color w:val="1F1F1F"/>
+          <w:sz w:val="26"/>
+          <w:szCs w:val="26"/>
+          <w:u w:val="single"/>
+          <w:lang w:val="vi-VN" w:eastAsia="vi-VN"/>
+        </w:rPr>
+        <w:t>Tính dễ sử dụng (Usability):</w:t>
+      </w:r>
+    </w:p>
+    <w:p>
+      <w:pPr>
+        <w:spacing w:after="0" w:line="240" w:lineRule="auto"/>
+        <w:rPr>
+          <w:rFonts w:ascii="Times New Roman" w:eastAsia="Times New Roman" w:hAnsi="Times New Roman" w:cs="Times New Roman"/>
+          <w:color w:val="1F1F1F"/>
+          <w:sz w:val="26"/>
+          <w:szCs w:val="26"/>
+          <w:lang w:val="vi-VN" w:eastAsia="vi-VN"/>
+        </w:rPr>
+      </w:pPr>
+      <w:r>
+        <w:rPr>
+          <w:rFonts w:ascii="Times New Roman" w:eastAsia="Times New Roman" w:hAnsi="Times New Roman" w:cs="Times New Roman"/>
+          <w:color w:val="1F1F1F"/>
+          <w:sz w:val="26"/>
+          <w:szCs w:val="26"/>
+          <w:lang w:val="vi-VN" w:eastAsia="vi-VN"/>
+        </w:rPr>
+        <w:t>-</w:t>
+      </w:r>
+      <w:r>
+        <w:rPr>
+          <w:rFonts w:ascii="Times New Roman" w:eastAsia="Times New Roman" w:hAnsi="Times New Roman" w:cs="Times New Roman"/>
+          <w:color w:val="1F1F1F"/>
+          <w:sz w:val="26"/>
+          <w:szCs w:val="26"/>
+          <w:lang w:val="vi-VN" w:eastAsia="vi-VN"/>
+        </w:rPr>
+        <w:t>Giao diện trực quan, tối ưu hóa các thao tác nhập liệu hành chính cho Lễ tân và thao tác chọn/đánh dấu sơ đồ răng, tải phim X-quang cho Nha sĩ.</w:t>
+      </w:r>
+    </w:p>
+    <w:p>
+      <w:pPr>
+        <w:spacing w:after="0" w:line="240" w:lineRule="auto"/>
+        <w:rPr>
+          <w:rFonts w:ascii="Times New Roman" w:eastAsia="Times New Roman" w:hAnsi="Times New Roman" w:cs="Times New Roman"/>
+          <w:color w:val="1F1F1F"/>
+          <w:sz w:val="26"/>
+          <w:szCs w:val="26"/>
+          <w:lang w:val="vi-VN" w:eastAsia="vi-VN"/>
+        </w:rPr>
+      </w:pPr>
+      <w:r>
+        <w:rPr>
+          <w:rFonts w:ascii="Times New Roman" w:eastAsia="Times New Roman" w:hAnsi="Times New Roman" w:cs="Times New Roman"/>
+          <w:color w:val="1F1F1F"/>
+          <w:sz w:val="26"/>
+          <w:szCs w:val="26"/>
+          <w:lang w:val="vi-VN" w:eastAsia="vi-VN"/>
+        </w:rPr>
+        <w:t>-</w:t>
+      </w:r>
+      <w:r>
+        <w:rPr>
+          <w:rFonts w:ascii="Times New Roman" w:eastAsia="Times New Roman" w:hAnsi="Times New Roman" w:cs="Times New Roman"/>
+          <w:color w:val="1F1F1F"/>
+          <w:sz w:val="26"/>
+          <w:szCs w:val="26"/>
+          <w:lang w:val="vi-VN" w:eastAsia="vi-VN"/>
+        </w:rPr>
+        <w:t>Ô tìm kiếm thông minh cho phép tra cứu nhanh bệnh nhân theo Mã bệnh nhân, Số điện thoại hoặc Họ tên chỉ qua vài cú nhấp chuột.</w:t>
+      </w:r>
+    </w:p>
+    <w:p>
+      <w:pPr>
+        <w:spacing w:after="0" w:line="240" w:lineRule="auto"/>
+        <w:rPr>
+          <w:rFonts w:ascii="Times New Roman" w:eastAsia="Times New Roman" w:hAnsi="Times New Roman" w:cs="Times New Roman"/>
+          <w:color w:val="1F1F1F"/>
+          <w:sz w:val="26"/>
+          <w:szCs w:val="26"/>
+          <w:u w:val="single"/>
+          <w:lang w:val="vi-VN" w:eastAsia="vi-VN"/>
+        </w:rPr>
+      </w:pPr>
+      <w:r>
+        <w:rPr>
+          <w:rFonts w:ascii="Times New Roman" w:eastAsia="Times New Roman" w:hAnsi="Times New Roman" w:cs="Times New Roman"/>
+          <w:color w:val="1F1F1F"/>
+          <w:sz w:val="26"/>
+          <w:szCs w:val="26"/>
+          <w:u w:val="single"/>
+          <w:lang w:val="vi-VN" w:eastAsia="vi-VN"/>
+        </w:rPr>
+        <w:t>Khả năng bảo trì (Maintainability):</w:t>
+      </w:r>
+    </w:p>
+    <w:p>
+      <w:pPr>
+        <w:spacing w:after="0" w:line="240" w:lineRule="auto"/>
+        <w:rPr>
+          <w:rFonts w:ascii="Times New Roman" w:eastAsia="Times New Roman" w:hAnsi="Times New Roman" w:cs="Times New Roman"/>
+          <w:color w:val="1F1F1F"/>
+          <w:sz w:val="26"/>
+          <w:szCs w:val="26"/>
+          <w:lang w:val="vi-VN" w:eastAsia="vi-VN"/>
+        </w:rPr>
+      </w:pPr>
+      <w:r>
+        <w:rPr>
+          <w:rFonts w:ascii="Times New Roman" w:eastAsia="Times New Roman" w:hAnsi="Times New Roman" w:cs="Times New Roman"/>
+          <w:color w:val="1F1F1F"/>
+          <w:sz w:val="26"/>
+          <w:szCs w:val="26"/>
+          <w:lang w:val="vi-VN" w:eastAsia="vi-VN"/>
+        </w:rPr>
+        <w:t>-</w:t>
+      </w:r>
+      <w:r>
+        <w:rPr>
+          <w:rFonts w:ascii="Times New Roman" w:eastAsia="Times New Roman" w:hAnsi="Times New Roman" w:cs="Times New Roman"/>
+          <w:color w:val="1F1F1F"/>
+          <w:sz w:val="26"/>
+          <w:szCs w:val="26"/>
+          <w:lang w:val="vi-VN" w:eastAsia="vi-VN"/>
+        </w:rPr>
+        <w:t>Thiết kế hệ thống theo dạng mô-đun độc lập giúp dễ dàng nâng cấp, sửa lỗi từng phần mà không làm gián đoạn toàn bộ hệ thống.</w:t>
+      </w:r>
+    </w:p>
+    <w:p>
+      <w:pPr>
+        <w:spacing w:after="0" w:line="240" w:lineRule="auto"/>
+        <w:rPr>
+          <w:rFonts w:ascii="Times New Roman" w:eastAsia="Times New Roman" w:hAnsi="Times New Roman" w:cs="Times New Roman"/>
+          <w:color w:val="1F1F1F"/>
+          <w:sz w:val="26"/>
+          <w:szCs w:val="26"/>
+          <w:lang w:val="vi-VN" w:eastAsia="vi-VN"/>
+        </w:rPr>
+      </w:pPr>
+      <w:r>
+        <w:rPr>
+          <w:rFonts w:ascii="Times New Roman" w:eastAsia="Times New Roman" w:hAnsi="Times New Roman" w:cs="Times New Roman"/>
+          <w:color w:val="1F1F1F"/>
+          <w:sz w:val="26"/>
+          <w:szCs w:val="26"/>
+          <w:lang w:val="vi-VN" w:eastAsia="vi-VN"/>
+        </w:rPr>
+        <w:t>-</w:t>
+      </w:r>
+      <w:r>
+        <w:rPr>
+          <w:rFonts w:ascii="Times New Roman" w:eastAsia="Times New Roman" w:hAnsi="Times New Roman" w:cs="Times New Roman"/>
+          <w:color w:val="1F1F1F"/>
+          <w:sz w:val="26"/>
+          <w:szCs w:val="26"/>
+          <w:lang w:val="vi-VN" w:eastAsia="vi-VN"/>
+        </w:rPr>
+        <w:t>Chuẩn hóa cấu trúc lưu trữ dữ liệu giúp kỹ thuật viên dễ dàng sao lưu, khôi phục dữ liệu và bảo trì định kỳ.</w:t>
+      </w:r>
     </w:p>
     <w:p>
       <w:pPr>
@@ -3212,6 +4249,7 @@
           <w:b/>
           <w:sz w:val="26"/>
           <w:szCs w:val="26"/>
+          <w:lang w:val="vi-VN"/>
         </w:rPr>
       </w:pPr>
       <w:r>
@@ -3220,6 +4258,7 @@
           <w:b/>
           <w:sz w:val="26"/>
           <w:szCs w:val="26"/>
+          <w:lang w:val="vi-VN"/>
         </w:rPr>
         <w:t>Sơ đồ phân cấp chức năng của ứng dụn</w:t>
       </w:r>
@@ -3229,6 +4268,7 @@
           <w:b/>
           <w:sz w:val="26"/>
           <w:szCs w:val="26"/>
+          <w:lang w:val="vi-VN"/>
         </w:rPr>
         <w:t>g</w:t>
       </w:r>
@@ -3244,6 +4284,7 @@
           <w:b/>
           <w:sz w:val="26"/>
           <w:szCs w:val="26"/>
+          <w:lang w:val="vi-VN"/>
         </w:rPr>
       </w:pPr>
     </w:p>
@@ -3471,7 +4512,7 @@
                 </wp:anchor>
               </w:drawing>
             </mc:Choice>
-            <mc:Fallback xmlns:oel="http://schemas.microsoft.com/office/2019/extlst" xmlns:w16cei="http://schemas.microsoft.com/office/word/2026/wordml/cei" xmlns:w16du="http://schemas.microsoft.com/office/word/2023/wordml/word16du" xmlns:w16sdtfl="http://schemas.microsoft.com/office/word/2024/wordml/sdtformatlock">
+            <mc:Fallback xmlns:w16sdtfl="http://schemas.microsoft.com/office/word/2024/wordml/sdtformatlock" xmlns:w16du="http://schemas.microsoft.com/office/word/2023/wordml/word16du" xmlns:w16cei="http://schemas.microsoft.com/office/word/2026/wordml/cei" xmlns:oel="http://schemas.microsoft.com/office/2019/extlst">
               <w:pict>
                 <v:line w14:anchorId="62D43E4F" id="Straight Connector 1" o:spid="_x0000_s1026" style="position:absolute;z-index:251659264;visibility:visible;mso-wrap-style:square;mso-width-percent:0;mso-wrap-distance-left:9pt;mso-wrap-distance-top:0;mso-wrap-distance-right:9pt;mso-wrap-distance-bottom:0;mso-position-horizontal:absolute;mso-position-horizontal-relative:text;mso-position-vertical:absolute;mso-position-vertical-relative:text;mso-width-percent:0;mso-width-relative:margin" from=".85pt,.5pt" to="525.25pt,.5pt" o:gfxdata="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" strokecolor="black [3200]" strokeweight=".5pt">
                   <v:stroke joinstyle="miter"/>
@@ -4470,6 +5511,155 @@
     </w:lvl>
   </w:abstractNum>
   <w:abstractNum w:abstractNumId="5" w15:restartNumberingAfterBreak="0">
+    <w:nsid w:val="20F6384A"/>
+    <w:multiLevelType w:val="multilevel"/>
+    <w:tmpl w:val="6F62783E"/>
+    <w:lvl w:ilvl="0">
+      <w:start w:val="1"/>
+      <w:numFmt w:val="bullet"/>
+      <w:lvlText w:val=""/>
+      <w:lvlJc w:val="left"/>
+      <w:pPr>
+        <w:tabs>
+          <w:tab w:val="num" w:pos="720"/>
+        </w:tabs>
+        <w:ind w:left="720" w:hanging="360"/>
+      </w:pPr>
+      <w:rPr>
+        <w:rFonts w:ascii="Symbol" w:hAnsi="Symbol" w:hint="default"/>
+        <w:sz w:val="20"/>
+      </w:rPr>
+    </w:lvl>
+    <w:lvl w:ilvl="1" w:tentative="1">
+      <w:start w:val="1"/>
+      <w:numFmt w:val="bullet"/>
+      <w:lvlText w:val="o"/>
+      <w:lvlJc w:val="left"/>
+      <w:pPr>
+        <w:tabs>
+          <w:tab w:val="num" w:pos="1440"/>
+        </w:tabs>
+        <w:ind w:left="1440" w:hanging="360"/>
+      </w:pPr>
+      <w:rPr>
+        <w:rFonts w:ascii="Courier New" w:hAnsi="Courier New" w:hint="default"/>
+        <w:sz w:val="20"/>
+      </w:rPr>
+    </w:lvl>
+    <w:lvl w:ilvl="2" w:tentative="1">
+      <w:start w:val="1"/>
+      <w:numFmt w:val="bullet"/>
+      <w:lvlText w:val=""/>
+      <w:lvlJc w:val="left"/>
+      <w:pPr>
+        <w:tabs>
+          <w:tab w:val="num" w:pos="2160"/>
+        </w:tabs>
+        <w:ind w:left="2160" w:hanging="360"/>
+      </w:pPr>
+      <w:rPr>
+        <w:rFonts w:ascii="Wingdings" w:hAnsi="Wingdings" w:hint="default"/>
+        <w:sz w:val="20"/>
+      </w:rPr>
+    </w:lvl>
+    <w:lvl w:ilvl="3" w:tentative="1">
+      <w:start w:val="1"/>
+      <w:numFmt w:val="bullet"/>
+      <w:lvlText w:val=""/>
+      <w:lvlJc w:val="left"/>
+      <w:pPr>
+        <w:tabs>
+          <w:tab w:val="num" w:pos="2880"/>
+        </w:tabs>
+        <w:ind w:left="2880" w:hanging="360"/>
+      </w:pPr>
+      <w:rPr>
+        <w:rFonts w:ascii="Wingdings" w:hAnsi="Wingdings" w:hint="default"/>
+        <w:sz w:val="20"/>
+      </w:rPr>
+    </w:lvl>
+    <w:lvl w:ilvl="4" w:tentative="1">
+      <w:start w:val="1"/>
+      <w:numFmt w:val="bullet"/>
+      <w:lvlText w:val=""/>
+      <w:lvlJc w:val="left"/>
+      <w:pPr>
+        <w:tabs>
+          <w:tab w:val="num" w:pos="3600"/>
+        </w:tabs>
+        <w:ind w:left="3600" w:hanging="360"/>
+      </w:pPr>
+      <w:rPr>
+        <w:rFonts w:ascii="Wingdings" w:hAnsi="Wingdings" w:hint="default"/>
+        <w:sz w:val="20"/>
+      </w:rPr>
+    </w:lvl>
+    <w:lvl w:ilvl="5" w:tentative="1">
+      <w:start w:val="1"/>
+      <w:numFmt w:val="bullet"/>
+      <w:lvlText w:val=""/>
+      <w:lvlJc w:val="left"/>
+      <w:pPr>
+        <w:tabs>
+          <w:tab w:val="num" w:pos="4320"/>
+        </w:tabs>
+        <w:ind w:left="4320" w:hanging="360"/>
+      </w:pPr>
+      <w:rPr>
+        <w:rFonts w:ascii="Wingdings" w:hAnsi="Wingdings" w:hint="default"/>
+        <w:sz w:val="20"/>
+      </w:rPr>
+    </w:lvl>
+    <w:lvl w:ilvl="6" w:tentative="1">
+      <w:start w:val="1"/>
+      <w:numFmt w:val="bullet"/>
+      <w:lvlText w:val=""/>
+      <w:lvlJc w:val="left"/>
+      <w:pPr>
+        <w:tabs>
+          <w:tab w:val="num" w:pos="5040"/>
+        </w:tabs>
+        <w:ind w:left="5040" w:hanging="360"/>
+      </w:pPr>
+      <w:rPr>
+        <w:rFonts w:ascii="Wingdings" w:hAnsi="Wingdings" w:hint="default"/>
+        <w:sz w:val="20"/>
+      </w:rPr>
+    </w:lvl>
+    <w:lvl w:ilvl="7" w:tentative="1">
+      <w:start w:val="1"/>
+      <w:numFmt w:val="bullet"/>
+      <w:lvlText w:val=""/>
+      <w:lvlJc w:val="left"/>
+      <w:pPr>
+        <w:tabs>
+          <w:tab w:val="num" w:pos="5760"/>
+        </w:tabs>
+        <w:ind w:left="5760" w:hanging="360"/>
+      </w:pPr>
+      <w:rPr>
+        <w:rFonts w:ascii="Wingdings" w:hAnsi="Wingdings" w:hint="default"/>
+        <w:sz w:val="20"/>
+      </w:rPr>
+    </w:lvl>
+    <w:lvl w:ilvl="8" w:tentative="1">
+      <w:start w:val="1"/>
+      <w:numFmt w:val="bullet"/>
+      <w:lvlText w:val=""/>
+      <w:lvlJc w:val="left"/>
+      <w:pPr>
+        <w:tabs>
+          <w:tab w:val="num" w:pos="6480"/>
+        </w:tabs>
+        <w:ind w:left="6480" w:hanging="360"/>
+      </w:pPr>
+      <w:rPr>
+        <w:rFonts w:ascii="Wingdings" w:hAnsi="Wingdings" w:hint="default"/>
+        <w:sz w:val="20"/>
+      </w:rPr>
+    </w:lvl>
+  </w:abstractNum>
+  <w:abstractNum w:abstractNumId="6" w15:restartNumberingAfterBreak="0">
     <w:nsid w:val="22956ADA"/>
     <w:multiLevelType w:val="hybridMultilevel"/>
     <w:tmpl w:val="152EDC48"/>
@@ -4555,7 +5745,7 @@
       </w:pPr>
     </w:lvl>
   </w:abstractNum>
-  <w:abstractNum w:abstractNumId="6" w15:restartNumberingAfterBreak="0">
+  <w:abstractNum w:abstractNumId="7" w15:restartNumberingAfterBreak="0">
     <w:nsid w:val="255B48AE"/>
     <w:multiLevelType w:val="multilevel"/>
     <w:tmpl w:val="106C8210"/>
@@ -4704,7 +5894,156 @@
       </w:rPr>
     </w:lvl>
   </w:abstractNum>
-  <w:abstractNum w:abstractNumId="7" w15:restartNumberingAfterBreak="0">
+  <w:abstractNum w:abstractNumId="8" w15:restartNumberingAfterBreak="0">
+    <w:nsid w:val="27297E86"/>
+    <w:multiLevelType w:val="multilevel"/>
+    <w:tmpl w:val="7B32A1DA"/>
+    <w:lvl w:ilvl="0">
+      <w:start w:val="1"/>
+      <w:numFmt w:val="bullet"/>
+      <w:lvlText w:val=""/>
+      <w:lvlJc w:val="left"/>
+      <w:pPr>
+        <w:tabs>
+          <w:tab w:val="num" w:pos="720"/>
+        </w:tabs>
+        <w:ind w:left="720" w:hanging="360"/>
+      </w:pPr>
+      <w:rPr>
+        <w:rFonts w:ascii="Symbol" w:hAnsi="Symbol" w:hint="default"/>
+        <w:sz w:val="20"/>
+      </w:rPr>
+    </w:lvl>
+    <w:lvl w:ilvl="1" w:tentative="1">
+      <w:start w:val="1"/>
+      <w:numFmt w:val="bullet"/>
+      <w:lvlText w:val="o"/>
+      <w:lvlJc w:val="left"/>
+      <w:pPr>
+        <w:tabs>
+          <w:tab w:val="num" w:pos="1440"/>
+        </w:tabs>
+        <w:ind w:left="1440" w:hanging="360"/>
+      </w:pPr>
+      <w:rPr>
+        <w:rFonts w:ascii="Courier New" w:hAnsi="Courier New" w:hint="default"/>
+        <w:sz w:val="20"/>
+      </w:rPr>
+    </w:lvl>
+    <w:lvl w:ilvl="2" w:tentative="1">
+      <w:start w:val="1"/>
+      <w:numFmt w:val="bullet"/>
+      <w:lvlText w:val=""/>
+      <w:lvlJc w:val="left"/>
+      <w:pPr>
+        <w:tabs>
+          <w:tab w:val="num" w:pos="2160"/>
+        </w:tabs>
+        <w:ind w:left="2160" w:hanging="360"/>
+      </w:pPr>
+      <w:rPr>
+        <w:rFonts w:ascii="Wingdings" w:hAnsi="Wingdings" w:hint="default"/>
+        <w:sz w:val="20"/>
+      </w:rPr>
+    </w:lvl>
+    <w:lvl w:ilvl="3" w:tentative="1">
+      <w:start w:val="1"/>
+      <w:numFmt w:val="bullet"/>
+      <w:lvlText w:val=""/>
+      <w:lvlJc w:val="left"/>
+      <w:pPr>
+        <w:tabs>
+          <w:tab w:val="num" w:pos="2880"/>
+        </w:tabs>
+        <w:ind w:left="2880" w:hanging="360"/>
+      </w:pPr>
+      <w:rPr>
+        <w:rFonts w:ascii="Wingdings" w:hAnsi="Wingdings" w:hint="default"/>
+        <w:sz w:val="20"/>
+      </w:rPr>
+    </w:lvl>
+    <w:lvl w:ilvl="4" w:tentative="1">
+      <w:start w:val="1"/>
+      <w:numFmt w:val="bullet"/>
+      <w:lvlText w:val=""/>
+      <w:lvlJc w:val="left"/>
+      <w:pPr>
+        <w:tabs>
+          <w:tab w:val="num" w:pos="3600"/>
+        </w:tabs>
+        <w:ind w:left="3600" w:hanging="360"/>
+      </w:pPr>
+      <w:rPr>
+        <w:rFonts w:ascii="Wingdings" w:hAnsi="Wingdings" w:hint="default"/>
+        <w:sz w:val="20"/>
+      </w:rPr>
+    </w:lvl>
+    <w:lvl w:ilvl="5" w:tentative="1">
+      <w:start w:val="1"/>
+      <w:numFmt w:val="bullet"/>
+      <w:lvlText w:val=""/>
+      <w:lvlJc w:val="left"/>
+      <w:pPr>
+        <w:tabs>
+          <w:tab w:val="num" w:pos="4320"/>
+        </w:tabs>
+        <w:ind w:left="4320" w:hanging="360"/>
+      </w:pPr>
+      <w:rPr>
+        <w:rFonts w:ascii="Wingdings" w:hAnsi="Wingdings" w:hint="default"/>
+        <w:sz w:val="20"/>
+      </w:rPr>
+    </w:lvl>
+    <w:lvl w:ilvl="6" w:tentative="1">
+      <w:start w:val="1"/>
+      <w:numFmt w:val="bullet"/>
+      <w:lvlText w:val=""/>
+      <w:lvlJc w:val="left"/>
+      <w:pPr>
+        <w:tabs>
+          <w:tab w:val="num" w:pos="5040"/>
+        </w:tabs>
+        <w:ind w:left="5040" w:hanging="360"/>
+      </w:pPr>
+      <w:rPr>
+        <w:rFonts w:ascii="Wingdings" w:hAnsi="Wingdings" w:hint="default"/>
+        <w:sz w:val="20"/>
+      </w:rPr>
+    </w:lvl>
+    <w:lvl w:ilvl="7" w:tentative="1">
+      <w:start w:val="1"/>
+      <w:numFmt w:val="bullet"/>
+      <w:lvlText w:val=""/>
+      <w:lvlJc w:val="left"/>
+      <w:pPr>
+        <w:tabs>
+          <w:tab w:val="num" w:pos="5760"/>
+        </w:tabs>
+        <w:ind w:left="5760" w:hanging="360"/>
+      </w:pPr>
+      <w:rPr>
+        <w:rFonts w:ascii="Wingdings" w:hAnsi="Wingdings" w:hint="default"/>
+        <w:sz w:val="20"/>
+      </w:rPr>
+    </w:lvl>
+    <w:lvl w:ilvl="8" w:tentative="1">
+      <w:start w:val="1"/>
+      <w:numFmt w:val="bullet"/>
+      <w:lvlText w:val=""/>
+      <w:lvlJc w:val="left"/>
+      <w:pPr>
+        <w:tabs>
+          <w:tab w:val="num" w:pos="6480"/>
+        </w:tabs>
+        <w:ind w:left="6480" w:hanging="360"/>
+      </w:pPr>
+      <w:rPr>
+        <w:rFonts w:ascii="Wingdings" w:hAnsi="Wingdings" w:hint="default"/>
+        <w:sz w:val="20"/>
+      </w:rPr>
+    </w:lvl>
+  </w:abstractNum>
+  <w:abstractNum w:abstractNumId="9" w15:restartNumberingAfterBreak="0">
     <w:nsid w:val="28811187"/>
     <w:multiLevelType w:val="multilevel"/>
     <w:tmpl w:val="2334D384"/>
@@ -4853,7 +6192,7 @@
       </w:rPr>
     </w:lvl>
   </w:abstractNum>
-  <w:abstractNum w:abstractNumId="8" w15:restartNumberingAfterBreak="0">
+  <w:abstractNum w:abstractNumId="10" w15:restartNumberingAfterBreak="0">
     <w:nsid w:val="2A595AD1"/>
     <w:multiLevelType w:val="hybridMultilevel"/>
     <w:tmpl w:val="3C7829DE"/>
@@ -4966,7 +6305,7 @@
       </w:rPr>
     </w:lvl>
   </w:abstractNum>
-  <w:abstractNum w:abstractNumId="9" w15:restartNumberingAfterBreak="0">
+  <w:abstractNum w:abstractNumId="11" w15:restartNumberingAfterBreak="0">
     <w:nsid w:val="2C39406B"/>
     <w:multiLevelType w:val="hybridMultilevel"/>
     <w:tmpl w:val="22FC64EE"/>
@@ -5079,7 +6418,156 @@
       </w:rPr>
     </w:lvl>
   </w:abstractNum>
-  <w:abstractNum w:abstractNumId="10" w15:restartNumberingAfterBreak="0">
+  <w:abstractNum w:abstractNumId="12" w15:restartNumberingAfterBreak="0">
+    <w:nsid w:val="2C6F4D72"/>
+    <w:multiLevelType w:val="multilevel"/>
+    <w:tmpl w:val="8D84710C"/>
+    <w:lvl w:ilvl="0">
+      <w:start w:val="1"/>
+      <w:numFmt w:val="bullet"/>
+      <w:lvlText w:val=""/>
+      <w:lvlJc w:val="left"/>
+      <w:pPr>
+        <w:tabs>
+          <w:tab w:val="num" w:pos="720"/>
+        </w:tabs>
+        <w:ind w:left="720" w:hanging="360"/>
+      </w:pPr>
+      <w:rPr>
+        <w:rFonts w:ascii="Symbol" w:hAnsi="Symbol" w:hint="default"/>
+        <w:sz w:val="20"/>
+      </w:rPr>
+    </w:lvl>
+    <w:lvl w:ilvl="1" w:tentative="1">
+      <w:start w:val="1"/>
+      <w:numFmt w:val="bullet"/>
+      <w:lvlText w:val="o"/>
+      <w:lvlJc w:val="left"/>
+      <w:pPr>
+        <w:tabs>
+          <w:tab w:val="num" w:pos="1440"/>
+        </w:tabs>
+        <w:ind w:left="1440" w:hanging="360"/>
+      </w:pPr>
+      <w:rPr>
+        <w:rFonts w:ascii="Courier New" w:hAnsi="Courier New" w:hint="default"/>
+        <w:sz w:val="20"/>
+      </w:rPr>
+    </w:lvl>
+    <w:lvl w:ilvl="2" w:tentative="1">
+      <w:start w:val="1"/>
+      <w:numFmt w:val="bullet"/>
+      <w:lvlText w:val=""/>
+      <w:lvlJc w:val="left"/>
+      <w:pPr>
+        <w:tabs>
+          <w:tab w:val="num" w:pos="2160"/>
+        </w:tabs>
+        <w:ind w:left="2160" w:hanging="360"/>
+      </w:pPr>
+      <w:rPr>
+        <w:rFonts w:ascii="Wingdings" w:hAnsi="Wingdings" w:hint="default"/>
+        <w:sz w:val="20"/>
+      </w:rPr>
+    </w:lvl>
+    <w:lvl w:ilvl="3" w:tentative="1">
+      <w:start w:val="1"/>
+      <w:numFmt w:val="bullet"/>
+      <w:lvlText w:val=""/>
+      <w:lvlJc w:val="left"/>
+      <w:pPr>
+        <w:tabs>
+          <w:tab w:val="num" w:pos="2880"/>
+        </w:tabs>
+        <w:ind w:left="2880" w:hanging="360"/>
+      </w:pPr>
+      <w:rPr>
+        <w:rFonts w:ascii="Wingdings" w:hAnsi="Wingdings" w:hint="default"/>
+        <w:sz w:val="20"/>
+      </w:rPr>
+    </w:lvl>
+    <w:lvl w:ilvl="4" w:tentative="1">
+      <w:start w:val="1"/>
+      <w:numFmt w:val="bullet"/>
+      <w:lvlText w:val=""/>
+      <w:lvlJc w:val="left"/>
+      <w:pPr>
+        <w:tabs>
+          <w:tab w:val="num" w:pos="3600"/>
+        </w:tabs>
+        <w:ind w:left="3600" w:hanging="360"/>
+      </w:pPr>
+      <w:rPr>
+        <w:rFonts w:ascii="Wingdings" w:hAnsi="Wingdings" w:hint="default"/>
+        <w:sz w:val="20"/>
+      </w:rPr>
+    </w:lvl>
+    <w:lvl w:ilvl="5" w:tentative="1">
+      <w:start w:val="1"/>
+      <w:numFmt w:val="bullet"/>
+      <w:lvlText w:val=""/>
+      <w:lvlJc w:val="left"/>
+      <w:pPr>
+        <w:tabs>
+          <w:tab w:val="num" w:pos="4320"/>
+        </w:tabs>
+        <w:ind w:left="4320" w:hanging="360"/>
+      </w:pPr>
+      <w:rPr>
+        <w:rFonts w:ascii="Wingdings" w:hAnsi="Wingdings" w:hint="default"/>
+        <w:sz w:val="20"/>
+      </w:rPr>
+    </w:lvl>
+    <w:lvl w:ilvl="6" w:tentative="1">
+      <w:start w:val="1"/>
+      <w:numFmt w:val="bullet"/>
+      <w:lvlText w:val=""/>
+      <w:lvlJc w:val="left"/>
+      <w:pPr>
+        <w:tabs>
+          <w:tab w:val="num" w:pos="5040"/>
+        </w:tabs>
+        <w:ind w:left="5040" w:hanging="360"/>
+      </w:pPr>
+      <w:rPr>
+        <w:rFonts w:ascii="Wingdings" w:hAnsi="Wingdings" w:hint="default"/>
+        <w:sz w:val="20"/>
+      </w:rPr>
+    </w:lvl>
+    <w:lvl w:ilvl="7" w:tentative="1">
+      <w:start w:val="1"/>
+      <w:numFmt w:val="bullet"/>
+      <w:lvlText w:val=""/>
+      <w:lvlJc w:val="left"/>
+      <w:pPr>
+        <w:tabs>
+          <w:tab w:val="num" w:pos="5760"/>
+        </w:tabs>
+        <w:ind w:left="5760" w:hanging="360"/>
+      </w:pPr>
+      <w:rPr>
+        <w:rFonts w:ascii="Wingdings" w:hAnsi="Wingdings" w:hint="default"/>
+        <w:sz w:val="20"/>
+      </w:rPr>
+    </w:lvl>
+    <w:lvl w:ilvl="8" w:tentative="1">
+      <w:start w:val="1"/>
+      <w:numFmt w:val="bullet"/>
+      <w:lvlText w:val=""/>
+      <w:lvlJc w:val="left"/>
+      <w:pPr>
+        <w:tabs>
+          <w:tab w:val="num" w:pos="6480"/>
+        </w:tabs>
+        <w:ind w:left="6480" w:hanging="360"/>
+      </w:pPr>
+      <w:rPr>
+        <w:rFonts w:ascii="Wingdings" w:hAnsi="Wingdings" w:hint="default"/>
+        <w:sz w:val="20"/>
+      </w:rPr>
+    </w:lvl>
+  </w:abstractNum>
+  <w:abstractNum w:abstractNumId="13" w15:restartNumberingAfterBreak="0">
     <w:nsid w:val="2F521F27"/>
     <w:multiLevelType w:val="multilevel"/>
     <w:tmpl w:val="8AAC7FB0"/>
@@ -5228,7 +6716,7 @@
       </w:rPr>
     </w:lvl>
   </w:abstractNum>
-  <w:abstractNum w:abstractNumId="11" w15:restartNumberingAfterBreak="0">
+  <w:abstractNum w:abstractNumId="14" w15:restartNumberingAfterBreak="0">
     <w:nsid w:val="2FD537C8"/>
     <w:multiLevelType w:val="multilevel"/>
     <w:tmpl w:val="50A897B0"/>
@@ -5377,7 +6865,156 @@
       </w:rPr>
     </w:lvl>
   </w:abstractNum>
-  <w:abstractNum w:abstractNumId="12" w15:restartNumberingAfterBreak="0">
+  <w:abstractNum w:abstractNumId="15" w15:restartNumberingAfterBreak="0">
+    <w:nsid w:val="3040561F"/>
+    <w:multiLevelType w:val="multilevel"/>
+    <w:tmpl w:val="52E23D9A"/>
+    <w:lvl w:ilvl="0">
+      <w:start w:val="1"/>
+      <w:numFmt w:val="bullet"/>
+      <w:lvlText w:val=""/>
+      <w:lvlJc w:val="left"/>
+      <w:pPr>
+        <w:tabs>
+          <w:tab w:val="num" w:pos="720"/>
+        </w:tabs>
+        <w:ind w:left="720" w:hanging="360"/>
+      </w:pPr>
+      <w:rPr>
+        <w:rFonts w:ascii="Symbol" w:hAnsi="Symbol" w:hint="default"/>
+        <w:sz w:val="20"/>
+      </w:rPr>
+    </w:lvl>
+    <w:lvl w:ilvl="1" w:tentative="1">
+      <w:start w:val="1"/>
+      <w:numFmt w:val="bullet"/>
+      <w:lvlText w:val="o"/>
+      <w:lvlJc w:val="left"/>
+      <w:pPr>
+        <w:tabs>
+          <w:tab w:val="num" w:pos="1440"/>
+        </w:tabs>
+        <w:ind w:left="1440" w:hanging="360"/>
+      </w:pPr>
+      <w:rPr>
+        <w:rFonts w:ascii="Courier New" w:hAnsi="Courier New" w:hint="default"/>
+        <w:sz w:val="20"/>
+      </w:rPr>
+    </w:lvl>
+    <w:lvl w:ilvl="2" w:tentative="1">
+      <w:start w:val="1"/>
+      <w:numFmt w:val="bullet"/>
+      <w:lvlText w:val=""/>
+      <w:lvlJc w:val="left"/>
+      <w:pPr>
+        <w:tabs>
+          <w:tab w:val="num" w:pos="2160"/>
+        </w:tabs>
+        <w:ind w:left="2160" w:hanging="360"/>
+      </w:pPr>
+      <w:rPr>
+        <w:rFonts w:ascii="Wingdings" w:hAnsi="Wingdings" w:hint="default"/>
+        <w:sz w:val="20"/>
+      </w:rPr>
+    </w:lvl>
+    <w:lvl w:ilvl="3" w:tentative="1">
+      <w:start w:val="1"/>
+      <w:numFmt w:val="bullet"/>
+      <w:lvlText w:val=""/>
+      <w:lvlJc w:val="left"/>
+      <w:pPr>
+        <w:tabs>
+          <w:tab w:val="num" w:pos="2880"/>
+        </w:tabs>
+        <w:ind w:left="2880" w:hanging="360"/>
+      </w:pPr>
+      <w:rPr>
+        <w:rFonts w:ascii="Wingdings" w:hAnsi="Wingdings" w:hint="default"/>
+        <w:sz w:val="20"/>
+      </w:rPr>
+    </w:lvl>
+    <w:lvl w:ilvl="4" w:tentative="1">
+      <w:start w:val="1"/>
+      <w:numFmt w:val="bullet"/>
+      <w:lvlText w:val=""/>
+      <w:lvlJc w:val="left"/>
+      <w:pPr>
+        <w:tabs>
+          <w:tab w:val="num" w:pos="3600"/>
+        </w:tabs>
+        <w:ind w:left="3600" w:hanging="360"/>
+      </w:pPr>
+      <w:rPr>
+        <w:rFonts w:ascii="Wingdings" w:hAnsi="Wingdings" w:hint="default"/>
+        <w:sz w:val="20"/>
+      </w:rPr>
+    </w:lvl>
+    <w:lvl w:ilvl="5" w:tentative="1">
+      <w:start w:val="1"/>
+      <w:numFmt w:val="bullet"/>
+      <w:lvlText w:val=""/>
+      <w:lvlJc w:val="left"/>
+      <w:pPr>
+        <w:tabs>
+          <w:tab w:val="num" w:pos="4320"/>
+        </w:tabs>
+        <w:ind w:left="4320" w:hanging="360"/>
+      </w:pPr>
+      <w:rPr>
+        <w:rFonts w:ascii="Wingdings" w:hAnsi="Wingdings" w:hint="default"/>
+        <w:sz w:val="20"/>
+      </w:rPr>
+    </w:lvl>
+    <w:lvl w:ilvl="6" w:tentative="1">
+      <w:start w:val="1"/>
+      <w:numFmt w:val="bullet"/>
+      <w:lvlText w:val=""/>
+      <w:lvlJc w:val="left"/>
+      <w:pPr>
+        <w:tabs>
+          <w:tab w:val="num" w:pos="5040"/>
+        </w:tabs>
+        <w:ind w:left="5040" w:hanging="360"/>
+      </w:pPr>
+      <w:rPr>
+        <w:rFonts w:ascii="Wingdings" w:hAnsi="Wingdings" w:hint="default"/>
+        <w:sz w:val="20"/>
+      </w:rPr>
+    </w:lvl>
+    <w:lvl w:ilvl="7" w:tentative="1">
+      <w:start w:val="1"/>
+      <w:numFmt w:val="bullet"/>
+      <w:lvlText w:val=""/>
+      <w:lvlJc w:val="left"/>
+      <w:pPr>
+        <w:tabs>
+          <w:tab w:val="num" w:pos="5760"/>
+        </w:tabs>
+        <w:ind w:left="5760" w:hanging="360"/>
+      </w:pPr>
+      <w:rPr>
+        <w:rFonts w:ascii="Wingdings" w:hAnsi="Wingdings" w:hint="default"/>
+        <w:sz w:val="20"/>
+      </w:rPr>
+    </w:lvl>
+    <w:lvl w:ilvl="8" w:tentative="1">
+      <w:start w:val="1"/>
+      <w:numFmt w:val="bullet"/>
+      <w:lvlText w:val=""/>
+      <w:lvlJc w:val="left"/>
+      <w:pPr>
+        <w:tabs>
+          <w:tab w:val="num" w:pos="6480"/>
+        </w:tabs>
+        <w:ind w:left="6480" w:hanging="360"/>
+      </w:pPr>
+      <w:rPr>
+        <w:rFonts w:ascii="Wingdings" w:hAnsi="Wingdings" w:hint="default"/>
+        <w:sz w:val="20"/>
+      </w:rPr>
+    </w:lvl>
+  </w:abstractNum>
+  <w:abstractNum w:abstractNumId="16" w15:restartNumberingAfterBreak="0">
     <w:nsid w:val="3717318C"/>
     <w:multiLevelType w:val="multilevel"/>
     <w:tmpl w:val="EDA46B90"/>
@@ -5526,7 +7163,7 @@
       </w:rPr>
     </w:lvl>
   </w:abstractNum>
-  <w:abstractNum w:abstractNumId="13" w15:restartNumberingAfterBreak="0">
+  <w:abstractNum w:abstractNumId="17" w15:restartNumberingAfterBreak="0">
     <w:nsid w:val="49C55587"/>
     <w:multiLevelType w:val="multilevel"/>
     <w:tmpl w:val="D5A6C080"/>
@@ -5675,7 +7312,156 @@
       </w:rPr>
     </w:lvl>
   </w:abstractNum>
-  <w:abstractNum w:abstractNumId="14" w15:restartNumberingAfterBreak="0">
+  <w:abstractNum w:abstractNumId="18" w15:restartNumberingAfterBreak="0">
+    <w:nsid w:val="4CCC6F34"/>
+    <w:multiLevelType w:val="multilevel"/>
+    <w:tmpl w:val="D8B4F0DC"/>
+    <w:lvl w:ilvl="0">
+      <w:start w:val="1"/>
+      <w:numFmt w:val="bullet"/>
+      <w:lvlText w:val=""/>
+      <w:lvlJc w:val="left"/>
+      <w:pPr>
+        <w:tabs>
+          <w:tab w:val="num" w:pos="720"/>
+        </w:tabs>
+        <w:ind w:left="720" w:hanging="360"/>
+      </w:pPr>
+      <w:rPr>
+        <w:rFonts w:ascii="Symbol" w:hAnsi="Symbol" w:hint="default"/>
+        <w:sz w:val="20"/>
+      </w:rPr>
+    </w:lvl>
+    <w:lvl w:ilvl="1" w:tentative="1">
+      <w:start w:val="1"/>
+      <w:numFmt w:val="bullet"/>
+      <w:lvlText w:val="o"/>
+      <w:lvlJc w:val="left"/>
+      <w:pPr>
+        <w:tabs>
+          <w:tab w:val="num" w:pos="1440"/>
+        </w:tabs>
+        <w:ind w:left="1440" w:hanging="360"/>
+      </w:pPr>
+      <w:rPr>
+        <w:rFonts w:ascii="Courier New" w:hAnsi="Courier New" w:hint="default"/>
+        <w:sz w:val="20"/>
+      </w:rPr>
+    </w:lvl>
+    <w:lvl w:ilvl="2" w:tentative="1">
+      <w:start w:val="1"/>
+      <w:numFmt w:val="bullet"/>
+      <w:lvlText w:val=""/>
+      <w:lvlJc w:val="left"/>
+      <w:pPr>
+        <w:tabs>
+          <w:tab w:val="num" w:pos="2160"/>
+        </w:tabs>
+        <w:ind w:left="2160" w:hanging="360"/>
+      </w:pPr>
+      <w:rPr>
+        <w:rFonts w:ascii="Wingdings" w:hAnsi="Wingdings" w:hint="default"/>
+        <w:sz w:val="20"/>
+      </w:rPr>
+    </w:lvl>
+    <w:lvl w:ilvl="3" w:tentative="1">
+      <w:start w:val="1"/>
+      <w:numFmt w:val="bullet"/>
+      <w:lvlText w:val=""/>
+      <w:lvlJc w:val="left"/>
+      <w:pPr>
+        <w:tabs>
+          <w:tab w:val="num" w:pos="2880"/>
+        </w:tabs>
+        <w:ind w:left="2880" w:hanging="360"/>
+      </w:pPr>
+      <w:rPr>
+        <w:rFonts w:ascii="Wingdings" w:hAnsi="Wingdings" w:hint="default"/>
+        <w:sz w:val="20"/>
+      </w:rPr>
+    </w:lvl>
+    <w:lvl w:ilvl="4" w:tentative="1">
+      <w:start w:val="1"/>
+      <w:numFmt w:val="bullet"/>
+      <w:lvlText w:val=""/>
+      <w:lvlJc w:val="left"/>
+      <w:pPr>
+        <w:tabs>
+          <w:tab w:val="num" w:pos="3600"/>
+        </w:tabs>
+        <w:ind w:left="3600" w:hanging="360"/>
+      </w:pPr>
+      <w:rPr>
+        <w:rFonts w:ascii="Wingdings" w:hAnsi="Wingdings" w:hint="default"/>
+        <w:sz w:val="20"/>
+      </w:rPr>
+    </w:lvl>
+    <w:lvl w:ilvl="5" w:tentative="1">
+      <w:start w:val="1"/>
+      <w:numFmt w:val="bullet"/>
+      <w:lvlText w:val=""/>
+      <w:lvlJc w:val="left"/>
+      <w:pPr>
+        <w:tabs>
+          <w:tab w:val="num" w:pos="4320"/>
+        </w:tabs>
+        <w:ind w:left="4320" w:hanging="360"/>
+      </w:pPr>
+      <w:rPr>
+        <w:rFonts w:ascii="Wingdings" w:hAnsi="Wingdings" w:hint="default"/>
+        <w:sz w:val="20"/>
+      </w:rPr>
+    </w:lvl>
+    <w:lvl w:ilvl="6" w:tentative="1">
+      <w:start w:val="1"/>
+      <w:numFmt w:val="bullet"/>
+      <w:lvlText w:val=""/>
+      <w:lvlJc w:val="left"/>
+      <w:pPr>
+        <w:tabs>
+          <w:tab w:val="num" w:pos="5040"/>
+        </w:tabs>
+        <w:ind w:left="5040" w:hanging="360"/>
+      </w:pPr>
+      <w:rPr>
+        <w:rFonts w:ascii="Wingdings" w:hAnsi="Wingdings" w:hint="default"/>
+        <w:sz w:val="20"/>
+      </w:rPr>
+    </w:lvl>
+    <w:lvl w:ilvl="7" w:tentative="1">
+      <w:start w:val="1"/>
+      <w:numFmt w:val="bullet"/>
+      <w:lvlText w:val=""/>
+      <w:lvlJc w:val="left"/>
+      <w:pPr>
+        <w:tabs>
+          <w:tab w:val="num" w:pos="5760"/>
+        </w:tabs>
+        <w:ind w:left="5760" w:hanging="360"/>
+      </w:pPr>
+      <w:rPr>
+        <w:rFonts w:ascii="Wingdings" w:hAnsi="Wingdings" w:hint="default"/>
+        <w:sz w:val="20"/>
+      </w:rPr>
+    </w:lvl>
+    <w:lvl w:ilvl="8" w:tentative="1">
+      <w:start w:val="1"/>
+      <w:numFmt w:val="bullet"/>
+      <w:lvlText w:val=""/>
+      <w:lvlJc w:val="left"/>
+      <w:pPr>
+        <w:tabs>
+          <w:tab w:val="num" w:pos="6480"/>
+        </w:tabs>
+        <w:ind w:left="6480" w:hanging="360"/>
+      </w:pPr>
+      <w:rPr>
+        <w:rFonts w:ascii="Wingdings" w:hAnsi="Wingdings" w:hint="default"/>
+        <w:sz w:val="20"/>
+      </w:rPr>
+    </w:lvl>
+  </w:abstractNum>
+  <w:abstractNum w:abstractNumId="19" w15:restartNumberingAfterBreak="0">
     <w:nsid w:val="50005FC3"/>
     <w:multiLevelType w:val="multilevel"/>
     <w:tmpl w:val="2D020F3A"/>
@@ -5824,7 +7610,7 @@
       </w:rPr>
     </w:lvl>
   </w:abstractNum>
-  <w:abstractNum w:abstractNumId="15" w15:restartNumberingAfterBreak="0">
+  <w:abstractNum w:abstractNumId="20" w15:restartNumberingAfterBreak="0">
     <w:nsid w:val="51D93193"/>
     <w:multiLevelType w:val="multilevel"/>
     <w:tmpl w:val="42A62AE0"/>
@@ -5973,7 +7759,7 @@
       </w:rPr>
     </w:lvl>
   </w:abstractNum>
-  <w:abstractNum w:abstractNumId="16" w15:restartNumberingAfterBreak="0">
+  <w:abstractNum w:abstractNumId="21" w15:restartNumberingAfterBreak="0">
     <w:nsid w:val="53FD5395"/>
     <w:multiLevelType w:val="hybridMultilevel"/>
     <w:tmpl w:val="6DB679FC"/>
@@ -6063,7 +7849,7 @@
       </w:pPr>
     </w:lvl>
   </w:abstractNum>
-  <w:abstractNum w:abstractNumId="17" w15:restartNumberingAfterBreak="0">
+  <w:abstractNum w:abstractNumId="22" w15:restartNumberingAfterBreak="0">
     <w:nsid w:val="59FD1723"/>
     <w:multiLevelType w:val="hybridMultilevel"/>
     <w:tmpl w:val="8990CF0E"/>
@@ -6203,7 +7989,7 @@
       </w:rPr>
     </w:lvl>
   </w:abstractNum>
-  <w:abstractNum w:abstractNumId="18" w15:restartNumberingAfterBreak="0">
+  <w:abstractNum w:abstractNumId="23" w15:restartNumberingAfterBreak="0">
     <w:nsid w:val="5DF9585A"/>
     <w:multiLevelType w:val="hybridMultilevel"/>
     <w:tmpl w:val="9E2EF62C"/>
@@ -6316,7 +8102,7 @@
       </w:rPr>
     </w:lvl>
   </w:abstractNum>
-  <w:abstractNum w:abstractNumId="19" w15:restartNumberingAfterBreak="0">
+  <w:abstractNum w:abstractNumId="24" w15:restartNumberingAfterBreak="0">
     <w:nsid w:val="62E06CD4"/>
     <w:multiLevelType w:val="multilevel"/>
     <w:tmpl w:val="BC744DD2"/>
@@ -6465,7 +8251,156 @@
       </w:rPr>
     </w:lvl>
   </w:abstractNum>
-  <w:abstractNum w:abstractNumId="20" w15:restartNumberingAfterBreak="0">
+  <w:abstractNum w:abstractNumId="25" w15:restartNumberingAfterBreak="0">
+    <w:nsid w:val="64432552"/>
+    <w:multiLevelType w:val="multilevel"/>
+    <w:tmpl w:val="017C6C5E"/>
+    <w:lvl w:ilvl="0">
+      <w:start w:val="1"/>
+      <w:numFmt w:val="bullet"/>
+      <w:lvlText w:val=""/>
+      <w:lvlJc w:val="left"/>
+      <w:pPr>
+        <w:tabs>
+          <w:tab w:val="num" w:pos="720"/>
+        </w:tabs>
+        <w:ind w:left="720" w:hanging="360"/>
+      </w:pPr>
+      <w:rPr>
+        <w:rFonts w:ascii="Symbol" w:hAnsi="Symbol" w:hint="default"/>
+        <w:sz w:val="20"/>
+      </w:rPr>
+    </w:lvl>
+    <w:lvl w:ilvl="1" w:tentative="1">
+      <w:start w:val="1"/>
+      <w:numFmt w:val="bullet"/>
+      <w:lvlText w:val="o"/>
+      <w:lvlJc w:val="left"/>
+      <w:pPr>
+        <w:tabs>
+          <w:tab w:val="num" w:pos="1440"/>
+        </w:tabs>
+        <w:ind w:left="1440" w:hanging="360"/>
+      </w:pPr>
+      <w:rPr>
+        <w:rFonts w:ascii="Courier New" w:hAnsi="Courier New" w:hint="default"/>
+        <w:sz w:val="20"/>
+      </w:rPr>
+    </w:lvl>
+    <w:lvl w:ilvl="2" w:tentative="1">
+      <w:start w:val="1"/>
+      <w:numFmt w:val="bullet"/>
+      <w:lvlText w:val=""/>
+      <w:lvlJc w:val="left"/>
+      <w:pPr>
+        <w:tabs>
+          <w:tab w:val="num" w:pos="2160"/>
+        </w:tabs>
+        <w:ind w:left="2160" w:hanging="360"/>
+      </w:pPr>
+      <w:rPr>
+        <w:rFonts w:ascii="Wingdings" w:hAnsi="Wingdings" w:hint="default"/>
+        <w:sz w:val="20"/>
+      </w:rPr>
+    </w:lvl>
+    <w:lvl w:ilvl="3" w:tentative="1">
+      <w:start w:val="1"/>
+      <w:numFmt w:val="bullet"/>
+      <w:lvlText w:val=""/>
+      <w:lvlJc w:val="left"/>
+      <w:pPr>
+        <w:tabs>
+          <w:tab w:val="num" w:pos="2880"/>
+        </w:tabs>
+        <w:ind w:left="2880" w:hanging="360"/>
+      </w:pPr>
+      <w:rPr>
+        <w:rFonts w:ascii="Wingdings" w:hAnsi="Wingdings" w:hint="default"/>
+        <w:sz w:val="20"/>
+      </w:rPr>
+    </w:lvl>
+    <w:lvl w:ilvl="4" w:tentative="1">
+      <w:start w:val="1"/>
+      <w:numFmt w:val="bullet"/>
+      <w:lvlText w:val=""/>
+      <w:lvlJc w:val="left"/>
+      <w:pPr>
+        <w:tabs>
+          <w:tab w:val="num" w:pos="3600"/>
+        </w:tabs>
+        <w:ind w:left="3600" w:hanging="360"/>
+      </w:pPr>
+      <w:rPr>
+        <w:rFonts w:ascii="Wingdings" w:hAnsi="Wingdings" w:hint="default"/>
+        <w:sz w:val="20"/>
+      </w:rPr>
+    </w:lvl>
+    <w:lvl w:ilvl="5" w:tentative="1">
+      <w:start w:val="1"/>
+      <w:numFmt w:val="bullet"/>
+      <w:lvlText w:val=""/>
+      <w:lvlJc w:val="left"/>
+      <w:pPr>
+        <w:tabs>
+          <w:tab w:val="num" w:pos="4320"/>
+        </w:tabs>
+        <w:ind w:left="4320" w:hanging="360"/>
+      </w:pPr>
+      <w:rPr>
+        <w:rFonts w:ascii="Wingdings" w:hAnsi="Wingdings" w:hint="default"/>
+        <w:sz w:val="20"/>
+      </w:rPr>
+    </w:lvl>
+    <w:lvl w:ilvl="6" w:tentative="1">
+      <w:start w:val="1"/>
+      <w:numFmt w:val="bullet"/>
+      <w:lvlText w:val=""/>
+      <w:lvlJc w:val="left"/>
+      <w:pPr>
+        <w:tabs>
+          <w:tab w:val="num" w:pos="5040"/>
+        </w:tabs>
+        <w:ind w:left="5040" w:hanging="360"/>
+      </w:pPr>
+      <w:rPr>
+        <w:rFonts w:ascii="Wingdings" w:hAnsi="Wingdings" w:hint="default"/>
+        <w:sz w:val="20"/>
+      </w:rPr>
+    </w:lvl>
+    <w:lvl w:ilvl="7" w:tentative="1">
+      <w:start w:val="1"/>
+      <w:numFmt w:val="bullet"/>
+      <w:lvlText w:val=""/>
+      <w:lvlJc w:val="left"/>
+      <w:pPr>
+        <w:tabs>
+          <w:tab w:val="num" w:pos="5760"/>
+        </w:tabs>
+        <w:ind w:left="5760" w:hanging="360"/>
+      </w:pPr>
+      <w:rPr>
+        <w:rFonts w:ascii="Wingdings" w:hAnsi="Wingdings" w:hint="default"/>
+        <w:sz w:val="20"/>
+      </w:rPr>
+    </w:lvl>
+    <w:lvl w:ilvl="8" w:tentative="1">
+      <w:start w:val="1"/>
+      <w:numFmt w:val="bullet"/>
+      <w:lvlText w:val=""/>
+      <w:lvlJc w:val="left"/>
+      <w:pPr>
+        <w:tabs>
+          <w:tab w:val="num" w:pos="6480"/>
+        </w:tabs>
+        <w:ind w:left="6480" w:hanging="360"/>
+      </w:pPr>
+      <w:rPr>
+        <w:rFonts w:ascii="Wingdings" w:hAnsi="Wingdings" w:hint="default"/>
+        <w:sz w:val="20"/>
+      </w:rPr>
+    </w:lvl>
+  </w:abstractNum>
+  <w:abstractNum w:abstractNumId="26" w15:restartNumberingAfterBreak="0">
     <w:nsid w:val="664646E2"/>
     <w:multiLevelType w:val="hybridMultilevel"/>
     <w:tmpl w:val="96EAF268"/>
@@ -6554,7 +8489,156 @@
       </w:pPr>
     </w:lvl>
   </w:abstractNum>
-  <w:abstractNum w:abstractNumId="21" w15:restartNumberingAfterBreak="0">
+  <w:abstractNum w:abstractNumId="27" w15:restartNumberingAfterBreak="0">
+    <w:nsid w:val="67433525"/>
+    <w:multiLevelType w:val="multilevel"/>
+    <w:tmpl w:val="2A16015A"/>
+    <w:lvl w:ilvl="0">
+      <w:start w:val="1"/>
+      <w:numFmt w:val="bullet"/>
+      <w:lvlText w:val=""/>
+      <w:lvlJc w:val="left"/>
+      <w:pPr>
+        <w:tabs>
+          <w:tab w:val="num" w:pos="720"/>
+        </w:tabs>
+        <w:ind w:left="720" w:hanging="360"/>
+      </w:pPr>
+      <w:rPr>
+        <w:rFonts w:ascii="Symbol" w:hAnsi="Symbol" w:hint="default"/>
+        <w:sz w:val="20"/>
+      </w:rPr>
+    </w:lvl>
+    <w:lvl w:ilvl="1" w:tentative="1">
+      <w:start w:val="1"/>
+      <w:numFmt w:val="bullet"/>
+      <w:lvlText w:val="o"/>
+      <w:lvlJc w:val="left"/>
+      <w:pPr>
+        <w:tabs>
+          <w:tab w:val="num" w:pos="1440"/>
+        </w:tabs>
+        <w:ind w:left="1440" w:hanging="360"/>
+      </w:pPr>
+      <w:rPr>
+        <w:rFonts w:ascii="Courier New" w:hAnsi="Courier New" w:hint="default"/>
+        <w:sz w:val="20"/>
+      </w:rPr>
+    </w:lvl>
+    <w:lvl w:ilvl="2" w:tentative="1">
+      <w:start w:val="1"/>
+      <w:numFmt w:val="bullet"/>
+      <w:lvlText w:val=""/>
+      <w:lvlJc w:val="left"/>
+      <w:pPr>
+        <w:tabs>
+          <w:tab w:val="num" w:pos="2160"/>
+        </w:tabs>
+        <w:ind w:left="2160" w:hanging="360"/>
+      </w:pPr>
+      <w:rPr>
+        <w:rFonts w:ascii="Wingdings" w:hAnsi="Wingdings" w:hint="default"/>
+        <w:sz w:val="20"/>
+      </w:rPr>
+    </w:lvl>
+    <w:lvl w:ilvl="3" w:tentative="1">
+      <w:start w:val="1"/>
+      <w:numFmt w:val="bullet"/>
+      <w:lvlText w:val=""/>
+      <w:lvlJc w:val="left"/>
+      <w:pPr>
+        <w:tabs>
+          <w:tab w:val="num" w:pos="2880"/>
+        </w:tabs>
+        <w:ind w:left="2880" w:hanging="360"/>
+      </w:pPr>
+      <w:rPr>
+        <w:rFonts w:ascii="Wingdings" w:hAnsi="Wingdings" w:hint="default"/>
+        <w:sz w:val="20"/>
+      </w:rPr>
+    </w:lvl>
+    <w:lvl w:ilvl="4" w:tentative="1">
+      <w:start w:val="1"/>
+      <w:numFmt w:val="bullet"/>
+      <w:lvlText w:val=""/>
+      <w:lvlJc w:val="left"/>
+      <w:pPr>
+        <w:tabs>
+          <w:tab w:val="num" w:pos="3600"/>
+        </w:tabs>
+        <w:ind w:left="3600" w:hanging="360"/>
+      </w:pPr>
+      <w:rPr>
+        <w:rFonts w:ascii="Wingdings" w:hAnsi="Wingdings" w:hint="default"/>
+        <w:sz w:val="20"/>
+      </w:rPr>
+    </w:lvl>
+    <w:lvl w:ilvl="5" w:tentative="1">
+      <w:start w:val="1"/>
+      <w:numFmt w:val="bullet"/>
+      <w:lvlText w:val=""/>
+      <w:lvlJc w:val="left"/>
+      <w:pPr>
+        <w:tabs>
+          <w:tab w:val="num" w:pos="4320"/>
+        </w:tabs>
+        <w:ind w:left="4320" w:hanging="360"/>
+      </w:pPr>
+      <w:rPr>
+        <w:rFonts w:ascii="Wingdings" w:hAnsi="Wingdings" w:hint="default"/>
+        <w:sz w:val="20"/>
+      </w:rPr>
+    </w:lvl>
+    <w:lvl w:ilvl="6" w:tentative="1">
+      <w:start w:val="1"/>
+      <w:numFmt w:val="bullet"/>
+      <w:lvlText w:val=""/>
+      <w:lvlJc w:val="left"/>
+      <w:pPr>
+        <w:tabs>
+          <w:tab w:val="num" w:pos="5040"/>
+        </w:tabs>
+        <w:ind w:left="5040" w:hanging="360"/>
+      </w:pPr>
+      <w:rPr>
+        <w:rFonts w:ascii="Wingdings" w:hAnsi="Wingdings" w:hint="default"/>
+        <w:sz w:val="20"/>
+      </w:rPr>
+    </w:lvl>
+    <w:lvl w:ilvl="7" w:tentative="1">
+      <w:start w:val="1"/>
+      <w:numFmt w:val="bullet"/>
+      <w:lvlText w:val=""/>
+      <w:lvlJc w:val="left"/>
+      <w:pPr>
+        <w:tabs>
+          <w:tab w:val="num" w:pos="5760"/>
+        </w:tabs>
+        <w:ind w:left="5760" w:hanging="360"/>
+      </w:pPr>
+      <w:rPr>
+        <w:rFonts w:ascii="Wingdings" w:hAnsi="Wingdings" w:hint="default"/>
+        <w:sz w:val="20"/>
+      </w:rPr>
+    </w:lvl>
+    <w:lvl w:ilvl="8" w:tentative="1">
+      <w:start w:val="1"/>
+      <w:numFmt w:val="bullet"/>
+      <w:lvlText w:val=""/>
+      <w:lvlJc w:val="left"/>
+      <w:pPr>
+        <w:tabs>
+          <w:tab w:val="num" w:pos="6480"/>
+        </w:tabs>
+        <w:ind w:left="6480" w:hanging="360"/>
+      </w:pPr>
+      <w:rPr>
+        <w:rFonts w:ascii="Wingdings" w:hAnsi="Wingdings" w:hint="default"/>
+        <w:sz w:val="20"/>
+      </w:rPr>
+    </w:lvl>
+  </w:abstractNum>
+  <w:abstractNum w:abstractNumId="28" w15:restartNumberingAfterBreak="0">
     <w:nsid w:val="6B5D0B43"/>
     <w:multiLevelType w:val="multilevel"/>
     <w:tmpl w:val="78306F24"/>
@@ -6703,7 +8787,7 @@
       </w:rPr>
     </w:lvl>
   </w:abstractNum>
-  <w:abstractNum w:abstractNumId="22" w15:restartNumberingAfterBreak="0">
+  <w:abstractNum w:abstractNumId="29" w15:restartNumberingAfterBreak="0">
     <w:nsid w:val="6BCC3DFC"/>
     <w:multiLevelType w:val="multilevel"/>
     <w:tmpl w:val="5C04A06A"/>
@@ -6852,7 +8936,454 @@
       </w:rPr>
     </w:lvl>
   </w:abstractNum>
-  <w:abstractNum w:abstractNumId="23" w15:restartNumberingAfterBreak="0">
+  <w:abstractNum w:abstractNumId="30" w15:restartNumberingAfterBreak="0">
+    <w:nsid w:val="6C43213F"/>
+    <w:multiLevelType w:val="multilevel"/>
+    <w:tmpl w:val="58505F92"/>
+    <w:lvl w:ilvl="0">
+      <w:start w:val="1"/>
+      <w:numFmt w:val="bullet"/>
+      <w:lvlText w:val=""/>
+      <w:lvlJc w:val="left"/>
+      <w:pPr>
+        <w:tabs>
+          <w:tab w:val="num" w:pos="720"/>
+        </w:tabs>
+        <w:ind w:left="720" w:hanging="360"/>
+      </w:pPr>
+      <w:rPr>
+        <w:rFonts w:ascii="Symbol" w:hAnsi="Symbol" w:hint="default"/>
+        <w:sz w:val="20"/>
+      </w:rPr>
+    </w:lvl>
+    <w:lvl w:ilvl="1" w:tentative="1">
+      <w:start w:val="1"/>
+      <w:numFmt w:val="bullet"/>
+      <w:lvlText w:val="o"/>
+      <w:lvlJc w:val="left"/>
+      <w:pPr>
+        <w:tabs>
+          <w:tab w:val="num" w:pos="1440"/>
+        </w:tabs>
+        <w:ind w:left="1440" w:hanging="360"/>
+      </w:pPr>
+      <w:rPr>
+        <w:rFonts w:ascii="Courier New" w:hAnsi="Courier New" w:hint="default"/>
+        <w:sz w:val="20"/>
+      </w:rPr>
+    </w:lvl>
+    <w:lvl w:ilvl="2" w:tentative="1">
+      <w:start w:val="1"/>
+      <w:numFmt w:val="bullet"/>
+      <w:lvlText w:val=""/>
+      <w:lvlJc w:val="left"/>
+      <w:pPr>
+        <w:tabs>
+          <w:tab w:val="num" w:pos="2160"/>
+        </w:tabs>
+        <w:ind w:left="2160" w:hanging="360"/>
+      </w:pPr>
+      <w:rPr>
+        <w:rFonts w:ascii="Wingdings" w:hAnsi="Wingdings" w:hint="default"/>
+        <w:sz w:val="20"/>
+      </w:rPr>
+    </w:lvl>
+    <w:lvl w:ilvl="3" w:tentative="1">
+      <w:start w:val="1"/>
+      <w:numFmt w:val="bullet"/>
+      <w:lvlText w:val=""/>
+      <w:lvlJc w:val="left"/>
+      <w:pPr>
+        <w:tabs>
+          <w:tab w:val="num" w:pos="2880"/>
+        </w:tabs>
+        <w:ind w:left="2880" w:hanging="360"/>
+      </w:pPr>
+      <w:rPr>
+        <w:rFonts w:ascii="Wingdings" w:hAnsi="Wingdings" w:hint="default"/>
+        <w:sz w:val="20"/>
+      </w:rPr>
+    </w:lvl>
+    <w:lvl w:ilvl="4" w:tentative="1">
+      <w:start w:val="1"/>
+      <w:numFmt w:val="bullet"/>
+      <w:lvlText w:val=""/>
+      <w:lvlJc w:val="left"/>
+      <w:pPr>
+        <w:tabs>
+          <w:tab w:val="num" w:pos="3600"/>
+        </w:tabs>
+        <w:ind w:left="3600" w:hanging="360"/>
+      </w:pPr>
+      <w:rPr>
+        <w:rFonts w:ascii="Wingdings" w:hAnsi="Wingdings" w:hint="default"/>
+        <w:sz w:val="20"/>
+      </w:rPr>
+    </w:lvl>
+    <w:lvl w:ilvl="5" w:tentative="1">
+      <w:start w:val="1"/>
+      <w:numFmt w:val="bullet"/>
+      <w:lvlText w:val=""/>
+      <w:lvlJc w:val="left"/>
+      <w:pPr>
+        <w:tabs>
+          <w:tab w:val="num" w:pos="4320"/>
+        </w:tabs>
+        <w:ind w:left="4320" w:hanging="360"/>
+      </w:pPr>
+      <w:rPr>
+        <w:rFonts w:ascii="Wingdings" w:hAnsi="Wingdings" w:hint="default"/>
+        <w:sz w:val="20"/>
+      </w:rPr>
+    </w:lvl>
+    <w:lvl w:ilvl="6" w:tentative="1">
+      <w:start w:val="1"/>
+      <w:numFmt w:val="bullet"/>
+      <w:lvlText w:val=""/>
+      <w:lvlJc w:val="left"/>
+      <w:pPr>
+        <w:tabs>
+          <w:tab w:val="num" w:pos="5040"/>
+        </w:tabs>
+        <w:ind w:left="5040" w:hanging="360"/>
+      </w:pPr>
+      <w:rPr>
+        <w:rFonts w:ascii="Wingdings" w:hAnsi="Wingdings" w:hint="default"/>
+        <w:sz w:val="20"/>
+      </w:rPr>
+    </w:lvl>
+    <w:lvl w:ilvl="7" w:tentative="1">
+      <w:start w:val="1"/>
+      <w:numFmt w:val="bullet"/>
+      <w:lvlText w:val=""/>
+      <w:lvlJc w:val="left"/>
+      <w:pPr>
+        <w:tabs>
+          <w:tab w:val="num" w:pos="5760"/>
+        </w:tabs>
+        <w:ind w:left="5760" w:hanging="360"/>
+      </w:pPr>
+      <w:rPr>
+        <w:rFonts w:ascii="Wingdings" w:hAnsi="Wingdings" w:hint="default"/>
+        <w:sz w:val="20"/>
+      </w:rPr>
+    </w:lvl>
+    <w:lvl w:ilvl="8" w:tentative="1">
+      <w:start w:val="1"/>
+      <w:numFmt w:val="bullet"/>
+      <w:lvlText w:val=""/>
+      <w:lvlJc w:val="left"/>
+      <w:pPr>
+        <w:tabs>
+          <w:tab w:val="num" w:pos="6480"/>
+        </w:tabs>
+        <w:ind w:left="6480" w:hanging="360"/>
+      </w:pPr>
+      <w:rPr>
+        <w:rFonts w:ascii="Wingdings" w:hAnsi="Wingdings" w:hint="default"/>
+        <w:sz w:val="20"/>
+      </w:rPr>
+    </w:lvl>
+  </w:abstractNum>
+  <w:abstractNum w:abstractNumId="31" w15:restartNumberingAfterBreak="0">
+    <w:nsid w:val="6D313DE9"/>
+    <w:multiLevelType w:val="multilevel"/>
+    <w:tmpl w:val="C4381506"/>
+    <w:lvl w:ilvl="0">
+      <w:start w:val="1"/>
+      <w:numFmt w:val="bullet"/>
+      <w:lvlText w:val=""/>
+      <w:lvlJc w:val="left"/>
+      <w:pPr>
+        <w:tabs>
+          <w:tab w:val="num" w:pos="720"/>
+        </w:tabs>
+        <w:ind w:left="720" w:hanging="360"/>
+      </w:pPr>
+      <w:rPr>
+        <w:rFonts w:ascii="Symbol" w:hAnsi="Symbol" w:hint="default"/>
+        <w:sz w:val="20"/>
+      </w:rPr>
+    </w:lvl>
+    <w:lvl w:ilvl="1" w:tentative="1">
+      <w:start w:val="1"/>
+      <w:numFmt w:val="bullet"/>
+      <w:lvlText w:val="o"/>
+      <w:lvlJc w:val="left"/>
+      <w:pPr>
+        <w:tabs>
+          <w:tab w:val="num" w:pos="1440"/>
+        </w:tabs>
+        <w:ind w:left="1440" w:hanging="360"/>
+      </w:pPr>
+      <w:rPr>
+        <w:rFonts w:ascii="Courier New" w:hAnsi="Courier New" w:hint="default"/>
+        <w:sz w:val="20"/>
+      </w:rPr>
+    </w:lvl>
+    <w:lvl w:ilvl="2" w:tentative="1">
+      <w:start w:val="1"/>
+      <w:numFmt w:val="bullet"/>
+      <w:lvlText w:val=""/>
+      <w:lvlJc w:val="left"/>
+      <w:pPr>
+        <w:tabs>
+          <w:tab w:val="num" w:pos="2160"/>
+        </w:tabs>
+        <w:ind w:left="2160" w:hanging="360"/>
+      </w:pPr>
+      <w:rPr>
+        <w:rFonts w:ascii="Wingdings" w:hAnsi="Wingdings" w:hint="default"/>
+        <w:sz w:val="20"/>
+      </w:rPr>
+    </w:lvl>
+    <w:lvl w:ilvl="3" w:tentative="1">
+      <w:start w:val="1"/>
+      <w:numFmt w:val="bullet"/>
+      <w:lvlText w:val=""/>
+      <w:lvlJc w:val="left"/>
+      <w:pPr>
+        <w:tabs>
+          <w:tab w:val="num" w:pos="2880"/>
+        </w:tabs>
+        <w:ind w:left="2880" w:hanging="360"/>
+      </w:pPr>
+      <w:rPr>
+        <w:rFonts w:ascii="Wingdings" w:hAnsi="Wingdings" w:hint="default"/>
+        <w:sz w:val="20"/>
+      </w:rPr>
+    </w:lvl>
+    <w:lvl w:ilvl="4" w:tentative="1">
+      <w:start w:val="1"/>
+      <w:numFmt w:val="bullet"/>
+      <w:lvlText w:val=""/>
+      <w:lvlJc w:val="left"/>
+      <w:pPr>
+        <w:tabs>
+          <w:tab w:val="num" w:pos="3600"/>
+        </w:tabs>
+        <w:ind w:left="3600" w:hanging="360"/>
+      </w:pPr>
+      <w:rPr>
+        <w:rFonts w:ascii="Wingdings" w:hAnsi="Wingdings" w:hint="default"/>
+        <w:sz w:val="20"/>
+      </w:rPr>
+    </w:lvl>
+    <w:lvl w:ilvl="5" w:tentative="1">
+      <w:start w:val="1"/>
+      <w:numFmt w:val="bullet"/>
+      <w:lvlText w:val=""/>
+      <w:lvlJc w:val="left"/>
+      <w:pPr>
+        <w:tabs>
+          <w:tab w:val="num" w:pos="4320"/>
+        </w:tabs>
+        <w:ind w:left="4320" w:hanging="360"/>
+      </w:pPr>
+      <w:rPr>
+        <w:rFonts w:ascii="Wingdings" w:hAnsi="Wingdings" w:hint="default"/>
+        <w:sz w:val="20"/>
+      </w:rPr>
+    </w:lvl>
+    <w:lvl w:ilvl="6" w:tentative="1">
+      <w:start w:val="1"/>
+      <w:numFmt w:val="bullet"/>
+      <w:lvlText w:val=""/>
+      <w:lvlJc w:val="left"/>
+      <w:pPr>
+        <w:tabs>
+          <w:tab w:val="num" w:pos="5040"/>
+        </w:tabs>
+        <w:ind w:left="5040" w:hanging="360"/>
+      </w:pPr>
+      <w:rPr>
+        <w:rFonts w:ascii="Wingdings" w:hAnsi="Wingdings" w:hint="default"/>
+        <w:sz w:val="20"/>
+      </w:rPr>
+    </w:lvl>
+    <w:lvl w:ilvl="7" w:tentative="1">
+      <w:start w:val="1"/>
+      <w:numFmt w:val="bullet"/>
+      <w:lvlText w:val=""/>
+      <w:lvlJc w:val="left"/>
+      <w:pPr>
+        <w:tabs>
+          <w:tab w:val="num" w:pos="5760"/>
+        </w:tabs>
+        <w:ind w:left="5760" w:hanging="360"/>
+      </w:pPr>
+      <w:rPr>
+        <w:rFonts w:ascii="Wingdings" w:hAnsi="Wingdings" w:hint="default"/>
+        <w:sz w:val="20"/>
+      </w:rPr>
+    </w:lvl>
+    <w:lvl w:ilvl="8" w:tentative="1">
+      <w:start w:val="1"/>
+      <w:numFmt w:val="bullet"/>
+      <w:lvlText w:val=""/>
+      <w:lvlJc w:val="left"/>
+      <w:pPr>
+        <w:tabs>
+          <w:tab w:val="num" w:pos="6480"/>
+        </w:tabs>
+        <w:ind w:left="6480" w:hanging="360"/>
+      </w:pPr>
+      <w:rPr>
+        <w:rFonts w:ascii="Wingdings" w:hAnsi="Wingdings" w:hint="default"/>
+        <w:sz w:val="20"/>
+      </w:rPr>
+    </w:lvl>
+  </w:abstractNum>
+  <w:abstractNum w:abstractNumId="32" w15:restartNumberingAfterBreak="0">
+    <w:nsid w:val="6E0F14AA"/>
+    <w:multiLevelType w:val="multilevel"/>
+    <w:tmpl w:val="C5FE1D48"/>
+    <w:lvl w:ilvl="0">
+      <w:start w:val="1"/>
+      <w:numFmt w:val="bullet"/>
+      <w:lvlText w:val=""/>
+      <w:lvlJc w:val="left"/>
+      <w:pPr>
+        <w:tabs>
+          <w:tab w:val="num" w:pos="720"/>
+        </w:tabs>
+        <w:ind w:left="720" w:hanging="360"/>
+      </w:pPr>
+      <w:rPr>
+        <w:rFonts w:ascii="Symbol" w:hAnsi="Symbol" w:hint="default"/>
+        <w:sz w:val="20"/>
+      </w:rPr>
+    </w:lvl>
+    <w:lvl w:ilvl="1" w:tentative="1">
+      <w:start w:val="1"/>
+      <w:numFmt w:val="bullet"/>
+      <w:lvlText w:val="o"/>
+      <w:lvlJc w:val="left"/>
+      <w:pPr>
+        <w:tabs>
+          <w:tab w:val="num" w:pos="1440"/>
+        </w:tabs>
+        <w:ind w:left="1440" w:hanging="360"/>
+      </w:pPr>
+      <w:rPr>
+        <w:rFonts w:ascii="Courier New" w:hAnsi="Courier New" w:hint="default"/>
+        <w:sz w:val="20"/>
+      </w:rPr>
+    </w:lvl>
+    <w:lvl w:ilvl="2" w:tentative="1">
+      <w:start w:val="1"/>
+      <w:numFmt w:val="bullet"/>
+      <w:lvlText w:val=""/>
+      <w:lvlJc w:val="left"/>
+      <w:pPr>
+        <w:tabs>
+          <w:tab w:val="num" w:pos="2160"/>
+        </w:tabs>
+        <w:ind w:left="2160" w:hanging="360"/>
+      </w:pPr>
+      <w:rPr>
+        <w:rFonts w:ascii="Wingdings" w:hAnsi="Wingdings" w:hint="default"/>
+        <w:sz w:val="20"/>
+      </w:rPr>
+    </w:lvl>
+    <w:lvl w:ilvl="3" w:tentative="1">
+      <w:start w:val="1"/>
+      <w:numFmt w:val="bullet"/>
+      <w:lvlText w:val=""/>
+      <w:lvlJc w:val="left"/>
+      <w:pPr>
+        <w:tabs>
+          <w:tab w:val="num" w:pos="2880"/>
+        </w:tabs>
+        <w:ind w:left="2880" w:hanging="360"/>
+      </w:pPr>
+      <w:rPr>
+        <w:rFonts w:ascii="Wingdings" w:hAnsi="Wingdings" w:hint="default"/>
+        <w:sz w:val="20"/>
+      </w:rPr>
+    </w:lvl>
+    <w:lvl w:ilvl="4" w:tentative="1">
+      <w:start w:val="1"/>
+      <w:numFmt w:val="bullet"/>
+      <w:lvlText w:val=""/>
+      <w:lvlJc w:val="left"/>
+      <w:pPr>
+        <w:tabs>
+          <w:tab w:val="num" w:pos="3600"/>
+        </w:tabs>
+        <w:ind w:left="3600" w:hanging="360"/>
+      </w:pPr>
+      <w:rPr>
+        <w:rFonts w:ascii="Wingdings" w:hAnsi="Wingdings" w:hint="default"/>
+        <w:sz w:val="20"/>
+      </w:rPr>
+    </w:lvl>
+    <w:lvl w:ilvl="5" w:tentative="1">
+      <w:start w:val="1"/>
+      <w:numFmt w:val="bullet"/>
+      <w:lvlText w:val=""/>
+      <w:lvlJc w:val="left"/>
+      <w:pPr>
+        <w:tabs>
+          <w:tab w:val="num" w:pos="4320"/>
+        </w:tabs>
+        <w:ind w:left="4320" w:hanging="360"/>
+      </w:pPr>
+      <w:rPr>
+        <w:rFonts w:ascii="Wingdings" w:hAnsi="Wingdings" w:hint="default"/>
+        <w:sz w:val="20"/>
+      </w:rPr>
+    </w:lvl>
+    <w:lvl w:ilvl="6" w:tentative="1">
+      <w:start w:val="1"/>
+      <w:numFmt w:val="bullet"/>
+      <w:lvlText w:val=""/>
+      <w:lvlJc w:val="left"/>
+      <w:pPr>
+        <w:tabs>
+          <w:tab w:val="num" w:pos="5040"/>
+        </w:tabs>
+        <w:ind w:left="5040" w:hanging="360"/>
+      </w:pPr>
+      <w:rPr>
+        <w:rFonts w:ascii="Wingdings" w:hAnsi="Wingdings" w:hint="default"/>
+        <w:sz w:val="20"/>
+      </w:rPr>
+    </w:lvl>
+    <w:lvl w:ilvl="7" w:tentative="1">
+      <w:start w:val="1"/>
+      <w:numFmt w:val="bullet"/>
+      <w:lvlText w:val=""/>
+      <w:lvlJc w:val="left"/>
+      <w:pPr>
+        <w:tabs>
+          <w:tab w:val="num" w:pos="5760"/>
+        </w:tabs>
+        <w:ind w:left="5760" w:hanging="360"/>
+      </w:pPr>
+      <w:rPr>
+        <w:rFonts w:ascii="Wingdings" w:hAnsi="Wingdings" w:hint="default"/>
+        <w:sz w:val="20"/>
+      </w:rPr>
+    </w:lvl>
+    <w:lvl w:ilvl="8" w:tentative="1">
+      <w:start w:val="1"/>
+      <w:numFmt w:val="bullet"/>
+      <w:lvlText w:val=""/>
+      <w:lvlJc w:val="left"/>
+      <w:pPr>
+        <w:tabs>
+          <w:tab w:val="num" w:pos="6480"/>
+        </w:tabs>
+        <w:ind w:left="6480" w:hanging="360"/>
+      </w:pPr>
+      <w:rPr>
+        <w:rFonts w:ascii="Wingdings" w:hAnsi="Wingdings" w:hint="default"/>
+        <w:sz w:val="20"/>
+      </w:rPr>
+    </w:lvl>
+  </w:abstractNum>
+  <w:abstractNum w:abstractNumId="33" w15:restartNumberingAfterBreak="0">
     <w:nsid w:val="79BF5A33"/>
     <w:multiLevelType w:val="hybridMultilevel"/>
     <w:tmpl w:val="F466ABF6"/>
@@ -6941,7 +9472,7 @@
       </w:pPr>
     </w:lvl>
   </w:abstractNum>
-  <w:abstractNum w:abstractNumId="24" w15:restartNumberingAfterBreak="0">
+  <w:abstractNum w:abstractNumId="34" w15:restartNumberingAfterBreak="0">
     <w:nsid w:val="7B763A57"/>
     <w:multiLevelType w:val="multilevel"/>
     <w:tmpl w:val="99083A42"/>
@@ -7091,34 +9622,34 @@
     </w:lvl>
   </w:abstractNum>
   <w:num w:numId="1">
+    <w:abstractNumId w:val="33"/>
+  </w:num>
+  <w:num w:numId="2">
+    <w:abstractNumId w:val="11"/>
+  </w:num>
+  <w:num w:numId="3">
+    <w:abstractNumId w:val="22"/>
+  </w:num>
+  <w:num w:numId="4">
+    <w:abstractNumId w:val="26"/>
+  </w:num>
+  <w:num w:numId="5">
+    <w:abstractNumId w:val="21"/>
+  </w:num>
+  <w:num w:numId="6">
+    <w:abstractNumId w:val="6"/>
+  </w:num>
+  <w:num w:numId="7">
+    <w:abstractNumId w:val="10"/>
+  </w:num>
+  <w:num w:numId="8">
     <w:abstractNumId w:val="23"/>
   </w:num>
-  <w:num w:numId="2">
-    <w:abstractNumId w:val="9"/>
-  </w:num>
-  <w:num w:numId="3">
-    <w:abstractNumId w:val="17"/>
-  </w:num>
-  <w:num w:numId="4">
+  <w:num w:numId="9">
     <w:abstractNumId w:val="20"/>
   </w:num>
-  <w:num w:numId="5">
-    <w:abstractNumId w:val="16"/>
-  </w:num>
-  <w:num w:numId="6">
-    <w:abstractNumId w:val="5"/>
-  </w:num>
-  <w:num w:numId="7">
-    <w:abstractNumId w:val="8"/>
-  </w:num>
-  <w:num w:numId="8">
-    <w:abstractNumId w:val="18"/>
-  </w:num>
-  <w:num w:numId="9">
-    <w:abstractNumId w:val="15"/>
-  </w:num>
   <w:num w:numId="10">
-    <w:abstractNumId w:val="10"/>
+    <w:abstractNumId w:val="13"/>
   </w:num>
   <w:num w:numId="11">
     <w:abstractNumId w:val="1"/>
@@ -7127,28 +9658,28 @@
     <w:abstractNumId w:val="2"/>
   </w:num>
   <w:num w:numId="13">
-    <w:abstractNumId w:val="6"/>
+    <w:abstractNumId w:val="7"/>
   </w:num>
   <w:num w:numId="14">
     <w:abstractNumId w:val="4"/>
   </w:num>
   <w:num w:numId="15">
-    <w:abstractNumId w:val="12"/>
+    <w:abstractNumId w:val="16"/>
   </w:num>
   <w:num w:numId="16">
+    <w:abstractNumId w:val="34"/>
+  </w:num>
+  <w:num w:numId="17">
+    <w:abstractNumId w:val="9"/>
+  </w:num>
+  <w:num w:numId="18">
+    <w:abstractNumId w:val="28"/>
+  </w:num>
+  <w:num w:numId="19">
     <w:abstractNumId w:val="24"/>
   </w:num>
-  <w:num w:numId="17">
-    <w:abstractNumId w:val="7"/>
-  </w:num>
-  <w:num w:numId="18">
-    <w:abstractNumId w:val="21"/>
-  </w:num>
-  <w:num w:numId="19">
-    <w:abstractNumId w:val="19"/>
-  </w:num>
   <w:num w:numId="20">
-    <w:abstractNumId w:val="22"/>
+    <w:abstractNumId w:val="29"/>
   </w:num>
   <w:num w:numId="21">
     <w:abstractNumId w:val="0"/>
@@ -7157,13 +9688,43 @@
     <w:abstractNumId w:val="3"/>
   </w:num>
   <w:num w:numId="23">
-    <w:abstractNumId w:val="11"/>
+    <w:abstractNumId w:val="14"/>
   </w:num>
   <w:num w:numId="24">
-    <w:abstractNumId w:val="14"/>
+    <w:abstractNumId w:val="19"/>
   </w:num>
   <w:num w:numId="25">
-    <w:abstractNumId w:val="13"/>
+    <w:abstractNumId w:val="17"/>
+  </w:num>
+  <w:num w:numId="26">
+    <w:abstractNumId w:val="12"/>
+  </w:num>
+  <w:num w:numId="27">
+    <w:abstractNumId w:val="8"/>
+  </w:num>
+  <w:num w:numId="28">
+    <w:abstractNumId w:val="30"/>
+  </w:num>
+  <w:num w:numId="29">
+    <w:abstractNumId w:val="32"/>
+  </w:num>
+  <w:num w:numId="30">
+    <w:abstractNumId w:val="31"/>
+  </w:num>
+  <w:num w:numId="31">
+    <w:abstractNumId w:val="27"/>
+  </w:num>
+  <w:num w:numId="32">
+    <w:abstractNumId w:val="5"/>
+  </w:num>
+  <w:num w:numId="33">
+    <w:abstractNumId w:val="15"/>
+  </w:num>
+  <w:num w:numId="34">
+    <w:abstractNumId w:val="18"/>
+  </w:num>
+  <w:num w:numId="35">
+    <w:abstractNumId w:val="25"/>
   </w:num>
 </w:numbering>
 </file>

</xml_diff>